<commit_message>
Atualiza SUJEITO da pesquisa (FTH/UFF, Grupo HOST/CNPq e Alfredo Lopes)
Co-Authored-By: Claude Opus 5 <noreply@anthropic.com>
</commit_message>
<xml_diff>
--- a/FICHA-DO-PROJETO.docx
+++ b/FICHA-DO-PROJETO.docx
@@ -241,7 +241,7 @@
           <w:sz w:val="22"/>
           <w:szCs w:val="22"/>
         </w:rPr>
-        <w:t xml:space="preserve">Revista curta, de edição única, com 6 páginas.</w:t>
+        <w:t xml:space="preserve">REVISTA — edição única, curta, com 6 páginas.</w:t>
       </w:r>
     </w:p>
     <w:p>
@@ -267,7 +267,7 @@
           <w:sz w:val="22"/>
           <w:szCs w:val="22"/>
         </w:rPr>
-        <w:t xml:space="preserve">Professor de Turismo da UFF; Presidente do Sindicato de Hotéis da Cidade do Rio de Janeiro.</w:t>
+        <w:t xml:space="preserve">Professor da Faculdade de Turismo e Hotelaria (FTH) da Universidade Federal Fluminense (UFF), Vice-Líder do Grupo de Pesquisa HOST — Rede de Estudos em Hospitalidade (CNPq) e Coordenador Geral da Linha de Pesquisa e Extensão Turismo, Hospitalidade e Inclusão (UFF); e Alfredo Lopes, Presidente do Sindicato de Hotéis da Cidade do Rio de Janeiro.</w:t>
       </w:r>
     </w:p>
     <w:p>
@@ -3982,7 +3982,7 @@
                 <w:sz w:val="19"/>
                 <w:szCs w:val="19"/>
               </w:rPr>
-              <w:t xml:space="preserve">Entrevistas com os dois sujeitos</w:t>
+              <w:t xml:space="preserve">Entrevistas: professor da FTH/UFF e Alfredo Lopes</w:t>
             </w:r>
           </w:p>
         </w:tc>

</xml_diff>

<commit_message>
Corrige acentuacao da ficha e do dashboard, preservando as URLs
Co-Authored-By: Claude Opus 5 <noreply@anthropic.com>
</commit_message>
<xml_diff>
--- a/FICHA-DO-PROJETO.docx
+++ b/FICHA-DO-PROJETO.docx
@@ -523,7 +523,7 @@
         </w:rPr>
         <w:t xml:space="preserve">→ Prefeitura do Rio (SMTUR-Rio, SMDE e Riotur, com dados do IFec RJ), 19 jan. 2026 — Rio recebeu 12,5 milhões de visitantes em 2025, que movimentaram R$ 27,2 bilhões </w:t>
       </w:r>
-      <w:hyperlink w:history="1" r:id="rIdlnk0rqgsnpjqwexiw4ddt">
+      <w:hyperlink w:history="1" r:id="rId7_abhp-uwntm_z-xfw3tb">
         <w:r>
           <w:rPr>
             <w:rFonts w:ascii="Calibri" w:cs="Calibri" w:eastAsia="Calibri" w:hAnsi="Calibri"/>
@@ -630,7 +630,7 @@
         </w:rPr>
         <w:t xml:space="preserve">→ Práticas de sustentabilidade nos empreendimentos hoteleiros construídos no âmbito dos Jogos Olímpicos Rio 2016 — Turismo: Visão e Ação / SciELO </w:t>
       </w:r>
-      <w:hyperlink w:history="1" r:id="rIdbxrbim-iwwnwku7divhxd">
+      <w:hyperlink w:history="1" r:id="rIduklzdzpqvkn9qnyutff65">
         <w:r>
           <w:rPr>
             <w:rFonts w:ascii="Calibri" w:cs="Calibri" w:eastAsia="Calibri" w:hAnsi="Calibri"/>
@@ -703,7 +703,7 @@
         </w:rPr>
         <w:t xml:space="preserve">→ RUSSO; FIGUEIRA. O paradoxo dos grandes eventos — RBTur, v. 16, e-2312, 2022 </w:t>
       </w:r>
-      <w:hyperlink w:history="1" r:id="rIdu6rvixvjhv8cxxakhvvka">
+      <w:hyperlink w:history="1" r:id="rIdem3xkyc2cw-0qpnadt_b_">
         <w:r>
           <w:rPr>
             <w:rFonts w:ascii="Calibri" w:cs="Calibri" w:eastAsia="Calibri" w:hAnsi="Calibri"/>
@@ -728,7 +728,7 @@
           <w:sz w:val="22"/>
           <w:szCs w:val="22"/>
         </w:rPr>
-        <w:t xml:space="preserve">Havia, alem da sobreoferta, um fator de conjuntura amplamente coberto pela imprensa da epoca: a violencia urbana. Levantamento da Confederacao Nacional do Comercio (CNC) divulgado pela Agencia Brasil estimou perda de R$ 657 milhoes nas receitas do turismo fluminense apenas entre janeiro e agosto de 2017, calculando que a cada aumento de 10% na criminalidade a receita bruta das empresas do setor turistico do estado recuava, em media, 1,8% - com sensibilidade ainda maior na hospedagem (-1,9%) e no transporte (-2,0%). Em 2018, ano da intervencao federal na seguranca publica do Rio, o presidente do HoteisRIO declarou a imprensa que a industria turistica da cidade estava se dissolvendo por efeito da violencia.</w:t>
+        <w:t xml:space="preserve">Havia, além da sobreoferta, um fator de conjuntura amplamente coberto pela imprensa da epoca: a violência urbana. Levantamento da Confederação Nacional do Comércio (CNC) divulgado pela Agência Brasil estimou perda de R$ 657 milhões nas receitas do turismo fluminense apenas entre janeiro e agosto de 2017, calculando que a cada aumento de 10% na criminalidade a receita bruta das empresas do setor turístico do estado recuava, em média, 1,8% - com sensibilidade ainda maior na hospedagem (-1,9%) e no transporte (-2,0%). Em 2018, ano da intervenção federal na segurança pública do Rio, o presidente do HotéisRIO declarou a imprensa que a indústria turística da cidade estava se dissolvendo por efeito da violência.</w:t>
       </w:r>
     </w:p>
     <w:p>
@@ -744,9 +744,9 @@
           <w:sz w:val="18"/>
           <w:szCs w:val="18"/>
         </w:rPr>
-        <w:t xml:space="preserve">→ Rio perdeu R$ 657 milhoes em turismo por causa da violencia, diz CNC - Agencia Brasil, out. 2017 </w:t>
-      </w:r>
-      <w:hyperlink w:history="1" r:id="rId6vvteiqmuckyr_mjre0s_">
+        <w:t xml:space="preserve">→ Rio perdeu R$ 657 milhões em turismo por causa da violência, diz CNC - Agência Brasil, out. 2017 </w:t>
+      </w:r>
+      <w:hyperlink w:history="1" r:id="rIdyoahnfsaejvvjhhhz0pli">
         <w:r>
           <w:rPr>
             <w:rFonts w:ascii="Calibri" w:cs="Calibri" w:eastAsia="Calibri" w:hAnsi="Calibri"/>
@@ -772,9 +772,9 @@
           <w:sz w:val="18"/>
           <w:szCs w:val="18"/>
         </w:rPr>
-        <w:t xml:space="preserve">→ Violencia no Rio faz industria turistica se dissolver, diz presidente do HoteisRIO - Diario do Rio </w:t>
-      </w:r>
-      <w:hyperlink w:history="1" r:id="rIdf76pach2tupqkscyw6fyk">
+        <w:t xml:space="preserve">→ Violência no Rio faz indústria turística se dissolver, diz presidente do HotéisRIO - Diario do Rio </w:t>
+      </w:r>
+      <w:hyperlink w:history="1" r:id="rIdr5nvadnq3xibq4pekxrzv">
         <w:r>
           <w:rPr>
             <w:rFonts w:ascii="Calibri" w:cs="Calibri" w:eastAsia="Calibri" w:hAnsi="Calibri"/>
@@ -800,9 +800,9 @@
           <w:sz w:val="18"/>
           <w:szCs w:val="18"/>
         </w:rPr>
-        <w:t xml:space="preserve">→ Como a violencia afeta o turismo - Observatorio Legislativo da Intervencao Federal na Seguranca Publica do RJ (Camara dos Deputados). ATENCAO: pagina fora do ar na consulta de 16/09/2026; tentar novamente ou solicitar a Camara </w:t>
-      </w:r>
-      <w:hyperlink w:history="1" r:id="rIdx9osbgegduwgieirci39p">
+        <w:t xml:space="preserve">→ Como a violência afeta o turismo - Observatório Legislativo da Intervenção Federal na Segurança Pública do RJ (Câmara dos Deputados). ATENÇÃO: página fora do ar na consulta de 16/09/2026; tentar novamente ou solicitar a Câmara </w:t>
+      </w:r>
+      <w:hyperlink w:history="1" r:id="rIdq1eu62ar7k1_xmveonpea">
         <w:r>
           <w:rPr>
             <w:rFonts w:ascii="Calibri" w:cs="Calibri" w:eastAsia="Calibri" w:hAnsi="Calibri"/>
@@ -827,7 +827,7 @@
           <w:sz w:val="22"/>
           <w:szCs w:val="22"/>
         </w:rPr>
-        <w:t xml:space="preserve">O quadro e, portanto, de dupla pressao: excesso de oferta hoteleira e demanda retraida por percepcao de inseguranca. E contra esse cenario que o crescimento posterior precisa ser lido - e e tambem por isso que a reducao da violencia aparece, na cobertura mais recente, como um dos vetores da retomada do destino.</w:t>
+        <w:t xml:space="preserve">O quadro é, portanto, de dupla pressão: excesso de oferta hoteleira e demanda retraída por percepção de insegurança. É contra esse cenário que o crescimento posterior precisa ser lido - e é também por isso que a redução da violência aparece, na cobertura mais recente, como um dos vetores da retomada do destino.</w:t>
       </w:r>
     </w:p>
     <w:p>
@@ -843,9 +843,9 @@
           <w:sz w:val="18"/>
           <w:szCs w:val="18"/>
         </w:rPr>
-        <w:t xml:space="preserve">→ Queda da violencia impulsiona turismo no Rio de Janeiro - CNN Brasil </w:t>
-      </w:r>
-      <w:hyperlink w:history="1" r:id="rId6y_vjik9y6aeu1yelmgad">
+        <w:t xml:space="preserve">→ Queda da violência impulsiona turismo no Rio de Janeiro - CNN Brasil </w:t>
+      </w:r>
+      <w:hyperlink w:history="1" r:id="rIdxn6umbxvko91kjbtyeheb">
         <w:r>
           <w:rPr>
             <w:rFonts w:ascii="Calibri" w:cs="Calibri" w:eastAsia="Calibri" w:hAnsi="Calibri"/>
@@ -888,7 +888,7 @@
         </w:rPr>
         <w:t xml:space="preserve">→ E agora, Rio? O turismo pós-megaeventos — Caderno Virtual de Turismo </w:t>
       </w:r>
-      <w:hyperlink w:history="1" r:id="rId4rkn6-s1b2ihoniz2aa-d">
+      <w:hyperlink w:history="1" r:id="rIdxj6xhznoaftm-nufbr98g">
         <w:r>
           <w:rPr>
             <w:rFonts w:ascii="Calibri" w:cs="Calibri" w:eastAsia="Calibri" w:hAnsi="Calibri"/>
@@ -916,7 +916,7 @@
         </w:rPr>
         <w:t xml:space="preserve">→ Embratur / Ministério do Turismo / Polícia Federal — série de chegadas internacionais (2019: 6,3 milhões) </w:t>
       </w:r>
-      <w:hyperlink w:history="1" r:id="rId0cedhvs4evkvgcnxmqc6v">
+      <w:hyperlink w:history="1" r:id="rIdkihzfxqnb0iwjo_ry3ng4">
         <w:r>
           <w:rPr>
             <w:rFonts w:ascii="Calibri" w:cs="Calibri" w:eastAsia="Calibri" w:hAnsi="Calibri"/>
@@ -976,7 +976,7 @@
         </w:rPr>
         <w:t xml:space="preserve">→ Com pandemia, Brasil registra em dois anos a chegada de 2,9 milhões de turistas internacionais — Embratur, 20 out. 2022 </w:t>
       </w:r>
-      <w:hyperlink w:history="1" r:id="rIdaoixmr5ugc8mzrh9gez9a">
+      <w:hyperlink w:history="1" r:id="rIdxfai2iyzihai1zimfshbb">
         <w:r>
           <w:rPr>
             <w:rFonts w:ascii="Calibri" w:cs="Calibri" w:eastAsia="Calibri" w:hAnsi="Calibri"/>
@@ -1019,7 +1019,7 @@
         </w:rPr>
         <w:t xml:space="preserve">→ Hotelaria do Rio registra prejuízo de R$ 1,6 bi em um ano — balanço HotéisRIO (PANROTAS, abr. 2021) </w:t>
       </w:r>
-      <w:hyperlink w:history="1" r:id="rIdcftfnqgrrzfpignxu2jan">
+      <w:hyperlink w:history="1" r:id="rIdn6sahfyswk-b0r_evsnz5">
         <w:r>
           <w:rPr>
             <w:rFonts w:ascii="Calibri" w:cs="Calibri" w:eastAsia="Calibri" w:hAnsi="Calibri"/>
@@ -1047,7 +1047,7 @@
         </w:rPr>
         <w:t xml:space="preserve">→ Na pandemia, hotéis foram fechados e 20 mil empregos do setor suspensos no Rio — Brasil de Fato, ago. 2020 </w:t>
       </w:r>
-      <w:hyperlink w:history="1" r:id="rIdhwlnjui9egb5cwwjrqqt2">
+      <w:hyperlink w:history="1" r:id="rIdaxyperbphdvhjshakmwpm">
         <w:r>
           <w:rPr>
             <w:rFonts w:ascii="Calibri" w:cs="Calibri" w:eastAsia="Calibri" w:hAnsi="Calibri"/>
@@ -1090,7 +1090,7 @@
         </w:rPr>
         <w:t xml:space="preserve">→ NEVES et al. Os impactos da Covid-19 nas viagens de turistas brasileiros — Turismo: Visão e Ação, v. 23, n. 1, 2021 </w:t>
       </w:r>
-      <w:hyperlink w:history="1" r:id="rIdbkdecrcjdwftlnkasoqqb">
+      <w:hyperlink w:history="1" r:id="rIdickf6p5dh4cblia-6o9ml">
         <w:r>
           <w:rPr>
             <w:rFonts w:ascii="Calibri" w:cs="Calibri" w:eastAsia="Calibri" w:hAnsi="Calibri"/>
@@ -1165,7 +1165,7 @@
         </w:rPr>
         <w:t xml:space="preserve">→ Recorde histórico: turismo internacional injeta R$ 34,5 bilhões na economia brasileira em 2023 — Agência Gov / Ministério do Turismo </w:t>
       </w:r>
-      <w:hyperlink w:history="1" r:id="rIdfykdst1yf34z5ctmwfnw8">
+      <w:hyperlink w:history="1" r:id="rIdgra0pyosvke5nmjcfnsru">
         <w:r>
           <w:rPr>
             <w:rFonts w:ascii="Calibri" w:cs="Calibri" w:eastAsia="Calibri" w:hAnsi="Calibri"/>
@@ -1193,7 +1193,7 @@
         </w:rPr>
         <w:t xml:space="preserve">→ Brasil encerra 2024 com recorde de 6,65 milhões de turistas estrangeiros, alta de 12,6% — Agência Gov </w:t>
       </w:r>
-      <w:hyperlink w:history="1" r:id="rIdkcd-s-wia51df93urhgpt">
+      <w:hyperlink w:history="1" r:id="rIdmgh7sxgj0kqb8wujxmxjy">
         <w:r>
           <w:rPr>
             <w:rFonts w:ascii="Calibri" w:cs="Calibri" w:eastAsia="Calibri" w:hAnsi="Calibri"/>
@@ -1221,7 +1221,7 @@
         </w:rPr>
         <w:t xml:space="preserve">→ Brasil alcança recorde histórico e fecha 2025 com 9,3 milhões de turistas internacionais — Secom / Presidência da República </w:t>
       </w:r>
-      <w:hyperlink w:history="1" r:id="rIdayzihfc32gtvtrqspbies">
+      <w:hyperlink w:history="1" r:id="rIddjy6kooozgh83mikgpowu">
         <w:r>
           <w:rPr>
             <w:rFonts w:ascii="Calibri" w:cs="Calibri" w:eastAsia="Calibri" w:hAnsi="Calibri"/>
@@ -1246,7 +1246,7 @@
           <w:sz w:val="22"/>
           <w:szCs w:val="22"/>
         </w:rPr>
-        <w:t xml:space="preserve">A virada de 2021 para 2022 tem contexto proprio, e ele e revelador do peso do calendario de eventos. Com o avanco da variante Omicron, os desfiles das escolas de samba do Grupo Especial foram adiados de fevereiro para abril de 2022 - decisao tomada, segundo as autoridades, em respeito a situacao sanitaria. Mesmo assim, a arrecadacao de ISS dos servicos ligados ao turismo no verao 2021/2022 somou R$ 52,5 milhoes, praticamente o dobro dos R$ 27,2 milhoes registrados na temporada anterior, ficando apenas 11,8% abaixo do patamar pre-pandemia. O evento deslocado no calendario deslocou com ele o movimento: abril de 2022 registrou 63,68% de ocupacao, contra 52,69% em maio.</w:t>
+        <w:t xml:space="preserve">A virada de 2021 para 2022 tem contexto próprio, e ele é revelador do peso do calendário de eventos. Com o avanço da variante Ômicron, os desfiles das escolas de samba do Grupo Especial foram adiados de fevereiro para abril de 2022 - decisão tomada, segundo as autoridades, em respeito a situação sanitária. Mesmo assim, a arrecadação de ISS dos serviços ligados ao turismo no verão 2021/2022 somou R$ 52,5 milhões, praticamente o dobro dos R$ 27,2 milhões registrados na temporada anterior, ficando apenas 11,8% abaixo do patamar pre-pandemia. O evento deslocado no calendário deslocou com ele o movimento: abril de 2022 registrou 63,68% de ocupação, contra 52,69% em maio.</w:t>
       </w:r>
     </w:p>
     <w:p>
@@ -1262,9 +1262,9 @@
           <w:sz w:val="18"/>
           <w:szCs w:val="18"/>
         </w:rPr>
-        <w:t xml:space="preserve">→ Arrecadacao do turismo na cidade superou os R$ 50 milhoes no verao - Prefeitura da Cidade do Rio de Janeiro </w:t>
-      </w:r>
-      <w:hyperlink w:history="1" r:id="rIdgwycz79xyfacjspx1ysyp">
+        <w:t xml:space="preserve">→ Arrecadação do turismo na cidade superou os R$ 50 milhões no verão - Prefeitura da Cidade do Rio de Janeiro </w:t>
+      </w:r>
+      <w:hyperlink w:history="1" r:id="rId3aq1b6phldqcoeode-uiy">
         <w:r>
           <w:rPr>
             <w:rFonts w:ascii="Calibri" w:cs="Calibri" w:eastAsia="Calibri" w:hAnsi="Calibri"/>
@@ -1290,9 +1290,9 @@
           <w:sz w:val="18"/>
           <w:szCs w:val="18"/>
         </w:rPr>
-        <w:t xml:space="preserve">→ Retorno do Carnaval deve movimentar economia do Rio de Janeiro e de Sao Paulo - Ministerio do Turismo </w:t>
-      </w:r>
-      <w:hyperlink w:history="1" r:id="rIdp865mvyzzb2pifxq8j-b6">
+        <w:t xml:space="preserve">→ Retorno do Carnaval deve movimentar economia do Rio de Janeiro e de São Paulo - Ministério do Turismo </w:t>
+      </w:r>
+      <w:hyperlink w:history="1" r:id="rIdua6_oe4j3h6c0frql8mah">
         <w:r>
           <w:rPr>
             <w:rFonts w:ascii="Calibri" w:cs="Calibri" w:eastAsia="Calibri" w:hAnsi="Calibri"/>
@@ -1335,7 +1335,7 @@
         </w:rPr>
         <w:t xml:space="preserve">→ Prefeitura do Rio — SMTUR-Rio, SMDE e Riotur, com dados do Instituto Fecomércio de Pesquisas e Análises (IFec RJ), 19 jan. 2026 </w:t>
       </w:r>
-      <w:hyperlink w:history="1" r:id="rId3yhloh-xqy6ycdnrh6sjm">
+      <w:hyperlink w:history="1" r:id="rId9nuvhgwy9cg3nsm4ypqk6">
         <w:r>
           <w:rPr>
             <w:rFonts w:ascii="Calibri" w:cs="Calibri" w:eastAsia="Calibri" w:hAnsi="Calibri"/>
@@ -1378,7 +1378,7 @@
         </w:rPr>
         <w:t xml:space="preserve">→ Rio de Janeiro registra aumento de 51,7% na chegada de turistas estrangeiros em 2025 — Embratur, 7 out. 2025 </w:t>
       </w:r>
-      <w:hyperlink w:history="1" r:id="rIdlutzk3tidwla-ynpwnz_g">
+      <w:hyperlink w:history="1" r:id="rIdcliex-2uog6yyvjx-olgp">
         <w:r>
           <w:rPr>
             <w:rFonts w:ascii="Calibri" w:cs="Calibri" w:eastAsia="Calibri" w:hAnsi="Calibri"/>
@@ -1406,7 +1406,7 @@
         </w:rPr>
         <w:t xml:space="preserve">→ Rio de Janeiro bate recorde de turistas internacionais em 2025 — Agência Brasil, nov. 2025 </w:t>
       </w:r>
-      <w:hyperlink w:history="1" r:id="rIdxp2p9wsckvioy8e0xyd8l">
+      <w:hyperlink w:history="1" r:id="rIdezzyealpnayo8g19pr9o0">
         <w:r>
           <w:rPr>
             <w:rFonts w:ascii="Calibri" w:cs="Calibri" w:eastAsia="Calibri" w:hAnsi="Calibri"/>
@@ -2805,7 +2805,7 @@
         </w:rPr>
         <w:t xml:space="preserve">→ Rock in Rio gera R$ 2,6 bilhões para economia fluminense — Agência Brasil, 23 set. 2024 </w:t>
       </w:r>
-      <w:hyperlink w:history="1" r:id="rIdjzccezm168e9czaxxf93r">
+      <w:hyperlink w:history="1" r:id="rIddn-4v2oauumqyxezh9n2n">
         <w:r>
           <w:rPr>
             <w:rFonts w:ascii="Calibri" w:cs="Calibri" w:eastAsia="Calibri" w:hAnsi="Calibri"/>
@@ -2833,7 +2833,7 @@
         </w:rPr>
         <w:t xml:space="preserve">→ Estudo da FGV sobre o impacto econômico do Rock in Rio 2024 — Hotelier News </w:t>
       </w:r>
-      <w:hyperlink w:history="1" r:id="rId-g4qza2azp3qcv8nfc99i">
+      <w:hyperlink w:history="1" r:id="rIda1lzr_qj5hzhdkqmvduxe">
         <w:r>
           <w:rPr>
             <w:rFonts w:ascii="Calibri" w:cs="Calibri" w:eastAsia="Calibri" w:hAnsi="Calibri"/>
@@ -2906,7 +2906,7 @@
         </w:rPr>
         <w:t xml:space="preserve">→ O futuro do turismo no Brasil a partir da análise crítica do período 2000-2019 — RBTur / SciELO </w:t>
       </w:r>
-      <w:hyperlink w:history="1" r:id="rIduiiehgzvorl5llfdh7ckc">
+      <w:hyperlink w:history="1" r:id="rIdqnrfx4fjzjjthtu2wlfk5">
         <w:r>
           <w:rPr>
             <w:rFonts w:ascii="Calibri" w:cs="Calibri" w:eastAsia="Calibri" w:hAnsi="Calibri"/>
@@ -4867,7 +4867,7 @@
           <w:sz w:val="22"/>
           <w:szCs w:val="22"/>
         </w:rPr>
-        <w:t xml:space="preserve">Duas entrevistas semiestruturadas, com funcoes distintas. Todas as perguntas partem dos eventos que impactaram a cidade e usam como apoio a serie de ocupacao (instrumento de datacao) e o contexto historico de cada ano.</w:t>
+        <w:t xml:space="preserve">Duas entrevistas semiestruturadas, com funções distintas. Todas as perguntas partem dos eventos que impactaram a cidade e usam como apoio a série de ocupação (instrumento de datação) e o contexto histórico de cada ano.</w:t>
       </w:r>
     </w:p>
     <w:p>
@@ -4884,7 +4884,7 @@
           <w:sz w:val="22"/>
           <w:szCs w:val="22"/>
         </w:rPr>
-        <w:t xml:space="preserve">Roteiro 1 - Especialista do setor turistico (professor da FTH/UFF, Grupo HOST/CNPq)</w:t>
+        <w:t xml:space="preserve">Roteiro 1 - Especialista do setor turístico (professor da FTH/UFF, Grupo HOST/CNPq)</w:t>
       </w:r>
     </w:p>
     <w:p>
@@ -4899,7 +4899,7 @@
           <w:sz w:val="22"/>
           <w:szCs w:val="22"/>
         </w:rPr>
-        <w:t xml:space="preserve">Funcao na pesquisa: enquadramento conceitual e interpretacao do fenomeno.</w:t>
+        <w:t xml:space="preserve">Função na pesquisa: enquadramento conceitual e interpretação do fenômeno.</w:t>
       </w:r>
     </w:p>
     <w:p>
@@ -4918,7 +4918,7 @@
           <w:sz w:val="22"/>
           <w:szCs w:val="22"/>
         </w:rPr>
-        <w:t xml:space="preserve">Quais foram, na sua avaliacao, os eventos que mais impactaram a cidade do Rio de Janeiro entre 2018 e 2025 - e por que esses, e nao outros?</w:t>
+        <w:t xml:space="preserve">Quais foram, na sua avaliação, os eventos que mais impactaram a cidade do Rio de Janeiro entre 2018 e 2025 - e por que esses, e não outros?</w:t>
       </w:r>
     </w:p>
     <w:p>
@@ -4937,7 +4937,7 @@
           <w:sz w:val="22"/>
           <w:szCs w:val="22"/>
         </w:rPr>
-        <w:t xml:space="preserve">A literatura distingue evento captado de evento de calendario permanente. No caso do Rio, qual dos dois explica melhor o crescimento do turismo entre 2022 e 2025?</w:t>
+        <w:t xml:space="preserve">A literatura distingue evento captado de evento de calendário permanente. No caso do Rio, qual dos dois explica melhor o crescimento do turismo entre 2022 e 2025?</w:t>
       </w:r>
     </w:p>
     <w:p>
@@ -4956,7 +4956,7 @@
           <w:sz w:val="22"/>
           <w:szCs w:val="22"/>
         </w:rPr>
-        <w:t xml:space="preserve">A serie de ocupacao mostra que setembro de 2022 (75,63%), no Rock in Rio, superou janeiro daquele ano (73,27%). Um festival de musica venceu o verao carioca. Como o senhor interpreta esse dado?</w:t>
+        <w:t xml:space="preserve">A série de ocupação mostra que setembro de 2022 (75,63%), no Rock in Rio, superou janeiro daquele ano (73,27%). Um festival de música venceu o verão carioca. Como o senhor interpreta esse dado?</w:t>
       </w:r>
     </w:p>
     <w:p>
@@ -4975,7 +4975,7 @@
           <w:sz w:val="22"/>
           <w:szCs w:val="22"/>
         </w:rPr>
-        <w:t xml:space="preserve">Maio saiu de 38,00% de ocupacao em 2018 para 72,81% em 2025, com os megashows gratuitos de Madonna e Lady Gaga em Copacabana no meio do periodo. Megashow gratuito financiado com dinheiro publico e politica de turismo eficiente ou gasto de vitrine?</w:t>
+        <w:t xml:space="preserve">Maio saiu de 38,00% de ocupação em 2018 para 72,81% em 2025, com os megashows gratuitos de Madonna e Lady Gaga em Copacabana no meio do período. Megashow gratuito financiado com dinheiro público e politica de turismo eficiente ou gasto de vitrine?</w:t>
       </w:r>
     </w:p>
     <w:p>
@@ -4994,7 +4994,7 @@
           <w:sz w:val="22"/>
           <w:szCs w:val="22"/>
         </w:rPr>
-        <w:t xml:space="preserve">A Cupula do G20 nao vendeu ingressos e levou os hoteis cinco estrelas a mais de 95% de ocupacao, com o Galeao 68% acima do ano anterior. Que tipo de legado um evento institucional como esse deixa para o destino, alem do gasto dos dias do encontro?</w:t>
+        <w:t xml:space="preserve">A Cúpula do G20 não vendeu ingressos e levou os hotéis cinco estrelas a mais de 95% de ocupação, com o Galeão 68% acima do ano anterior. Que tipo de legado um evento institucional como esse deixa para o destino, além do gasto dos dias do encontro?</w:t>
       </w:r>
     </w:p>
     <w:p>
@@ -5013,7 +5013,7 @@
           <w:sz w:val="22"/>
           <w:szCs w:val="22"/>
         </w:rPr>
-        <w:t xml:space="preserve">Em 2018 e 2019 o Rio convivia com sobreoferta hoteleira e com o impacto da violencia urbana sobre a demanda. Quanto do crescimento posterior e efeito dos eventos e quanto e recuperacao desse contexto adverso?</w:t>
+        <w:t xml:space="preserve">Em 2018 e 2019 o Rio convivia com sobreoferta hoteleira e com o impacto da violência urbana sobre a demanda. Quanto do crescimento posterior e efeito dos eventos e quanto e recuperação desse contexto adverso?</w:t>
       </w:r>
     </w:p>
     <w:p>
@@ -5032,7 +5032,7 @@
           <w:sz w:val="22"/>
           <w:szCs w:val="22"/>
         </w:rPr>
-        <w:t xml:space="preserve">Usar a taxa de ocupacao hoteleira como instrumento para datar o crescimento do turismo e metodologicamente adequado? O que esse indicador nao captura?</w:t>
+        <w:t xml:space="preserve">Usar a taxa de ocupação hoteleira como instrumento para datar o crescimento do turismo e metodologicamente adequado? O que esse indicador não captura?</w:t>
       </w:r>
     </w:p>
     <w:p>
@@ -5051,7 +5051,7 @@
           <w:sz w:val="22"/>
           <w:szCs w:val="22"/>
         </w:rPr>
-        <w:t xml:space="preserve">Ha pesquisa mostrando que os megaeventos esportivos brasileiros de 2007 a 2016 nao produziram a expansao turistica prevista. O calendario recorrente de eventos do Rio contradiz ou confirma essa conclusao?</w:t>
+        <w:t xml:space="preserve">Há pesquisa mostrando que os megaeventos esportivos brasileiros de 2007 a 2016 não produziram a expansão turística prevista. O calendário recorrente de eventos do Rio contradiz ou confirma essa conclusão?</w:t>
       </w:r>
     </w:p>
     <w:p>
@@ -5070,7 +5070,7 @@
           <w:sz w:val="22"/>
           <w:szCs w:val="22"/>
         </w:rPr>
-        <w:t xml:space="preserve">O Rio corre risco de dependencia do calendario de eventos? O que acontece com o turismo da cidade num ano sem grande evento?</w:t>
+        <w:t xml:space="preserve">O Rio corre risco de dependência do calendário de eventos? O que acontece com o turismo da cidade num ano sem grande evento?</w:t>
       </w:r>
     </w:p>
     <w:p>
@@ -5087,7 +5087,7 @@
           <w:sz w:val="22"/>
           <w:szCs w:val="22"/>
         </w:rPr>
-        <w:t xml:space="preserve">Roteiro 2 - Alfredo Lopes, Presidente do Sindicato de Hoteis da Cidade do Rio de Janeiro</w:t>
+        <w:t xml:space="preserve">Roteiro 2 - Alfredo Lopes, Presidente do Sindicato de Hotéis da Cidade do Rio de Janeiro</w:t>
       </w:r>
     </w:p>
     <w:p>
@@ -5102,7 +5102,7 @@
           <w:sz w:val="22"/>
           <w:szCs w:val="22"/>
         </w:rPr>
-        <w:t xml:space="preserve">Funcao na pesquisa: serie historica em perspectiva, metodologia da pesquisa de ocupacao e dado de bastidor. Supre a lacuna documental de 2019.</w:t>
+        <w:t xml:space="preserve">Função na pesquisa: série histórica em perspectiva, metodologia da pesquisa de ocupação e dado de bastidor. Supre a lacuna documental de 2019.</w:t>
       </w:r>
     </w:p>
     <w:p>
@@ -5121,7 +5121,7 @@
           <w:sz w:val="22"/>
           <w:szCs w:val="22"/>
         </w:rPr>
-        <w:t xml:space="preserve">Como a Pesquisa de Ocupacao Hoteleira do Sindicato e feita, e por que ela e mais confiavel que dados de plataformas de reserva? Essa e a base metodologica do trabalho, e preciso descreve-la com precisao.</w:t>
+        <w:t xml:space="preserve">Como a Pesquisa de Ocupação Hoteleira do Sindicato e feita, e por que ela é mais confiável que dados de plataformas de reserva? Essa é a base metodológica do trabalho, é preciso descrevê-la com precisão.</w:t>
       </w:r>
     </w:p>
     <w:p>
@@ -5140,7 +5140,7 @@
           <w:sz w:val="22"/>
           <w:szCs w:val="22"/>
         </w:rPr>
-        <w:t xml:space="preserve">Como estava o turismo da cidade em 2018 e 2019, no rescaldo dos Jogos Olimpicos, com excesso de leitos e violencia urbana em pauta? Que peso a Copa America e o Rock in Rio de 2019 tiveram naquele momento?</w:t>
+        <w:t xml:space="preserve">Como estava o turismo da cidade em 2018 e 2019, no rescaldo dos Jogos Olímpicos, com excesso de leitos e violência urbana em pauta? Que peso a Copa América e o Rock in Rio de 2019 tiveram naquele momento?</w:t>
       </w:r>
     </w:p>
     <w:p>
@@ -5159,7 +5159,7 @@
           <w:sz w:val="22"/>
           <w:szCs w:val="22"/>
         </w:rPr>
-        <w:t xml:space="preserve">Qual foi o pior mes da historia recente da hotelaria carioca, e como o setor sobreviveu a ele? A serie aponta julho de 2020, com 19,78%.</w:t>
+        <w:t xml:space="preserve">Qual foi o pior mês da história recente da hotelaria carioca, e como o setor sobreviveu a ele? A série aponta julho de 2020, com 19,78%.</w:t>
       </w:r>
     </w:p>
     <w:p>
@@ -5178,7 +5178,7 @@
           <w:sz w:val="22"/>
           <w:szCs w:val="22"/>
         </w:rPr>
-        <w:t xml:space="preserve">Quantos hoteis fecharam na pandemia e quantos reabriram? Qual o tamanho da oferta hoje comparado a 2019 - e quanto disso explica as taxas altas de 2024 e 2025?</w:t>
+        <w:t xml:space="preserve">Quantos hotéis fecharam na pandemia e quantos reabriram? Qual o tamanho da oferta hoje comparado a 2019 - e quanto disso explica as taxas altas de 2024 e 2025?</w:t>
       </w:r>
     </w:p>
     <w:p>
@@ -5197,7 +5197,7 @@
           <w:sz w:val="22"/>
           <w:szCs w:val="22"/>
         </w:rPr>
-        <w:t xml:space="preserve">Entre todos os eventos de 2018 a 2025, qual trouxe o melhor resultado para o hotel - nao em publico, mas em diaria media, permanencia e receita por quarto?</w:t>
+        <w:t xml:space="preserve">Entre todos os eventos de 2018 a 2025, qual trouxe o melhor resultado para o hotel - não em público, mas em diária média, permanência e receita por quarto?</w:t>
       </w:r>
     </w:p>
     <w:p>
@@ -5216,7 +5216,7 @@
           <w:sz w:val="22"/>
           <w:szCs w:val="22"/>
         </w:rPr>
-        <w:t xml:space="preserve">Eventos diferentes enchem bairros diferentes: Rock in Rio puxa a Barra, megashow na orla puxa Copacabana, Rio Innovation Week puxa o Centro. Isso muda a estrategia dos hoteis e a conversa com o poder publico?</w:t>
+        <w:t xml:space="preserve">Eventos diferentes enchem bairros diferentes: Rock in Rio puxa a Barra, megashow na orla puxa Copacabana, Rio Innovation Week puxa o Centro. Isso muda a estratégia dos hotéis e a conversa com o poder público?</w:t>
       </w:r>
     </w:p>
     <w:p>
@@ -5235,7 +5235,7 @@
           <w:sz w:val="22"/>
           <w:szCs w:val="22"/>
         </w:rPr>
-        <w:t xml:space="preserve">O Carnaval de 2025 chegou a 98,62% de ocupacao na capital. Existe espaco para crescer, ou a cidade bateu no teto de capacidade?</w:t>
+        <w:t xml:space="preserve">O Carnaval de 2025 chegou a 98,62% de ocupação na capital. Existe espaço para crescer, ou a cidade bateu no teto de capacidade?</w:t>
       </w:r>
     </w:p>
     <w:p>
@@ -5254,7 +5254,7 @@
           <w:sz w:val="22"/>
           <w:szCs w:val="22"/>
         </w:rPr>
-        <w:t xml:space="preserve">Novembro de 2024, com o G20, e novembro de 2023, com os grandes shows, foram picos em meses sem verao e sem Carnaval. O setor passou a planejar o ano em funcao do calendario de eventos?</w:t>
+        <w:t xml:space="preserve">Novembro de 2024, com o G20, e novembro de 2023, com os grandes shows, foram picos em meses sem verão e sem Carnaval. O setor passou a planejar o ano em função do calendário de eventos?</w:t>
       </w:r>
     </w:p>
     <w:p>
@@ -5273,7 +5273,7 @@
           <w:sz w:val="22"/>
           <w:szCs w:val="22"/>
         </w:rPr>
-        <w:t xml:space="preserve">Que evento o Rio ainda nao tem e deveria captar?</w:t>
+        <w:t xml:space="preserve">Que evento o Rio ainda não tem e deveria captar?</w:t>
       </w:r>
     </w:p>
     <w:p>
@@ -5292,7 +5292,7 @@
           <w:sz w:val="22"/>
           <w:szCs w:val="22"/>
         </w:rPr>
-        <w:t xml:space="preserve">Marco de 2019 aparece na base com 90,66%, valor incompativel com as regioes no mesmo mes. O senhor consegue confirmar se houve erro de registro?</w:t>
+        <w:t xml:space="preserve">Março de 2019 aparece na base com 90,66%, valor incompatível com as regiões no mesmo mês. O senhor consegue confirmar se houve erro de registro?</w:t>
       </w:r>
     </w:p>
     <w:p>
@@ -5496,7 +5496,7 @@
           <w:sz w:val="24"/>
           <w:szCs w:val="24"/>
         </w:rPr>
-        <w:t xml:space="preserve">4.1. O que e turismo: o conceito de base</w:t>
+        <w:t xml:space="preserve">4.1. O que é turismo: o conceito de base</w:t>
       </w:r>
     </w:p>
     <w:p>
@@ -5511,7 +5511,7 @@
           <w:sz w:val="22"/>
           <w:szCs w:val="22"/>
         </w:rPr>
-        <w:t xml:space="preserve">Antes de discutir eventos e preciso fixar o conceito do fenomeno que se pretende medir. A definicao de referencia e a da Organizacao Mundial do Turismo, adotada pela literatura brasileira: o turismo compreende as atividades que as pessoas realizam durante suas viagens e permanencias em lugares distintos do seu entorno habitual, por um periodo consecutivo inferior a um ano, com finalidade de lazer, negocios ou outros motivos.</w:t>
+        <w:t xml:space="preserve">Antes de discutir eventos é preciso fixar o conceito do fenômeno que se pretende medir. A definição de referência é a da Organização Mundial do Turismo, adotada pela literatura brasileira: o turismo compreende as atividades que as pessoas realizam durante suas viagens e permanências em lugares distintos do seu entorno habitual, por um período consecutivo inferior a um ano, com finalidade de lazer, negócios ou outros motivos.</w:t>
       </w:r>
     </w:p>
     <w:p>
@@ -5527,9 +5527,9 @@
           <w:sz w:val="18"/>
           <w:szCs w:val="18"/>
         </w:rPr>
-        <w:t xml:space="preserve">→ Artigo em Turismo: Visao e Acao (SciELO) que apresenta e discute a definicao de turismo da OMT (2001) </w:t>
-      </w:r>
-      <w:hyperlink w:history="1" r:id="rIdwqoabd7u0xzbwsppv4e0a">
+        <w:t xml:space="preserve">→ Artigo em Turismo: Visão e Ação (SciELO) que apresenta e discute a definição de turismo da OMT (2001) </w:t>
+      </w:r>
+      <w:hyperlink w:history="1" r:id="rIdjmrc1mwxw_9vrmxhh8zvi">
         <w:r>
           <w:rPr>
             <w:rFonts w:ascii="Calibri" w:cs="Calibri" w:eastAsia="Calibri" w:hAnsi="Calibri"/>
@@ -5554,7 +5554,7 @@
           <w:sz w:val="22"/>
           <w:szCs w:val="22"/>
         </w:rPr>
-        <w:t xml:space="preserve">Tres consequencias dessa definicao orientam a metodologia deste trabalho. Primeira: turismo e deslocamento, e portanto se mede por FLUXO DE PESSOAS, nao por leitos ocupados - a ocupacao hoteleira e consequencia do fluxo, e e por isso que ela serve de instrumento de datacao, e nao de objeto. Segunda: a definicao inclui explicitamente a finalidade de NEGOCIOS, o que legitima tratar a Cupula do G20, o Web Summit Rio e a Rio Innovation Week como eventos turisticos no mesmo plano dos festivais de musica. Terceira: exige permanencia fora do entorno habitual, razao pela qual os publicos locais dos megashows gratuitos - cariocas e moradores da regiao metropolitana - nao sao turistas; por isso a analise separa publico total de turistas efetivos, como fazem os proprios estudos da Prefeitura, que estimaram 150 mil turistas entre 1,6 milhao de pessoas no show de Madonna.</w:t>
+        <w:t xml:space="preserve">Três consequências dessa definição orientam a metodologia deste trabalho. Primeira: turismo é deslocamento, e portanto se mede por FLUXO DE PESSOAS, não por leitos ocupados - a ocupação hoteleira é consequência do fluxo, e é por isso que ela serve de instrumento de datação, e não de objeto. Segunda: a definição inclui explicitamente a finalidade de NEGÓCIOS, o que legitima tratar a Cúpula do G20, o Web Summit Rio e a Rio Innovation Week como eventos turísticos no mesmo plano dos festivais de música. Terceira: exige permanência fora do entorno habitual, razão pela qual os públicos locais dos megashows gratuitos - cariocas e moradores da região metropolitana - não são turistas; por isso a análise separa público total de turistas efetivos, como fazem os próprios estudos da Prefeitura, que estimaram 150 mil turistas entre 1,6 milhão de pessoas no show de Madonna.</w:t>
       </w:r>
     </w:p>
     <w:p>
@@ -5569,7 +5569,7 @@
           <w:sz w:val="22"/>
           <w:szCs w:val="22"/>
         </w:rPr>
-        <w:t xml:space="preserve">A literatura brasileira acrescenta a dimensao cultural. Para Barretto (2006), o turismo cultural e todo turismo cuja atracao principal nao e a natureza, mas algum aspecto da cultura humana - definicao que enquadra diretamente o objeto desta pesquisa, ja que Carnaval, Rock in Rio e megashows na orla sao atrativos culturais, e nao naturais. E uma inversao relevante para o caso carioca: a cidade e mundialmente vendida pela natureza, mas o crescimento turistico aqui analisado foi puxado por cultura e por negocios.</w:t>
+        <w:t xml:space="preserve">A literatura brasileira acrescenta a dimensão cultural. Para Barretto (2006), o turismo cultural e todo turismo cuja atração principal não e a natureza, mas algum aspecto da cultura humana - definição que enquadra diretamente o objeto desta pesquisa, já que Carnaval, Rock in Rio e megashows na orla são atrativos culturais, e não naturais. É uma inversão relevante para o caso carioca: a cidade é mundialmente vendida pela natureza, mas o crescimento turístico aqui analisado foi puxado por cultura e por negócios.</w:t>
       </w:r>
     </w:p>
     <w:p>
@@ -5585,7 +5585,7 @@
           <w:sz w:val="19"/>
           <w:szCs w:val="19"/>
         </w:rPr>
-        <w:t xml:space="preserve">Consequencia pratica para a redacao do TCC: sempre que o texto disser que o turismo cresceu, o dado que sustenta a frase deve ser de fluxo de visitantes ou de receita turistica (Embratur/MTur, Prefeitura/IFec RJ). Quando o dado for de ocupacao hoteleira, a formulacao correta e a de que o movimento se concentrou em determinado mes - e datacao, nao medicao do turismo.</w:t>
+        <w:t xml:space="preserve">Consequência prática para a redação do TCC: sempre que o texto disser que o turismo cresceu, o dado que sustenta a frase deve ser de fluxo de visitantes ou de receita turística (Embratur/MTur, Prefeitura/IFec RJ). Quando o dado for de ocupação hoteleira, a formulação correta é a de que o movimento se concentrou em determinado mês - e datação, não medição do turismo.</w:t>
       </w:r>
     </w:p>
     <w:p>
@@ -5695,7 +5695,7 @@
         </w:rPr>
         <w:t xml:space="preserve">→ Megaeventos e Turismo: um estudo bibliométrico dos periódicos brasileiros de turismo — Turismo: Visão e Ação, v. 18, n. 3, p. 633-659, 2016 </w:t>
       </w:r>
-      <w:hyperlink w:history="1" r:id="rIdjvqtpukfsuldjccg6bxdn">
+      <w:hyperlink w:history="1" r:id="rIdfgeuim0txrsfkwwhb8-du">
         <w:r>
           <w:rPr>
             <w:rFonts w:ascii="Calibri" w:cs="Calibri" w:eastAsia="Calibri" w:hAnsi="Calibri"/>
@@ -5753,7 +5753,7 @@
         </w:rPr>
         <w:t xml:space="preserve">→ GETZ, D. Event tourism: definition, evolution, and research. Tourism Management, v. 29, n. 3, p. 403-428, 2008 </w:t>
       </w:r>
-      <w:hyperlink w:history="1" r:id="rIdvujhffd3zyh1tjg2tinsy">
+      <w:hyperlink w:history="1" r:id="rIdxuufivfhdmnlq0k3eakev">
         <w:r>
           <w:rPr>
             <w:rFonts w:ascii="Calibri" w:cs="Calibri" w:eastAsia="Calibri" w:hAnsi="Calibri"/>
@@ -5796,7 +5796,7 @@
         </w:rPr>
         <w:t xml:space="preserve">→ CARNEIRO, J. B.; FONTES, N. D. Turismo e eventos: instrumento de promoção e estratégia de marketing. Revista Turismo em Análise, v. 8, n. 1, p. 65-74, 1997 </w:t>
       </w:r>
-      <w:hyperlink w:history="1" r:id="rIdos6invdyr-l5lc_lwcep6">
+      <w:hyperlink w:history="1" r:id="rIdqyqpnpuspuav0aabzzrwr">
         <w:r>
           <w:rPr>
             <w:rFonts w:ascii="Calibri" w:cs="Calibri" w:eastAsia="Calibri" w:hAnsi="Calibri"/>
@@ -5886,7 +5886,7 @@
         </w:rPr>
         <w:t xml:space="preserve">→ RUSSO; FIGUEIRA. O paradoxo dos grandes eventos. RBTur, v. 16, e-2312, 2022. DOI 10.7784/rbtur.v16.2312 </w:t>
       </w:r>
-      <w:hyperlink w:history="1" r:id="rIdmgpillio4qqeshja9atpn">
+      <w:hyperlink w:history="1" r:id="rIdn5b9wzpb9gui0ycpnunue">
         <w:r>
           <w:rPr>
             <w:rFonts w:ascii="Calibri" w:cs="Calibri" w:eastAsia="Calibri" w:hAnsi="Calibri"/>
@@ -5959,7 +5959,7 @@
         </w:rPr>
         <w:t xml:space="preserve">→ FERNANDES, A. M. V. Megaeventos e Turismo no Rio de Janeiro. Caderno Virtual de Turismo, v. 19, n. 1, 2019. DOI 10.18472/cvt.19n1.2019.1532 </w:t>
       </w:r>
-      <w:hyperlink w:history="1" r:id="rIdkalnnu62tr-robptbtuyv">
+      <w:hyperlink w:history="1" r:id="rIdbtmapn4ov9wrey45rjlsj">
         <w:r>
           <w:rPr>
             <w:rFonts w:ascii="Calibri" w:cs="Calibri" w:eastAsia="Calibri" w:hAnsi="Calibri"/>
@@ -6002,7 +6002,7 @@
         </w:rPr>
         <w:t xml:space="preserve">→ E agora, Rio? O turismo pós-megaeventos — Caderno Virtual de Turismo </w:t>
       </w:r>
-      <w:hyperlink w:history="1" r:id="rIdwclfe8znhb5ztey57tumc">
+      <w:hyperlink w:history="1" r:id="rIdrdbagkvjg2q4m1cvazaql">
         <w:r>
           <w:rPr>
             <w:rFonts w:ascii="Calibri" w:cs="Calibri" w:eastAsia="Calibri" w:hAnsi="Calibri"/>
@@ -6045,7 +6045,7 @@
         </w:rPr>
         <w:t xml:space="preserve">→ Gestão de crise no turismo: reflexos da pandemia da Covid-19 nos meios de hospedagem de Torres (RS) — Turismo: Visão e Ação </w:t>
       </w:r>
-      <w:hyperlink w:history="1" r:id="rIdk3-4kk5fhjovcmam3hdib">
+      <w:hyperlink w:history="1" r:id="rIdtpnb8mc_gr6othqdr49gx">
         <w:r>
           <w:rPr>
             <w:rFonts w:ascii="Calibri" w:cs="Calibri" w:eastAsia="Calibri" w:hAnsi="Calibri"/>
@@ -6073,7 +6073,7 @@
         </w:rPr>
         <w:t xml:space="preserve">→ Perspectivas para o turismo em Petrópolis (RJ): impactos da Covid-19 e das chuvas no verão de 2022 — SciELO </w:t>
       </w:r>
-      <w:hyperlink w:history="1" r:id="rId1ucvnabmbqfezzzcq45xa">
+      <w:hyperlink w:history="1" r:id="rIdmju-ucsgxklwbvmxghqsi">
         <w:r>
           <w:rPr>
             <w:rFonts w:ascii="Calibri" w:cs="Calibri" w:eastAsia="Calibri" w:hAnsi="Calibri"/>
@@ -6116,7 +6116,7 @@
         </w:rPr>
         <w:t xml:space="preserve">→ Residents' Perceptions of the Impacts of the Rio 2016 Olympic Games — RBTur </w:t>
       </w:r>
-      <w:hyperlink w:history="1" r:id="rIdf--0w7sbckuv5mvxktyzg">
+      <w:hyperlink w:history="1" r:id="rIdslc-fjazsinulliuyqy0_">
         <w:r>
           <w:rPr>
             <w:rFonts w:ascii="Calibri" w:cs="Calibri" w:eastAsia="Calibri" w:hAnsi="Calibri"/>
@@ -6176,7 +6176,7 @@
         </w:rPr>
         <w:t xml:space="preserve">→ TCC do Repositório UFSC que utiliza Scalzo como referência — SCALZO, Marília. Jornalismo de Revista. São Paulo: Contexto, 2003 </w:t>
       </w:r>
-      <w:hyperlink w:history="1" r:id="rIdfwrnohxtaqywuipyfvtrx">
+      <w:hyperlink w:history="1" r:id="rIdzsiocgnsz5rohsutznkgb">
         <w:r>
           <w:rPr>
             <w:rFonts w:ascii="Calibri" w:cs="Calibri" w:eastAsia="Calibri" w:hAnsi="Calibri"/>
@@ -6249,7 +6249,7 @@
         </w:rPr>
         <w:t xml:space="preserve">→ SCHUCH, L. D. DCMAGZ: projeto gráfico editorial de uma revista de design gráfico. TCC — UFSC (fonte das referências de design editorial aqui citadas) </w:t>
       </w:r>
-      <w:hyperlink w:history="1" r:id="rIdk3lpjauym9dcacpobg3lp">
+      <w:hyperlink w:history="1" r:id="rId1gazdlavvhxqpojwhajcy">
         <w:r>
           <w:rPr>
             <w:rFonts w:ascii="Calibri" w:cs="Calibri" w:eastAsia="Calibri" w:hAnsi="Calibri"/>
@@ -6292,7 +6292,7 @@
         </w:rPr>
         <w:t xml:space="preserve">→ Priti: projeto gráfico-editorial e produção de revista digital — TCC, Repositório UFSC </w:t>
       </w:r>
-      <w:hyperlink w:history="1" r:id="rIduo337hmckrwz0xerk_vfi">
+      <w:hyperlink w:history="1" r:id="rIdbswidqjkbtp1wkzpk6oze">
         <w:r>
           <w:rPr>
             <w:rFonts w:ascii="Calibri" w:cs="Calibri" w:eastAsia="Calibri" w:hAnsi="Calibri"/>
@@ -6320,7 +6320,7 @@
         </w:rPr>
         <w:t xml:space="preserve">→ Projeto gráfico-editorial de uma revista independente sobre arte e ilustração — TCC, Repositório UFSC </w:t>
       </w:r>
-      <w:hyperlink w:history="1" r:id="rIdzc2lmefajshxm-bcdssjn">
+      <w:hyperlink w:history="1" r:id="rIdxlmqqbrsgm3toohpmasqk">
         <w:r>
           <w:rPr>
             <w:rFonts w:ascii="Calibri" w:cs="Calibri" w:eastAsia="Calibri" w:hAnsi="Calibri"/>
@@ -6348,7 +6348,7 @@
         </w:rPr>
         <w:t xml:space="preserve">→ A identidade visual no projeto gráfico de revistas — LUME/UFRGS </w:t>
       </w:r>
-      <w:hyperlink w:history="1" r:id="rIdpez28mju72vwyhfcku2qw">
+      <w:hyperlink w:history="1" r:id="rIdjp91ivljfafi6glrx-60v">
         <w:r>
           <w:rPr>
             <w:rFonts w:ascii="Calibri" w:cs="Calibri" w:eastAsia="Calibri" w:hAnsi="Calibri"/>
@@ -7565,7 +7565,7 @@
         </w:rPr>
         <w:t xml:space="preserve">→ Prefeitura do Rio (SMTUR-Rio, SMDE, Riotur / IFec RJ), 19 jan. 2026 </w:t>
       </w:r>
-      <w:hyperlink w:history="1" r:id="rIdfr4dqr_gruypkf96wq2lq">
+      <w:hyperlink w:history="1" r:id="rId1nhtfaadjgklzjgwdnonz">
         <w:r>
           <w:rPr>
             <w:rFonts w:ascii="Calibri" w:cs="Calibri" w:eastAsia="Calibri" w:hAnsi="Calibri"/>
@@ -7638,7 +7638,7 @@
         </w:rPr>
         <w:t xml:space="preserve">→ Hotéis do Rio que receberão comitivas do G20 atingem 95% de ocupação — dados HotéisRIO/ABIH-RJ (PANROTAS, 14 nov. 2024) </w:t>
       </w:r>
-      <w:hyperlink w:history="1" r:id="rIdflhroyanx5iomswgbz6pi">
+      <w:hyperlink w:history="1" r:id="rIdla7fr404-tjn_ejz-gpj2">
         <w:r>
           <w:rPr>
             <w:rFonts w:ascii="Calibri" w:cs="Calibri" w:eastAsia="Calibri" w:hAnsi="Calibri"/>
@@ -7681,7 +7681,7 @@
         </w:rPr>
         <w:t xml:space="preserve">→ Rio Innovation Week impulsiona ocupação hoteleira no Rio, aponta HotéisRIO — Mercado &amp; Eventos, 2025 </w:t>
       </w:r>
-      <w:hyperlink w:history="1" r:id="rIdki7uz3hamksmcs5ldhfur">
+      <w:hyperlink w:history="1" r:id="rIdpqidokxsdbb4zesukdp97">
         <w:r>
           <w:rPr>
             <w:rFonts w:ascii="Calibri" w:cs="Calibri" w:eastAsia="Calibri" w:hAnsi="Calibri"/>
@@ -7821,7 +7821,7 @@
           <w:sz w:val="18"/>
           <w:szCs w:val="18"/>
         </w:rPr>
-        <w:t xml:space="preserve">PROPOSTA de um novo conceito para turismo sustentavel, a luz dos saberes de cidadania global e desenvolvimento sustentavel. Turismo: Visao e Acao / SciELO. (Artigo que apresenta e discute a definicao de turismo da Organizacao Mundial do Turismo - OMT, 2001.) Disponivel em: https://www.scielo.br/j/tva/a/ChNCsScn8yjfWfSPMrcSLtj/?lang=pt. Acesso em: 16 set. 2026.</w:t>
+        <w:t xml:space="preserve">PROPOSTA de um novo conceito para turismo sustentável, a luz dos saberes de cidadania global e desenvolvimento sustentável. Turismo: Visão e Ação / SciELO. (Artigo que apresenta e discute a definição de turismo da Organização Mundial do Turismo - OMT, 2001.) Disponível em: https://www.scielo.br/j/tva/a/ChNCsScn8yjfWfSPMrcSLtj/?lang=pt. Acesso em: 16 set. 2026.</w:t>
       </w:r>
     </w:p>
     <w:p>
@@ -7837,7 +7837,7 @@
           <w:sz w:val="18"/>
           <w:szCs w:val="18"/>
         </w:rPr>
-        <w:t xml:space="preserve">BARRETTO, Margarita. Manual de iniciacao ao estudo do turismo. Campinas: Papirus, 2006. (Referencia do conceito de turismo cultural utilizada nesta pesquisa.)</w:t>
+        <w:t xml:space="preserve">BARRETTO, Margarita. Manual de iniciação ao estudo do turismo. Campinas: Papirus, 2006. (Referência do conceito de turismo cultural utilizada nesta pesquisa.)</w:t>
       </w:r>
     </w:p>
     <w:p>
@@ -7853,7 +7853,7 @@
           <w:sz w:val="18"/>
           <w:szCs w:val="18"/>
         </w:rPr>
-        <w:t xml:space="preserve">CONSIDERACOES sobre um campo cientifico em formacao: Bourdieu e a nova ciencia do turismo. SciELO. Disponivel em: https://scielo.br/scielo.php?pid=S1679-39512007000400006&amp;script=sci_arttext. Acesso em: 16 set. 2026.</w:t>
+        <w:t xml:space="preserve">CONSIDERAÇÕES sobre um campo científico em formação: Bourdieu e a nova ciência do turismo. SciELO. Disponível em: https://scielo.br/scielo.php?pid=S1679-39512007000400006&amp;script=sci_arttext. Acesso em: 16 set. 2026.</w:t>
       </w:r>
     </w:p>
     <w:p>
@@ -8431,7 +8431,7 @@
           <w:sz w:val="18"/>
           <w:szCs w:val="18"/>
         </w:rPr>
-        <w:t xml:space="preserve">AGENCIA BRASIL. Rio perdeu R$ 657 milhoes em turismo por causa da violencia, diz CNC. out. 2017. Disponivel em: https://agenciabrasil.ebc.com.br/economia/noticia/2017-10/rio-perdeu-r-657-milhoes-em-turismo-por-causa-da-violencia-diz-cnc. Acesso em: 16 set. 2026.</w:t>
+        <w:t xml:space="preserve">AGÊNCIA BRASIL. Rio perdeu R$ 657 milhões em turismo por causa da violência, diz CNC. out. 2017. Disponível em: https://agenciabrasil.ebc.com.br/economia/noticia/2017-10/rio-perdeu-r-657-milhoes-em-turismo-por-causa-da-violencia-diz-cnc. Acesso em: 16 set. 2026.</w:t>
       </w:r>
     </w:p>
     <w:p>
@@ -8447,7 +8447,7 @@
           <w:sz w:val="18"/>
           <w:szCs w:val="18"/>
         </w:rPr>
-        <w:t xml:space="preserve">DIARIO DO RIO DE JANEIRO. Violencia no Rio faz industria turistica se dissolver, diz presidente do HoteisRio. Disponivel em: https://diariodorio.com/violencia-no-rio-faz-industria-turistica-se-dissolver-diz-presidente-do-hoteisrio/. Acesso em: 16 set. 2026.</w:t>
+        <w:t xml:space="preserve">DIÁRIO DO RIO DE JANEIRO. Violência no Rio faz indústria turística se dissolver, diz presidente do HotéisRIO. Disponível em: https://diariodorio.com/violencia-no-rio-faz-industria-turistica-se-dissolver-diz-presidente-do-hoteisrio/. Acesso em: 16 set. 2026.</w:t>
       </w:r>
     </w:p>
     <w:p>
@@ -8463,7 +8463,7 @@
           <w:sz w:val="18"/>
           <w:szCs w:val="18"/>
         </w:rPr>
-        <w:t xml:space="preserve">BRASIL. Camara dos Deputados. Observatorio Legislativo da Intervencao Federal na Seguranca Publica do Rio de Janeiro. Como a violencia afeta o turismo. Disponivel em: https://olerj.camara.leg.br/retratos-da-intervencao/como-a-violencia-afeta-o-turismo. Acesso em: 16 set. 2026. (Pagina indisponivel na data da consulta.)</w:t>
+        <w:t xml:space="preserve">BRASIL. Câmara dos Deputados. Observatório Legislativo da Intervenção Federal na Segurança Pública do Rio de Janeiro. Como a violência afeta o turismo. Disponível em: https://olerj.camara.leg.br/retratos-da-intervencao/como-a-violencia-afeta-o-turismo. Acesso em: 16 set. 2026. (Página indisponível na data da consulta.)</w:t>
       </w:r>
     </w:p>
     <w:p>
@@ -8479,7 +8479,7 @@
           <w:sz w:val="18"/>
           <w:szCs w:val="18"/>
         </w:rPr>
-        <w:t xml:space="preserve">CNN BRASIL. Queda da violencia impulsiona turismo no Rio de Janeiro. Disponivel em: https://www.cnnbrasil.com.br/nacional/queda-da-violencia-impulsiona-turismo-no-rio-de-janeiro/. Acesso em: 16 set. 2026.</w:t>
+        <w:t xml:space="preserve">CNN BRASIL. Queda da violência impulsiona turismo no Rio de Janeiro. Disponível em: https://www.cnnbrasil.com.br/nacional/queda-da-violencia-impulsiona-turismo-no-rio-de-janeiro/. Acesso em: 16 set. 2026.</w:t>
       </w:r>
     </w:p>
     <w:p>
@@ -8495,7 +8495,7 @@
           <w:sz w:val="18"/>
           <w:szCs w:val="18"/>
         </w:rPr>
-        <w:t xml:space="preserve">RIO DE JANEIRO (Municipio). Prefeitura da Cidade do Rio de Janeiro. Arrecadacao do turismo na cidade superou os R$ 50 milhoes no verao. Disponivel em: https://prefeitura.rio/desenvolvimento-economico-inovacao-simplificacao/arrecadacao-do-turismo-na-cidade-superou-os-r-50-milhoes-no-verao/. Acesso em: 16 set. 2026.</w:t>
+        <w:t xml:space="preserve">RIO DE JANEIRO (Município). Prefeitura da Cidade do Rio de Janeiro. Arrecadação do turismo na cidade superou os R$ 50 milhões no verão. Disponível em: https://prefeitura.rio/desenvolvimento-economico-inovacao-simplificacao/arrecadacao-do-turismo-na-cidade-superou-os-r-50-milhoes-no-verao/. Acesso em: 16 set. 2026.</w:t>
       </w:r>
     </w:p>
     <w:p>
@@ -8511,7 +8511,7 @@
           <w:sz w:val="18"/>
           <w:szCs w:val="18"/>
         </w:rPr>
-        <w:t xml:space="preserve">BRASIL. Ministerio do Turismo. Retorno do Carnaval deve movimentar economia do Rio de Janeiro e de Sao Paulo. Disponivel em: https://www.gov.br/turismo/pt-br/assuntos/noticias/retorno-do-carnaval-deve-movimentar-economia-do-rio-de-janeiro-e-de-sao-paulo. Acesso em: 16 set. 2026.</w:t>
+        <w:t xml:space="preserve">BRASIL. Ministério do Turismo. Retorno do Carnaval deve movimentar economia do Rio de Janeiro e de São Paulo. Disponível em: https://www.gov.br/turismo/pt-br/assuntos/noticias/retorno-do-carnaval-deve-movimentar-economia-do-rio-de-janeiro-e-de-sao-paulo. Acesso em: 16 set. 2026.</w:t>
       </w:r>
     </w:p>
     <w:p>
@@ -8855,7 +8855,7 @@
           <w:sz w:val="28"/>
           <w:szCs w:val="28"/>
         </w:rPr>
-        <w:t xml:space="preserve">8. Quadro de conferencia: cada afirmacao, a fonte e a citacao pronta</w:t>
+        <w:t xml:space="preserve">8. Quadro de conferência: cada afirmação, a fonte e a citação pronta</w:t>
       </w:r>
     </w:p>
     <w:p>
@@ -8870,7 +8870,7 @@
           <w:sz w:val="22"/>
           <w:szCs w:val="22"/>
         </w:rPr>
-        <w:t xml:space="preserve">Este quadro existe para uma coisa so: permitir que cada numero desta ficha seja conferido na origem e citado no TCC sem retrabalho. A primeira coluna diz o que esta escrito; a segunda, onde foi publicado, com o endereco completo para abrir; a terceira traz a citacao ja formatada, pronta para colar no texto. As aspas indicam transcricao literal da fonte; o texto sem aspas e parafrase fiel.</w:t>
+        <w:t xml:space="preserve">Este quadro existe para uma coisa só: permitir que cada número desta ficha seja conferido na origem e citado no TCC sem retrabalho. A primeira coluna diz o que esta escrito; a segunda, onde foi publicado, com o endereço completo para abrir; a terceira traz a citação já formatada, pronta para colar no texto. As aspas indicam transcrição literal da fonte; o texto sem aspas é paráfrase fiel.</w:t>
       </w:r>
     </w:p>
     <w:tbl>
@@ -8977,7 +8977,7 @@
                 <w:sz w:val="15"/>
                 <w:szCs w:val="15"/>
               </w:rPr>
-              <w:t xml:space="preserve">Citacao pronta para o TCC</w:t>
+              <w:t xml:space="preserve">Citação pronta para o TCC</w:t>
             </w:r>
           </w:p>
         </w:tc>
@@ -9005,7 +9005,7 @@
                 <w:sz w:val="15"/>
                 <w:szCs w:val="15"/>
               </w:rPr>
-              <w:t xml:space="preserve">Rio recebeu 12,5 milhoes de visitantes em 2025, que movimentaram R$ 27,2 bilhoes; fluxo internacional cresceu 44,8%</w:t>
+              <w:t xml:space="preserve">Rio recebeu 12,5 milhões de visitantes em 2025, que movimentaram R$ 27,2 bilhões; fluxo internacional cresceu 44,8%</w:t>
             </w:r>
           </w:p>
         </w:tc>
@@ -9072,7 +9072,7 @@
                 <w:sz w:val="15"/>
                 <w:szCs w:val="15"/>
               </w:rPr>
-              <w:t xml:space="preserve">"a cidade do Rio recebeu 12,5 milhoes de turistas", sendo "10,5 milhoes (83,1%), de visitantes nacionais e 2,1 milhoes (16,9%) de estrangeiros", com "uma movimentacao total de R$ 27,2 bilhoes" (PREFEITURA DO RIO, 2026)</w:t>
+              <w:t xml:space="preserve">"a cidade do Rio recebeu 12,5 milhões de turistas", sendo "10,5 milhões (83,1%), de visitantes nacionais e 2,1 milhões (16,9%) de estrangeiros", com "uma movimentação total de R$ 27,2 bilhões" (PREFEITURA DO RIO, 2026)</w:t>
             </w:r>
           </w:p>
         </w:tc>
@@ -9198,7 +9198,7 @@
                 <w:sz w:val="15"/>
                 <w:szCs w:val="15"/>
               </w:rPr>
-              <w:t xml:space="preserve">Brasil fechou 2025 com recorde de 9,3 milhoes de turistas internacionais (+37,1%)</w:t>
+              <w:t xml:space="preserve">Brasil fechou 2025 com recorde de 9,3 milhões de turistas internacionais (+37,1%)</w:t>
             </w:r>
           </w:p>
         </w:tc>
@@ -9224,7 +9224,7 @@
                 <w:sz w:val="15"/>
                 <w:szCs w:val="15"/>
               </w:rPr>
-              <w:t xml:space="preserve">Secom / Presidencia da Republica, jan. 2026</w:t>
+              <w:t xml:space="preserve">Secom / Presidência da Republica, jan. 2026</w:t>
             </w:r>
           </w:p>
           <w:p>
@@ -9265,7 +9265,7 @@
                 <w:sz w:val="15"/>
                 <w:szCs w:val="15"/>
               </w:rPr>
-              <w:t xml:space="preserve">O Brasil registrou 9.287.196 chegadas de turistas estrangeiros em 2025, "o maior volume ja observado na serie historica", com crescimento de 37,1% sobre 2024 (BRASIL, 2026).</w:t>
+              <w:t xml:space="preserve">O Brasil registrou 9.287.196 chegadas de turistas estrangeiros em 2025, "o maior volume já observado na série histórica", com crescimento de 37,1% sobre 2024 (BRASIL, 2026).</w:t>
             </w:r>
           </w:p>
         </w:tc>
@@ -9294,7 +9294,7 @@
                 <w:sz w:val="15"/>
                 <w:szCs w:val="15"/>
               </w:rPr>
-              <w:t xml:space="preserve">Brasil fechou 2024 com recorde de 6,65 milhoes de estrangeiros (+12,6%)</w:t>
+              <w:t xml:space="preserve">Brasil fechou 2024 com recorde de 6,65 milhões de estrangeiros (+12,6%)</w:t>
             </w:r>
           </w:p>
         </w:tc>
@@ -9321,7 +9321,7 @@
                 <w:sz w:val="15"/>
                 <w:szCs w:val="15"/>
               </w:rPr>
-              <w:t xml:space="preserve">Agencia Gov / Ministerio do Turismo, jan. 2025</w:t>
+              <w:t xml:space="preserve">Agência Gov / Ministério do Turismo, jan. 2025</w:t>
             </w:r>
           </w:p>
           <w:p>
@@ -9363,7 +9363,7 @@
                 <w:sz w:val="15"/>
                 <w:szCs w:val="15"/>
               </w:rPr>
-              <w:t xml:space="preserve">"Brasil encerra 2024 com recorde de 6,65 milhoes de turistas estrangeiros, alta de 12,6%" (AGENCIA GOV, 2025).</w:t>
+              <w:t xml:space="preserve">"Brasil encerra 2024 com recorde de 6,65 milhões de turistas estrangeiros, alta de 12,6%" (AGÊNCIA GOV, 2025).</w:t>
             </w:r>
           </w:p>
         </w:tc>
@@ -9391,7 +9391,7 @@
                 <w:sz w:val="15"/>
                 <w:szCs w:val="15"/>
               </w:rPr>
-              <w:t xml:space="preserve">Turismo internacional injetou R$ 34,5 bilhoes no Brasil em 2023, com chegadas em 93% do nivel de 2019</w:t>
+              <w:t xml:space="preserve">Turismo internacional injetou R$ 34,5 bilhões no Brasil em 2023, com chegadas em 93% do nivel de 2019</w:t>
             </w:r>
           </w:p>
         </w:tc>
@@ -9417,7 +9417,7 @@
                 <w:sz w:val="15"/>
                 <w:szCs w:val="15"/>
               </w:rPr>
-              <w:t xml:space="preserve">Agencia Gov / Ministerio do Turismo, fev. 2024</w:t>
+              <w:t xml:space="preserve">Agência Gov / Ministério do Turismo, fev. 2024</w:t>
             </w:r>
           </w:p>
           <w:p>
@@ -9458,7 +9458,7 @@
                 <w:sz w:val="15"/>
                 <w:szCs w:val="15"/>
               </w:rPr>
-              <w:t xml:space="preserve">Em 2023 o turismo internacional injetou R$ 34,5 bilhoes na economia brasileira, e o volume de chegadas correspondeu a 93% do registrado em 2019 (AGENCIA GOV, 2024).</w:t>
+              <w:t xml:space="preserve">Em 2023 o turismo internacional injetou R$ 34,5 bilhões na economia brasileira, e o volume de chegadas correspondeu a 93% do registrado em 2019 (AGÊNCIA GOV, 2024).</w:t>
             </w:r>
           </w:p>
         </w:tc>
@@ -9556,7 +9556,7 @@
                 <w:sz w:val="15"/>
                 <w:szCs w:val="15"/>
               </w:rPr>
-              <w:t xml:space="preserve">Com a pandemia, as chegadas de turistas internacionais ao Brasil cairam de 6,3 milhoes em 2019 para 2,1 milhoes em 2020, e em 2021 o pais recebeu 745,8 mil visitantes estrangeiros - queda de 88% em relacao a 2019 (EMBRATUR, 2022).</w:t>
+              <w:t xml:space="preserve">Com a pandemia, as chegadas de turistas internacionais ao Brasil cairam de 6,3 milhões em 2019 para 2,1 milhões em 2020, e em 2021 o pais recebeu 745,8 mil visitantes estrangeiros - queda de 88% em relação a 2019 (EMBRATUR, 2022).</w:t>
             </w:r>
           </w:p>
         </w:tc>
@@ -9584,7 +9584,7 @@
                 <w:sz w:val="15"/>
                 <w:szCs w:val="15"/>
               </w:rPr>
-              <w:t xml:space="preserve">Violencia urbana custou R$ 657 milhoes ao turismo fluminense entre janeiro e agosto de 2017</w:t>
+              <w:t xml:space="preserve">Violência urbana custou R$ 657 milhões ao turismo fluminense entre janeiro e agosto de 2017</w:t>
             </w:r>
           </w:p>
         </w:tc>
@@ -9610,7 +9610,7 @@
                 <w:sz w:val="15"/>
                 <w:szCs w:val="15"/>
               </w:rPr>
-              <w:t xml:space="preserve">Agencia Brasil, com estimativa da CNC, out. 2017</w:t>
+              <w:t xml:space="preserve">Agência Brasil, com estimativa da CNC, out. 2017</w:t>
             </w:r>
           </w:p>
           <w:p>
@@ -9651,7 +9651,7 @@
                 <w:sz w:val="15"/>
                 <w:szCs w:val="15"/>
               </w:rPr>
-              <w:t xml:space="preserve">Segundo estimativa da Confederacao Nacional do Comercio, a criminalidade provocou queda de R$ 657 milhoes nas receitas do turismo fluminense entre janeiro e agosto de 2017, sendo que "para cada aumento de 10% na criminalidade, a receita bruta das empresas que compoem a atividade turistica do Estado recua, em media, 1,8%" (AGENCIA BRASIL, 2017).</w:t>
+              <w:t xml:space="preserve">Segundo estimativa da Confederação Nacional do Comércio, a criminalidade provocou queda de R$ 657 milhões nas receitas do turismo fluminense entre janeiro e agosto de 2017, sendo que "para cada aumento de 10% na criminalidade, a receita bruta das empresas que compoem a atividade turística do Estado recua, em média, 1,8%" (AGÊNCIA BRASIL, 2017).</w:t>
             </w:r>
           </w:p>
         </w:tc>
@@ -9680,7 +9680,7 @@
                 <w:sz w:val="15"/>
                 <w:szCs w:val="15"/>
               </w:rPr>
-              <w:t xml:space="preserve">Ocupacao hoteleira do Rio caiu de cerca de 70% em marco de 2020 para cerca de 5% em abril; prejuizo de R$ 1,6 bilhao em doze meses</w:t>
+              <w:t xml:space="preserve">Ocupação hoteleira do Rio caiu de cerca de 70% em março de 2020 para cerca de 5% em abril; prejuizo de R$ 1,6 bilhão em doze meses</w:t>
             </w:r>
           </w:p>
         </w:tc>
@@ -9707,7 +9707,7 @@
                 <w:sz w:val="15"/>
                 <w:szCs w:val="15"/>
               </w:rPr>
-              <w:t xml:space="preserve">PANROTAS, com balanco do HoteisRIO, abr. 2021</w:t>
+              <w:t xml:space="preserve">PANROTAS, com balanco do HotéisRIO, abr. 2021</w:t>
             </w:r>
           </w:p>
           <w:p>
@@ -9749,7 +9749,7 @@
                 <w:sz w:val="15"/>
                 <w:szCs w:val="15"/>
               </w:rPr>
-              <w:t xml:space="preserve">A ocupacao da rede hoteleira carioca caiu de cerca de 70% no inicio de marco de 2020 para aproximadamente 5% em abril, e a rede acumulou prejuizo de aproximadamente R$ 1,6 bilhao em doze meses (HOTEISRIO apud PANROTAS, 2021).</w:t>
+              <w:t xml:space="preserve">A ocupação da rede hoteleira carioca caiu de cerca de 70% no inicio de março de 2020 para aproximadamente 5% em abril, e a rede acumulou prejuizo de aproximadamente R$ 1,6 bilhão em doze meses (HotéisRIO apud PANROTAS, 2021).</w:t>
             </w:r>
           </w:p>
         </w:tc>
@@ -9777,7 +9777,7 @@
                 <w:sz w:val="15"/>
                 <w:szCs w:val="15"/>
               </w:rPr>
-              <w:t xml:space="preserve">Cerca de 90 hoteis e albergues fora de operacao e mais de 25% dos empregos suspensos na pandemia</w:t>
+              <w:t xml:space="preserve">Cerca de 90 hotéis e albergues fora de operação e mais de 25% dos empregos suspensos na pandemia</w:t>
             </w:r>
           </w:p>
         </w:tc>
@@ -9844,7 +9844,7 @@
                 <w:sz w:val="15"/>
                 <w:szCs w:val="15"/>
               </w:rPr>
-              <w:t xml:space="preserve">Em maio de 2020, cerca de 90 hoteis e albergues estavam fora de operacao na cidade, com mais de 25% dos postos de trabalho suspensos e sete estabelecimentos fechados em definitivo (BRASIL DE FATO, 2020).</w:t>
+              <w:t xml:space="preserve">Em maio de 2020, cerca de 90 hotéis e albergues estavam fora de operação na cidade, com mais de 25% dos postos de trabalho suspensos e sete estabelecimentos fechados em definitivo (BRASIL DE FATO, 2020).</w:t>
             </w:r>
           </w:p>
         </w:tc>
@@ -9873,7 +9873,7 @@
                 <w:sz w:val="15"/>
                 <w:szCs w:val="15"/>
               </w:rPr>
-              <w:t xml:space="preserve">Arrecadacao de ISS do turismo dobrou no verao 2021/2022, para R$ 52,5 milhoes</w:t>
+              <w:t xml:space="preserve">Arrecadação de ISS do turismo dobrou no verão 2021/2022, para R$ 52,5 milhões</w:t>
             </w:r>
           </w:p>
         </w:tc>
@@ -9942,7 +9942,7 @@
                 <w:sz w:val="15"/>
                 <w:szCs w:val="15"/>
               </w:rPr>
-              <w:t xml:space="preserve">A cidade arrecadou R$ 52,5 milhoes de ISS do setor de turismo no verao 2021/2022, quase o dobro dos R$ 27,2 milhoes registrados na temporada anterior (PREFEITURA DO RIO, 2022).</w:t>
+              <w:t xml:space="preserve">A cidade arrecadou R$ 52,5 milhões de ISS do setor de turismo no verão 2021/2022, quase o dobro dos R$ 27,2 milhões registrados na temporada anterior (PREFEITURA DO RIO, 2022).</w:t>
             </w:r>
           </w:p>
         </w:tc>
@@ -9970,7 +9970,7 @@
                 <w:sz w:val="15"/>
                 <w:szCs w:val="15"/>
               </w:rPr>
-              <w:t xml:space="preserve">Rock in Rio 2022: R$ 1,7 bilhao de impacto (FGV), 700 mil pessoas e 28 mil empregos diretos</w:t>
+              <w:t xml:space="preserve">Rock in Rio 2022: R$ 1,7 bilhão de impacto (FGV), 700 mil pessoas e 28 mil empregos diretos</w:t>
             </w:r>
           </w:p>
         </w:tc>
@@ -10037,7 +10037,7 @@
                 <w:sz w:val="15"/>
                 <w:szCs w:val="15"/>
               </w:rPr>
-              <w:t xml:space="preserve">O Rock in Rio de 2022 movimentou R$ 1,7 bilhao na economia do estado, segundo a Fundacao Getulio Vargas, reunindo 700 mil pessoas e gerando 28 mil empregos diretos (DIARIO DO RIO, 2022).</w:t>
+              <w:t xml:space="preserve">O Rock in Rio de 2022 movimentou R$ 1,7 bilhão na economia do estado, segundo a Fundação Getulio Vargas, reunindo 700 mil pessoas e gerando 28 mil empregos diretos (DIÁRIO DO RIO, 2022).</w:t>
             </w:r>
           </w:p>
         </w:tc>
@@ -10066,7 +10066,7 @@
                 <w:sz w:val="15"/>
                 <w:szCs w:val="15"/>
               </w:rPr>
-              <w:t xml:space="preserve">Rock in Rio 2024: R$ 2,6 bilhoes, 95% de ocupacao hoteleira, 380 voos extras</w:t>
+              <w:t xml:space="preserve">Rock in Rio 2024: R$ 2,6 bilhões, 95% de ocupação hoteleira, 380 voos extras</w:t>
             </w:r>
           </w:p>
         </w:tc>
@@ -10093,7 +10093,7 @@
                 <w:sz w:val="15"/>
                 <w:szCs w:val="15"/>
               </w:rPr>
-              <w:t xml:space="preserve">Agencia Brasil, 23 set. 2024</w:t>
+              <w:t xml:space="preserve">Agência Brasil, 23 set. 2024</w:t>
             </w:r>
           </w:p>
           <w:p>
@@ -10135,7 +10135,7 @@
                 <w:sz w:val="15"/>
                 <w:szCs w:val="15"/>
               </w:rPr>
-              <w:t xml:space="preserve">"Um balanco dos sete dias do Rock in Rio indica que o festival gerou R$ 2,6 bilhoes para a economia do estado do Rio de Janeiro"; "a taxa de ocupacao hoteleira atingiu 95%" e no Galeao "foram registrados 380 voos extras, transportando 47 mil passageiros nos dias de evento" (AGENCIA BRASIL, 2024).</w:t>
+              <w:t xml:space="preserve">"Um balanco dos sete dias do Rock in Rio indica que o festival gerou R$ 2,6 bilhões para a economia do estado do Rio de Janeiro"; "a taxa de ocupação hoteleira atingiu 95%" e no Galeão "foram registrados 380 voos extras, transportando 47 mil passageiros nos dias de evento" (AGÊNCIA BRASIL, 2024).</w:t>
             </w:r>
           </w:p>
         </w:tc>
@@ -10230,7 +10230,7 @@
                 <w:sz w:val="15"/>
                 <w:szCs w:val="15"/>
               </w:rPr>
-              <w:t xml:space="preserve">A edicao de 2024 do Rock in Rio foi responsavel pela criacao de 32,6 mil postos de trabalho na cidade, segundo relatorio da FGV (HOTELIER NEWS, 2024).</w:t>
+              <w:t xml:space="preserve">A edição de 2024 do Rock in Rio foi responsavel pela criação de 32,6 mil postos de trabalho na cidade, segundo relatório da FGV (HOTELIER NEWS, 2024).</w:t>
             </w:r>
           </w:p>
         </w:tc>
@@ -10259,7 +10259,7 @@
                 <w:sz w:val="15"/>
                 <w:szCs w:val="15"/>
               </w:rPr>
-              <w:t xml:space="preserve">Show de Madonna: R$ 293,4 milhoes projetados, retorno 30 vezes o patrocinio, ocupacao perto de 100% em Copacabana</w:t>
+              <w:t xml:space="preserve">Show de Madonna: R$ 293,4 milhões projetados, retorno 30 vezes o patrocinio, ocupação perto de 100% em Copacabana</w:t>
             </w:r>
           </w:p>
         </w:tc>
@@ -10328,7 +10328,7 @@
                 <w:sz w:val="15"/>
                 <w:szCs w:val="15"/>
               </w:rPr>
-              <w:t xml:space="preserve">"O show da cantora Madonna, na Praia de Copacabana, no dia 4 de maio, ira movimentar a economia carioca em R$ 293,4 milhoes" e, "em alguns bairros, como Copacabana, local do show, a ocupacao deve ficar perto dos 100%" (PREFEITURA DO RIO, 2024).</w:t>
+              <w:t xml:space="preserve">"O show da cantora Madonna, na Praia de Copacabana, no dia 4 de maio, ira movimentar a economia carioca em R$ 293,4 milhões" e, "em alguns bairros, como Copacabana, local do show, a ocupação deve ficar perto dos 100%" (PREFEITURA DO RIO, 2024).</w:t>
             </w:r>
           </w:p>
         </w:tc>
@@ -10356,7 +10356,7 @@
                 <w:sz w:val="15"/>
                 <w:szCs w:val="15"/>
               </w:rPr>
-              <w:t xml:space="preserve">Show de Lady Gaga: mais de R$ 600 milhoes e mais de 500 mil turistas entre 1 e 3 de maio de 2025</w:t>
+              <w:t xml:space="preserve">Show de Lady Gaga: mais de R$ 600 milhões e mais de 500 mil turistas entre 1 e 3 de maio de 2025</w:t>
             </w:r>
           </w:p>
         </w:tc>
@@ -10423,7 +10423,7 @@
                 <w:sz w:val="15"/>
                 <w:szCs w:val="15"/>
               </w:rPr>
-              <w:t xml:space="preserve">"Um estudo da Prefeitura do Rio, elaborado pela Secretaria Municipal de Desenvolvimento Economico (SMDE) em parceria com a Riotur, aponta que o evento deve injetar mais de R$ 600 milhoes na economia carioca", com "mais de 500 mil turistas" chegando entre 1 e 3 de maio (PREFEITURA DO RIO, 2025).</w:t>
+              <w:t xml:space="preserve">"Um estudo da Prefeitura do Rio, elaborado pela Secretaria Municipal de Desenvolvimento Economico (SMDE) em parceria com a Riotur, aponta que o evento deve injetar mais de R$ 600 milhões na economia carioca", com "mais de 500 mil turistas" chegando entre 1 e 3 de maio (PREFEITURA DO RIO, 2025).</w:t>
             </w:r>
           </w:p>
         </w:tc>
@@ -10452,7 +10452,7 @@
                 <w:sz w:val="15"/>
                 <w:szCs w:val="15"/>
               </w:rPr>
-              <w:t xml:space="preserve">Novembro de 2023: R$ 158 milhoes so com Taylor Swift e R$ 669,2 milhoes no mes; hoteis com quase 100% de ocupacao</w:t>
+              <w:t xml:space="preserve">Novembro de 2023: R$ 158 milhões so com Taylor Swift e R$ 669,2 milhões no mês; hotéis com quase 100% de ocupação</w:t>
             </w:r>
           </w:p>
         </w:tc>
@@ -10521,7 +10521,7 @@
                 <w:sz w:val="15"/>
                 <w:szCs w:val="15"/>
               </w:rPr>
-              <w:t xml:space="preserve">Os shows "devem ajudar a incrementar a economia carioca em pelo menos R$ 158 milhoes, sem contar os gastos de turistas com hoteis, que estao com quase 100% de ocupacao", e "todos esses acontecimentos juntos devem incrementar a economia do Rio em R$ 669,2 milhoes, considerando as atividades de turismo e eventos" (PREFEITURA DO RIO, 2023).</w:t>
+              <w:t xml:space="preserve">Os shows "devem ajudar a incrementar a economia carioca em pelo menos R$ 158 milhões, sem contar os gastos de turistas com hotéis, que estão com quase 100% de ocupação", e "todos esses acontecimentos juntos devem incrementar a economia do Rio em R$ 669,2 milhões, considerando as atividades de turismo e eventos" (PREFEITURA DO RIO, 2023).</w:t>
             </w:r>
           </w:p>
         </w:tc>
@@ -10549,7 +10549,7 @@
                 <w:sz w:val="15"/>
                 <w:szCs w:val="15"/>
               </w:rPr>
-              <w:t xml:space="preserve">Cupula do G20: 80,09% de ocupacao media entre 15 e 20 de novembro e mais de 95% nos cinco estrelas</w:t>
+              <w:t xml:space="preserve">Cúpula do G20: 80,09% de ocupação média entre 15 e 20 de novembro e mais de 95% nos cinco estrelas</w:t>
             </w:r>
           </w:p>
         </w:tc>
@@ -10575,7 +10575,7 @@
                 <w:sz w:val="15"/>
                 <w:szCs w:val="15"/>
               </w:rPr>
-              <w:t xml:space="preserve">PANROTAS, com dados HoteisRIO/ABIH-RJ, 14 nov. 2024</w:t>
+              <w:t xml:space="preserve">PANROTAS, com dados HotéisRIO/ABIH-RJ, 14 nov. 2024</w:t>
             </w:r>
           </w:p>
           <w:p>
@@ -10616,7 +10616,7 @@
                 <w:sz w:val="15"/>
                 <w:szCs w:val="15"/>
               </w:rPr>
-              <w:t xml:space="preserve">"A cidade do Rio de Janeiro alcancou os 80,09% de taxa de ocupacao media da hotelaria para o periodo de 15 a 20 de novembro", e "os hoteis que receberao as comitivas estrangeiras que virao para a reuniao do G20, em especial os empreendimentos cinco estrelas, registram numeros acima dos 95%" (PANROTAS, 2024).</w:t>
+              <w:t xml:space="preserve">"A cidade do Rio de Janeiro alcancou os 80,09% de taxa de ocupação média da hotelaria para o período de 15 a 20 de novembro", e "os hotéis que receberão as comitivas estrangeiras que virão para a reunião do G20, em especial os empreendimentos cinco estrelas, registram números acima dos 95%" (PANROTAS, 2024).</w:t>
             </w:r>
           </w:p>
         </w:tc>
@@ -10645,7 +10645,7 @@
                 <w:sz w:val="15"/>
                 <w:szCs w:val="15"/>
               </w:rPr>
-              <w:t xml:space="preserve">Cupula do BRICS 2025: impacto de R$ 70 milhoes no ciclo de eventos da cidade</w:t>
+              <w:t xml:space="preserve">Cúpula do BRICS 2025: impacto de R$ 70 milhões no ciclo de eventos da cidade</w:t>
             </w:r>
           </w:p>
         </w:tc>
@@ -10714,7 +10714,7 @@
                 <w:sz w:val="15"/>
                 <w:szCs w:val="15"/>
               </w:rPr>
-              <w:t xml:space="preserve">Estudo da Prefeitura estima que os eventos do BRICS 2025 devem impactar a economia da cidade do Rio em R$ 70 milhoes (PREFEITURA DO RIO, 2025).</w:t>
+              <w:t xml:space="preserve">Estudo da Prefeitura estima que os eventos do BRICS 2025 devem impactar a economia da cidade do Rio em R$ 70 milhões (PREFEITURA DO RIO, 2025).</w:t>
             </w:r>
           </w:p>
         </w:tc>
@@ -10742,7 +10742,7 @@
                 <w:sz w:val="15"/>
                 <w:szCs w:val="15"/>
               </w:rPr>
-              <w:t xml:space="preserve">Web Summit Rio: Barra da Tijuca a 88,42% contra media de 72,25% da cidade; hotelaria concentrou 51,6% dos gastos</w:t>
+              <w:t xml:space="preserve">Web Summit Rio: Barra da Tijuca a 88,42% contra média de 72,25% da cidade; hotelaria concentrou 51,6% dos gastos</w:t>
             </w:r>
           </w:p>
         </w:tc>
@@ -10768,7 +10768,7 @@
                 <w:sz w:val="15"/>
                 <w:szCs w:val="15"/>
               </w:rPr>
-              <w:t xml:space="preserve">PANROTAS, com pesquisa HoteisRIO, maio 2023</w:t>
+              <w:t xml:space="preserve">PANROTAS, com pesquisa HotéisRIO, maio 2023</w:t>
             </w:r>
           </w:p>
           <w:p>
@@ -10809,7 +10809,7 @@
                 <w:sz w:val="15"/>
                 <w:szCs w:val="15"/>
               </w:rPr>
-              <w:t xml:space="preserve">"A regiao da Barra da Tijuca, onde acontece o evento, concentra grande numero de reservas, com 88,42%, enquanto a media na cidade durante o periodo do evento esta em 72,25%" (HOTEISRIO apud PANROTAS, 2023).</w:t>
+              <w:t xml:space="preserve">"A região da Barra da Tijuca, onde acontece o evento, concentra grande número de reservas, com 88,42%, enquanto a média na cidade durante o período do evento esta em 72,25%" (HotéisRIO apud PANROTAS, 2023).</w:t>
             </w:r>
           </w:p>
         </w:tc>
@@ -10838,7 +10838,7 @@
                 <w:sz w:val="15"/>
                 <w:szCs w:val="15"/>
               </w:rPr>
-              <w:t xml:space="preserve">Rio Innovation Week 2025: 90% de ocupacao no Centro e Zona Sul e R$ 149,7 milhoes injetados na cidade</w:t>
+              <w:t xml:space="preserve">Rio Innovation Week 2025: 90% de ocupação no Centro e Zona Sul e R$ 149,7 milhões injetados na cidade</w:t>
             </w:r>
           </w:p>
         </w:tc>
@@ -10865,7 +10865,7 @@
                 <w:sz w:val="15"/>
                 <w:szCs w:val="15"/>
               </w:rPr>
-              <w:t xml:space="preserve">Mercado &amp; Eventos, com pesquisa HoteisRIO, 2025</w:t>
+              <w:t xml:space="preserve">Mercado &amp; Eventos, com pesquisa HotéisRIO, 2025</w:t>
             </w:r>
           </w:p>
           <w:p>
@@ -10907,7 +10907,7 @@
                 <w:sz w:val="15"/>
                 <w:szCs w:val="15"/>
               </w:rPr>
-              <w:t xml:space="preserve">A rede hoteleira registrou 90% de ocupacao no Centro e na Zona Sul durante a Rio Innovation Week, movimentando R$ 149,7 milhoes na economia da cidade, com o Centro cerca de 30% acima da sua media historica (HOTEISRIO apud MERCADO &amp; EVENTOS, 2025).</w:t>
+              <w:t xml:space="preserve">A rede hoteleira registrou 90% de ocupação no Centro e na Zona Sul durante a Rio Innovation Week, movimentando R$ 149,7 milhões na economia da cidade, com o Centro cerca de 30% acima da sua média histórica (HotéisRIO apud MERCADO &amp; EVENTOS, 2025).</w:t>
             </w:r>
           </w:p>
         </w:tc>
@@ -10935,7 +10935,7 @@
                 <w:sz w:val="15"/>
                 <w:szCs w:val="15"/>
               </w:rPr>
-              <w:t xml:space="preserve">Carnaval 2025: 98,62% de ocupacao na capital e R$ 6,5 bilhoes de impacto</w:t>
+              <w:t xml:space="preserve">Carnaval 2025: 98,62% de ocupação na capital e R$ 6,5 bilhões de impacto</w:t>
             </w:r>
           </w:p>
         </w:tc>
@@ -10961,7 +10961,7 @@
                 <w:sz w:val="15"/>
                 <w:szCs w:val="15"/>
               </w:rPr>
-              <w:t xml:space="preserve">Agencia Brasil, com dados do Governo do Estado, ABIH-RJ e CNC, 10 mar. 2025</w:t>
+              <w:t xml:space="preserve">Agência Brasil, com dados do Governo do Estado, ABIH-RJ e CNC, 10 mar. 2025</w:t>
             </w:r>
           </w:p>
           <w:p>
@@ -11002,7 +11002,7 @@
                 <w:sz w:val="15"/>
                 <w:szCs w:val="15"/>
               </w:rPr>
-              <w:t xml:space="preserve">"O setor hoteleiro teve 98,62% de taxa de ocupacao na capital do Rio" e "o impacto positivo do periodo de folia na economia chegou a R$ 6,5 bilhoes" (AGENCIA BRASIL, 2025).</w:t>
+              <w:t xml:space="preserve">"O setor hoteleiro teve 98,62% de taxa de ocupação na capital do Rio" e "o impacto positivo do período de folia na economia chegou a R$ 6,5 bilhões" (AGÊNCIA BRASIL, 2025).</w:t>
             </w:r>
           </w:p>
         </w:tc>
@@ -11058,7 +11058,7 @@
                 <w:sz w:val="15"/>
                 <w:szCs w:val="15"/>
               </w:rPr>
-              <w:t xml:space="preserve">Agencia Brasil, com dados do HoteisRIO, 30 dez. 2024</w:t>
+              <w:t xml:space="preserve">Agência Brasil, com dados do HotéisRIO, 30 dez. 2024</w:t>
             </w:r>
           </w:p>
           <w:p>
@@ -11100,7 +11100,7 @@
                 <w:sz w:val="15"/>
                 <w:szCs w:val="15"/>
               </w:rPr>
-              <w:t xml:space="preserve">"Mais de 96% dos quartos de hoteis do Rio de Janeiro ja estao ocupados para a noite de Reveillon (31 de dezembro)", e "do dia 29 de dezembro a 1o de janeiro - a ocupacao e de cerca de 85%" (HOTEISRIO apud AGENCIA BRASIL, 2024).</w:t>
+              <w:t xml:space="preserve">"Mais de 96% dos quartos de hotéis do Rio de Janeiro já estão ocupados para a noite de Reveillon (31 de dezembro)", e "do dia 29 de dezembro a 1o de janeiro - a ocupação e de cerca de 85%" (HotéisRIO apud AGÊNCIA BRASIL, 2024).</w:t>
             </w:r>
           </w:p>
         </w:tc>
@@ -11128,7 +11128,7 @@
                 <w:sz w:val="15"/>
                 <w:szCs w:val="15"/>
               </w:rPr>
-              <w:t xml:space="preserve">Ocupacao hoteleira caiu de quase 100% nos megaeventos para media de 51% em 2017</w:t>
+              <w:t xml:space="preserve">Ocupação hoteleira caiu de quase 100% nos megaeventos para média de 51% em 2017</w:t>
             </w:r>
           </w:p>
         </w:tc>
@@ -11154,7 +11154,7 @@
                 <w:sz w:val="15"/>
                 <w:szCs w:val="15"/>
               </w:rPr>
-              <w:t xml:space="preserve">RUSSO; FIGUEIRA (2022), RBTur, v. 16, e-2312 - artigo cientifico revisado por pares</w:t>
+              <w:t xml:space="preserve">RUSSO; FIGUEIRA (2022), RBTur, v. 16, e-2312 - artigo científico revisado por pares</w:t>
             </w:r>
           </w:p>
           <w:p>
@@ -11195,7 +11195,7 @@
                 <w:sz w:val="15"/>
                 <w:szCs w:val="15"/>
               </w:rPr>
-              <w:t xml:space="preserve">"Com o fim dos incentivos e grande aumento na oferta de leitos, o setor comecou a passar por um periodo de grandes dificuldades vendo as taxas de ocupacao despencar de quase 100% proximo aos megaeventos para uma media de 51% em 2017" (RUSSO; FIGUEIRA, 2022, p. 1).</w:t>
+              <w:t xml:space="preserve">"Com o fim dos incentivos e grande aumento na oferta de leitos, o setor comecou a passar por um período de grandes dificuldades vendo as taxas de ocupação despencar de quase 100% proximo aos megaeventos para uma média de 51% em 2017" (RUSSO; FIGUEIRA, 2022, p. 1).</w:t>
             </w:r>
           </w:p>
         </w:tc>
@@ -11251,7 +11251,7 @@
                 <w:sz w:val="15"/>
                 <w:szCs w:val="15"/>
               </w:rPr>
-              <w:t xml:space="preserve">Turismo: Visao e Acao / SciELO - artigo cientifico</w:t>
+              <w:t xml:space="preserve">Turismo: Visão e Ação / SciELO - artigo científico</w:t>
             </w:r>
           </w:p>
           <w:p>
@@ -11293,7 +11293,7 @@
                 <w:sz w:val="15"/>
                 <w:szCs w:val="15"/>
               </w:rPr>
-              <w:t xml:space="preserve">Das cerca de 19.800 unidades habitacionais existentes na cidade em 2010, chegou-se a 37.000 em 2016, numero que ultrapassa 51 mil quartos somadas as ofertas de apart-hoteis, albergues e moteis (TURISMO: VISAO E ACAO).</w:t>
+              <w:t xml:space="preserve">Das cerca de 19.800 unidades habitacionais existentes na cidade em 2010, chegou-se a 37.000 em 2016, número que ultrapassa 51 mil quartos somadas as ofertas de apart-hotéis, albergues e moteis (TURISMO: VISÃO E AÇÃO).</w:t>
             </w:r>
           </w:p>
         </w:tc>
@@ -11347,7 +11347,7 @@
                 <w:sz w:val="15"/>
                 <w:szCs w:val="15"/>
               </w:rPr>
-              <w:t xml:space="preserve">SILVA; BRAGA; ROMANO (2016), Turismo: Visao e Acao, v. 18, n. 3 - artigo cientifico</w:t>
+              <w:t xml:space="preserve">SILVA; BRAGA; ROMANO (2016), Turismo: Visão e Ação, v. 18, n. 3 - artigo científico</w:t>
             </w:r>
           </w:p>
           <w:p>
@@ -11388,7 +11388,7 @@
                 <w:sz w:val="15"/>
                 <w:szCs w:val="15"/>
               </w:rPr>
-              <w:t xml:space="preserve">"Os megaeventos se colocam diante do mercado como uma grande ferramenta de marketing e, tambem, uma grande influenciadora de escolhas" (SILVA; BRAGA; ROMANO, 2016).</w:t>
+              <w:t xml:space="preserve">"Os megaeventos se colocam diante do mercado como uma grande ferramenta de marketing e, também, uma grande influenciadora de escolhas" (SILVA; BRAGA; ROMANO, 2016).</w:t>
             </w:r>
           </w:p>
         </w:tc>
@@ -11417,7 +11417,7 @@
                 <w:sz w:val="15"/>
                 <w:szCs w:val="15"/>
               </w:rPr>
-              <w:t xml:space="preserve">Megaevento como estrategia de posicionamento competitivo da cidade</w:t>
+              <w:t xml:space="preserve">Megaevento como estratégia de posicionamento competitivo da cidade</w:t>
             </w:r>
           </w:p>
         </w:tc>
@@ -11444,7 +11444,7 @@
                 <w:sz w:val="15"/>
                 <w:szCs w:val="15"/>
               </w:rPr>
-              <w:t xml:space="preserve">FERNANDES (2019), Caderno Virtual de Turismo, v. 19, n. 1 - artigo cientifico</w:t>
+              <w:t xml:space="preserve">FERNANDES (2019), Caderno Virtual de Turismo, v. 19, n. 1 - artigo científico</w:t>
             </w:r>
           </w:p>
           <w:p>
@@ -11486,7 +11486,7 @@
                 <w:sz w:val="15"/>
                 <w:szCs w:val="15"/>
               </w:rPr>
-              <w:t xml:space="preserve">"Cada vez mais incorporados as agendas politicas de cidades contemporaneas, os megaeventos vem sendo cobicados pelos gestores publicos como uma estrategia de posicionamento competitivo no mercado economico em nivel mundial" (FERNANDES, 2019).</w:t>
+              <w:t xml:space="preserve">"Cada vez mais incorporados as agendas politicas de cidades contemporaneas, os megaeventos vem sendo cobicados pelos gestores públicos como uma estratégia de posicionamento competitivo no mercado economico em nivel mundial" (FERNANDES, 2019).</w:t>
             </w:r>
           </w:p>
         </w:tc>
@@ -11514,7 +11514,7 @@
                 <w:sz w:val="15"/>
                 <w:szCs w:val="15"/>
               </w:rPr>
-              <w:t xml:space="preserve">Definicao de turismo da Organizacao Mundial do Turismo</w:t>
+              <w:t xml:space="preserve">Definição de turismo da Organização Mundial do Turismo</w:t>
             </w:r>
           </w:p>
         </w:tc>
@@ -11540,7 +11540,7 @@
                 <w:sz w:val="15"/>
                 <w:szCs w:val="15"/>
               </w:rPr>
-              <w:t xml:space="preserve">Turismo: Visao e Acao / SciELO - artigo que apresenta a definicao da OMT (2001)</w:t>
+              <w:t xml:space="preserve">Turismo: Visão e Ação / SciELO - artigo que apresenta a definição da OMT (2001)</w:t>
             </w:r>
           </w:p>
           <w:p>
@@ -11581,7 +11581,7 @@
                 <w:sz w:val="15"/>
                 <w:szCs w:val="15"/>
               </w:rPr>
-              <w:t xml:space="preserve">Segundo a OMT (2001), o turismo compreende as atividades que as pessoas realizam durante suas viagens e permanencias em lugares distintos do seu entorno habitual, por um periodo consecutivo inferior a um ano, com finalidade de lazer, negocios ou outros motivos.</w:t>
+              <w:t xml:space="preserve">Segundo a OMT (2001), o turismo compreende as atividades que as pessoas realizam durante suas viagens e permanências em lugares distintos do seu entorno habitual, por um período consecutivo inferior a um ano, com finalidade de lazer, negócios ou outros motivos.</w:t>
             </w:r>
           </w:p>
         </w:tc>
@@ -11637,7 +11637,7 @@
                 <w:sz w:val="15"/>
                 <w:szCs w:val="15"/>
               </w:rPr>
-              <w:t xml:space="preserve">NEVES et al. (2021), Turismo: Visao e Acao, v. 23, n. 1 - artigo cientifico</w:t>
+              <w:t xml:space="preserve">NEVES et al. (2021), Turismo: Visão e Ação, v. 23, n. 1 - artigo científico</w:t>
             </w:r>
           </w:p>
           <w:p>
@@ -11733,7 +11733,7 @@
                 <w:sz w:val="15"/>
                 <w:szCs w:val="15"/>
               </w:rPr>
-              <w:t xml:space="preserve">SCALZO, Marilia. Jornalismo de Revista. Sao Paulo: Contexto, 2003 - livro (referencia verificada em TCC do Repositorio UFSC)</w:t>
+              <w:t xml:space="preserve">SCALZO, Marília. Jornalismo de Revista. São Paulo: Contexto, 2003 - livro (referência verificada em TCC do Repositorio UFSC)</w:t>
             </w:r>
           </w:p>
           <w:p>
@@ -11774,7 +11774,7 @@
                 <w:sz w:val="15"/>
                 <w:szCs w:val="15"/>
               </w:rPr>
-              <w:t xml:space="preserve">Para Scalzo (2003), a revista e um veiculo de comunicacao, um produto, um negocio, uma marca, um objeto, um conjunto de servicos e uma mistura de jornalismo com entretenimento.</w:t>
+              <w:t xml:space="preserve">Para Scalzo (2003), a revista e um veiculo de comunicação, um produto, um negocio, uma marca, um objeto, um conjunto de serviços e uma mistura de jornalismo com entretenimento.</w:t>
             </w:r>
           </w:p>
         </w:tc>
@@ -11803,7 +11803,7 @@
                 <w:sz w:val="15"/>
                 <w:szCs w:val="15"/>
               </w:rPr>
-              <w:t xml:space="preserve">Cada componente de uma publicacao existe em relacao aos outros</w:t>
+              <w:t xml:space="preserve">Cada componente de uma publicação existe em relação aos outros</w:t>
             </w:r>
           </w:p>
         </w:tc>
@@ -11830,7 +11830,7 @@
                 <w:sz w:val="15"/>
                 <w:szCs w:val="15"/>
               </w:rPr>
-              <w:t xml:space="preserve">SAMARA, Timothy. Guia de design editorial. Porto Alegre: Bookman, 2011 - livro (referencia verificada em TCC do Repositorio UFSC)</w:t>
+              <w:t xml:space="preserve">SAMARA, Timothy. Guia de design editorial. Porto Alegre: Bookman, 2011 - livro (referência verificada em TCC do Repositorio UFSC)</w:t>
             </w:r>
           </w:p>
           <w:p>
@@ -11872,7 +11872,7 @@
                 <w:sz w:val="15"/>
                 <w:szCs w:val="15"/>
               </w:rPr>
-              <w:t xml:space="preserve">"Cada componente de uma publicacao existe em relacao aos outros, de modo que sua diferenciacao implica tambem conexoes entre eles" (SAMARA, 2011).</w:t>
+              <w:t xml:space="preserve">"Cada componente de uma publicação existe em relação aos outros, de modo que sua diferenciação implica também conexões entre eles" (SAMARA, 2011).</w:t>
             </w:r>
           </w:p>
         </w:tc>
@@ -11900,7 +11900,7 @@
                 <w:sz w:val="15"/>
                 <w:szCs w:val="15"/>
               </w:rPr>
-              <w:t xml:space="preserve">Serie mensal de ocupacao hoteleira da cidade, 2018-2025, por regiao (instrumento da pesquisa)</w:t>
+              <w:t xml:space="preserve">Série mensal de ocupação hoteleira da cidade, 2018-2025, por região (instrumento da pesquisa)</w:t>
             </w:r>
           </w:p>
         </w:tc>
@@ -11926,7 +11926,7 @@
                 <w:sz w:val="15"/>
                 <w:szCs w:val="15"/>
               </w:rPr>
-              <w:t xml:space="preserve">HoteisRIO / ABIH-RJ - Observatorio da Hotelaria do Rio de Janeiro</w:t>
+              <w:t xml:space="preserve">HotéisRIO / ABIH-RJ - Observatório da Hotelaria do Rio de Janeiro</w:t>
             </w:r>
           </w:p>
           <w:p>
@@ -11967,7 +11967,7 @@
                 <w:sz w:val="15"/>
                 <w:szCs w:val="15"/>
               </w:rPr>
-              <w:t xml:space="preserve">Dados da Pesquisa de Ocupacao Hoteleira do Sindicato dos Meios de Hospedagem do Municipio do Rio de Janeiro (HoteisRIO) e da ABIH-RJ, consolidados no Observatorio da Hotelaria do Rio de Janeiro (HOTEISRIO/ABIH-RJ, 2025).</w:t>
+              <w:t xml:space="preserve">Dados da Pesquisa de Ocupação Hoteleira do Sindicato dos Meios de Hospedagem do Município do Rio de Janeiro (HotéisRIO) e da ABIH-RJ, consolidados no Observatório da Hotelaria do Rio de Janeiro (HotéisRIO/ABIH-RJ, 2025).</w:t>
             </w:r>
           </w:p>
         </w:tc>
@@ -12000,7 +12000,7 @@
           <w:sz w:val="17"/>
           <w:szCs w:val="17"/>
         </w:rPr>
-        <w:t xml:space="preserve">Todos os enderecos foram acessados e conferidos em 16 de setembro de 2026. Duas ressalvas: a pagina do Ministerio do Turismo sobre o G20 estava com acesso restrito na data da consulta, e a pagina do Observatorio Legislativo da Camara sobre violencia e turismo estava fora do ar - ambas estao assinaladas nas referencias. Onde a fonte e projecao divulgada antes do evento, a citacao preserva o verbo no futuro (deve movimentar, ira movimentar).</w:t>
+        <w:t xml:space="preserve">Todos os endereços foram acessados e conferidos em 16 de setembro de 2026. Duas ressalvas: a página do Ministério do Turismo sobre o G20 estava com acesso restrito na data da consulta, e a página do Observatório Legislativo da Câmara sobre violência e turismo estava fora do ar - ambas estão assinaladas nas referências. Onde a fonte é projeção divulgada antes do evento, a citação preserva o verbo no futuro (deve movimentar, ira movimentar).</w:t>
       </w:r>
     </w:p>
     <w:p>
@@ -12016,7 +12016,7 @@
           <w:sz w:val="19"/>
           <w:szCs w:val="19"/>
         </w:rPr>
-        <w:t xml:space="preserve">Como citar em ABNT no corpo do texto: para os artigos cientificos, use autor e ano, como em (RUSSO; FIGUEIRA, 2022). Para orgaos publicos, use a entidade e o ano, como em (PREFEITURA DO RIO, 2024) ou (EMBRATUR, 2025). Para dado do sindicato divulgado pela imprensa, a forma mais precisa e (HOTEISRIO apud PANROTAS, 2024), porque preserva a distincao entre quem produziu o dado e quem o publicou - detalhe que uma banca de jornalismo tende a valorizar.</w:t>
+        <w:t xml:space="preserve">Como citar em ABNT no corpo do texto: para os artigos científicos, use autor e ano, como em (RUSSO; FIGUEIRA, 2022). Para órgãos públicos, use a entidade e o ano, como em (PREFEITURA DO RIO, 2024) ou (EMBRATUR, 2025). Para dado do sindicato divulgado pela imprensa, a forma mais precisa é (HotéisRIO apud PANROTAS, 2024), porque preserva a distinção entre quem produziu o dado e quem o publicou - detalhe que uma banca de jornalismo tende a valorizar.</w:t>
       </w:r>
     </w:p>
     <w:p>

</xml_diff>

<commit_message>
Amplia fundamentacao teorica (4 eixos) e contextualizacao social na ficha
- 4.4 o que e uma revista jornalistica (Scalzo, Vilas Boas, Sodre e Ferrari,
  Ali, Samara, Lupton, Munari)
- 4.5 a entrevista jornalistica como tecnica e metodo (Medina, Lage,
  Mariano 2018 na FAMECOS, Soares e Negrini 2020 na Alterjor)
- 4.6 a apuracao: hierarquia de fontes, projecao x apuracao, quem produziu
  o dado x quem publicou, registro das falhas de acesso
- 4.7 por que a revista se adequa como produto de pesquisa (Silva, UFSC 2020)
- contextualizacao social: emprego (FGV), pequeno comercio (CNC/Caged),
  imagem da cidade e a contrapartida da percepcao dos moradores (RBTur)
- 68 referencias, 36 linhas no quadro de conferencia

Co-Authored-By: Claude Opus 5 <noreply@anthropic.com>
</commit_message>
<xml_diff>
--- a/FICHA-DO-PROJETO.docx
+++ b/FICHA-DO-PROJETO.docx
@@ -523,7 +523,7 @@
         </w:rPr>
         <w:t xml:space="preserve">→ Prefeitura do Rio (SMTUR-Rio, SMDE e Riotur, com dados do IFec RJ), 19 jan. 2026 — Rio recebeu 12,5 milhões de visitantes em 2025, que movimentaram R$ 27,2 bilhões </w:t>
       </w:r>
-      <w:hyperlink w:history="1" r:id="rId7_abhp-uwntm_z-xfw3tb">
+      <w:hyperlink w:history="1" r:id="rIdz_lnxna9t6av_ttkb09ra">
         <w:r>
           <w:rPr>
             <w:rFonts w:ascii="Calibri" w:cs="Calibri" w:eastAsia="Calibri" w:hAnsi="Calibri"/>
@@ -630,7 +630,7 @@
         </w:rPr>
         <w:t xml:space="preserve">→ Práticas de sustentabilidade nos empreendimentos hoteleiros construídos no âmbito dos Jogos Olímpicos Rio 2016 — Turismo: Visão e Ação / SciELO </w:t>
       </w:r>
-      <w:hyperlink w:history="1" r:id="rIduklzdzpqvkn9qnyutff65">
+      <w:hyperlink w:history="1" r:id="rIdjvdprefiolehfcmlyislm">
         <w:r>
           <w:rPr>
             <w:rFonts w:ascii="Calibri" w:cs="Calibri" w:eastAsia="Calibri" w:hAnsi="Calibri"/>
@@ -703,7 +703,7 @@
         </w:rPr>
         <w:t xml:space="preserve">→ RUSSO; FIGUEIRA. O paradoxo dos grandes eventos — RBTur, v. 16, e-2312, 2022 </w:t>
       </w:r>
-      <w:hyperlink w:history="1" r:id="rIdem3xkyc2cw-0qpnadt_b_">
+      <w:hyperlink w:history="1" r:id="rIdaooco7suycahotqtvwsm4">
         <w:r>
           <w:rPr>
             <w:rFonts w:ascii="Calibri" w:cs="Calibri" w:eastAsia="Calibri" w:hAnsi="Calibri"/>
@@ -746,7 +746,7 @@
         </w:rPr>
         <w:t xml:space="preserve">→ Rio perdeu R$ 657 milhões em turismo por causa da violência, diz CNC - Agência Brasil, out. 2017 </w:t>
       </w:r>
-      <w:hyperlink w:history="1" r:id="rIdyoahnfsaejvvjhhhz0pli">
+      <w:hyperlink w:history="1" r:id="rId-utgtox0ty9lyl1zhsqzh">
         <w:r>
           <w:rPr>
             <w:rFonts w:ascii="Calibri" w:cs="Calibri" w:eastAsia="Calibri" w:hAnsi="Calibri"/>
@@ -774,7 +774,7 @@
         </w:rPr>
         <w:t xml:space="preserve">→ Violência no Rio faz indústria turística se dissolver, diz presidente do HotéisRIO - Diario do Rio </w:t>
       </w:r>
-      <w:hyperlink w:history="1" r:id="rIdr5nvadnq3xibq4pekxrzv">
+      <w:hyperlink w:history="1" r:id="rIdces8e-fssurjm3neizbxh">
         <w:r>
           <w:rPr>
             <w:rFonts w:ascii="Calibri" w:cs="Calibri" w:eastAsia="Calibri" w:hAnsi="Calibri"/>
@@ -802,7 +802,7 @@
         </w:rPr>
         <w:t xml:space="preserve">→ Como a violência afeta o turismo - Observatório Legislativo da Intervenção Federal na Segurança Pública do RJ (Câmara dos Deputados). ATENÇÃO: página fora do ar na consulta de 16/09/2026; tentar novamente ou solicitar a Câmara </w:t>
       </w:r>
-      <w:hyperlink w:history="1" r:id="rIdq1eu62ar7k1_xmveonpea">
+      <w:hyperlink w:history="1" r:id="rIduap7zu2ryifkxj9kky-5y">
         <w:r>
           <w:rPr>
             <w:rFonts w:ascii="Calibri" w:cs="Calibri" w:eastAsia="Calibri" w:hAnsi="Calibri"/>
@@ -845,7 +845,7 @@
         </w:rPr>
         <w:t xml:space="preserve">→ Queda da violência impulsiona turismo no Rio de Janeiro - CNN Brasil </w:t>
       </w:r>
-      <w:hyperlink w:history="1" r:id="rIdxn6umbxvko91kjbtyeheb">
+      <w:hyperlink w:history="1" r:id="rIdichqa_kpcc-a0vayqlfey">
         <w:r>
           <w:rPr>
             <w:rFonts w:ascii="Calibri" w:cs="Calibri" w:eastAsia="Calibri" w:hAnsi="Calibri"/>
@@ -888,7 +888,7 @@
         </w:rPr>
         <w:t xml:space="preserve">→ E agora, Rio? O turismo pós-megaeventos — Caderno Virtual de Turismo </w:t>
       </w:r>
-      <w:hyperlink w:history="1" r:id="rIdxj6xhznoaftm-nufbr98g">
+      <w:hyperlink w:history="1" r:id="rIdpwqepsc01ljth5nj5njpu">
         <w:r>
           <w:rPr>
             <w:rFonts w:ascii="Calibri" w:cs="Calibri" w:eastAsia="Calibri" w:hAnsi="Calibri"/>
@@ -916,7 +916,7 @@
         </w:rPr>
         <w:t xml:space="preserve">→ Embratur / Ministério do Turismo / Polícia Federal — série de chegadas internacionais (2019: 6,3 milhões) </w:t>
       </w:r>
-      <w:hyperlink w:history="1" r:id="rIdkihzfxqnb0iwjo_ry3ng4">
+      <w:hyperlink w:history="1" r:id="rIdh1_n7dvnwwtdnood3fbv1">
         <w:r>
           <w:rPr>
             <w:rFonts w:ascii="Calibri" w:cs="Calibri" w:eastAsia="Calibri" w:hAnsi="Calibri"/>
@@ -976,7 +976,7 @@
         </w:rPr>
         <w:t xml:space="preserve">→ Com pandemia, Brasil registra em dois anos a chegada de 2,9 milhões de turistas internacionais — Embratur, 20 out. 2022 </w:t>
       </w:r>
-      <w:hyperlink w:history="1" r:id="rIdxfai2iyzihai1zimfshbb">
+      <w:hyperlink w:history="1" r:id="rIdh0iu5hoitirzwg7xw49um">
         <w:r>
           <w:rPr>
             <w:rFonts w:ascii="Calibri" w:cs="Calibri" w:eastAsia="Calibri" w:hAnsi="Calibri"/>
@@ -1019,7 +1019,7 @@
         </w:rPr>
         <w:t xml:space="preserve">→ Hotelaria do Rio registra prejuízo de R$ 1,6 bi em um ano — balanço HotéisRIO (PANROTAS, abr. 2021) </w:t>
       </w:r>
-      <w:hyperlink w:history="1" r:id="rIdn6sahfyswk-b0r_evsnz5">
+      <w:hyperlink w:history="1" r:id="rId_jfjutzmahn7mwuzwl9wo">
         <w:r>
           <w:rPr>
             <w:rFonts w:ascii="Calibri" w:cs="Calibri" w:eastAsia="Calibri" w:hAnsi="Calibri"/>
@@ -1047,7 +1047,7 @@
         </w:rPr>
         <w:t xml:space="preserve">→ Na pandemia, hotéis foram fechados e 20 mil empregos do setor suspensos no Rio — Brasil de Fato, ago. 2020 </w:t>
       </w:r>
-      <w:hyperlink w:history="1" r:id="rIdaxyperbphdvhjshakmwpm">
+      <w:hyperlink w:history="1" r:id="rIdcojyhzb4nmjwunv5a_osc">
         <w:r>
           <w:rPr>
             <w:rFonts w:ascii="Calibri" w:cs="Calibri" w:eastAsia="Calibri" w:hAnsi="Calibri"/>
@@ -1090,7 +1090,7 @@
         </w:rPr>
         <w:t xml:space="preserve">→ NEVES et al. Os impactos da Covid-19 nas viagens de turistas brasileiros — Turismo: Visão e Ação, v. 23, n. 1, 2021 </w:t>
       </w:r>
-      <w:hyperlink w:history="1" r:id="rIdickf6p5dh4cblia-6o9ml">
+      <w:hyperlink w:history="1" r:id="rIdxzi3yhzj_vrf_l5zdqjjb">
         <w:r>
           <w:rPr>
             <w:rFonts w:ascii="Calibri" w:cs="Calibri" w:eastAsia="Calibri" w:hAnsi="Calibri"/>
@@ -1165,7 +1165,7 @@
         </w:rPr>
         <w:t xml:space="preserve">→ Recorde histórico: turismo internacional injeta R$ 34,5 bilhões na economia brasileira em 2023 — Agência Gov / Ministério do Turismo </w:t>
       </w:r>
-      <w:hyperlink w:history="1" r:id="rIdgra0pyosvke5nmjcfnsru">
+      <w:hyperlink w:history="1" r:id="rIdqikjjjxdmqrzl6lbcybrp">
         <w:r>
           <w:rPr>
             <w:rFonts w:ascii="Calibri" w:cs="Calibri" w:eastAsia="Calibri" w:hAnsi="Calibri"/>
@@ -1193,7 +1193,7 @@
         </w:rPr>
         <w:t xml:space="preserve">→ Brasil encerra 2024 com recorde de 6,65 milhões de turistas estrangeiros, alta de 12,6% — Agência Gov </w:t>
       </w:r>
-      <w:hyperlink w:history="1" r:id="rIdmgh7sxgj0kqb8wujxmxjy">
+      <w:hyperlink w:history="1" r:id="rIddcalaesw4lxs0guvisyb4">
         <w:r>
           <w:rPr>
             <w:rFonts w:ascii="Calibri" w:cs="Calibri" w:eastAsia="Calibri" w:hAnsi="Calibri"/>
@@ -1221,7 +1221,7 @@
         </w:rPr>
         <w:t xml:space="preserve">→ Brasil alcança recorde histórico e fecha 2025 com 9,3 milhões de turistas internacionais — Secom / Presidência da República </w:t>
       </w:r>
-      <w:hyperlink w:history="1" r:id="rIddjy6kooozgh83mikgpowu">
+      <w:hyperlink w:history="1" r:id="rIdp78jukr0zpodsactgb8hh">
         <w:r>
           <w:rPr>
             <w:rFonts w:ascii="Calibri" w:cs="Calibri" w:eastAsia="Calibri" w:hAnsi="Calibri"/>
@@ -1264,7 +1264,7 @@
         </w:rPr>
         <w:t xml:space="preserve">→ Arrecadação do turismo na cidade superou os R$ 50 milhões no verão - Prefeitura da Cidade do Rio de Janeiro </w:t>
       </w:r>
-      <w:hyperlink w:history="1" r:id="rId3aq1b6phldqcoeode-uiy">
+      <w:hyperlink w:history="1" r:id="rIdgxlaxpxylgx6ejo1jqdbh">
         <w:r>
           <w:rPr>
             <w:rFonts w:ascii="Calibri" w:cs="Calibri" w:eastAsia="Calibri" w:hAnsi="Calibri"/>
@@ -1292,7 +1292,7 @@
         </w:rPr>
         <w:t xml:space="preserve">→ Retorno do Carnaval deve movimentar economia do Rio de Janeiro e de São Paulo - Ministério do Turismo </w:t>
       </w:r>
-      <w:hyperlink w:history="1" r:id="rIdua6_oe4j3h6c0frql8mah">
+      <w:hyperlink w:history="1" r:id="rIdxywqugynkfjpi8jlsm4ot">
         <w:r>
           <w:rPr>
             <w:rFonts w:ascii="Calibri" w:cs="Calibri" w:eastAsia="Calibri" w:hAnsi="Calibri"/>
@@ -1335,7 +1335,7 @@
         </w:rPr>
         <w:t xml:space="preserve">→ Prefeitura do Rio — SMTUR-Rio, SMDE e Riotur, com dados do Instituto Fecomércio de Pesquisas e Análises (IFec RJ), 19 jan. 2026 </w:t>
       </w:r>
-      <w:hyperlink w:history="1" r:id="rId9nuvhgwy9cg3nsm4ypqk6">
+      <w:hyperlink w:history="1" r:id="rIdpzeyg2xz53v9r0qoeuwxm">
         <w:r>
           <w:rPr>
             <w:rFonts w:ascii="Calibri" w:cs="Calibri" w:eastAsia="Calibri" w:hAnsi="Calibri"/>
@@ -1378,7 +1378,7 @@
         </w:rPr>
         <w:t xml:space="preserve">→ Rio de Janeiro registra aumento de 51,7% na chegada de turistas estrangeiros em 2025 — Embratur, 7 out. 2025 </w:t>
       </w:r>
-      <w:hyperlink w:history="1" r:id="rIdcliex-2uog6yyvjx-olgp">
+      <w:hyperlink w:history="1" r:id="rId1_nowdc4lbxllcnrdh4vk">
         <w:r>
           <w:rPr>
             <w:rFonts w:ascii="Calibri" w:cs="Calibri" w:eastAsia="Calibri" w:hAnsi="Calibri"/>
@@ -1406,7 +1406,7 @@
         </w:rPr>
         <w:t xml:space="preserve">→ Rio de Janeiro bate recorde de turistas internacionais em 2025 — Agência Brasil, nov. 2025 </w:t>
       </w:r>
-      <w:hyperlink w:history="1" r:id="rIdezzyealpnayo8g19pr9o0">
+      <w:hyperlink w:history="1" r:id="rIdhuwk1dvmsjkvuyvja4x7e">
         <w:r>
           <w:rPr>
             <w:rFonts w:ascii="Calibri" w:cs="Calibri" w:eastAsia="Calibri" w:hAnsi="Calibri"/>
@@ -1418,6 +1418,282 @@
           <w:t xml:space="preserve">https://agenciabrasil.ebc.com.br/economia/noticia/2025-11/rio-de-janeiro-bate-recorde-de-turistas-internacionais-em-2025</w:t>
         </w:r>
       </w:hyperlink>
+    </w:p>
+    <w:p>
+      <w:pPr>
+        <w:pStyle w:val="Heading3"/>
+        <w:spacing w:after="160" w:before="300"/>
+      </w:pPr>
+      <w:r>
+        <w:rPr>
+          <w:rFonts w:ascii="Calibri" w:cs="Calibri" w:eastAsia="Calibri" w:hAnsi="Calibri"/>
+          <w:b/>
+          <w:bCs/>
+          <w:color w:val="123A6B"/>
+          <w:sz w:val="22"/>
+          <w:szCs w:val="22"/>
+        </w:rPr>
+        <w:t xml:space="preserve">O contexto social: o que o evento faz com a cidade e com quem mora nela</w:t>
+      </w:r>
+    </w:p>
+    <w:p>
+      <w:pPr>
+        <w:spacing w:after="140" w:before="0" w:line="300"/>
+        <w:jc w:val="both"/>
+      </w:pPr>
+      <w:r>
+        <w:rPr>
+          <w:rFonts w:ascii="Calibri" w:cs="Calibri" w:eastAsia="Calibri" w:hAnsi="Calibri"/>
+          <w:color w:val="1A1A1A"/>
+          <w:sz w:val="22"/>
+          <w:szCs w:val="22"/>
+        </w:rPr>
+        <w:t xml:space="preserve">Contextualizar o período apenas por fluxo de visitantes e receita seria descrever metade do fenômeno. O turismo de eventos produz efeitos sobre a sociedade carioca que precisam estar declarados, e há dado oficial para três deles.</w:t>
+      </w:r>
+    </w:p>
+    <w:p>
+      <w:pPr>
+        <w:spacing w:after="140" w:before="0" w:line="300"/>
+        <w:jc w:val="both"/>
+      </w:pPr>
+      <w:r>
+        <w:rPr>
+          <w:rFonts w:ascii="Calibri" w:cs="Calibri" w:eastAsia="Calibri" w:hAnsi="Calibri"/>
+          <w:color w:val="1A1A1A"/>
+          <w:sz w:val="22"/>
+          <w:szCs w:val="22"/>
+        </w:rPr>
+        <w:t xml:space="preserve">O primeiro é o emprego. O estudo da Fundação Getulio Vargas sobre a edição de 2024 do Rock in Rio aponta a criação de 32,6 mil postos de trabalho na cidade; a edição de 2022 havia gerado 28 mil empregos diretos. São vagas majoritariamente temporárias, concentradas em serviços, alimentação, transporte, limpeza e segurança — o que significa que o benefício chega justamente à faixa de trabalhadores de menor renda e maior rotatividade. É por isso que a contribuição social declarada neste projeto fala de emprego e comércio, e não apenas de arrecadação.</w:t>
+      </w:r>
+    </w:p>
+    <w:p>
+      <w:pPr>
+        <w:spacing w:after="130" w:line="270"/>
+        <w:ind w:left="240"/>
+        <w:jc w:val="left"/>
+      </w:pPr>
+      <w:r>
+        <w:rPr>
+          <w:rFonts w:ascii="Calibri" w:cs="Calibri" w:eastAsia="Calibri" w:hAnsi="Calibri"/>
+          <w:color w:val="4A5058"/>
+          <w:sz w:val="18"/>
+          <w:szCs w:val="18"/>
+        </w:rPr>
+        <w:t xml:space="preserve">→ Estudo da FGV sobre o Rock in Rio 2024: 32,6 mil postos de trabalho — Hotelier News </w:t>
+      </w:r>
+      <w:hyperlink w:history="1" r:id="rIdkbpket0kklnlr40edfqi0">
+        <w:r>
+          <w:rPr>
+            <w:rFonts w:ascii="Calibri" w:cs="Calibri" w:eastAsia="Calibri" w:hAnsi="Calibri"/>
+            <w:color w:val="1155CC"/>
+            <w:sz w:val="17"/>
+            <w:szCs w:val="17"/>
+            <w:u w:val="single"/>
+          </w:rPr>
+          <w:t xml:space="preserve">https://hoteliernews.com.br/rock-in-rio-2024-deve-gerar-impacto-economico-bilionario-diz-fgv/</w:t>
+        </w:r>
+      </w:hyperlink>
+    </w:p>
+    <w:p>
+      <w:pPr>
+        <w:spacing w:after="130" w:line="270"/>
+        <w:ind w:left="240"/>
+        <w:jc w:val="left"/>
+      </w:pPr>
+      <w:r>
+        <w:rPr>
+          <w:rFonts w:ascii="Calibri" w:cs="Calibri" w:eastAsia="Calibri" w:hAnsi="Calibri"/>
+          <w:color w:val="4A5058"/>
+          <w:sz w:val="18"/>
+          <w:szCs w:val="18"/>
+        </w:rPr>
+        <w:t xml:space="preserve">→ Balanço do Rock in Rio 2024 — Agência Brasil, 23 set. 2024 </w:t>
+      </w:r>
+      <w:hyperlink w:history="1" r:id="rIdssv5kxmpaiyot41f0ukge">
+        <w:r>
+          <w:rPr>
+            <w:rFonts w:ascii="Calibri" w:cs="Calibri" w:eastAsia="Calibri" w:hAnsi="Calibri"/>
+            <w:color w:val="1155CC"/>
+            <w:sz w:val="17"/>
+            <w:szCs w:val="17"/>
+            <w:u w:val="single"/>
+          </w:rPr>
+          <w:t xml:space="preserve">https://agenciabrasil.ebc.com.br/cultura/noticia/2024-09/rock-rio-gera-r-26-bilhoes-para-economia-fluminense</w:t>
+        </w:r>
+      </w:hyperlink>
+    </w:p>
+    <w:p>
+      <w:pPr>
+        <w:spacing w:after="140" w:before="0" w:line="300"/>
+        <w:jc w:val="both"/>
+      </w:pPr>
+      <w:r>
+        <w:rPr>
+          <w:rFonts w:ascii="Calibri" w:cs="Calibri" w:eastAsia="Calibri" w:hAnsi="Calibri"/>
+          <w:color w:val="1A1A1A"/>
+          <w:sz w:val="22"/>
+          <w:szCs w:val="22"/>
+        </w:rPr>
+        <w:t xml:space="preserve">O segundo é o pequeno comércio. No balanço do Carnaval de 2025, divulgado pela Agência Brasil com dados do Governo do Estado, da ABIH-RJ, da Confederação Nacional do Comércio e do Caged, o setor de bares e restaurantes registrou crescimento de 40% em relação a 2015 e de 20% sobre 2024. Durante o Rock in Rio de 2024, o comércio faturou 24% mais. O evento, portanto, não beneficia apenas a cadeia formal do turismo: ele irriga o comércio de rua, o ambulante, o mototáxi, o restaurante de bairro.</w:t>
+      </w:r>
+    </w:p>
+    <w:p>
+      <w:pPr>
+        <w:spacing w:after="130" w:line="270"/>
+        <w:ind w:left="240"/>
+        <w:jc w:val="left"/>
+      </w:pPr>
+      <w:r>
+        <w:rPr>
+          <w:rFonts w:ascii="Calibri" w:cs="Calibri" w:eastAsia="Calibri" w:hAnsi="Calibri"/>
+          <w:color w:val="4A5058"/>
+          <w:sz w:val="18"/>
+          <w:szCs w:val="18"/>
+        </w:rPr>
+        <w:t xml:space="preserve">→ Carnaval de 2025 teve recordes para bares, restaurantes e hotéis do RJ — Agência Brasil, 10 mar. 2025 </w:t>
+      </w:r>
+      <w:hyperlink w:history="1" r:id="rIdvknlk9x4cttki3yctpo6m">
+        <w:r>
+          <w:rPr>
+            <w:rFonts w:ascii="Calibri" w:cs="Calibri" w:eastAsia="Calibri" w:hAnsi="Calibri"/>
+            <w:color w:val="1155CC"/>
+            <w:sz w:val="17"/>
+            <w:szCs w:val="17"/>
+            <w:u w:val="single"/>
+          </w:rPr>
+          <w:t xml:space="preserve">https://agenciabrasil.ebc.com.br/economia/noticia/2025-03/carnaval-de-2025-teve-recordes-para-bares-restaurantes-e-hoteis-do-rj</w:t>
+        </w:r>
+      </w:hyperlink>
+    </w:p>
+    <w:p>
+      <w:pPr>
+        <w:spacing w:after="140" w:before="0" w:line="300"/>
+        <w:jc w:val="both"/>
+      </w:pPr>
+      <w:r>
+        <w:rPr>
+          <w:rFonts w:ascii="Calibri" w:cs="Calibri" w:eastAsia="Calibri" w:hAnsi="Calibri"/>
+          <w:color w:val="1A1A1A"/>
+          <w:sz w:val="22"/>
+          <w:szCs w:val="22"/>
+        </w:rPr>
+        <w:t xml:space="preserve">O terceiro é a imagem da cidade e a autoestima de quem vive nela. O contraste entre os dois extremos do recorte é eloquente: em 2017 e 2018, o Rio aparecia na imprensa nacional como destino em retração por causa da violência urbana, com perda estimada de R$ 657 milhões em receitas turísticas apenas entre janeiro e agosto de 2017; em 2024, o governo do estado avaliou que o show de Madonna em Copacabana havia contribuído para recuperar a reputação da cidade. Trata-se de um ganho difuso, que nenhum indicador de ocupação mede, mas que é parte do que a sociedade recebe — e do que uma revista jornalística consegue narrar melhor do que uma tabela.</w:t>
+      </w:r>
+    </w:p>
+    <w:p>
+      <w:pPr>
+        <w:spacing w:after="130" w:line="270"/>
+        <w:ind w:left="240"/>
+        <w:jc w:val="left"/>
+      </w:pPr>
+      <w:r>
+        <w:rPr>
+          <w:rFonts w:ascii="Calibri" w:cs="Calibri" w:eastAsia="Calibri" w:hAnsi="Calibri"/>
+          <w:color w:val="4A5058"/>
+          <w:sz w:val="18"/>
+          <w:szCs w:val="18"/>
+        </w:rPr>
+        <w:t xml:space="preserve">→ Rio perdeu R$ 657 milhões em turismo por causa da violência, diz CNC — Agência Brasil, out. 2017 </w:t>
+      </w:r>
+      <w:hyperlink w:history="1" r:id="rIdffothvp3ruxansfcaav3y">
+        <w:r>
+          <w:rPr>
+            <w:rFonts w:ascii="Calibri" w:cs="Calibri" w:eastAsia="Calibri" w:hAnsi="Calibri"/>
+            <w:color w:val="1155CC"/>
+            <w:sz w:val="17"/>
+            <w:szCs w:val="17"/>
+            <w:u w:val="single"/>
+          </w:rPr>
+          <w:t xml:space="preserve">https://agenciabrasil.ebc.com.br/economia/noticia/2017-10/rio-perdeu-r-657-milhoes-em-turismo-por-causa-da-violencia-diz-cnc</w:t>
+        </w:r>
+      </w:hyperlink>
+    </w:p>
+    <w:p>
+      <w:pPr>
+        <w:spacing w:after="130" w:line="270"/>
+        <w:ind w:left="240"/>
+        <w:jc w:val="left"/>
+      </w:pPr>
+      <w:r>
+        <w:rPr>
+          <w:rFonts w:ascii="Calibri" w:cs="Calibri" w:eastAsia="Calibri" w:hAnsi="Calibri"/>
+          <w:color w:val="4A5058"/>
+          <w:sz w:val="18"/>
+          <w:szCs w:val="18"/>
+        </w:rPr>
+        <w:t xml:space="preserve">→ Show de Madonna movimentou R$ 300 milhões e recuperou reputação do Rio, diz governo do estado — Exame, 2024 </w:t>
+      </w:r>
+      <w:hyperlink w:history="1" r:id="rId6g44x6ioreemfja2iciuy">
+        <w:r>
+          <w:rPr>
+            <w:rFonts w:ascii="Calibri" w:cs="Calibri" w:eastAsia="Calibri" w:hAnsi="Calibri"/>
+            <w:color w:val="1155CC"/>
+            <w:sz w:val="17"/>
+            <w:szCs w:val="17"/>
+            <w:u w:val="single"/>
+          </w:rPr>
+          <w:t xml:space="preserve">https://exame.com/brasil/show-de-madonna-movimentou-r-300-milhoes-e-recuperou-reputacao-do-rio-diz-governo-do-estado/</w:t>
+        </w:r>
+      </w:hyperlink>
+    </w:p>
+    <w:p>
+      <w:pPr>
+        <w:spacing w:after="140" w:before="0" w:line="300"/>
+        <w:jc w:val="both"/>
+      </w:pPr>
+      <w:r>
+        <w:rPr>
+          <w:rFonts w:ascii="Calibri" w:cs="Calibri" w:eastAsia="Calibri" w:hAnsi="Calibri"/>
+          <w:color w:val="1A1A1A"/>
+          <w:sz w:val="22"/>
+          <w:szCs w:val="22"/>
+        </w:rPr>
+        <w:t xml:space="preserve">É preciso, no entanto, registrar a contrapartida, e a literatura acadêmica oferece o instrumento para isso. Pesquisa publicada na Revista Brasileira de Pesquisa em Turismo investigou a percepção dos moradores do Rio sobre os impactos dos Jogos Olímpicos de 2016 antes, durante e depois do megaevento — abordagem que mostra que morador e visitante não avaliam o mesmo evento da mesma forma. Megaevento implica interdição de vias, deslocamento de atividades, pressão sobre transporte e, em alguns casos, remoções e gentrificação. Este trabalho não tem como objeto essa dimensão, mas precisa citá-la, sob pena de confundir pesquisa com peça de divulgação institucional — risco real para quem, como a autora, trabalha na promoção do destino.</w:t>
+      </w:r>
+    </w:p>
+    <w:p>
+      <w:pPr>
+        <w:spacing w:after="130" w:line="270"/>
+        <w:ind w:left="240"/>
+        <w:jc w:val="left"/>
+      </w:pPr>
+      <w:r>
+        <w:rPr>
+          <w:rFonts w:ascii="Calibri" w:cs="Calibri" w:eastAsia="Calibri" w:hAnsi="Calibri"/>
+          <w:color w:val="4A5058"/>
+          <w:sz w:val="18"/>
+          <w:szCs w:val="18"/>
+        </w:rPr>
+        <w:t xml:space="preserve">→ Residents' Perceptions of the Impacts of the Rio 2016 Olympic Games: Before, During and After the Mega-Event — Revista Brasileira de Pesquisa em Turismo </w:t>
+      </w:r>
+      <w:hyperlink w:history="1" r:id="rIdtmh2jmk-gfi_gbtdmxqjn">
+        <w:r>
+          <w:rPr>
+            <w:rFonts w:ascii="Calibri" w:cs="Calibri" w:eastAsia="Calibri" w:hAnsi="Calibri"/>
+            <w:color w:val="1155CC"/>
+            <w:sz w:val="17"/>
+            <w:szCs w:val="17"/>
+            <w:u w:val="single"/>
+          </w:rPr>
+          <w:t xml:space="preserve">https://www.scielo.br/j/rbtur/a/fSJPfrhHs63z4wF7vLPPbfz/?lang=en</w:t>
+        </w:r>
+      </w:hyperlink>
+    </w:p>
+    <w:p>
+      <w:pPr>
+        <w:spacing w:after="200" w:before="0" w:line="300"/>
+        <w:ind w:left="200"/>
+        <w:jc w:val="both"/>
+      </w:pPr>
+      <w:r>
+        <w:rPr>
+          <w:rFonts w:ascii="Calibri" w:cs="Calibri" w:eastAsia="Calibri" w:hAnsi="Calibri"/>
+          <w:color w:val="8A6D1F"/>
+          <w:sz w:val="19"/>
+          <w:szCs w:val="19"/>
+        </w:rPr>
+        <w:t xml:space="preserve">Sugestão de pauta para a revista, que resolve essa tensão de forma jornalística: uma página ou um box ouvindo trabalhadores da cadeia do evento — garçom, camareira, ambulante, motorista de aplicativo. É a voz que os balanços oficiais não trazem, é apuração de campo, e transforma o dado econômico em matéria humana. Cabe no espaço de uma página e eleva o produto inteiro.</w:t>
+      </w:r>
     </w:p>
     <w:p>
       <w:pPr>
@@ -2805,7 +3081,7 @@
         </w:rPr>
         <w:t xml:space="preserve">→ Rock in Rio gera R$ 2,6 bilhões para economia fluminense — Agência Brasil, 23 set. 2024 </w:t>
       </w:r>
-      <w:hyperlink w:history="1" r:id="rIddn-4v2oauumqyxezh9n2n">
+      <w:hyperlink w:history="1" r:id="rIdqb7manfsgqity1ppo41d1">
         <w:r>
           <w:rPr>
             <w:rFonts w:ascii="Calibri" w:cs="Calibri" w:eastAsia="Calibri" w:hAnsi="Calibri"/>
@@ -2833,7 +3109,7 @@
         </w:rPr>
         <w:t xml:space="preserve">→ Estudo da FGV sobre o impacto econômico do Rock in Rio 2024 — Hotelier News </w:t>
       </w:r>
-      <w:hyperlink w:history="1" r:id="rIda1lzr_qj5hzhdkqmvduxe">
+      <w:hyperlink w:history="1" r:id="rIdvnx5ominnpmcob3stb9ou">
         <w:r>
           <w:rPr>
             <w:rFonts w:ascii="Calibri" w:cs="Calibri" w:eastAsia="Calibri" w:hAnsi="Calibri"/>
@@ -2906,7 +3182,7 @@
         </w:rPr>
         <w:t xml:space="preserve">→ O futuro do turismo no Brasil a partir da análise crítica do período 2000-2019 — RBTur / SciELO </w:t>
       </w:r>
-      <w:hyperlink w:history="1" r:id="rIdqnrfx4fjzjjthtu2wlfk5">
+      <w:hyperlink w:history="1" r:id="rIduf4dgzykzhedpr8iamrzy">
         <w:r>
           <w:rPr>
             <w:rFonts w:ascii="Calibri" w:cs="Calibri" w:eastAsia="Calibri" w:hAnsi="Calibri"/>
@@ -5529,7 +5805,7 @@
         </w:rPr>
         <w:t xml:space="preserve">→ Artigo em Turismo: Visão e Ação (SciELO) que apresenta e discute a definição de turismo da OMT (2001) </w:t>
       </w:r>
-      <w:hyperlink w:history="1" r:id="rIdjmrc1mwxw_9vrmxhh8zvi">
+      <w:hyperlink w:history="1" r:id="rIdpzavcsix6zbe7ixhnbs2a">
         <w:r>
           <w:rPr>
             <w:rFonts w:ascii="Calibri" w:cs="Calibri" w:eastAsia="Calibri" w:hAnsi="Calibri"/>
@@ -5695,7 +5971,7 @@
         </w:rPr>
         <w:t xml:space="preserve">→ Megaeventos e Turismo: um estudo bibliométrico dos periódicos brasileiros de turismo — Turismo: Visão e Ação, v. 18, n. 3, p. 633-659, 2016 </w:t>
       </w:r>
-      <w:hyperlink w:history="1" r:id="rIdfgeuim0txrsfkwwhb8-du">
+      <w:hyperlink w:history="1" r:id="rIdn6scoezfdkirzwqim7lne">
         <w:r>
           <w:rPr>
             <w:rFonts w:ascii="Calibri" w:cs="Calibri" w:eastAsia="Calibri" w:hAnsi="Calibri"/>
@@ -5753,7 +6029,7 @@
         </w:rPr>
         <w:t xml:space="preserve">→ GETZ, D. Event tourism: definition, evolution, and research. Tourism Management, v. 29, n. 3, p. 403-428, 2008 </w:t>
       </w:r>
-      <w:hyperlink w:history="1" r:id="rIdxuufivfhdmnlq0k3eakev">
+      <w:hyperlink w:history="1" r:id="rId1ieaihmot6vmryhkwp87m">
         <w:r>
           <w:rPr>
             <w:rFonts w:ascii="Calibri" w:cs="Calibri" w:eastAsia="Calibri" w:hAnsi="Calibri"/>
@@ -5796,7 +6072,7 @@
         </w:rPr>
         <w:t xml:space="preserve">→ CARNEIRO, J. B.; FONTES, N. D. Turismo e eventos: instrumento de promoção e estratégia de marketing. Revista Turismo em Análise, v. 8, n. 1, p. 65-74, 1997 </w:t>
       </w:r>
-      <w:hyperlink w:history="1" r:id="rIdqyqpnpuspuav0aabzzrwr">
+      <w:hyperlink w:history="1" r:id="rIdhxq_bhzubqjou-zngahth">
         <w:r>
           <w:rPr>
             <w:rFonts w:ascii="Calibri" w:cs="Calibri" w:eastAsia="Calibri" w:hAnsi="Calibri"/>
@@ -5886,7 +6162,7 @@
         </w:rPr>
         <w:t xml:space="preserve">→ RUSSO; FIGUEIRA. O paradoxo dos grandes eventos. RBTur, v. 16, e-2312, 2022. DOI 10.7784/rbtur.v16.2312 </w:t>
       </w:r>
-      <w:hyperlink w:history="1" r:id="rIdn5b9wzpb9gui0ycpnunue">
+      <w:hyperlink w:history="1" r:id="rIdbsbaobyleeanoo-j6pdj3">
         <w:r>
           <w:rPr>
             <w:rFonts w:ascii="Calibri" w:cs="Calibri" w:eastAsia="Calibri" w:hAnsi="Calibri"/>
@@ -5959,7 +6235,7 @@
         </w:rPr>
         <w:t xml:space="preserve">→ FERNANDES, A. M. V. Megaeventos e Turismo no Rio de Janeiro. Caderno Virtual de Turismo, v. 19, n. 1, 2019. DOI 10.18472/cvt.19n1.2019.1532 </w:t>
       </w:r>
-      <w:hyperlink w:history="1" r:id="rIdbtmapn4ov9wrey45rjlsj">
+      <w:hyperlink w:history="1" r:id="rIdwg3m3dgnksw-ddd837mqh">
         <w:r>
           <w:rPr>
             <w:rFonts w:ascii="Calibri" w:cs="Calibri" w:eastAsia="Calibri" w:hAnsi="Calibri"/>
@@ -6002,7 +6278,7 @@
         </w:rPr>
         <w:t xml:space="preserve">→ E agora, Rio? O turismo pós-megaeventos — Caderno Virtual de Turismo </w:t>
       </w:r>
-      <w:hyperlink w:history="1" r:id="rIdrdbagkvjg2q4m1cvazaql">
+      <w:hyperlink w:history="1" r:id="rIdyuukwxamrdnodknedh3da">
         <w:r>
           <w:rPr>
             <w:rFonts w:ascii="Calibri" w:cs="Calibri" w:eastAsia="Calibri" w:hAnsi="Calibri"/>
@@ -6045,7 +6321,7 @@
         </w:rPr>
         <w:t xml:space="preserve">→ Gestão de crise no turismo: reflexos da pandemia da Covid-19 nos meios de hospedagem de Torres (RS) — Turismo: Visão e Ação </w:t>
       </w:r>
-      <w:hyperlink w:history="1" r:id="rIdtpnb8mc_gr6othqdr49gx">
+      <w:hyperlink w:history="1" r:id="rIdplcwzgenletol5pmfoenq">
         <w:r>
           <w:rPr>
             <w:rFonts w:ascii="Calibri" w:cs="Calibri" w:eastAsia="Calibri" w:hAnsi="Calibri"/>
@@ -6073,7 +6349,7 @@
         </w:rPr>
         <w:t xml:space="preserve">→ Perspectivas para o turismo em Petrópolis (RJ): impactos da Covid-19 e das chuvas no verão de 2022 — SciELO </w:t>
       </w:r>
-      <w:hyperlink w:history="1" r:id="rIdmju-ucsgxklwbvmxghqsi">
+      <w:hyperlink w:history="1" r:id="rIdsy-fgqzwb1qayuabwic4r">
         <w:r>
           <w:rPr>
             <w:rFonts w:ascii="Calibri" w:cs="Calibri" w:eastAsia="Calibri" w:hAnsi="Calibri"/>
@@ -6116,7 +6392,7 @@
         </w:rPr>
         <w:t xml:space="preserve">→ Residents' Perceptions of the Impacts of the Rio 2016 Olympic Games — RBTur </w:t>
       </w:r>
-      <w:hyperlink w:history="1" r:id="rIdslc-fjazsinulliuyqy0_">
+      <w:hyperlink w:history="1" r:id="rIdotv2wukxskeaqchkybayd">
         <w:r>
           <w:rPr>
             <w:rFonts w:ascii="Calibri" w:cs="Calibri" w:eastAsia="Calibri" w:hAnsi="Calibri"/>
@@ -6143,7 +6419,7 @@
           <w:sz w:val="24"/>
           <w:szCs w:val="24"/>
         </w:rPr>
-        <w:t xml:space="preserve">4.4. A revista como veículo e o projeto gráfico-editorial</w:t>
+        <w:t xml:space="preserve">4.4. O que é uma revista jornalística</w:t>
       </w:r>
     </w:p>
     <w:p>
@@ -6158,7 +6434,7 @@
           <w:sz w:val="22"/>
           <w:szCs w:val="22"/>
         </w:rPr>
-        <w:t xml:space="preserve">Sendo o produto uma revista, a fundamentação cobre também a teoria do veículo. A referência canônica no Brasil é Scalzo (2003), para quem a revista é, simultaneamente, veículo de comunicação, produto, negócio, marca, objeto, conjunto de serviços e mistura de jornalismo com entretenimento. A autora observa que a revista se situa entre a instantaneidade do jornal e a longevidade do livro, e que é segmentada por assunto e por público — definição que orienta as escolhas deste projeto: leitores formados por profissionais de turismo, gestores públicos e jornalistas de economia e cultura.</w:t>
+        <w:t xml:space="preserve">Sendo o produto uma revista, a fundamentação precisa cobrir a teoria do veículo com o mesmo rigor aplicado ao turismo. A referência canônica no Brasil é Scalzo (2003), para quem a revista é, simultaneamente, veículo de comunicação, produto, negócio, marca, objeto, conjunto de serviços e mistura de jornalismo com entretenimento. A autora situa a revista entre a instantaneidade do jornal e a longevidade do livro, e registra que ela é segmentada por assunto e por público, buscando sintonia permanente com o interesse do leitor.</w:t>
       </w:r>
     </w:p>
     <w:p>
@@ -6174,9 +6450,9 @@
           <w:sz w:val="18"/>
           <w:szCs w:val="18"/>
         </w:rPr>
-        <w:t xml:space="preserve">→ TCC do Repositório UFSC que utiliza Scalzo como referência — SCALZO, Marília. Jornalismo de Revista. São Paulo: Contexto, 2003 </w:t>
-      </w:r>
-      <w:hyperlink w:history="1" r:id="rIdzsiocgnsz5rohsutznkgb">
+        <w:t xml:space="preserve">→ TCC do Repositório da UFSC que utiliza e cita Scalzo — referência: SCALZO, Marília. Jornalismo de Revista. São Paulo: Contexto, 2003 </w:t>
+      </w:r>
+      <w:hyperlink w:history="1" r:id="rIddipfdymdagv4hc5xgaucv">
         <w:r>
           <w:rPr>
             <w:rFonts w:ascii="Calibri" w:cs="Calibri" w:eastAsia="Calibri" w:hAnsi="Calibri"/>
@@ -6201,6 +6477,64 @@
           <w:sz w:val="22"/>
           <w:szCs w:val="22"/>
         </w:rPr>
+        <w:t xml:space="preserve">Três características da revista justificam a escolha do veículo para este trabalho. A primeira é a periodicidade mais larga, que permite apuração em profundidade — condição indispensável quando o objeto é uma série de oito anos. A segunda é a segmentação: a revista fala a um público definido, e o público deste trabalho é preciso (profissionais de turismo e hotelaria, gestores públicos e jornalistas de economia e cultura). A terceira é a relação entre texto e imagem, que na revista não é ilustrativa, mas estruturante — o que acomoda a curadoria de imagens prevista na metodologia e a infografia exigida pelos dados.</w:t>
+      </w:r>
+    </w:p>
+    <w:p>
+      <w:pPr>
+        <w:spacing w:after="140" w:before="0" w:line="300"/>
+        <w:jc w:val="both"/>
+      </w:pPr>
+      <w:r>
+        <w:rPr>
+          <w:rFonts w:ascii="Calibri" w:cs="Calibri" w:eastAsia="Calibri" w:hAnsi="Calibri"/>
+          <w:color w:val="1A1A1A"/>
+          <w:sz w:val="22"/>
+          <w:szCs w:val="22"/>
+        </w:rPr>
+        <w:t xml:space="preserve">Sobre o texto de revista, a referência é Vilas Boas (1996), em O estilo magazine: o texto em revista, que descreve o gênero como território privilegiado da reportagem, com ênfase no detalhe revelador, na descrição do cotidiano e na presença autoral — em contraste com a objetividade seca do texto diário. Sodré e Ferrari, em Técnica de reportagem, situam a reportagem como lugar nobre do jornalismo, e é esse o registro adotado nas seis páginas do produto: reportagem, e não release institucional.</w:t>
+      </w:r>
+    </w:p>
+    <w:p>
+      <w:pPr>
+        <w:spacing w:after="130" w:line="270"/>
+        <w:ind w:left="240"/>
+        <w:jc w:val="left"/>
+      </w:pPr>
+      <w:r>
+        <w:rPr>
+          <w:rFonts w:ascii="Calibri" w:cs="Calibri" w:eastAsia="Calibri" w:hAnsi="Calibri"/>
+          <w:color w:val="4A5058"/>
+          <w:sz w:val="18"/>
+          <w:szCs w:val="18"/>
+        </w:rPr>
+        <w:t xml:space="preserve">→ Jornalismo Literário: revisão conceitual, história e novas perspectivas — Intercom/SciELO: artigo que discute Vilas Boas e o estilo magazine </w:t>
+      </w:r>
+      <w:hyperlink w:history="1" r:id="rIdjwh1tcl88vgi3j17gdtfk">
+        <w:r>
+          <w:rPr>
+            <w:rFonts w:ascii="Calibri" w:cs="Calibri" w:eastAsia="Calibri" w:hAnsi="Calibri"/>
+            <w:color w:val="1155CC"/>
+            <w:sz w:val="17"/>
+            <w:szCs w:val="17"/>
+            <w:u w:val="single"/>
+          </w:rPr>
+          <w:t xml:space="preserve">https://www.scielo.br/j/interc/a/YywYmt85GZrc4NRsjHytXYm/?lang=pt</w:t>
+        </w:r>
+      </w:hyperlink>
+    </w:p>
+    <w:p>
+      <w:pPr>
+        <w:spacing w:after="140" w:before="0" w:line="300"/>
+        <w:jc w:val="both"/>
+      </w:pPr>
+      <w:r>
+        <w:rPr>
+          <w:rFonts w:ascii="Calibri" w:cs="Calibri" w:eastAsia="Calibri" w:hAnsi="Calibri"/>
+          <w:color w:val="1A1A1A"/>
+          <w:sz w:val="22"/>
+          <w:szCs w:val="22"/>
+        </w:rPr>
         <w:t xml:space="preserve">Para o projeto gráfico-editorial, a bibliografia consolidada é Ali (2009), sobre a arte de editar revistas; Samara (2011), manual prático de design de publicações; Lupton (2013), sobre tipografia e entrelinha; e Munari (2015), sobre metodologia de projeto. Samara formula o princípio que rege a diagramação desta revista:</w:t>
       </w:r>
     </w:p>
@@ -6247,9 +6581,9 @@
           <w:sz w:val="18"/>
           <w:szCs w:val="18"/>
         </w:rPr>
-        <w:t xml:space="preserve">→ SCHUCH, L. D. DCMAGZ: projeto gráfico editorial de uma revista de design gráfico. TCC — UFSC (fonte das referências de design editorial aqui citadas) </w:t>
-      </w:r>
-      <w:hyperlink w:history="1" r:id="rId1gazdlavvhxqpojwhajcy">
+        <w:t xml:space="preserve">→ SCHUCH, L. D. DCMAGZ: projeto gráfico editorial de uma revista de design gráfico — TCC/UFSC, fonte verificada das referências de design editorial (Ali, Samara, Lupton, Munari) </w:t>
+      </w:r>
+      <w:hyperlink w:history="1" r:id="rIdceqk_wnsksyd_v5518qes">
         <w:r>
           <w:rPr>
             <w:rFonts w:ascii="Calibri" w:cs="Calibri" w:eastAsia="Calibri" w:hAnsi="Calibri"/>
@@ -6264,6 +6598,23 @@
     </w:p>
     <w:p>
       <w:pPr>
+        <w:pStyle w:val="Heading2"/>
+        <w:spacing w:after="160" w:before="300"/>
+      </w:pPr>
+      <w:r>
+        <w:rPr>
+          <w:rFonts w:ascii="Calibri" w:cs="Calibri" w:eastAsia="Calibri" w:hAnsi="Calibri"/>
+          <w:b/>
+          <w:bCs/>
+          <w:color w:val="123A6B"/>
+          <w:sz w:val="24"/>
+          <w:szCs w:val="24"/>
+        </w:rPr>
+        <w:t xml:space="preserve">4.5. A entrevista jornalística: técnica e método</w:t>
+      </w:r>
+    </w:p>
+    <w:p>
+      <w:pPr>
         <w:spacing w:after="140" w:before="0" w:line="300"/>
         <w:jc w:val="both"/>
       </w:pPr>
@@ -6274,7 +6625,37 @@
           <w:sz w:val="22"/>
           <w:szCs w:val="22"/>
         </w:rPr>
-        <w:t xml:space="preserve">Consultaram-se ainda, como precedentes metodológicos de TCC de produto na mesma linha — revista concebida como projeto gráfico-editorial completo —, trabalhos dos repositórios da UFSC e do LUME/UFRGS, que estruturam o processo em briefing, análise de similares, definição de público, sistema de grid, escolha tipográfica, paleta e fechamento de arquivo.</w:t>
+        <w:t xml:space="preserve">A metodologia declarada no projeto prevê entrevistas com especialistas, e isso exige fundamentação própria — a entrevista não é conversa, é técnica. Mariano (2018), em artigo na Revista FAMECOS, observa que, apesar de central na prática profissional, a entrevista é pouco teorizada:</w:t>
+      </w:r>
+    </w:p>
+    <w:p>
+      <w:pPr>
+        <w:pBdr>
+          <w:left w:val="single" w:color="C8452F" w:sz="12" w:space="10"/>
+        </w:pBdr>
+        <w:spacing w:after="150" w:before="60" w:line="290"/>
+        <w:ind w:left="380" w:right="200"/>
+        <w:jc w:val="both"/>
+      </w:pPr>
+      <w:r>
+        <w:rPr>
+          <w:rFonts w:ascii="Calibri" w:cs="Calibri" w:eastAsia="Calibri" w:hAnsi="Calibri"/>
+          <w:i/>
+          <w:iCs/>
+          <w:color w:val="123A6B"/>
+          <w:sz w:val="21"/>
+          <w:szCs w:val="21"/>
+        </w:rPr>
+        <w:t xml:space="preserve">“A entrevista vem sendo estudada de forma esporádica e fragmentada. São poucos os livros e artigos que tratam do tema.”</w:t>
+      </w:r>
+      <w:r>
+        <w:rPr>
+          <w:rFonts w:ascii="Calibri" w:cs="Calibri" w:eastAsia="Calibri" w:hAnsi="Calibri"/>
+          <w:color w:val="4A5058"/>
+          <w:sz w:val="17"/>
+          <w:szCs w:val="17"/>
+        </w:rPr>
+        <w:t xml:space="preserve">  (MARIANO, 2018)</w:t>
       </w:r>
     </w:p>
     <w:p>
@@ -6290,9 +6671,9 @@
           <w:sz w:val="18"/>
           <w:szCs w:val="18"/>
         </w:rPr>
-        <w:t xml:space="preserve">→ Priti: projeto gráfico-editorial e produção de revista digital — TCC, Repositório UFSC </w:t>
-      </w:r>
-      <w:hyperlink w:history="1" r:id="rIdbswidqjkbtp1wkzpk6oze">
+        <w:t xml:space="preserve">→ MARIANO, Agnes Francine de Carvalho. A entrevista como tema de pesquisa no campo da comunicação. Revista FAMECOS, v. 25, n. 2, 2018. DOI 10.15448/1980-3729.2018.2.28307 </w:t>
+      </w:r>
+      <w:hyperlink w:history="1" r:id="rIddtzw8pe3hgkoz19l639ib">
         <w:r>
           <w:rPr>
             <w:rFonts w:ascii="Calibri" w:cs="Calibri" w:eastAsia="Calibri" w:hAnsi="Calibri"/>
@@ -6301,9 +6682,114 @@
             <w:szCs w:val="17"/>
             <w:u w:val="single"/>
           </w:rPr>
-          <w:t xml:space="preserve">https://repositorio.ufsc.br/handle/123456789/237226</w:t>
+          <w:t xml:space="preserve">https://www.redalyc.org/journal/4955/495557631006/html/</w:t>
         </w:r>
       </w:hyperlink>
+    </w:p>
+    <w:p>
+      <w:pPr>
+        <w:spacing w:after="140" w:before="0" w:line="300"/>
+        <w:jc w:val="both"/>
+      </w:pPr>
+      <w:r>
+        <w:rPr>
+          <w:rFonts w:ascii="Calibri" w:cs="Calibri" w:eastAsia="Calibri" w:hAnsi="Calibri"/>
+          <w:color w:val="1A1A1A"/>
+          <w:sz w:val="22"/>
+          <w:szCs w:val="22"/>
+        </w:rPr>
+        <w:t xml:space="preserve">As duas referências clássicas são complementares e, juntas, orientam os dois roteiros deste trabalho. Medina concebe a entrevista como diálogo e interação, capaz de produzir sentido novo:</w:t>
+      </w:r>
+    </w:p>
+    <w:p>
+      <w:pPr>
+        <w:pBdr>
+          <w:left w:val="single" w:color="C8452F" w:sz="12" w:space="10"/>
+        </w:pBdr>
+        <w:spacing w:after="150" w:before="60" w:line="290"/>
+        <w:ind w:left="380" w:right="200"/>
+        <w:jc w:val="both"/>
+      </w:pPr>
+      <w:r>
+        <w:rPr>
+          <w:rFonts w:ascii="Calibri" w:cs="Calibri" w:eastAsia="Calibri" w:hAnsi="Calibri"/>
+          <w:i/>
+          <w:iCs/>
+          <w:color w:val="123A6B"/>
+          <w:sz w:val="21"/>
+          <w:szCs w:val="21"/>
+        </w:rPr>
+        <w:t xml:space="preserve">“Haverá até a possibilidade de acontecer um ato culminante que se pode nomear como interação social criadora.”</w:t>
+      </w:r>
+      <w:r>
+        <w:rPr>
+          <w:rFonts w:ascii="Calibri" w:cs="Calibri" w:eastAsia="Calibri" w:hAnsi="Calibri"/>
+          <w:color w:val="4A5058"/>
+          <w:sz w:val="17"/>
+          <w:szCs w:val="17"/>
+        </w:rPr>
+        <w:t xml:space="preserve">  (MEDINA, Entrevista: o diálogo possível, apud MARIANO, 2018)</w:t>
+      </w:r>
+    </w:p>
+    <w:p>
+      <w:pPr>
+        <w:spacing w:after="140" w:before="0" w:line="300"/>
+        <w:jc w:val="both"/>
+      </w:pPr>
+      <w:r>
+        <w:rPr>
+          <w:rFonts w:ascii="Calibri" w:cs="Calibri" w:eastAsia="Calibri" w:hAnsi="Calibri"/>
+          <w:color w:val="1A1A1A"/>
+          <w:sz w:val="22"/>
+          <w:szCs w:val="22"/>
+        </w:rPr>
+        <w:t xml:space="preserve">Lage, por sua vez, insiste no controle da condução pelo repórter:</w:t>
+      </w:r>
+    </w:p>
+    <w:p>
+      <w:pPr>
+        <w:pBdr>
+          <w:left w:val="single" w:color="C8452F" w:sz="12" w:space="10"/>
+        </w:pBdr>
+        <w:spacing w:after="150" w:before="60" w:line="290"/>
+        <w:ind w:left="380" w:right="200"/>
+        <w:jc w:val="both"/>
+      </w:pPr>
+      <w:r>
+        <w:rPr>
+          <w:rFonts w:ascii="Calibri" w:cs="Calibri" w:eastAsia="Calibri" w:hAnsi="Calibri"/>
+          <w:i/>
+          <w:iCs/>
+          <w:color w:val="123A6B"/>
+          <w:sz w:val="21"/>
+          <w:szCs w:val="21"/>
+        </w:rPr>
+        <w:t xml:space="preserve">“O jornalista tem de conduzir a entrevista para onde quer, e não deixar-se conduzir pelo entrevistado.”</w:t>
+      </w:r>
+      <w:r>
+        <w:rPr>
+          <w:rFonts w:ascii="Calibri" w:cs="Calibri" w:eastAsia="Calibri" w:hAnsi="Calibri"/>
+          <w:color w:val="4A5058"/>
+          <w:sz w:val="17"/>
+          <w:szCs w:val="17"/>
+        </w:rPr>
+        <w:t xml:space="preserve">  (LAGE, A reportagem, 2001, apud MARIANO, 2018)</w:t>
+      </w:r>
+    </w:p>
+    <w:p>
+      <w:pPr>
+        <w:spacing w:after="140" w:before="0" w:line="300"/>
+        <w:jc w:val="both"/>
+      </w:pPr>
+      <w:r>
+        <w:rPr>
+          <w:rFonts w:ascii="Calibri" w:cs="Calibri" w:eastAsia="Calibri" w:hAnsi="Calibri"/>
+          <w:color w:val="1A1A1A"/>
+          <w:sz w:val="22"/>
+          <w:szCs w:val="22"/>
+        </w:rPr>
+        <w:t xml:space="preserve">Lage também classifica as entrevistas por objetivo e por circunstância de realização, distinção que foi aplicada na construção dos roteiros: a entrevista com o professor da FTH/UFF é de interpretação — busca enquadramento conceitual e admite divergência; a entrevista com o presidente do Sindicato é ao mesmo tempo ritual e temática — busca dado, série histórica e a descrição do próprio instrumento de coleta, além de suprir a lacuna documental de 2019. Essa diferença de objetivo explica por que os dois roteiros têm forma distinta, e é isso que deve ser dito na defesa.</w:t>
+      </w:r>
     </w:p>
     <w:p>
       <w:pPr>
@@ -6318,9 +6804,9 @@
           <w:sz w:val="18"/>
           <w:szCs w:val="18"/>
         </w:rPr>
-        <w:t xml:space="preserve">→ Projeto gráfico-editorial de uma revista independente sobre arte e ilustração — TCC, Repositório UFSC </w:t>
-      </w:r>
-      <w:hyperlink w:history="1" r:id="rIdxlmqqbrsgm3toohpmasqk">
+        <w:t xml:space="preserve">→ SOARES, L. S.; NEGRINI, M. As técnicas de entrevista utilizadas pelos jornalistas do Jornal Nacional com os presidenciáveis 2018. Revista Alterjor, v. 22, n. 2, 2020 — aplicação das tipologias de Lage </w:t>
+      </w:r>
+      <w:hyperlink w:history="1" r:id="rIdyetra7uiktdgyjhybs1np">
         <w:r>
           <w:rPr>
             <w:rFonts w:ascii="Calibri" w:cs="Calibri" w:eastAsia="Calibri" w:hAnsi="Calibri"/>
@@ -6329,9 +6815,57 @@
             <w:szCs w:val="17"/>
             <w:u w:val="single"/>
           </w:rPr>
-          <w:t xml:space="preserve">https://repositorio.ufsc.br/handle/123456789/218844</w:t>
+          <w:t xml:space="preserve">https://revistas.usp.br/alterjor/article/view/171023</w:t>
         </w:r>
       </w:hyperlink>
+    </w:p>
+    <w:p>
+      <w:pPr>
+        <w:spacing w:after="200" w:before="0" w:line="300"/>
+        <w:ind w:left="200"/>
+        <w:jc w:val="both"/>
+      </w:pPr>
+      <w:r>
+        <w:rPr>
+          <w:rFonts w:ascii="Calibri" w:cs="Calibri" w:eastAsia="Calibri" w:hAnsi="Calibri"/>
+          <w:color w:val="8A6D1F"/>
+          <w:sz w:val="19"/>
+          <w:szCs w:val="19"/>
+        </w:rPr>
+        <w:t xml:space="preserve">Cuidado ético e metodológico declarado: a autora trabalha na comunicação da entidade que produz o dado e entrevistará o presidente dessa mesma entidade. Isso precisa estar explícito no texto do TCC, com a ressalva de que o dado primário é público, verificável no Observatório da Hotelaria, e que a entrevista com o professor da UFF cumpre a função de contraditório teórico. Declarar o lugar de fala fortalece o trabalho; omiti-lo o fragiliza.</w:t>
+      </w:r>
+    </w:p>
+    <w:p>
+      <w:pPr>
+        <w:pStyle w:val="Heading2"/>
+        <w:spacing w:after="160" w:before="300"/>
+      </w:pPr>
+      <w:r>
+        <w:rPr>
+          <w:rFonts w:ascii="Calibri" w:cs="Calibri" w:eastAsia="Calibri" w:hAnsi="Calibri"/>
+          <w:b/>
+          <w:bCs/>
+          <w:color w:val="123A6B"/>
+          <w:sz w:val="24"/>
+          <w:szCs w:val="24"/>
+        </w:rPr>
+        <w:t xml:space="preserve">4.6. A apuração: como se verifica o que se afirma</w:t>
+      </w:r>
+    </w:p>
+    <w:p>
+      <w:pPr>
+        <w:spacing w:after="140" w:before="0" w:line="300"/>
+        <w:jc w:val="both"/>
+      </w:pPr>
+      <w:r>
+        <w:rPr>
+          <w:rFonts w:ascii="Calibri" w:cs="Calibri" w:eastAsia="Calibri" w:hAnsi="Calibri"/>
+          <w:color w:val="1A1A1A"/>
+          <w:sz w:val="22"/>
+          <w:szCs w:val="22"/>
+        </w:rPr>
+        <w:t xml:space="preserve">A apuração é o procedimento que separa jornalismo de opinião, e neste trabalho ela tem peso metodológico porque quase todos os números disponíveis sobre eventos são produzidos por quem tem interesse no resultado — prefeituras, governos, organizadores e entidades do setor. Lage, em A reportagem: teoria e técnica de entrevista e pesquisa jornalística, estabelece a pesquisa jornalística como etapa formal do processo, anterior e posterior à entrevista, e é esse o desenho adotado aqui.</w:t>
+      </w:r>
     </w:p>
     <w:p>
       <w:pPr>
@@ -6346,9 +6880,9 @@
           <w:sz w:val="18"/>
           <w:szCs w:val="18"/>
         </w:rPr>
-        <w:t xml:space="preserve">→ A identidade visual no projeto gráfico de revistas — LUME/UFRGS </w:t>
-      </w:r>
-      <w:hyperlink w:history="1" r:id="rIdjp91ivljfafi6glrx-60v">
+        <w:t xml:space="preserve">→ Artigo em Revista Alterjor (USP) que discute as técnicas de Lage — referência: LAGE, Nilson. A reportagem: teoria e técnica de entrevista e pesquisa jornalística. Rio de Janeiro: Record, 2001 </w:t>
+      </w:r>
+      <w:hyperlink w:history="1" r:id="rIdpyphrdawyjtyepimgdrh9">
         <w:r>
           <w:rPr>
             <w:rFonts w:ascii="Calibri" w:cs="Calibri" w:eastAsia="Calibri" w:hAnsi="Calibri"/>
@@ -6357,9 +6891,115 @@
             <w:szCs w:val="17"/>
             <w:u w:val="single"/>
           </w:rPr>
-          <w:t xml:space="preserve">https://lume.ufrgs.br/bitstream/handle/10183/115890/000965592.pdf</w:t>
+          <w:t xml:space="preserve">https://revistas.usp.br/alterjor/es/article/download/171023/162402/425166</w:t>
         </w:r>
       </w:hyperlink>
+    </w:p>
+    <w:p>
+      <w:pPr>
+        <w:spacing w:after="140" w:before="0" w:line="300"/>
+        <w:jc w:val="both"/>
+      </w:pPr>
+      <w:r>
+        <w:rPr>
+          <w:rFonts w:ascii="Calibri" w:cs="Calibri" w:eastAsia="Calibri" w:hAnsi="Calibri"/>
+          <w:color w:val="1A1A1A"/>
+          <w:sz w:val="22"/>
+          <w:szCs w:val="22"/>
+        </w:rPr>
+        <w:t xml:space="preserve">Quatro regras de apuração foram fixadas para esta pesquisa, e todas estão aplicadas no Quadro de conferência que encerra esta ficha:</w:t>
+      </w:r>
+    </w:p>
+    <w:p>
+      <w:pPr>
+        <w:pStyle w:val="ListParagraph"/>
+        <w:numPr>
+          <w:ilvl w:val="0"/>
+          <w:numId w:val="2"/>
+        </w:numPr>
+        <w:spacing w:after="110" w:line="295"/>
+      </w:pPr>
+      <w:r>
+        <w:rPr>
+          <w:rFonts w:ascii="Calibri" w:cs="Calibri" w:eastAsia="Calibri" w:hAnsi="Calibri"/>
+          <w:color w:val="1A1A1A"/>
+          <w:sz w:val="22"/>
+          <w:szCs w:val="22"/>
+        </w:rPr>
+        <w:t xml:space="preserve">Hierarquia de fontes. Para número de visitantes e receita: Embratur, Ministério do Turismo, Polícia Federal e Prefeitura do Rio. Para ocupação: a pesquisa do HotéisRIO/ABIH-RJ. Para conceito: artigo científico revisado por pares. Fonte comercial e portal de bilheteria servem apenas para localizar a existência e a data de um evento.</w:t>
+      </w:r>
+    </w:p>
+    <w:p>
+      <w:pPr>
+        <w:pStyle w:val="ListParagraph"/>
+        <w:numPr>
+          <w:ilvl w:val="0"/>
+          <w:numId w:val="2"/>
+        </w:numPr>
+        <w:spacing w:after="110" w:line="295"/>
+      </w:pPr>
+      <w:r>
+        <w:rPr>
+          <w:rFonts w:ascii="Calibri" w:cs="Calibri" w:eastAsia="Calibri" w:hAnsi="Calibri"/>
+          <w:color w:val="1A1A1A"/>
+          <w:sz w:val="22"/>
+          <w:szCs w:val="22"/>
+        </w:rPr>
+        <w:t xml:space="preserve">Separação entre projeção e apuração. Estudo divulgado antes do evento é previsão e recebe verbo no futuro; balanço posterior é apuração. O caso de Lady Gaga é exemplar: o release da Prefeitura, de 2 de maio de 2025, estimava 1,6 milhão de pessoas; os balanços posteriores consolidaram 2,1 milhões. Citar os dois, com as datas, é mais preciso do que escolher um.</w:t>
+      </w:r>
+    </w:p>
+    <w:p>
+      <w:pPr>
+        <w:pStyle w:val="ListParagraph"/>
+        <w:numPr>
+          <w:ilvl w:val="0"/>
+          <w:numId w:val="2"/>
+        </w:numPr>
+        <w:spacing w:after="110" w:line="295"/>
+      </w:pPr>
+      <w:r>
+        <w:rPr>
+          <w:rFonts w:ascii="Calibri" w:cs="Calibri" w:eastAsia="Calibri" w:hAnsi="Calibri"/>
+          <w:color w:val="1A1A1A"/>
+          <w:sz w:val="22"/>
+          <w:szCs w:val="22"/>
+        </w:rPr>
+        <w:t xml:space="preserve">Identificação de quem produziu o dado, e não apenas de quem o publicou. Quando a taxa de ocupação aparece em veículo de imprensa, a origem é a pesquisa do sindicato; a forma correta de citação preserva isso: HotéisRIO apud PANROTAS, 2024.</w:t>
+      </w:r>
+    </w:p>
+    <w:p>
+      <w:pPr>
+        <w:pStyle w:val="ListParagraph"/>
+        <w:numPr>
+          <w:ilvl w:val="0"/>
+          <w:numId w:val="2"/>
+        </w:numPr>
+        <w:spacing w:after="110" w:line="295"/>
+      </w:pPr>
+      <w:r>
+        <w:rPr>
+          <w:rFonts w:ascii="Calibri" w:cs="Calibri" w:eastAsia="Calibri" w:hAnsi="Calibri"/>
+          <w:color w:val="1A1A1A"/>
+          <w:sz w:val="22"/>
+          <w:szCs w:val="22"/>
+        </w:rPr>
+        <w:t xml:space="preserve">Registro das falhas de acesso. Duas páginas oficiais consultadas estavam indisponíveis — a do Ministério do Turismo sobre o G20 (acesso restrito) e a do Observatório Legislativo da Câmara sobre violência e turismo (fora do ar). Ambas ficaram assinaladas nas referências. Apuração que não encontra a fonte registra a tentativa; não preenche a lacuna com estimativa.</w:t>
+      </w:r>
+    </w:p>
+    <w:p>
+      <w:pPr>
+        <w:spacing w:after="140" w:before="0" w:line="300"/>
+        <w:jc w:val="both"/>
+      </w:pPr>
+      <w:r>
+        <w:rPr>
+          <w:rFonts w:ascii="Calibri" w:cs="Calibri" w:eastAsia="Calibri" w:hAnsi="Calibri"/>
+          <w:color w:val="1A1A1A"/>
+          <w:sz w:val="22"/>
+          <w:szCs w:val="22"/>
+        </w:rPr>
+        <w:t xml:space="preserve">Há ainda um cuidado específico ao objeto. Impacto econômico, negócios gerados e movimentação financeira são metodologias distintas e não podem ser somadas num total único — erro comum na cobertura de eventos. Por isso a tabela de impactos desta pesquisa apresenta os valores lado a lado, com a natureza de cada um declarada, e não um número agregado.</w:t>
+      </w:r>
     </w:p>
     <w:p>
       <w:pPr>
@@ -6375,7 +7015,7 @@
           <w:sz w:val="24"/>
           <w:szCs w:val="24"/>
         </w:rPr>
-        <w:t xml:space="preserve">4.5. Síntese: onde este trabalho se encaixa</w:t>
+        <w:t xml:space="preserve">4.7. Por que a revista se adequa como produto de pesquisa</w:t>
       </w:r>
     </w:p>
     <w:p>
@@ -6390,7 +7030,187 @@
           <w:sz w:val="22"/>
           <w:szCs w:val="22"/>
         </w:rPr>
+        <w:t xml:space="preserve">A pergunta é legítima e tem resposta na literatura sobre o próprio ensino de jornalismo. O relatório de pesquisa de Gislene da Silva, do Departamento de Jornalismo da UFSC, mapeou três décadas de trabalhos de conclusão do curso e registra o produto jornalístico como a segunda modalidade mais frequente:</w:t>
+      </w:r>
+    </w:p>
+    <w:p>
+      <w:pPr>
+        <w:pBdr>
+          <w:left w:val="single" w:color="C8452F" w:sz="12" w:space="10"/>
+        </w:pBdr>
+        <w:spacing w:after="150" w:before="60" w:line="290"/>
+        <w:ind w:left="380" w:right="200"/>
+        <w:jc w:val="both"/>
+      </w:pPr>
+      <w:r>
+        <w:rPr>
+          <w:rFonts w:ascii="Calibri" w:cs="Calibri" w:eastAsia="Calibri" w:hAnsi="Calibri"/>
+          <w:i/>
+          <w:iCs/>
+          <w:color w:val="123A6B"/>
+          <w:sz w:val="21"/>
+          <w:szCs w:val="21"/>
+        </w:rPr>
+        <w:t xml:space="preserve">“O segundo tipo de trabalho mais encontrado foi produto jornalístico. Dentre os 72 finalizados, 18 eram documentários, o produto mais recorrente: em 2002 houve seis deles. Em segundo lugar, estão os websites, com 17 produções.”</w:t>
+      </w:r>
+      <w:r>
+        <w:rPr>
+          <w:rFonts w:ascii="Calibri" w:cs="Calibri" w:eastAsia="Calibri" w:hAnsi="Calibri"/>
+          <w:color w:val="4A5058"/>
+          <w:sz w:val="17"/>
+          <w:szCs w:val="17"/>
+        </w:rPr>
+        <w:t xml:space="preserve">  (SILVA, UFSC, 2020)</w:t>
+      </w:r>
+    </w:p>
+    <w:p>
+      <w:pPr>
+        <w:spacing w:after="140" w:before="0" w:line="300"/>
+        <w:jc w:val="both"/>
+      </w:pPr>
+      <w:r>
+        <w:rPr>
+          <w:rFonts w:ascii="Calibri" w:cs="Calibri" w:eastAsia="Calibri" w:hAnsi="Calibri"/>
+          <w:color w:val="1A1A1A"/>
+          <w:sz w:val="22"/>
+          <w:szCs w:val="22"/>
+        </w:rPr>
+        <w:t xml:space="preserve">O mesmo relatório propõe a definição de produto jornalístico que enquadra exatamente este TCC — e a revista aparece nomeada:</w:t>
+      </w:r>
+    </w:p>
+    <w:p>
+      <w:pPr>
+        <w:pBdr>
+          <w:left w:val="single" w:color="C8452F" w:sz="12" w:space="10"/>
+        </w:pBdr>
+        <w:spacing w:after="150" w:before="60" w:line="290"/>
+        <w:ind w:left="380" w:right="200"/>
+        <w:jc w:val="both"/>
+      </w:pPr>
+      <w:r>
+        <w:rPr>
+          <w:rFonts w:ascii="Calibri" w:cs="Calibri" w:eastAsia="Calibri" w:hAnsi="Calibri"/>
+          <w:i/>
+          <w:iCs/>
+          <w:color w:val="123A6B"/>
+          <w:sz w:val="21"/>
+          <w:szCs w:val="21"/>
+        </w:rPr>
+        <w:t xml:space="preserve">“Produto Jornalístico, incluindo todas as atividades em que o projeto jornalístico seja executado por completo, desde o projeto até a finalização, como a criação de um jornal ou revista ou de um documentário.”</w:t>
+      </w:r>
+      <w:r>
+        <w:rPr>
+          <w:rFonts w:ascii="Calibri" w:cs="Calibri" w:eastAsia="Calibri" w:hAnsi="Calibri"/>
+          <w:color w:val="4A5058"/>
+          <w:sz w:val="17"/>
+          <w:szCs w:val="17"/>
+        </w:rPr>
+        <w:t xml:space="preserve">  (SILVA, UFSC, 2020)</w:t>
+      </w:r>
+    </w:p>
+    <w:p>
+      <w:pPr>
+        <w:spacing w:after="130" w:line="270"/>
+        <w:ind w:left="240"/>
+        <w:jc w:val="left"/>
+      </w:pPr>
+      <w:r>
+        <w:rPr>
+          <w:rFonts w:ascii="Calibri" w:cs="Calibri" w:eastAsia="Calibri" w:hAnsi="Calibri"/>
+          <w:color w:val="4A5058"/>
+          <w:sz w:val="18"/>
+          <w:szCs w:val="18"/>
+        </w:rPr>
+        <w:t xml:space="preserve">→ SILVA, Gislene da. Relatório final: inserção dos TCCs do Curso de Jornalismo da UFSC no Repositório Institucional. UFSC, fev. 2020 — mapeamento de três décadas de TCCs e definição das modalidades </w:t>
+      </w:r>
+      <w:hyperlink w:history="1" r:id="rIdk-r_gknckmynb229c3yad">
+        <w:r>
+          <w:rPr>
+            <w:rFonts w:ascii="Calibri" w:cs="Calibri" w:eastAsia="Calibri" w:hAnsi="Calibri"/>
+            <w:color w:val="1155CC"/>
+            <w:sz w:val="17"/>
+            <w:szCs w:val="17"/>
+            <w:u w:val="single"/>
+          </w:rPr>
+          <w:t xml:space="preserve">https://repositorio.ufsc.br/bitstream/handle/123456789/209015/RELATORIO.pdf</w:t>
+        </w:r>
+      </w:hyperlink>
+    </w:p>
+    <w:p>
+      <w:pPr>
+        <w:spacing w:after="140" w:before="0" w:line="300"/>
+        <w:jc w:val="both"/>
+      </w:pPr>
+      <w:r>
+        <w:rPr>
+          <w:rFonts w:ascii="Calibri" w:cs="Calibri" w:eastAsia="Calibri" w:hAnsi="Calibri"/>
+          <w:color w:val="1A1A1A"/>
+          <w:sz w:val="22"/>
+          <w:szCs w:val="22"/>
+        </w:rPr>
+        <w:t xml:space="preserve">Três razões adicionais sustentam a escolha do formato para este objeto específico. Primeira, a natureza do material: uma série de oito anos com noventa e quatro medições mensais, cruzada com dezoito eventos, é densa demais para uma reportagem única e pobre demais para um livro — a revista, com sua estrutura de seções, comporta a divisão em eixos (o colapso, a cultura, os negócios, o recorde) sem perder a unidade. Segunda, a exigência de infografia: os dados só se tornam compreensíveis quando visualizados, e a revista é o veículo impresso que melhor integra gráfico, legenda e texto. Terceira, a destinação: o trabalho pretende servir de fonte confiável para coberturas jornalísticas sobre turismo, economia e cultura no Rio, conforme declarado nas contribuições do projeto, e uma revista circula entre esses profissionais de forma que uma monografia não circula.</w:t>
+      </w:r>
+    </w:p>
+    <w:p>
+      <w:pPr>
+        <w:spacing w:after="140" w:before="0" w:line="300"/>
+        <w:jc w:val="both"/>
+      </w:pPr>
+      <w:r>
+        <w:rPr>
+          <w:rFonts w:ascii="Calibri" w:cs="Calibri" w:eastAsia="Calibri" w:hAnsi="Calibri"/>
+          <w:color w:val="1A1A1A"/>
+          <w:sz w:val="22"/>
+          <w:szCs w:val="22"/>
+        </w:rPr>
+        <w:t xml:space="preserve">Vale registrar, por honestidade acadêmica, que o produto não substitui a pesquisa: ele a materializa. A revista das seis páginas é o resultado de um processo que inclui reconstituição de série histórica, levantamento de fontes oficiais, cruzamento de dados, revisão bibliográfica e entrevistas — todas as etapas descritas na Metodologia desta ficha. É a distinção entre um trabalho de produto e um trabalho apenas prático.</w:t>
+      </w:r>
+    </w:p>
+    <w:p>
+      <w:pPr>
+        <w:pStyle w:val="Heading2"/>
+        <w:spacing w:after="160" w:before="300"/>
+      </w:pPr>
+      <w:r>
+        <w:rPr>
+          <w:rFonts w:ascii="Calibri" w:cs="Calibri" w:eastAsia="Calibri" w:hAnsi="Calibri"/>
+          <w:b/>
+          <w:bCs/>
+          <w:color w:val="123A6B"/>
+          <w:sz w:val="24"/>
+          <w:szCs w:val="24"/>
+        </w:rPr>
+        <w:t xml:space="preserve">4.8. Síntese: onde este trabalho se encaixa</w:t>
+      </w:r>
+    </w:p>
+    <w:p>
+      <w:pPr>
+        <w:spacing w:after="140" w:before="0" w:line="300"/>
+        <w:jc w:val="both"/>
+      </w:pPr>
+      <w:r>
+        <w:rPr>
+          <w:rFonts w:ascii="Calibri" w:cs="Calibri" w:eastAsia="Calibri" w:hAnsi="Calibri"/>
+          <w:color w:val="1A1A1A"/>
+          <w:sz w:val="22"/>
+          <w:szCs w:val="22"/>
+        </w:rPr>
         <w:t xml:space="preserve">A literatura existente descreve o ciclo dos megaeventos de 2014 e 2016, o excesso de oferta hoteleira que o sucedeu e o impacto da pandemia sobre turismo e eventos. Não foi localizado, entre as referências consultadas, estudo que relacione o crescimento do fluxo turístico do Rio de Janeiro entre 2018 e 2025 ao calendário de grandes eventos, usando como instrumento de datação a série mensal produzida pela entidade do setor. É essa a contribuição original pretendida: demonstrar que a cidade passou a operar um calendário de eventos como política de fomento ao turismo, e que esse arranjo — e não um megaevento isolado — acompanhou o melhor desempenho turístico já registrado, com 12,5 milhões de visitantes e R$ 27,2 bilhões movimentados em 2025.</w:t>
+      </w:r>
+    </w:p>
+    <w:p>
+      <w:pPr>
+        <w:spacing w:after="140" w:before="0" w:line="300"/>
+        <w:jc w:val="both"/>
+      </w:pPr>
+      <w:r>
+        <w:rPr>
+          <w:rFonts w:ascii="Calibri" w:cs="Calibri" w:eastAsia="Calibri" w:hAnsi="Calibri"/>
+          <w:color w:val="1A1A1A"/>
+          <w:sz w:val="22"/>
+          <w:szCs w:val="22"/>
+        </w:rPr>
+        <w:t xml:space="preserve">Do ponto de vista do jornalismo, a contribuição é de outra ordem e igualmente verificável: organizar, em um único produto, uma série de dados dispersos em releases oficiais, estudos de impacto e pesquisas setoriais, com a origem de cada número declarada. É o que a revista entrega e o que o Quadro de conferência desta ficha torna auditável.</w:t>
       </w:r>
     </w:p>
     <w:p>
@@ -7565,7 +8385,7 @@
         </w:rPr>
         <w:t xml:space="preserve">→ Prefeitura do Rio (SMTUR-Rio, SMDE, Riotur / IFec RJ), 19 jan. 2026 </w:t>
       </w:r>
-      <w:hyperlink w:history="1" r:id="rId1nhtfaadjgklzjgwdnonz">
+      <w:hyperlink w:history="1" r:id="rIdei5tdqcpkwpcebc5ivgv9">
         <w:r>
           <w:rPr>
             <w:rFonts w:ascii="Calibri" w:cs="Calibri" w:eastAsia="Calibri" w:hAnsi="Calibri"/>
@@ -7638,7 +8458,7 @@
         </w:rPr>
         <w:t xml:space="preserve">→ Hotéis do Rio que receberão comitivas do G20 atingem 95% de ocupação — dados HotéisRIO/ABIH-RJ (PANROTAS, 14 nov. 2024) </w:t>
       </w:r>
-      <w:hyperlink w:history="1" r:id="rIdla7fr404-tjn_ejz-gpj2">
+      <w:hyperlink w:history="1" r:id="rIdo8rikpknsscxnodv5v91j">
         <w:r>
           <w:rPr>
             <w:rFonts w:ascii="Calibri" w:cs="Calibri" w:eastAsia="Calibri" w:hAnsi="Calibri"/>
@@ -7681,7 +8501,7 @@
         </w:rPr>
         <w:t xml:space="preserve">→ Rio Innovation Week impulsiona ocupação hoteleira no Rio, aponta HotéisRIO — Mercado &amp; Eventos, 2025 </w:t>
       </w:r>
-      <w:hyperlink w:history="1" r:id="rIdpqidokxsdbb4zesukdp97">
+      <w:hyperlink w:history="1" r:id="rIdta_wts7490bf3dok_x_f6">
         <w:r>
           <w:rPr>
             <w:rFonts w:ascii="Calibri" w:cs="Calibri" w:eastAsia="Calibri" w:hAnsi="Calibri"/>
@@ -8239,6 +9059,134 @@
           <w:szCs w:val="18"/>
         </w:rPr>
         <w:t xml:space="preserve">MUNARI, Bruno. Das coisas nascem coisas. Tradução: José Manuel de Vasconcelos. 3. ed. São Paulo: Martins Fontes, 2015.</w:t>
+      </w:r>
+    </w:p>
+    <w:p>
+      <w:pPr>
+        <w:spacing w:after="130" w:before="0" w:line="300"/>
+        <w:ind w:left="200" w:hanging="200"/>
+        <w:jc w:val="both"/>
+      </w:pPr>
+      <w:r>
+        <w:rPr>
+          <w:rFonts w:ascii="Calibri" w:cs="Calibri" w:eastAsia="Calibri" w:hAnsi="Calibri"/>
+          <w:color w:val="1A1A1A"/>
+          <w:sz w:val="18"/>
+          <w:szCs w:val="18"/>
+        </w:rPr>
+        <w:t xml:space="preserve">VILAS BOAS, Sergio. O estilo magazine: o texto em revista. São Paulo: Summus, 1996.</w:t>
+      </w:r>
+    </w:p>
+    <w:p>
+      <w:pPr>
+        <w:spacing w:after="130" w:before="0" w:line="300"/>
+        <w:ind w:left="200" w:hanging="200"/>
+        <w:jc w:val="both"/>
+      </w:pPr>
+      <w:r>
+        <w:rPr>
+          <w:rFonts w:ascii="Calibri" w:cs="Calibri" w:eastAsia="Calibri" w:hAnsi="Calibri"/>
+          <w:color w:val="1A1A1A"/>
+          <w:sz w:val="18"/>
+          <w:szCs w:val="18"/>
+        </w:rPr>
+        <w:t xml:space="preserve">SODRÉ, Muniz; FERRARI, Maria Helena. Técnica de reportagem: notas sobre a narrativa jornalística. São Paulo: Summus, 1986.</w:t>
+      </w:r>
+    </w:p>
+    <w:p>
+      <w:pPr>
+        <w:spacing w:after="130" w:before="0" w:line="300"/>
+        <w:ind w:left="200" w:hanging="200"/>
+        <w:jc w:val="both"/>
+      </w:pPr>
+      <w:r>
+        <w:rPr>
+          <w:rFonts w:ascii="Calibri" w:cs="Calibri" w:eastAsia="Calibri" w:hAnsi="Calibri"/>
+          <w:color w:val="1A1A1A"/>
+          <w:sz w:val="18"/>
+          <w:szCs w:val="18"/>
+        </w:rPr>
+        <w:t xml:space="preserve">MEDINA, Cremilda. Entrevista: o diálogo possível. São Paulo: Ática. (Citada a partir de MARIANO, 2018, que utiliza a edição de 1995, p. 30-31.)</w:t>
+      </w:r>
+    </w:p>
+    <w:p>
+      <w:pPr>
+        <w:spacing w:after="130" w:before="0" w:line="300"/>
+        <w:ind w:left="200" w:hanging="200"/>
+        <w:jc w:val="both"/>
+      </w:pPr>
+      <w:r>
+        <w:rPr>
+          <w:rFonts w:ascii="Calibri" w:cs="Calibri" w:eastAsia="Calibri" w:hAnsi="Calibri"/>
+          <w:color w:val="1A1A1A"/>
+          <w:sz w:val="18"/>
+          <w:szCs w:val="18"/>
+        </w:rPr>
+        <w:t xml:space="preserve">LAGE, Nilson. A reportagem: teoria e técnica de entrevista e pesquisa jornalística. Rio de Janeiro: Record, 2001. (Citada a partir de MARIANO, 2018, p. 237-238.)</w:t>
+      </w:r>
+    </w:p>
+    <w:p>
+      <w:pPr>
+        <w:spacing w:after="130" w:before="0" w:line="300"/>
+        <w:ind w:left="200" w:hanging="200"/>
+        <w:jc w:val="both"/>
+      </w:pPr>
+      <w:r>
+        <w:rPr>
+          <w:rFonts w:ascii="Calibri" w:cs="Calibri" w:eastAsia="Calibri" w:hAnsi="Calibri"/>
+          <w:color w:val="1A1A1A"/>
+          <w:sz w:val="18"/>
+          <w:szCs w:val="18"/>
+        </w:rPr>
+        <w:t xml:space="preserve">MARIANO, Agnes Francine de Carvalho. A entrevista como tema de pesquisa no campo da comunicação. Revista FAMECOS: mídia, cultura e tecnologia, v. 25, n. 2, 2018. DOI: 10.15448/1980-3729.2018.2.28307. Disponível em: https://www.redalyc.org/journal/4955/495557631006/html/. Acesso em: 16 set. 2026.</w:t>
+      </w:r>
+    </w:p>
+    <w:p>
+      <w:pPr>
+        <w:spacing w:after="130" w:before="0" w:line="300"/>
+        <w:ind w:left="200" w:hanging="200"/>
+        <w:jc w:val="both"/>
+      </w:pPr>
+      <w:r>
+        <w:rPr>
+          <w:rFonts w:ascii="Calibri" w:cs="Calibri" w:eastAsia="Calibri" w:hAnsi="Calibri"/>
+          <w:color w:val="1A1A1A"/>
+          <w:sz w:val="18"/>
+          <w:szCs w:val="18"/>
+        </w:rPr>
+        <w:t xml:space="preserve">SOARES, Lenise Slawski; NEGRINI, Michele. As técnicas de entrevista utilizadas pelos jornalistas do Jornal Nacional com os presidenciáveis 2018. Revista Alterjor, v. 22, n. 2, p. 230-255, 2020. DOI: 10.11606/issn.2176-1507.v22i2p230-255. Disponível em: https://revistas.usp.br/alterjor/article/view/171023. Acesso em: 16 set. 2026.</w:t>
+      </w:r>
+    </w:p>
+    <w:p>
+      <w:pPr>
+        <w:spacing w:after="130" w:before="0" w:line="300"/>
+        <w:ind w:left="200" w:hanging="200"/>
+        <w:jc w:val="both"/>
+      </w:pPr>
+      <w:r>
+        <w:rPr>
+          <w:rFonts w:ascii="Calibri" w:cs="Calibri" w:eastAsia="Calibri" w:hAnsi="Calibri"/>
+          <w:color w:val="1A1A1A"/>
+          <w:sz w:val="18"/>
+          <w:szCs w:val="18"/>
+        </w:rPr>
+        <w:t xml:space="preserve">SILVA, Gislene da. Relatório final: inserção dos Trabalhos de Conclusão de Curso (TCCs) do Curso de Jornalismo da UFSC no Repositório Institucional da Biblioteca Universitária. Florianópolis: Departamento de Jornalismo, UFSC, fev. 2020. Disponível em: https://repositorio.ufsc.br/bitstream/handle/123456789/209015/RELATORIO.pdf. Acesso em: 16 set. 2026.</w:t>
+      </w:r>
+    </w:p>
+    <w:p>
+      <w:pPr>
+        <w:spacing w:after="130" w:before="0" w:line="300"/>
+        <w:ind w:left="200" w:hanging="200"/>
+        <w:jc w:val="both"/>
+      </w:pPr>
+      <w:r>
+        <w:rPr>
+          <w:rFonts w:ascii="Calibri" w:cs="Calibri" w:eastAsia="Calibri" w:hAnsi="Calibri"/>
+          <w:color w:val="1A1A1A"/>
+          <w:sz w:val="18"/>
+          <w:szCs w:val="18"/>
+        </w:rPr>
+        <w:t xml:space="preserve">JORNALISMO Literário: revisão conceitual, história e novas perspectivas. Intercom — Revista Brasileira de Ciências da Comunicação, v. 40, n. 3, p. 21-36, set./dez. 2017. Disponível em: https://www.scielo.br/j/interc/a/YywYmt85GZrc4NRsjHytXYm/?lang=pt. Acesso em: 16 set. 2026.</w:t>
       </w:r>
     </w:p>
     <w:p>
@@ -9005,7 +9953,7 @@
                 <w:sz w:val="15"/>
                 <w:szCs w:val="15"/>
               </w:rPr>
-              <w:t xml:space="preserve">Rio recebeu 12,5 milhões de visitantes em 2025, que movimentaram R$ 27,2 bilhões; fluxo internacional cresceu 44,8%</w:t>
+              <w:t xml:space="preserve">Produto jornalístico é a segunda modalidade mais frequente nos TCCs de Jornalismo, e a revista está nomeada na definição da modalidade</w:t>
             </w:r>
           </w:p>
         </w:tc>
@@ -9031,22 +9979,22 @@
                 <w:sz w:val="15"/>
                 <w:szCs w:val="15"/>
               </w:rPr>
-              <w:t xml:space="preserve">Prefeitura do Rio (SMTUR-Rio, SMDE, Riotur / IFec RJ), 19 jan. 2026</w:t>
-            </w:r>
-          </w:p>
-          <w:p>
-            <w:pPr>
-              <w:spacing w:after="0" w:line="250"/>
-              <w:jc w:val="left"/>
-            </w:pPr>
-            <w:r>
-              <w:rPr>
-                <w:rFonts w:ascii="Calibri" w:cs="Calibri" w:eastAsia="Calibri" w:hAnsi="Calibri"/>
-                <w:color w:val="1A1A1A"/>
-                <w:sz w:val="15"/>
-                <w:szCs w:val="15"/>
-              </w:rPr>
-              <w:t xml:space="preserve">https://prefeitura.rio/cidade/recorde-no-rio-cidade-recebeu-125-milhoes-de-visitantes-em-2025-que-movimentaram-r-272-bilhoes-na-economia/</w:t>
+              <w:t xml:space="preserve">SILVA, Gislene da (UFSC, fev. 2020) — relatório de pesquisa do Departamento de Jornalismo</w:t>
+            </w:r>
+          </w:p>
+          <w:p>
+            <w:pPr>
+              <w:spacing w:after="0" w:line="250"/>
+              <w:jc w:val="left"/>
+            </w:pPr>
+            <w:r>
+              <w:rPr>
+                <w:rFonts w:ascii="Calibri" w:cs="Calibri" w:eastAsia="Calibri" w:hAnsi="Calibri"/>
+                <w:color w:val="1A1A1A"/>
+                <w:sz w:val="15"/>
+                <w:szCs w:val="15"/>
+              </w:rPr>
+              <w:t xml:space="preserve">https://repositorio.ufsc.br/bitstream/handle/123456789/209015/RELATORIO.pdf</w:t>
             </w:r>
           </w:p>
         </w:tc>
@@ -9072,7 +10020,7 @@
                 <w:sz w:val="15"/>
                 <w:szCs w:val="15"/>
               </w:rPr>
-              <w:t xml:space="preserve">"a cidade do Rio recebeu 12,5 milhões de turistas", sendo "10,5 milhões (83,1%), de visitantes nacionais e 2,1 milhões (16,9%) de estrangeiros", com "uma movimentação total de R$ 27,2 bilhões" (PREFEITURA DO RIO, 2026)</w:t>
+              <w:t xml:space="preserve">"O segundo tipo de trabalho mais encontrado foi produto jornalístico. Dentre os 72 finalizados, 18 eram documentários, o produto mais recorrente"; a modalidade é definida como aquela "em que o projeto jornalístico seja executado por completo, desde o projeto até a finalização, como a criação de um jornal ou revista ou de um documentário" (SILVA, 2020).</w:t>
             </w:r>
           </w:p>
         </w:tc>
@@ -9101,7 +10049,7 @@
                 <w:sz w:val="15"/>
                 <w:szCs w:val="15"/>
               </w:rPr>
-              <w:t xml:space="preserve">Chegada de estrangeiros ao Rio cresceu 51,7% em 2025, sobre 1.528.133 desembarques em 2024</w:t>
+              <w:t xml:space="preserve">O jornalista deve conduzir a entrevista, e não ser conduzido pelo entrevistado</w:t>
             </w:r>
           </w:p>
         </w:tc>
@@ -9128,22 +10076,22 @@
                 <w:sz w:val="15"/>
                 <w:szCs w:val="15"/>
               </w:rPr>
-              <w:t xml:space="preserve">Embratur, 7 out. 2025</w:t>
-            </w:r>
-          </w:p>
-          <w:p>
-            <w:pPr>
-              <w:spacing w:after="0" w:line="250"/>
-              <w:jc w:val="left"/>
-            </w:pPr>
-            <w:r>
-              <w:rPr>
-                <w:rFonts w:ascii="Calibri" w:cs="Calibri" w:eastAsia="Calibri" w:hAnsi="Calibri"/>
-                <w:color w:val="1A1A1A"/>
-                <w:sz w:val="15"/>
-                <w:szCs w:val="15"/>
-              </w:rPr>
-              <w:t xml:space="preserve">https://embratur.com.br/2025/10/07/rio-de-janeiro-registra-aumento-de-517-na-chegada-de-turistas-estrangeiros-em-2025-e-celebra-recorde-historico-de-visitantes/</w:t>
+              <w:t xml:space="preserve">LAGE, Nilson (2001), citado por MARIANO (2018), Revista FAMECOS, v. 25, n. 2</w:t>
+            </w:r>
+          </w:p>
+          <w:p>
+            <w:pPr>
+              <w:spacing w:after="0" w:line="250"/>
+              <w:jc w:val="left"/>
+            </w:pPr>
+            <w:r>
+              <w:rPr>
+                <w:rFonts w:ascii="Calibri" w:cs="Calibri" w:eastAsia="Calibri" w:hAnsi="Calibri"/>
+                <w:color w:val="1A1A1A"/>
+                <w:sz w:val="15"/>
+                <w:szCs w:val="15"/>
+              </w:rPr>
+              <w:t xml:space="preserve">https://www.redalyc.org/journal/4955/495557631006/html/</w:t>
             </w:r>
           </w:p>
         </w:tc>
@@ -9170,7 +10118,7 @@
                 <w:sz w:val="15"/>
                 <w:szCs w:val="15"/>
               </w:rPr>
-              <w:t xml:space="preserve">Segundo a Embratur (2025), o Rio de Janeiro registrou aumento de 51,7% na chegada de turistas estrangeiros em 2025, sobre a base de 1.528.133 desembarques internacionais em 2024.</w:t>
+              <w:t xml:space="preserve">"O jornalista tem de conduzir a entrevista para onde quer, e não deixar-se conduzir pelo entrevistado" (LAGE, 2001, p. 237-238 apud MARIANO, 2018).</w:t>
             </w:r>
           </w:p>
         </w:tc>
@@ -9198,7 +10146,7 @@
                 <w:sz w:val="15"/>
                 <w:szCs w:val="15"/>
               </w:rPr>
-              <w:t xml:space="preserve">Brasil fechou 2025 com recorde de 9,3 milhões de turistas internacionais (+37,1%)</w:t>
+              <w:t xml:space="preserve">A entrevista pode produzir uma interação social criadora</w:t>
             </w:r>
           </w:p>
         </w:tc>
@@ -9224,22 +10172,22 @@
                 <w:sz w:val="15"/>
                 <w:szCs w:val="15"/>
               </w:rPr>
-              <w:t xml:space="preserve">Secom / Presidência da Republica, jan. 2026</w:t>
-            </w:r>
-          </w:p>
-          <w:p>
-            <w:pPr>
-              <w:spacing w:after="0" w:line="250"/>
-              <w:jc w:val="left"/>
-            </w:pPr>
-            <w:r>
-              <w:rPr>
-                <w:rFonts w:ascii="Calibri" w:cs="Calibri" w:eastAsia="Calibri" w:hAnsi="Calibri"/>
-                <w:color w:val="1A1A1A"/>
-                <w:sz w:val="15"/>
-                <w:szCs w:val="15"/>
-              </w:rPr>
-              <w:t xml:space="preserve">https://www.gov.br/secom/pt-br/acompanhe-a-secom/noticias/2026/01/brasil-alcanca-recorde-historico-e-fecha-2025-com-9-3-milhoes-de-turistas-internacionais</w:t>
+              <w:t xml:space="preserve">MEDINA, Cremilda (Entrevista: o diálogo possível), citada por MARIANO (2018)</w:t>
+            </w:r>
+          </w:p>
+          <w:p>
+            <w:pPr>
+              <w:spacing w:after="0" w:line="250"/>
+              <w:jc w:val="left"/>
+            </w:pPr>
+            <w:r>
+              <w:rPr>
+                <w:rFonts w:ascii="Calibri" w:cs="Calibri" w:eastAsia="Calibri" w:hAnsi="Calibri"/>
+                <w:color w:val="1A1A1A"/>
+                <w:sz w:val="15"/>
+                <w:szCs w:val="15"/>
+              </w:rPr>
+              <w:t xml:space="preserve">https://www.redalyc.org/journal/4955/495557631006/html/</w:t>
             </w:r>
           </w:p>
         </w:tc>
@@ -9265,7 +10213,7 @@
                 <w:sz w:val="15"/>
                 <w:szCs w:val="15"/>
               </w:rPr>
-              <w:t xml:space="preserve">O Brasil registrou 9.287.196 chegadas de turistas estrangeiros em 2025, "o maior volume já observado na série histórica", com crescimento de 37,1% sobre 2024 (BRASIL, 2026).</w:t>
+              <w:t xml:space="preserve">"Haverá até a possibilidade de acontecer um ato culminante que se pode nomear como interação social criadora" (MEDINA, 1995, p. 30-31 apud MARIANO, 2018).</w:t>
             </w:r>
           </w:p>
         </w:tc>
@@ -9294,7 +10242,7 @@
                 <w:sz w:val="15"/>
                 <w:szCs w:val="15"/>
               </w:rPr>
-              <w:t xml:space="preserve">Brasil fechou 2024 com recorde de 6,65 milhões de estrangeiros (+12,6%)</w:t>
+              <w:t xml:space="preserve">A entrevista é pouco teorizada no campo da comunicação</w:t>
             </w:r>
           </w:p>
         </w:tc>
@@ -9321,22 +10269,22 @@
                 <w:sz w:val="15"/>
                 <w:szCs w:val="15"/>
               </w:rPr>
-              <w:t xml:space="preserve">Agência Gov / Ministério do Turismo, jan. 2025</w:t>
-            </w:r>
-          </w:p>
-          <w:p>
-            <w:pPr>
-              <w:spacing w:after="0" w:line="250"/>
-              <w:jc w:val="left"/>
-            </w:pPr>
-            <w:r>
-              <w:rPr>
-                <w:rFonts w:ascii="Calibri" w:cs="Calibri" w:eastAsia="Calibri" w:hAnsi="Calibri"/>
-                <w:color w:val="1A1A1A"/>
-                <w:sz w:val="15"/>
-                <w:szCs w:val="15"/>
-              </w:rPr>
-              <w:t xml:space="preserve">https://agenciagov.ebc.com.br/noticias/202501/brasil-encerra-2024-com-recorde-de-6-65-milhoes-de-turistas-estrangeiros-alta-de-12-6</w:t>
+              <w:t xml:space="preserve">MARIANO, Agnes Francine de Carvalho (2018), Revista FAMECOS, v. 25, n. 2, DOI 10.15448/1980-3729.2018.2.28307</w:t>
+            </w:r>
+          </w:p>
+          <w:p>
+            <w:pPr>
+              <w:spacing w:after="0" w:line="250"/>
+              <w:jc w:val="left"/>
+            </w:pPr>
+            <w:r>
+              <w:rPr>
+                <w:rFonts w:ascii="Calibri" w:cs="Calibri" w:eastAsia="Calibri" w:hAnsi="Calibri"/>
+                <w:color w:val="1A1A1A"/>
+                <w:sz w:val="15"/>
+                <w:szCs w:val="15"/>
+              </w:rPr>
+              <w:t xml:space="preserve">https://www.redalyc.org/journal/4955/495557631006/html/</w:t>
             </w:r>
           </w:p>
         </w:tc>
@@ -9363,7 +10311,7 @@
                 <w:sz w:val="15"/>
                 <w:szCs w:val="15"/>
               </w:rPr>
-              <w:t xml:space="preserve">"Brasil encerra 2024 com recorde de 6,65 milhões de turistas estrangeiros, alta de 12,6%" (AGÊNCIA GOV, 2025).</w:t>
+              <w:t xml:space="preserve">"A entrevista vem sendo estudada de forma esporádica e fragmentada. São poucos os livros e artigos que tratam do tema" (MARIANO, 2018).</w:t>
             </w:r>
           </w:p>
         </w:tc>
@@ -9391,7 +10339,7 @@
                 <w:sz w:val="15"/>
                 <w:szCs w:val="15"/>
               </w:rPr>
-              <w:t xml:space="preserve">Turismo internacional injetou R$ 34,5 bilhões no Brasil em 2023, com chegadas em 93% do nivel de 2019</w:t>
+              <w:t xml:space="preserve">O estilo magazine: o texto de revista como território privilegiado da reportagem</w:t>
             </w:r>
           </w:p>
         </w:tc>
@@ -9417,22 +10365,22 @@
                 <w:sz w:val="15"/>
                 <w:szCs w:val="15"/>
               </w:rPr>
-              <w:t xml:space="preserve">Agência Gov / Ministério do Turismo, fev. 2024</w:t>
-            </w:r>
-          </w:p>
-          <w:p>
-            <w:pPr>
-              <w:spacing w:after="0" w:line="250"/>
-              <w:jc w:val="left"/>
-            </w:pPr>
-            <w:r>
-              <w:rPr>
-                <w:rFonts w:ascii="Calibri" w:cs="Calibri" w:eastAsia="Calibri" w:hAnsi="Calibri"/>
-                <w:color w:val="1A1A1A"/>
-                <w:sz w:val="15"/>
-                <w:szCs w:val="15"/>
-              </w:rPr>
-              <w:t xml:space="preserve">https://agenciagov.ebc.com.br/noticias/202402/recorde-historico-turismo-internacional-injeta-r-34-5-bilhoes-na-economia-brasileira-em-2023</w:t>
+              <w:t xml:space="preserve">VILAS BOAS, Sergio (1996) e SODRÉ; FERRARI (1986), discutidos em artigo da Intercom/SciELO</w:t>
+            </w:r>
+          </w:p>
+          <w:p>
+            <w:pPr>
+              <w:spacing w:after="0" w:line="250"/>
+              <w:jc w:val="left"/>
+            </w:pPr>
+            <w:r>
+              <w:rPr>
+                <w:rFonts w:ascii="Calibri" w:cs="Calibri" w:eastAsia="Calibri" w:hAnsi="Calibri"/>
+                <w:color w:val="1A1A1A"/>
+                <w:sz w:val="15"/>
+                <w:szCs w:val="15"/>
+              </w:rPr>
+              <w:t xml:space="preserve">https://www.scielo.br/j/interc/a/YywYmt85GZrc4NRsjHytXYm/?lang=pt</w:t>
             </w:r>
           </w:p>
         </w:tc>
@@ -9458,7 +10406,7 @@
                 <w:sz w:val="15"/>
                 <w:szCs w:val="15"/>
               </w:rPr>
-              <w:t xml:space="preserve">Em 2023 o turismo internacional injetou R$ 34,5 bilhões na economia brasileira, e o volume de chegadas correspondeu a 93% do registrado em 2019 (AGÊNCIA GOV, 2024).</w:t>
+              <w:t xml:space="preserve">O gênero é considerado o mais nobre por Vilas Boas (1996) e ocupa lugar privilegiado no jornalismo segundo Sodré e Ferrari (1986).</w:t>
             </w:r>
           </w:p>
         </w:tc>
@@ -9487,7 +10435,7 @@
                 <w:sz w:val="15"/>
                 <w:szCs w:val="15"/>
               </w:rPr>
-              <w:t xml:space="preserve">Chegadas internacionais cairam 66% em 2020 e 88% em 2021 (745,8 mil turistas)</w:t>
+              <w:t xml:space="preserve">Rio recebeu 12,5 milhões de visitantes em 2025, que movimentaram R$ 27,2 bilhões; fluxo internacional cresceu 44,8%</w:t>
             </w:r>
           </w:p>
         </w:tc>
@@ -9514,22 +10462,22 @@
                 <w:sz w:val="15"/>
                 <w:szCs w:val="15"/>
               </w:rPr>
-              <w:t xml:space="preserve">Embratur / MTur / Policia Federal, 20 out. 2022</w:t>
-            </w:r>
-          </w:p>
-          <w:p>
-            <w:pPr>
-              <w:spacing w:after="0" w:line="250"/>
-              <w:jc w:val="left"/>
-            </w:pPr>
-            <w:r>
-              <w:rPr>
-                <w:rFonts w:ascii="Calibri" w:cs="Calibri" w:eastAsia="Calibri" w:hAnsi="Calibri"/>
-                <w:color w:val="1A1A1A"/>
-                <w:sz w:val="15"/>
-                <w:szCs w:val="15"/>
-              </w:rPr>
-              <w:t xml:space="preserve">https://embratur.com.br/2022/10/20/com-pandemia-brasil-registra-em-dois-anos-a-chegada-de-29-milhoes-de-turistas-internacionais/</w:t>
+              <w:t xml:space="preserve">Prefeitura do Rio (SMTUR-Rio, SMDE, Riotur / IFec RJ), 19 jan. 2026</w:t>
+            </w:r>
+          </w:p>
+          <w:p>
+            <w:pPr>
+              <w:spacing w:after="0" w:line="250"/>
+              <w:jc w:val="left"/>
+            </w:pPr>
+            <w:r>
+              <w:rPr>
+                <w:rFonts w:ascii="Calibri" w:cs="Calibri" w:eastAsia="Calibri" w:hAnsi="Calibri"/>
+                <w:color w:val="1A1A1A"/>
+                <w:sz w:val="15"/>
+                <w:szCs w:val="15"/>
+              </w:rPr>
+              <w:t xml:space="preserve">https://prefeitura.rio/cidade/recorde-no-rio-cidade-recebeu-125-milhoes-de-visitantes-em-2025-que-movimentaram-r-272-bilhoes-na-economia/</w:t>
             </w:r>
           </w:p>
         </w:tc>
@@ -9556,7 +10504,7 @@
                 <w:sz w:val="15"/>
                 <w:szCs w:val="15"/>
               </w:rPr>
-              <w:t xml:space="preserve">Com a pandemia, as chegadas de turistas internacionais ao Brasil cairam de 6,3 milhões em 2019 para 2,1 milhões em 2020, e em 2021 o pais recebeu 745,8 mil visitantes estrangeiros - queda de 88% em relação a 2019 (EMBRATUR, 2022).</w:t>
+              <w:t xml:space="preserve">"a cidade do Rio recebeu 12,5 milhões de turistas", sendo "10,5 milhões (83,1%), de visitantes nacionais e 2,1 milhões (16,9%) de estrangeiros", com "uma movimentação total de R$ 27,2 bilhões" (PREFEITURA DO RIO, 2026)</w:t>
             </w:r>
           </w:p>
         </w:tc>
@@ -9584,7 +10532,7 @@
                 <w:sz w:val="15"/>
                 <w:szCs w:val="15"/>
               </w:rPr>
-              <w:t xml:space="preserve">Violência urbana custou R$ 657 milhões ao turismo fluminense entre janeiro e agosto de 2017</w:t>
+              <w:t xml:space="preserve">Chegada de estrangeiros ao Rio cresceu 51,7% em 2025, sobre 1.528.133 desembarques em 2024</w:t>
             </w:r>
           </w:p>
         </w:tc>
@@ -9610,22 +10558,22 @@
                 <w:sz w:val="15"/>
                 <w:szCs w:val="15"/>
               </w:rPr>
-              <w:t xml:space="preserve">Agência Brasil, com estimativa da CNC, out. 2017</w:t>
-            </w:r>
-          </w:p>
-          <w:p>
-            <w:pPr>
-              <w:spacing w:after="0" w:line="250"/>
-              <w:jc w:val="left"/>
-            </w:pPr>
-            <w:r>
-              <w:rPr>
-                <w:rFonts w:ascii="Calibri" w:cs="Calibri" w:eastAsia="Calibri" w:hAnsi="Calibri"/>
-                <w:color w:val="1A1A1A"/>
-                <w:sz w:val="15"/>
-                <w:szCs w:val="15"/>
-              </w:rPr>
-              <w:t xml:space="preserve">https://agenciabrasil.ebc.com.br/economia/noticia/2017-10/rio-perdeu-r-657-milhoes-em-turismo-por-causa-da-violencia-diz-cnc</w:t>
+              <w:t xml:space="preserve">Embratur, 7 out. 2025</w:t>
+            </w:r>
+          </w:p>
+          <w:p>
+            <w:pPr>
+              <w:spacing w:after="0" w:line="250"/>
+              <w:jc w:val="left"/>
+            </w:pPr>
+            <w:r>
+              <w:rPr>
+                <w:rFonts w:ascii="Calibri" w:cs="Calibri" w:eastAsia="Calibri" w:hAnsi="Calibri"/>
+                <w:color w:val="1A1A1A"/>
+                <w:sz w:val="15"/>
+                <w:szCs w:val="15"/>
+              </w:rPr>
+              <w:t xml:space="preserve">https://embratur.com.br/2025/10/07/rio-de-janeiro-registra-aumento-de-517-na-chegada-de-turistas-estrangeiros-em-2025-e-celebra-recorde-historico-de-visitantes/</w:t>
             </w:r>
           </w:p>
         </w:tc>
@@ -9651,7 +10599,7 @@
                 <w:sz w:val="15"/>
                 <w:szCs w:val="15"/>
               </w:rPr>
-              <w:t xml:space="preserve">Segundo estimativa da Confederação Nacional do Comércio, a criminalidade provocou queda de R$ 657 milhões nas receitas do turismo fluminense entre janeiro e agosto de 2017, sendo que "para cada aumento de 10% na criminalidade, a receita bruta das empresas que compoem a atividade turística do Estado recua, em média, 1,8%" (AGÊNCIA BRASIL, 2017).</w:t>
+              <w:t xml:space="preserve">Segundo a Embratur (2025), o Rio de Janeiro registrou aumento de 51,7% na chegada de turistas estrangeiros em 2025, sobre a base de 1.528.133 desembarques internacionais em 2024.</w:t>
             </w:r>
           </w:p>
         </w:tc>
@@ -9680,7 +10628,7 @@
                 <w:sz w:val="15"/>
                 <w:szCs w:val="15"/>
               </w:rPr>
-              <w:t xml:space="preserve">Ocupação hoteleira do Rio caiu de cerca de 70% em março de 2020 para cerca de 5% em abril; prejuizo de R$ 1,6 bilhão em doze meses</w:t>
+              <w:t xml:space="preserve">Brasil fechou 2025 com recorde de 9,3 milhões de turistas internacionais (+37,1%)</w:t>
             </w:r>
           </w:p>
         </w:tc>
@@ -9707,22 +10655,22 @@
                 <w:sz w:val="15"/>
                 <w:szCs w:val="15"/>
               </w:rPr>
-              <w:t xml:space="preserve">PANROTAS, com balanco do HotéisRIO, abr. 2021</w:t>
-            </w:r>
-          </w:p>
-          <w:p>
-            <w:pPr>
-              <w:spacing w:after="0" w:line="250"/>
-              <w:jc w:val="left"/>
-            </w:pPr>
-            <w:r>
-              <w:rPr>
-                <w:rFonts w:ascii="Calibri" w:cs="Calibri" w:eastAsia="Calibri" w:hAnsi="Calibri"/>
-                <w:color w:val="1A1A1A"/>
-                <w:sz w:val="15"/>
-                <w:szCs w:val="15"/>
-              </w:rPr>
-              <w:t xml:space="preserve">https://www.panrotas.com.br/hotelaria/mercado/2021/04/hotelaria-do-rio-registra-prejuizo-de-r-16-bi-em-um-ano_180799.html</w:t>
+              <w:t xml:space="preserve">Secom / Presidência da Republica, jan. 2026</w:t>
+            </w:r>
+          </w:p>
+          <w:p>
+            <w:pPr>
+              <w:spacing w:after="0" w:line="250"/>
+              <w:jc w:val="left"/>
+            </w:pPr>
+            <w:r>
+              <w:rPr>
+                <w:rFonts w:ascii="Calibri" w:cs="Calibri" w:eastAsia="Calibri" w:hAnsi="Calibri"/>
+                <w:color w:val="1A1A1A"/>
+                <w:sz w:val="15"/>
+                <w:szCs w:val="15"/>
+              </w:rPr>
+              <w:t xml:space="preserve">https://www.gov.br/secom/pt-br/acompanhe-a-secom/noticias/2026/01/brasil-alcanca-recorde-historico-e-fecha-2025-com-9-3-milhoes-de-turistas-internacionais</w:t>
             </w:r>
           </w:p>
         </w:tc>
@@ -9749,7 +10697,7 @@
                 <w:sz w:val="15"/>
                 <w:szCs w:val="15"/>
               </w:rPr>
-              <w:t xml:space="preserve">A ocupação da rede hoteleira carioca caiu de cerca de 70% no inicio de março de 2020 para aproximadamente 5% em abril, e a rede acumulou prejuizo de aproximadamente R$ 1,6 bilhão em doze meses (HotéisRIO apud PANROTAS, 2021).</w:t>
+              <w:t xml:space="preserve">O Brasil registrou 9.287.196 chegadas de turistas estrangeiros em 2025, "o maior volume já observado na série histórica", com crescimento de 37,1% sobre 2024 (BRASIL, 2026).</w:t>
             </w:r>
           </w:p>
         </w:tc>
@@ -9777,7 +10725,7 @@
                 <w:sz w:val="15"/>
                 <w:szCs w:val="15"/>
               </w:rPr>
-              <w:t xml:space="preserve">Cerca de 90 hotéis e albergues fora de operação e mais de 25% dos empregos suspensos na pandemia</w:t>
+              <w:t xml:space="preserve">Brasil fechou 2024 com recorde de 6,65 milhões de estrangeiros (+12,6%)</w:t>
             </w:r>
           </w:p>
         </w:tc>
@@ -9803,22 +10751,22 @@
                 <w:sz w:val="15"/>
                 <w:szCs w:val="15"/>
               </w:rPr>
-              <w:t xml:space="preserve">Brasil de Fato, 29 ago. 2020</w:t>
-            </w:r>
-          </w:p>
-          <w:p>
-            <w:pPr>
-              <w:spacing w:after="0" w:line="250"/>
-              <w:jc w:val="left"/>
-            </w:pPr>
-            <w:r>
-              <w:rPr>
-                <w:rFonts w:ascii="Calibri" w:cs="Calibri" w:eastAsia="Calibri" w:hAnsi="Calibri"/>
-                <w:color w:val="1A1A1A"/>
-                <w:sz w:val="15"/>
-                <w:szCs w:val="15"/>
-              </w:rPr>
-              <w:t xml:space="preserve">https://www.brasildefato.com.br/2020/08/29/na-pandemia-seis-hoteis-foram-fechados-e-20-mil-empregos-do-setor-suspensos-no-rio</w:t>
+              <w:t xml:space="preserve">Agência Gov / Ministério do Turismo, jan. 2025</w:t>
+            </w:r>
+          </w:p>
+          <w:p>
+            <w:pPr>
+              <w:spacing w:after="0" w:line="250"/>
+              <w:jc w:val="left"/>
+            </w:pPr>
+            <w:r>
+              <w:rPr>
+                <w:rFonts w:ascii="Calibri" w:cs="Calibri" w:eastAsia="Calibri" w:hAnsi="Calibri"/>
+                <w:color w:val="1A1A1A"/>
+                <w:sz w:val="15"/>
+                <w:szCs w:val="15"/>
+              </w:rPr>
+              <w:t xml:space="preserve">https://agenciagov.ebc.com.br/noticias/202501/brasil-encerra-2024-com-recorde-de-6-65-milhoes-de-turistas-estrangeiros-alta-de-12-6</w:t>
             </w:r>
           </w:p>
         </w:tc>
@@ -9844,7 +10792,7 @@
                 <w:sz w:val="15"/>
                 <w:szCs w:val="15"/>
               </w:rPr>
-              <w:t xml:space="preserve">Em maio de 2020, cerca de 90 hotéis e albergues estavam fora de operação na cidade, com mais de 25% dos postos de trabalho suspensos e sete estabelecimentos fechados em definitivo (BRASIL DE FATO, 2020).</w:t>
+              <w:t xml:space="preserve">"Brasil encerra 2024 com recorde de 6,65 milhões de turistas estrangeiros, alta de 12,6%" (AGÊNCIA GOV, 2025).</w:t>
             </w:r>
           </w:p>
         </w:tc>
@@ -9873,7 +10821,7 @@
                 <w:sz w:val="15"/>
                 <w:szCs w:val="15"/>
               </w:rPr>
-              <w:t xml:space="preserve">Arrecadação de ISS do turismo dobrou no verão 2021/2022, para R$ 52,5 milhões</w:t>
+              <w:t xml:space="preserve">Turismo internacional injetou R$ 34,5 bilhões no Brasil em 2023, com chegadas em 93% do nivel de 2019</w:t>
             </w:r>
           </w:p>
         </w:tc>
@@ -9900,22 +10848,22 @@
                 <w:sz w:val="15"/>
                 <w:szCs w:val="15"/>
               </w:rPr>
-              <w:t xml:space="preserve">Prefeitura da Cidade do Rio de Janeiro</w:t>
-            </w:r>
-          </w:p>
-          <w:p>
-            <w:pPr>
-              <w:spacing w:after="0" w:line="250"/>
-              <w:jc w:val="left"/>
-            </w:pPr>
-            <w:r>
-              <w:rPr>
-                <w:rFonts w:ascii="Calibri" w:cs="Calibri" w:eastAsia="Calibri" w:hAnsi="Calibri"/>
-                <w:color w:val="1A1A1A"/>
-                <w:sz w:val="15"/>
-                <w:szCs w:val="15"/>
-              </w:rPr>
-              <w:t xml:space="preserve">https://prefeitura.rio/desenvolvimento-economico-inovacao-simplificacao/arrecadacao-do-turismo-na-cidade-superou-os-r-50-milhoes-no-verao/</w:t>
+              <w:t xml:space="preserve">Agência Gov / Ministério do Turismo, fev. 2024</w:t>
+            </w:r>
+          </w:p>
+          <w:p>
+            <w:pPr>
+              <w:spacing w:after="0" w:line="250"/>
+              <w:jc w:val="left"/>
+            </w:pPr>
+            <w:r>
+              <w:rPr>
+                <w:rFonts w:ascii="Calibri" w:cs="Calibri" w:eastAsia="Calibri" w:hAnsi="Calibri"/>
+                <w:color w:val="1A1A1A"/>
+                <w:sz w:val="15"/>
+                <w:szCs w:val="15"/>
+              </w:rPr>
+              <w:t xml:space="preserve">https://agenciagov.ebc.com.br/noticias/202402/recorde-historico-turismo-internacional-injeta-r-34-5-bilhoes-na-economia-brasileira-em-2023</w:t>
             </w:r>
           </w:p>
         </w:tc>
@@ -9942,7 +10890,7 @@
                 <w:sz w:val="15"/>
                 <w:szCs w:val="15"/>
               </w:rPr>
-              <w:t xml:space="preserve">A cidade arrecadou R$ 52,5 milhões de ISS do setor de turismo no verão 2021/2022, quase o dobro dos R$ 27,2 milhões registrados na temporada anterior (PREFEITURA DO RIO, 2022).</w:t>
+              <w:t xml:space="preserve">Em 2023 o turismo internacional injetou R$ 34,5 bilhões na economia brasileira, e o volume de chegadas correspondeu a 93% do registrado em 2019 (AGÊNCIA GOV, 2024).</w:t>
             </w:r>
           </w:p>
         </w:tc>
@@ -9970,7 +10918,7 @@
                 <w:sz w:val="15"/>
                 <w:szCs w:val="15"/>
               </w:rPr>
-              <w:t xml:space="preserve">Rock in Rio 2022: R$ 1,7 bilhão de impacto (FGV), 700 mil pessoas e 28 mil empregos diretos</w:t>
+              <w:t xml:space="preserve">Chegadas internacionais cairam 66% em 2020 e 88% em 2021 (745,8 mil turistas)</w:t>
             </w:r>
           </w:p>
         </w:tc>
@@ -9996,22 +10944,22 @@
                 <w:sz w:val="15"/>
                 <w:szCs w:val="15"/>
               </w:rPr>
-              <w:t xml:space="preserve">Diario do Rio, com estudo da FGV, 2022</w:t>
-            </w:r>
-          </w:p>
-          <w:p>
-            <w:pPr>
-              <w:spacing w:after="0" w:line="250"/>
-              <w:jc w:val="left"/>
-            </w:pPr>
-            <w:r>
-              <w:rPr>
-                <w:rFonts w:ascii="Calibri" w:cs="Calibri" w:eastAsia="Calibri" w:hAnsi="Calibri"/>
-                <w:color w:val="1A1A1A"/>
-                <w:sz w:val="15"/>
-                <w:szCs w:val="15"/>
-              </w:rPr>
-              <w:t xml:space="preserve">https://diariodorio.com/rock-in-rio-festival-movimenta-r17-bilhao-na-economia-do-rj/</w:t>
+              <w:t xml:space="preserve">Embratur / MTur / Policia Federal, 20 out. 2022</w:t>
+            </w:r>
+          </w:p>
+          <w:p>
+            <w:pPr>
+              <w:spacing w:after="0" w:line="250"/>
+              <w:jc w:val="left"/>
+            </w:pPr>
+            <w:r>
+              <w:rPr>
+                <w:rFonts w:ascii="Calibri" w:cs="Calibri" w:eastAsia="Calibri" w:hAnsi="Calibri"/>
+                <w:color w:val="1A1A1A"/>
+                <w:sz w:val="15"/>
+                <w:szCs w:val="15"/>
+              </w:rPr>
+              <w:t xml:space="preserve">https://embratur.com.br/2022/10/20/com-pandemia-brasil-registra-em-dois-anos-a-chegada-de-29-milhoes-de-turistas-internacionais/</w:t>
             </w:r>
           </w:p>
         </w:tc>
@@ -10037,7 +10985,7 @@
                 <w:sz w:val="15"/>
                 <w:szCs w:val="15"/>
               </w:rPr>
-              <w:t xml:space="preserve">O Rock in Rio de 2022 movimentou R$ 1,7 bilhão na economia do estado, segundo a Fundação Getulio Vargas, reunindo 700 mil pessoas e gerando 28 mil empregos diretos (DIÁRIO DO RIO, 2022).</w:t>
+              <w:t xml:space="preserve">Com a pandemia, as chegadas de turistas internacionais ao Brasil cairam de 6,3 milhões em 2019 para 2,1 milhões em 2020, e em 2021 o pais recebeu 745,8 mil visitantes estrangeiros - queda de 88% em relação a 2019 (EMBRATUR, 2022).</w:t>
             </w:r>
           </w:p>
         </w:tc>
@@ -10066,7 +11014,7 @@
                 <w:sz w:val="15"/>
                 <w:szCs w:val="15"/>
               </w:rPr>
-              <w:t xml:space="preserve">Rock in Rio 2024: R$ 2,6 bilhões, 95% de ocupação hoteleira, 380 voos extras</w:t>
+              <w:t xml:space="preserve">Violência urbana custou R$ 657 milhões ao turismo fluminense entre janeiro e agosto de 2017</w:t>
             </w:r>
           </w:p>
         </w:tc>
@@ -10093,22 +11041,22 @@
                 <w:sz w:val="15"/>
                 <w:szCs w:val="15"/>
               </w:rPr>
-              <w:t xml:space="preserve">Agência Brasil, 23 set. 2024</w:t>
-            </w:r>
-          </w:p>
-          <w:p>
-            <w:pPr>
-              <w:spacing w:after="0" w:line="250"/>
-              <w:jc w:val="left"/>
-            </w:pPr>
-            <w:r>
-              <w:rPr>
-                <w:rFonts w:ascii="Calibri" w:cs="Calibri" w:eastAsia="Calibri" w:hAnsi="Calibri"/>
-                <w:color w:val="1A1A1A"/>
-                <w:sz w:val="15"/>
-                <w:szCs w:val="15"/>
-              </w:rPr>
-              <w:t xml:space="preserve">https://agenciabrasil.ebc.com.br/cultura/noticia/2024-09/rock-rio-gera-r-26-bilhoes-para-economia-fluminense</w:t>
+              <w:t xml:space="preserve">Agência Brasil, com estimativa da CNC, out. 2017</w:t>
+            </w:r>
+          </w:p>
+          <w:p>
+            <w:pPr>
+              <w:spacing w:after="0" w:line="250"/>
+              <w:jc w:val="left"/>
+            </w:pPr>
+            <w:r>
+              <w:rPr>
+                <w:rFonts w:ascii="Calibri" w:cs="Calibri" w:eastAsia="Calibri" w:hAnsi="Calibri"/>
+                <w:color w:val="1A1A1A"/>
+                <w:sz w:val="15"/>
+                <w:szCs w:val="15"/>
+              </w:rPr>
+              <w:t xml:space="preserve">https://agenciabrasil.ebc.com.br/economia/noticia/2017-10/rio-perdeu-r-657-milhoes-em-turismo-por-causa-da-violencia-diz-cnc</w:t>
             </w:r>
           </w:p>
         </w:tc>
@@ -10135,7 +11083,7 @@
                 <w:sz w:val="15"/>
                 <w:szCs w:val="15"/>
               </w:rPr>
-              <w:t xml:space="preserve">"Um balanco dos sete dias do Rock in Rio indica que o festival gerou R$ 2,6 bilhões para a economia do estado do Rio de Janeiro"; "a taxa de ocupação hoteleira atingiu 95%" e no Galeão "foram registrados 380 voos extras, transportando 47 mil passageiros nos dias de evento" (AGÊNCIA BRASIL, 2024).</w:t>
+              <w:t xml:space="preserve">Segundo estimativa da Confederação Nacional do Comércio, a criminalidade provocou queda de R$ 657 milhões nas receitas do turismo fluminense entre janeiro e agosto de 2017, sendo que "para cada aumento de 10% na criminalidade, a receita bruta das empresas que compoem a atividade turística do Estado recua, em média, 1,8%" (AGÊNCIA BRASIL, 2017).</w:t>
             </w:r>
           </w:p>
         </w:tc>
@@ -10163,7 +11111,7 @@
                 <w:sz w:val="15"/>
                 <w:szCs w:val="15"/>
               </w:rPr>
-              <w:t xml:space="preserve">Rock in Rio 2024 criou 32,6 mil postos de trabalho, segundo a FGV</w:t>
+              <w:t xml:space="preserve">Ocupação hoteleira do Rio caiu de cerca de 70% em março de 2020 para cerca de 5% em abril; prejuizo de R$ 1,6 bilhão em doze meses</w:t>
             </w:r>
           </w:p>
         </w:tc>
@@ -10189,22 +11137,22 @@
                 <w:sz w:val="15"/>
                 <w:szCs w:val="15"/>
               </w:rPr>
-              <w:t xml:space="preserve">Hotelier News, com estudo da FGV, 2024</w:t>
-            </w:r>
-          </w:p>
-          <w:p>
-            <w:pPr>
-              <w:spacing w:after="0" w:line="250"/>
-              <w:jc w:val="left"/>
-            </w:pPr>
-            <w:r>
-              <w:rPr>
-                <w:rFonts w:ascii="Calibri" w:cs="Calibri" w:eastAsia="Calibri" w:hAnsi="Calibri"/>
-                <w:color w:val="1A1A1A"/>
-                <w:sz w:val="15"/>
-                <w:szCs w:val="15"/>
-              </w:rPr>
-              <w:t xml:space="preserve">https://hoteliernews.com.br/rock-in-rio-2024-deve-gerar-impacto-economico-bilionario-diz-fgv/</w:t>
+              <w:t xml:space="preserve">PANROTAS, com balanco do HotéisRIO, abr. 2021</w:t>
+            </w:r>
+          </w:p>
+          <w:p>
+            <w:pPr>
+              <w:spacing w:after="0" w:line="250"/>
+              <w:jc w:val="left"/>
+            </w:pPr>
+            <w:r>
+              <w:rPr>
+                <w:rFonts w:ascii="Calibri" w:cs="Calibri" w:eastAsia="Calibri" w:hAnsi="Calibri"/>
+                <w:color w:val="1A1A1A"/>
+                <w:sz w:val="15"/>
+                <w:szCs w:val="15"/>
+              </w:rPr>
+              <w:t xml:space="preserve">https://www.panrotas.com.br/hotelaria/mercado/2021/04/hotelaria-do-rio-registra-prejuizo-de-r-16-bi-em-um-ano_180799.html</w:t>
             </w:r>
           </w:p>
         </w:tc>
@@ -10230,7 +11178,7 @@
                 <w:sz w:val="15"/>
                 <w:szCs w:val="15"/>
               </w:rPr>
-              <w:t xml:space="preserve">A edição de 2024 do Rock in Rio foi responsavel pela criação de 32,6 mil postos de trabalho na cidade, segundo relatório da FGV (HOTELIER NEWS, 2024).</w:t>
+              <w:t xml:space="preserve">A ocupação da rede hoteleira carioca caiu de cerca de 70% no inicio de março de 2020 para aproximadamente 5% em abril, e a rede acumulou prejuizo de aproximadamente R$ 1,6 bilhão em doze meses (HotéisRIO apud PANROTAS, 2021).</w:t>
             </w:r>
           </w:p>
         </w:tc>
@@ -10259,7 +11207,7 @@
                 <w:sz w:val="15"/>
                 <w:szCs w:val="15"/>
               </w:rPr>
-              <w:t xml:space="preserve">Show de Madonna: R$ 293,4 milhões projetados, retorno 30 vezes o patrocinio, ocupação perto de 100% em Copacabana</w:t>
+              <w:t xml:space="preserve">Cerca de 90 hotéis e albergues fora de operação e mais de 25% dos empregos suspensos na pandemia</w:t>
             </w:r>
           </w:p>
         </w:tc>
@@ -10286,22 +11234,22 @@
                 <w:sz w:val="15"/>
                 <w:szCs w:val="15"/>
               </w:rPr>
-              <w:t xml:space="preserve">Prefeitura do Rio (SMDUE e SMTUR), 13 abr. 2024</w:t>
-            </w:r>
-          </w:p>
-          <w:p>
-            <w:pPr>
-              <w:spacing w:after="0" w:line="250"/>
-              <w:jc w:val="left"/>
-            </w:pPr>
-            <w:r>
-              <w:rPr>
-                <w:rFonts w:ascii="Calibri" w:cs="Calibri" w:eastAsia="Calibri" w:hAnsi="Calibri"/>
-                <w:color w:val="1A1A1A"/>
-                <w:sz w:val="15"/>
-                <w:szCs w:val="15"/>
-              </w:rPr>
-              <w:t xml:space="preserve">https://prefeitura.rio/desenvolvimento-urbano-e-economico/show-de-madonna-vai-movimentar-r-2934-milhoes-na-economia-e-dar-aos-cariocas-um-retorno-30-vezes-maior-do-que-o-valor-investido-pela-prefeitura-em-patrocinio/</w:t>
+              <w:t xml:space="preserve">Brasil de Fato, 29 ago. 2020</w:t>
+            </w:r>
+          </w:p>
+          <w:p>
+            <w:pPr>
+              <w:spacing w:after="0" w:line="250"/>
+              <w:jc w:val="left"/>
+            </w:pPr>
+            <w:r>
+              <w:rPr>
+                <w:rFonts w:ascii="Calibri" w:cs="Calibri" w:eastAsia="Calibri" w:hAnsi="Calibri"/>
+                <w:color w:val="1A1A1A"/>
+                <w:sz w:val="15"/>
+                <w:szCs w:val="15"/>
+              </w:rPr>
+              <w:t xml:space="preserve">https://www.brasildefato.com.br/2020/08/29/na-pandemia-seis-hoteis-foram-fechados-e-20-mil-empregos-do-setor-suspensos-no-rio</w:t>
             </w:r>
           </w:p>
         </w:tc>
@@ -10328,7 +11276,7 @@
                 <w:sz w:val="15"/>
                 <w:szCs w:val="15"/>
               </w:rPr>
-              <w:t xml:space="preserve">"O show da cantora Madonna, na Praia de Copacabana, no dia 4 de maio, ira movimentar a economia carioca em R$ 293,4 milhões" e, "em alguns bairros, como Copacabana, local do show, a ocupação deve ficar perto dos 100%" (PREFEITURA DO RIO, 2024).</w:t>
+              <w:t xml:space="preserve">Em maio de 2020, cerca de 90 hotéis e albergues estavam fora de operação na cidade, com mais de 25% dos postos de trabalho suspensos e sete estabelecimentos fechados em definitivo (BRASIL DE FATO, 2020).</w:t>
             </w:r>
           </w:p>
         </w:tc>
@@ -10356,7 +11304,7 @@
                 <w:sz w:val="15"/>
                 <w:szCs w:val="15"/>
               </w:rPr>
-              <w:t xml:space="preserve">Show de Lady Gaga: mais de R$ 600 milhões e mais de 500 mil turistas entre 1 e 3 de maio de 2025</w:t>
+              <w:t xml:space="preserve">Arrecadação de ISS do turismo dobrou no verão 2021/2022, para R$ 52,5 milhões</w:t>
             </w:r>
           </w:p>
         </w:tc>
@@ -10382,22 +11330,22 @@
                 <w:sz w:val="15"/>
                 <w:szCs w:val="15"/>
               </w:rPr>
-              <w:t xml:space="preserve">Prefeitura do Rio (SMDE e Riotur), 2 maio 2025</w:t>
-            </w:r>
-          </w:p>
-          <w:p>
-            <w:pPr>
-              <w:spacing w:after="0" w:line="250"/>
-              <w:jc w:val="left"/>
-            </w:pPr>
-            <w:r>
-              <w:rPr>
-                <w:rFonts w:ascii="Calibri" w:cs="Calibri" w:eastAsia="Calibri" w:hAnsi="Calibri"/>
-                <w:color w:val="1A1A1A"/>
-                <w:sz w:val="15"/>
-                <w:szCs w:val="15"/>
-              </w:rPr>
-              <w:t xml:space="preserve">https://prefeitura.rio/cor/show-da-lady-gaga-em-copacabana-movimenta-a-economia-da-cidade-em-mais-de-r-600-milhoes/</w:t>
+              <w:t xml:space="preserve">Prefeitura da Cidade do Rio de Janeiro</w:t>
+            </w:r>
+          </w:p>
+          <w:p>
+            <w:pPr>
+              <w:spacing w:after="0" w:line="250"/>
+              <w:jc w:val="left"/>
+            </w:pPr>
+            <w:r>
+              <w:rPr>
+                <w:rFonts w:ascii="Calibri" w:cs="Calibri" w:eastAsia="Calibri" w:hAnsi="Calibri"/>
+                <w:color w:val="1A1A1A"/>
+                <w:sz w:val="15"/>
+                <w:szCs w:val="15"/>
+              </w:rPr>
+              <w:t xml:space="preserve">https://prefeitura.rio/desenvolvimento-economico-inovacao-simplificacao/arrecadacao-do-turismo-na-cidade-superou-os-r-50-milhoes-no-verao/</w:t>
             </w:r>
           </w:p>
         </w:tc>
@@ -10423,7 +11371,7 @@
                 <w:sz w:val="15"/>
                 <w:szCs w:val="15"/>
               </w:rPr>
-              <w:t xml:space="preserve">"Um estudo da Prefeitura do Rio, elaborado pela Secretaria Municipal de Desenvolvimento Economico (SMDE) em parceria com a Riotur, aponta que o evento deve injetar mais de R$ 600 milhões na economia carioca", com "mais de 500 mil turistas" chegando entre 1 e 3 de maio (PREFEITURA DO RIO, 2025).</w:t>
+              <w:t xml:space="preserve">A cidade arrecadou R$ 52,5 milhões de ISS do setor de turismo no verão 2021/2022, quase o dobro dos R$ 27,2 milhões registrados na temporada anterior (PREFEITURA DO RIO, 2022).</w:t>
             </w:r>
           </w:p>
         </w:tc>
@@ -10452,7 +11400,7 @@
                 <w:sz w:val="15"/>
                 <w:szCs w:val="15"/>
               </w:rPr>
-              <w:t xml:space="preserve">Novembro de 2023: R$ 158 milhões so com Taylor Swift e R$ 669,2 milhões no mês; hotéis com quase 100% de ocupação</w:t>
+              <w:t xml:space="preserve">Rock in Rio 2022: R$ 1,7 bilhão de impacto (FGV), 700 mil pessoas e 28 mil empregos diretos</w:t>
             </w:r>
           </w:p>
         </w:tc>
@@ -10479,22 +11427,22 @@
                 <w:sz w:val="15"/>
                 <w:szCs w:val="15"/>
               </w:rPr>
-              <w:t xml:space="preserve">Prefeitura do Rio (SMDUE), 17 nov. 2023</w:t>
-            </w:r>
-          </w:p>
-          <w:p>
-            <w:pPr>
-              <w:spacing w:after="0" w:line="250"/>
-              <w:jc w:val="left"/>
-            </w:pPr>
-            <w:r>
-              <w:rPr>
-                <w:rFonts w:ascii="Calibri" w:cs="Calibri" w:eastAsia="Calibri" w:hAnsi="Calibri"/>
-                <w:color w:val="1A1A1A"/>
-                <w:sz w:val="15"/>
-                <w:szCs w:val="15"/>
-              </w:rPr>
-              <w:t xml:space="preserve">https://prefeitura.rio/desenvolvimento-urbano-e-economico/taylor-swift-deve-movimentar-a-economia-carioca-em-r-158-milhoes/</w:t>
+              <w:t xml:space="preserve">Diario do Rio, com estudo da FGV, 2022</w:t>
+            </w:r>
+          </w:p>
+          <w:p>
+            <w:pPr>
+              <w:spacing w:after="0" w:line="250"/>
+              <w:jc w:val="left"/>
+            </w:pPr>
+            <w:r>
+              <w:rPr>
+                <w:rFonts w:ascii="Calibri" w:cs="Calibri" w:eastAsia="Calibri" w:hAnsi="Calibri"/>
+                <w:color w:val="1A1A1A"/>
+                <w:sz w:val="15"/>
+                <w:szCs w:val="15"/>
+              </w:rPr>
+              <w:t xml:space="preserve">https://diariodorio.com/rock-in-rio-festival-movimenta-r17-bilhao-na-economia-do-rj/</w:t>
             </w:r>
           </w:p>
         </w:tc>
@@ -10521,7 +11469,7 @@
                 <w:sz w:val="15"/>
                 <w:szCs w:val="15"/>
               </w:rPr>
-              <w:t xml:space="preserve">Os shows "devem ajudar a incrementar a economia carioca em pelo menos R$ 158 milhões, sem contar os gastos de turistas com hotéis, que estão com quase 100% de ocupação", e "todos esses acontecimentos juntos devem incrementar a economia do Rio em R$ 669,2 milhões, considerando as atividades de turismo e eventos" (PREFEITURA DO RIO, 2023).</w:t>
+              <w:t xml:space="preserve">O Rock in Rio de 2022 movimentou R$ 1,7 bilhão na economia do estado, segundo a Fundação Getulio Vargas, reunindo 700 mil pessoas e gerando 28 mil empregos diretos (DIÁRIO DO RIO, 2022).</w:t>
             </w:r>
           </w:p>
         </w:tc>
@@ -10549,7 +11497,7 @@
                 <w:sz w:val="15"/>
                 <w:szCs w:val="15"/>
               </w:rPr>
-              <w:t xml:space="preserve">Cúpula do G20: 80,09% de ocupação média entre 15 e 20 de novembro e mais de 95% nos cinco estrelas</w:t>
+              <w:t xml:space="preserve">Rock in Rio 2024: R$ 2,6 bilhões, 95% de ocupação hoteleira, 380 voos extras</w:t>
             </w:r>
           </w:p>
         </w:tc>
@@ -10575,22 +11523,22 @@
                 <w:sz w:val="15"/>
                 <w:szCs w:val="15"/>
               </w:rPr>
-              <w:t xml:space="preserve">PANROTAS, com dados HotéisRIO/ABIH-RJ, 14 nov. 2024</w:t>
-            </w:r>
-          </w:p>
-          <w:p>
-            <w:pPr>
-              <w:spacing w:after="0" w:line="250"/>
-              <w:jc w:val="left"/>
-            </w:pPr>
-            <w:r>
-              <w:rPr>
-                <w:rFonts w:ascii="Calibri" w:cs="Calibri" w:eastAsia="Calibri" w:hAnsi="Calibri"/>
-                <w:color w:val="1A1A1A"/>
-                <w:sz w:val="15"/>
-                <w:szCs w:val="15"/>
-              </w:rPr>
-              <w:t xml:space="preserve">https://www.panrotas.com.br/hotelaria/eventos/2024/11/hoteis-do-rio-que-receberao-comitivas-do-g20-atingem-95-de-ocupacao_211733.html</w:t>
+              <w:t xml:space="preserve">Agência Brasil, 23 set. 2024</w:t>
+            </w:r>
+          </w:p>
+          <w:p>
+            <w:pPr>
+              <w:spacing w:after="0" w:line="250"/>
+              <w:jc w:val="left"/>
+            </w:pPr>
+            <w:r>
+              <w:rPr>
+                <w:rFonts w:ascii="Calibri" w:cs="Calibri" w:eastAsia="Calibri" w:hAnsi="Calibri"/>
+                <w:color w:val="1A1A1A"/>
+                <w:sz w:val="15"/>
+                <w:szCs w:val="15"/>
+              </w:rPr>
+              <w:t xml:space="preserve">https://agenciabrasil.ebc.com.br/cultura/noticia/2024-09/rock-rio-gera-r-26-bilhoes-para-economia-fluminense</w:t>
             </w:r>
           </w:p>
         </w:tc>
@@ -10616,7 +11564,7 @@
                 <w:sz w:val="15"/>
                 <w:szCs w:val="15"/>
               </w:rPr>
-              <w:t xml:space="preserve">"A cidade do Rio de Janeiro alcancou os 80,09% de taxa de ocupação média da hotelaria para o período de 15 a 20 de novembro", e "os hotéis que receberão as comitivas estrangeiras que virão para a reunião do G20, em especial os empreendimentos cinco estrelas, registram números acima dos 95%" (PANROTAS, 2024).</w:t>
+              <w:t xml:space="preserve">"Um balanco dos sete dias do Rock in Rio indica que o festival gerou R$ 2,6 bilhões para a economia do estado do Rio de Janeiro"; "a taxa de ocupação hoteleira atingiu 95%" e no Galeão "foram registrados 380 voos extras, transportando 47 mil passageiros nos dias de evento" (AGÊNCIA BRASIL, 2024).</w:t>
             </w:r>
           </w:p>
         </w:tc>
@@ -10645,7 +11593,7 @@
                 <w:sz w:val="15"/>
                 <w:szCs w:val="15"/>
               </w:rPr>
-              <w:t xml:space="preserve">Cúpula do BRICS 2025: impacto de R$ 70 milhões no ciclo de eventos da cidade</w:t>
+              <w:t xml:space="preserve">Rock in Rio 2024 criou 32,6 mil postos de trabalho, segundo a FGV</w:t>
             </w:r>
           </w:p>
         </w:tc>
@@ -10672,22 +11620,22 @@
                 <w:sz w:val="15"/>
                 <w:szCs w:val="15"/>
               </w:rPr>
-              <w:t xml:space="preserve">Prefeitura do Rio (Casa Civil), 2025</w:t>
-            </w:r>
-          </w:p>
-          <w:p>
-            <w:pPr>
-              <w:spacing w:after="0" w:line="250"/>
-              <w:jc w:val="left"/>
-            </w:pPr>
-            <w:r>
-              <w:rPr>
-                <w:rFonts w:ascii="Calibri" w:cs="Calibri" w:eastAsia="Calibri" w:hAnsi="Calibri"/>
-                <w:color w:val="1A1A1A"/>
-                <w:sz w:val="15"/>
-                <w:szCs w:val="15"/>
-              </w:rPr>
-              <w:t xml:space="preserve">https://prefeitura.rio/casa-civil/eventos-do-brics-2025-devem-impactar-a-economia-da-cidade-do-rio-em-r-70-milhoes-diz-estudo/</w:t>
+              <w:t xml:space="preserve">Hotelier News, com estudo da FGV, 2024</w:t>
+            </w:r>
+          </w:p>
+          <w:p>
+            <w:pPr>
+              <w:spacing w:after="0" w:line="250"/>
+              <w:jc w:val="left"/>
+            </w:pPr>
+            <w:r>
+              <w:rPr>
+                <w:rFonts w:ascii="Calibri" w:cs="Calibri" w:eastAsia="Calibri" w:hAnsi="Calibri"/>
+                <w:color w:val="1A1A1A"/>
+                <w:sz w:val="15"/>
+                <w:szCs w:val="15"/>
+              </w:rPr>
+              <w:t xml:space="preserve">https://hoteliernews.com.br/rock-in-rio-2024-deve-gerar-impacto-economico-bilionario-diz-fgv/</w:t>
             </w:r>
           </w:p>
         </w:tc>
@@ -10714,7 +11662,7 @@
                 <w:sz w:val="15"/>
                 <w:szCs w:val="15"/>
               </w:rPr>
-              <w:t xml:space="preserve">Estudo da Prefeitura estima que os eventos do BRICS 2025 devem impactar a economia da cidade do Rio em R$ 70 milhões (PREFEITURA DO RIO, 2025).</w:t>
+              <w:t xml:space="preserve">A edição de 2024 do Rock in Rio foi responsavel pela criação de 32,6 mil postos de trabalho na cidade, segundo relatório da FGV (HOTELIER NEWS, 2024).</w:t>
             </w:r>
           </w:p>
         </w:tc>
@@ -10742,7 +11690,7 @@
                 <w:sz w:val="15"/>
                 <w:szCs w:val="15"/>
               </w:rPr>
-              <w:t xml:space="preserve">Web Summit Rio: Barra da Tijuca a 88,42% contra média de 72,25% da cidade; hotelaria concentrou 51,6% dos gastos</w:t>
+              <w:t xml:space="preserve">Show de Madonna: R$ 293,4 milhões projetados, retorno 30 vezes o patrocinio, ocupação perto de 100% em Copacabana</w:t>
             </w:r>
           </w:p>
         </w:tc>
@@ -10768,22 +11716,22 @@
                 <w:sz w:val="15"/>
                 <w:szCs w:val="15"/>
               </w:rPr>
-              <w:t xml:space="preserve">PANROTAS, com pesquisa HotéisRIO, maio 2023</w:t>
-            </w:r>
-          </w:p>
-          <w:p>
-            <w:pPr>
-              <w:spacing w:after="0" w:line="250"/>
-              <w:jc w:val="left"/>
-            </w:pPr>
-            <w:r>
-              <w:rPr>
-                <w:rFonts w:ascii="Calibri" w:cs="Calibri" w:eastAsia="Calibri" w:hAnsi="Calibri"/>
-                <w:color w:val="1A1A1A"/>
-                <w:sz w:val="15"/>
-                <w:szCs w:val="15"/>
-              </w:rPr>
-              <w:t xml:space="preserve">https://www.panrotas.com.br/hotelaria/eventos/2023/05/web-summit-rio-eleva-ocupacao-hoteleira-da-barra-da-tijuca_196434.html</w:t>
+              <w:t xml:space="preserve">Prefeitura do Rio (SMDUE e SMTUR), 13 abr. 2024</w:t>
+            </w:r>
+          </w:p>
+          <w:p>
+            <w:pPr>
+              <w:spacing w:after="0" w:line="250"/>
+              <w:jc w:val="left"/>
+            </w:pPr>
+            <w:r>
+              <w:rPr>
+                <w:rFonts w:ascii="Calibri" w:cs="Calibri" w:eastAsia="Calibri" w:hAnsi="Calibri"/>
+                <w:color w:val="1A1A1A"/>
+                <w:sz w:val="15"/>
+                <w:szCs w:val="15"/>
+              </w:rPr>
+              <w:t xml:space="preserve">https://prefeitura.rio/desenvolvimento-urbano-e-economico/show-de-madonna-vai-movimentar-r-2934-milhoes-na-economia-e-dar-aos-cariocas-um-retorno-30-vezes-maior-do-que-o-valor-investido-pela-prefeitura-em-patrocinio/</w:t>
             </w:r>
           </w:p>
         </w:tc>
@@ -10809,7 +11757,7 @@
                 <w:sz w:val="15"/>
                 <w:szCs w:val="15"/>
               </w:rPr>
-              <w:t xml:space="preserve">"A região da Barra da Tijuca, onde acontece o evento, concentra grande número de reservas, com 88,42%, enquanto a média na cidade durante o período do evento esta em 72,25%" (HotéisRIO apud PANROTAS, 2023).</w:t>
+              <w:t xml:space="preserve">"O show da cantora Madonna, na Praia de Copacabana, no dia 4 de maio, ira movimentar a economia carioca em R$ 293,4 milhões" e, "em alguns bairros, como Copacabana, local do show, a ocupação deve ficar perto dos 100%" (PREFEITURA DO RIO, 2024).</w:t>
             </w:r>
           </w:p>
         </w:tc>
@@ -10838,7 +11786,7 @@
                 <w:sz w:val="15"/>
                 <w:szCs w:val="15"/>
               </w:rPr>
-              <w:t xml:space="preserve">Rio Innovation Week 2025: 90% de ocupação no Centro e Zona Sul e R$ 149,7 milhões injetados na cidade</w:t>
+              <w:t xml:space="preserve">Show de Lady Gaga: mais de R$ 600 milhões e mais de 500 mil turistas entre 1 e 3 de maio de 2025</w:t>
             </w:r>
           </w:p>
         </w:tc>
@@ -10865,22 +11813,22 @@
                 <w:sz w:val="15"/>
                 <w:szCs w:val="15"/>
               </w:rPr>
-              <w:t xml:space="preserve">Mercado &amp; Eventos, com pesquisa HotéisRIO, 2025</w:t>
-            </w:r>
-          </w:p>
-          <w:p>
-            <w:pPr>
-              <w:spacing w:after="0" w:line="250"/>
-              <w:jc w:val="left"/>
-            </w:pPr>
-            <w:r>
-              <w:rPr>
-                <w:rFonts w:ascii="Calibri" w:cs="Calibri" w:eastAsia="Calibri" w:hAnsi="Calibri"/>
-                <w:color w:val="1A1A1A"/>
-                <w:sz w:val="15"/>
-                <w:szCs w:val="15"/>
-              </w:rPr>
-              <w:t xml:space="preserve">https://www.mercadoeeventos.com.br/hotelaria-2/rio-innovation-week-impulsiona-ocupacao-hoteleira-no-rio-aponta-hoteisrio/</w:t>
+              <w:t xml:space="preserve">Prefeitura do Rio (SMDE e Riotur), 2 maio 2025</w:t>
+            </w:r>
+          </w:p>
+          <w:p>
+            <w:pPr>
+              <w:spacing w:after="0" w:line="250"/>
+              <w:jc w:val="left"/>
+            </w:pPr>
+            <w:r>
+              <w:rPr>
+                <w:rFonts w:ascii="Calibri" w:cs="Calibri" w:eastAsia="Calibri" w:hAnsi="Calibri"/>
+                <w:color w:val="1A1A1A"/>
+                <w:sz w:val="15"/>
+                <w:szCs w:val="15"/>
+              </w:rPr>
+              <w:t xml:space="preserve">https://prefeitura.rio/cor/show-da-lady-gaga-em-copacabana-movimenta-a-economia-da-cidade-em-mais-de-r-600-milhoes/</w:t>
             </w:r>
           </w:p>
         </w:tc>
@@ -10907,7 +11855,7 @@
                 <w:sz w:val="15"/>
                 <w:szCs w:val="15"/>
               </w:rPr>
-              <w:t xml:space="preserve">A rede hoteleira registrou 90% de ocupação no Centro e na Zona Sul durante a Rio Innovation Week, movimentando R$ 149,7 milhões na economia da cidade, com o Centro cerca de 30% acima da sua média histórica (HotéisRIO apud MERCADO &amp; EVENTOS, 2025).</w:t>
+              <w:t xml:space="preserve">"Um estudo da Prefeitura do Rio, elaborado pela Secretaria Municipal de Desenvolvimento Economico (SMDE) em parceria com a Riotur, aponta que o evento deve injetar mais de R$ 600 milhões na economia carioca", com "mais de 500 mil turistas" chegando entre 1 e 3 de maio (PREFEITURA DO RIO, 2025).</w:t>
             </w:r>
           </w:p>
         </w:tc>
@@ -10935,7 +11883,7 @@
                 <w:sz w:val="15"/>
                 <w:szCs w:val="15"/>
               </w:rPr>
-              <w:t xml:space="preserve">Carnaval 2025: 98,62% de ocupação na capital e R$ 6,5 bilhões de impacto</w:t>
+              <w:t xml:space="preserve">Novembro de 2023: R$ 158 milhões so com Taylor Swift e R$ 669,2 milhões no mês; hotéis com quase 100% de ocupação</w:t>
             </w:r>
           </w:p>
         </w:tc>
@@ -10961,22 +11909,22 @@
                 <w:sz w:val="15"/>
                 <w:szCs w:val="15"/>
               </w:rPr>
-              <w:t xml:space="preserve">Agência Brasil, com dados do Governo do Estado, ABIH-RJ e CNC, 10 mar. 2025</w:t>
-            </w:r>
-          </w:p>
-          <w:p>
-            <w:pPr>
-              <w:spacing w:after="0" w:line="250"/>
-              <w:jc w:val="left"/>
-            </w:pPr>
-            <w:r>
-              <w:rPr>
-                <w:rFonts w:ascii="Calibri" w:cs="Calibri" w:eastAsia="Calibri" w:hAnsi="Calibri"/>
-                <w:color w:val="1A1A1A"/>
-                <w:sz w:val="15"/>
-                <w:szCs w:val="15"/>
-              </w:rPr>
-              <w:t xml:space="preserve">https://agenciabrasil.ebc.com.br/economia/noticia/2025-03/carnaval-de-2025-teve-recordes-para-bares-restaurantes-e-hoteis-do-rj</w:t>
+              <w:t xml:space="preserve">Prefeitura do Rio (SMDUE), 17 nov. 2023</w:t>
+            </w:r>
+          </w:p>
+          <w:p>
+            <w:pPr>
+              <w:spacing w:after="0" w:line="250"/>
+              <w:jc w:val="left"/>
+            </w:pPr>
+            <w:r>
+              <w:rPr>
+                <w:rFonts w:ascii="Calibri" w:cs="Calibri" w:eastAsia="Calibri" w:hAnsi="Calibri"/>
+                <w:color w:val="1A1A1A"/>
+                <w:sz w:val="15"/>
+                <w:szCs w:val="15"/>
+              </w:rPr>
+              <w:t xml:space="preserve">https://prefeitura.rio/desenvolvimento-urbano-e-economico/taylor-swift-deve-movimentar-a-economia-carioca-em-r-158-milhoes/</w:t>
             </w:r>
           </w:p>
         </w:tc>
@@ -11002,7 +11950,7 @@
                 <w:sz w:val="15"/>
                 <w:szCs w:val="15"/>
               </w:rPr>
-              <w:t xml:space="preserve">"O setor hoteleiro teve 98,62% de taxa de ocupação na capital do Rio" e "o impacto positivo do período de folia na economia chegou a R$ 6,5 bilhões" (AGÊNCIA BRASIL, 2025).</w:t>
+              <w:t xml:space="preserve">Os shows "devem ajudar a incrementar a economia carioca em pelo menos R$ 158 milhões, sem contar os gastos de turistas com hotéis, que estão com quase 100% de ocupação", e "todos esses acontecimentos juntos devem incrementar a economia do Rio em R$ 669,2 milhões, considerando as atividades de turismo e eventos" (PREFEITURA DO RIO, 2023).</w:t>
             </w:r>
           </w:p>
         </w:tc>
@@ -11031,7 +11979,7 @@
                 <w:sz w:val="15"/>
                 <w:szCs w:val="15"/>
               </w:rPr>
-              <w:t xml:space="preserve">Reveillon 2024/2025: mais de 96% dos quartos ocupados na noite de 31 de dezembro</w:t>
+              <w:t xml:space="preserve">Cúpula do G20: 80,09% de ocupação média entre 15 e 20 de novembro e mais de 95% nos cinco estrelas</w:t>
             </w:r>
           </w:p>
         </w:tc>
@@ -11058,22 +12006,22 @@
                 <w:sz w:val="15"/>
                 <w:szCs w:val="15"/>
               </w:rPr>
-              <w:t xml:space="preserve">Agência Brasil, com dados do HotéisRIO, 30 dez. 2024</w:t>
-            </w:r>
-          </w:p>
-          <w:p>
-            <w:pPr>
-              <w:spacing w:after="0" w:line="250"/>
-              <w:jc w:val="left"/>
-            </w:pPr>
-            <w:r>
-              <w:rPr>
-                <w:rFonts w:ascii="Calibri" w:cs="Calibri" w:eastAsia="Calibri" w:hAnsi="Calibri"/>
-                <w:color w:val="1A1A1A"/>
-                <w:sz w:val="15"/>
-                <w:szCs w:val="15"/>
-              </w:rPr>
-              <w:t xml:space="preserve">https://agenciabrasil.ebc.com.br/economia/noticia/2024-12/ocupacao-hoteleira-do-rio-passa-de-96-para-o-reveillon</w:t>
+              <w:t xml:space="preserve">PANROTAS, com dados HotéisRIO/ABIH-RJ, 14 nov. 2024</w:t>
+            </w:r>
+          </w:p>
+          <w:p>
+            <w:pPr>
+              <w:spacing w:after="0" w:line="250"/>
+              <w:jc w:val="left"/>
+            </w:pPr>
+            <w:r>
+              <w:rPr>
+                <w:rFonts w:ascii="Calibri" w:cs="Calibri" w:eastAsia="Calibri" w:hAnsi="Calibri"/>
+                <w:color w:val="1A1A1A"/>
+                <w:sz w:val="15"/>
+                <w:szCs w:val="15"/>
+              </w:rPr>
+              <w:t xml:space="preserve">https://www.panrotas.com.br/hotelaria/eventos/2024/11/hoteis-do-rio-que-receberao-comitivas-do-g20-atingem-95-de-ocupacao_211733.html</w:t>
             </w:r>
           </w:p>
         </w:tc>
@@ -11100,7 +12048,7 @@
                 <w:sz w:val="15"/>
                 <w:szCs w:val="15"/>
               </w:rPr>
-              <w:t xml:space="preserve">"Mais de 96% dos quartos de hotéis do Rio de Janeiro já estão ocupados para a noite de Reveillon (31 de dezembro)", e "do dia 29 de dezembro a 1o de janeiro - a ocupação e de cerca de 85%" (HotéisRIO apud AGÊNCIA BRASIL, 2024).</w:t>
+              <w:t xml:space="preserve">"A cidade do Rio de Janeiro alcancou os 80,09% de taxa de ocupação média da hotelaria para o período de 15 a 20 de novembro", e "os hotéis que receberão as comitivas estrangeiras que virão para a reunião do G20, em especial os empreendimentos cinco estrelas, registram números acima dos 95%" (PANROTAS, 2024).</w:t>
             </w:r>
           </w:p>
         </w:tc>
@@ -11128,7 +12076,7 @@
                 <w:sz w:val="15"/>
                 <w:szCs w:val="15"/>
               </w:rPr>
-              <w:t xml:space="preserve">Ocupação hoteleira caiu de quase 100% nos megaeventos para média de 51% em 2017</w:t>
+              <w:t xml:space="preserve">Cúpula do BRICS 2025: impacto de R$ 70 milhões no ciclo de eventos da cidade</w:t>
             </w:r>
           </w:p>
         </w:tc>
@@ -11154,22 +12102,22 @@
                 <w:sz w:val="15"/>
                 <w:szCs w:val="15"/>
               </w:rPr>
-              <w:t xml:space="preserve">RUSSO; FIGUEIRA (2022), RBTur, v. 16, e-2312 - artigo científico revisado por pares</w:t>
-            </w:r>
-          </w:p>
-          <w:p>
-            <w:pPr>
-              <w:spacing w:after="0" w:line="250"/>
-              <w:jc w:val="left"/>
-            </w:pPr>
-            <w:r>
-              <w:rPr>
-                <w:rFonts w:ascii="Calibri" w:cs="Calibri" w:eastAsia="Calibri" w:hAnsi="Calibri"/>
-                <w:color w:val="1A1A1A"/>
-                <w:sz w:val="15"/>
-                <w:szCs w:val="15"/>
-              </w:rPr>
-              <w:t xml:space="preserve">https://www.scielo.br/j/rbtur/a/GpTJtZ5SxKp7kBKtKHFtQdB/?lang=pt</w:t>
+              <w:t xml:space="preserve">Prefeitura do Rio (Casa Civil), 2025</w:t>
+            </w:r>
+          </w:p>
+          <w:p>
+            <w:pPr>
+              <w:spacing w:after="0" w:line="250"/>
+              <w:jc w:val="left"/>
+            </w:pPr>
+            <w:r>
+              <w:rPr>
+                <w:rFonts w:ascii="Calibri" w:cs="Calibri" w:eastAsia="Calibri" w:hAnsi="Calibri"/>
+                <w:color w:val="1A1A1A"/>
+                <w:sz w:val="15"/>
+                <w:szCs w:val="15"/>
+              </w:rPr>
+              <w:t xml:space="preserve">https://prefeitura.rio/casa-civil/eventos-do-brics-2025-devem-impactar-a-economia-da-cidade-do-rio-em-r-70-milhoes-diz-estudo/</w:t>
             </w:r>
           </w:p>
         </w:tc>
@@ -11195,7 +12143,7 @@
                 <w:sz w:val="15"/>
                 <w:szCs w:val="15"/>
               </w:rPr>
-              <w:t xml:space="preserve">"Com o fim dos incentivos e grande aumento na oferta de leitos, o setor comecou a passar por um período de grandes dificuldades vendo as taxas de ocupação despencar de quase 100% proximo aos megaeventos para uma média de 51% em 2017" (RUSSO; FIGUEIRA, 2022, p. 1).</w:t>
+              <w:t xml:space="preserve">Estudo da Prefeitura estima que os eventos do BRICS 2025 devem impactar a economia da cidade do Rio em R$ 70 milhões (PREFEITURA DO RIO, 2025).</w:t>
             </w:r>
           </w:p>
         </w:tc>
@@ -11224,7 +12172,7 @@
                 <w:sz w:val="15"/>
                 <w:szCs w:val="15"/>
               </w:rPr>
-              <w:t xml:space="preserve">Oferta hoteleira saltou de cerca de 19.800 unidades habitacionais em 2010 para 37.000 em 2016</w:t>
+              <w:t xml:space="preserve">Web Summit Rio: Barra da Tijuca a 88,42% contra média de 72,25% da cidade; hotelaria concentrou 51,6% dos gastos</w:t>
             </w:r>
           </w:p>
         </w:tc>
@@ -11251,22 +12199,22 @@
                 <w:sz w:val="15"/>
                 <w:szCs w:val="15"/>
               </w:rPr>
-              <w:t xml:space="preserve">Turismo: Visão e Ação / SciELO - artigo científico</w:t>
-            </w:r>
-          </w:p>
-          <w:p>
-            <w:pPr>
-              <w:spacing w:after="0" w:line="250"/>
-              <w:jc w:val="left"/>
-            </w:pPr>
-            <w:r>
-              <w:rPr>
-                <w:rFonts w:ascii="Calibri" w:cs="Calibri" w:eastAsia="Calibri" w:hAnsi="Calibri"/>
-                <w:color w:val="1A1A1A"/>
-                <w:sz w:val="15"/>
-                <w:szCs w:val="15"/>
-              </w:rPr>
-              <w:t xml:space="preserve">https://www.scielo.br/j/tva/a/NCrFQYwx64kXQFhgFBrbDpR/?lang=pt</w:t>
+              <w:t xml:space="preserve">PANROTAS, com pesquisa HotéisRIO, maio 2023</w:t>
+            </w:r>
+          </w:p>
+          <w:p>
+            <w:pPr>
+              <w:spacing w:after="0" w:line="250"/>
+              <w:jc w:val="left"/>
+            </w:pPr>
+            <w:r>
+              <w:rPr>
+                <w:rFonts w:ascii="Calibri" w:cs="Calibri" w:eastAsia="Calibri" w:hAnsi="Calibri"/>
+                <w:color w:val="1A1A1A"/>
+                <w:sz w:val="15"/>
+                <w:szCs w:val="15"/>
+              </w:rPr>
+              <w:t xml:space="preserve">https://www.panrotas.com.br/hotelaria/eventos/2023/05/web-summit-rio-eleva-ocupacao-hoteleira-da-barra-da-tijuca_196434.html</w:t>
             </w:r>
           </w:p>
         </w:tc>
@@ -11293,7 +12241,7 @@
                 <w:sz w:val="15"/>
                 <w:szCs w:val="15"/>
               </w:rPr>
-              <w:t xml:space="preserve">Das cerca de 19.800 unidades habitacionais existentes na cidade em 2010, chegou-se a 37.000 em 2016, número que ultrapassa 51 mil quartos somadas as ofertas de apart-hotéis, albergues e moteis (TURISMO: VISÃO E AÇÃO).</w:t>
+              <w:t xml:space="preserve">"A região da Barra da Tijuca, onde acontece o evento, concentra grande número de reservas, com 88,42%, enquanto a média na cidade durante o período do evento esta em 72,25%" (HotéisRIO apud PANROTAS, 2023).</w:t>
             </w:r>
           </w:p>
         </w:tc>
@@ -11321,7 +12269,7 @@
                 <w:sz w:val="15"/>
                 <w:szCs w:val="15"/>
               </w:rPr>
-              <w:t xml:space="preserve">Megaevento e ferramenta de marketing e influenciador de escolhas; turismo de eventos planeja e organiza essa demanda</w:t>
+              <w:t xml:space="preserve">Rio Innovation Week 2025: 90% de ocupação no Centro e Zona Sul e R$ 149,7 milhões injetados na cidade</w:t>
             </w:r>
           </w:p>
         </w:tc>
@@ -11347,22 +12295,22 @@
                 <w:sz w:val="15"/>
                 <w:szCs w:val="15"/>
               </w:rPr>
-              <w:t xml:space="preserve">SILVA; BRAGA; ROMANO (2016), Turismo: Visão e Ação, v. 18, n. 3 - artigo científico</w:t>
-            </w:r>
-          </w:p>
-          <w:p>
-            <w:pPr>
-              <w:spacing w:after="0" w:line="250"/>
-              <w:jc w:val="left"/>
-            </w:pPr>
-            <w:r>
-              <w:rPr>
-                <w:rFonts w:ascii="Calibri" w:cs="Calibri" w:eastAsia="Calibri" w:hAnsi="Calibri"/>
-                <w:color w:val="1A1A1A"/>
-                <w:sz w:val="15"/>
-                <w:szCs w:val="15"/>
-              </w:rPr>
-              <w:t xml:space="preserve">https://www.redalyc.org/journal/2610/261056061010/html/</w:t>
+              <w:t xml:space="preserve">Mercado &amp; Eventos, com pesquisa HotéisRIO, 2025</w:t>
+            </w:r>
+          </w:p>
+          <w:p>
+            <w:pPr>
+              <w:spacing w:after="0" w:line="250"/>
+              <w:jc w:val="left"/>
+            </w:pPr>
+            <w:r>
+              <w:rPr>
+                <w:rFonts w:ascii="Calibri" w:cs="Calibri" w:eastAsia="Calibri" w:hAnsi="Calibri"/>
+                <w:color w:val="1A1A1A"/>
+                <w:sz w:val="15"/>
+                <w:szCs w:val="15"/>
+              </w:rPr>
+              <w:t xml:space="preserve">https://www.mercadoeeventos.com.br/hotelaria-2/rio-innovation-week-impulsiona-ocupacao-hoteleira-no-rio-aponta-hoteisrio/</w:t>
             </w:r>
           </w:p>
         </w:tc>
@@ -11388,7 +12336,7 @@
                 <w:sz w:val="15"/>
                 <w:szCs w:val="15"/>
               </w:rPr>
-              <w:t xml:space="preserve">"Os megaeventos se colocam diante do mercado como uma grande ferramenta de marketing e, também, uma grande influenciadora de escolhas" (SILVA; BRAGA; ROMANO, 2016).</w:t>
+              <w:t xml:space="preserve">A rede hoteleira registrou 90% de ocupação no Centro e na Zona Sul durante a Rio Innovation Week, movimentando R$ 149,7 milhões na economia da cidade, com o Centro cerca de 30% acima da sua média histórica (HotéisRIO apud MERCADO &amp; EVENTOS, 2025).</w:t>
             </w:r>
           </w:p>
         </w:tc>
@@ -11417,7 +12365,7 @@
                 <w:sz w:val="15"/>
                 <w:szCs w:val="15"/>
               </w:rPr>
-              <w:t xml:space="preserve">Megaevento como estratégia de posicionamento competitivo da cidade</w:t>
+              <w:t xml:space="preserve">Carnaval 2025: 98,62% de ocupação na capital e R$ 6,5 bilhões de impacto</w:t>
             </w:r>
           </w:p>
         </w:tc>
@@ -11444,22 +12392,22 @@
                 <w:sz w:val="15"/>
                 <w:szCs w:val="15"/>
               </w:rPr>
-              <w:t xml:space="preserve">FERNANDES (2019), Caderno Virtual de Turismo, v. 19, n. 1 - artigo científico</w:t>
-            </w:r>
-          </w:p>
-          <w:p>
-            <w:pPr>
-              <w:spacing w:after="0" w:line="250"/>
-              <w:jc w:val="left"/>
-            </w:pPr>
-            <w:r>
-              <w:rPr>
-                <w:rFonts w:ascii="Calibri" w:cs="Calibri" w:eastAsia="Calibri" w:hAnsi="Calibri"/>
-                <w:color w:val="1A1A1A"/>
-                <w:sz w:val="15"/>
-                <w:szCs w:val="15"/>
-              </w:rPr>
-              <w:t xml:space="preserve">https://www.redalyc.org/journal/1154/115459473003/html/</w:t>
+              <w:t xml:space="preserve">Agência Brasil, com dados do Governo do Estado, ABIH-RJ e CNC, 10 mar. 2025</w:t>
+            </w:r>
+          </w:p>
+          <w:p>
+            <w:pPr>
+              <w:spacing w:after="0" w:line="250"/>
+              <w:jc w:val="left"/>
+            </w:pPr>
+            <w:r>
+              <w:rPr>
+                <w:rFonts w:ascii="Calibri" w:cs="Calibri" w:eastAsia="Calibri" w:hAnsi="Calibri"/>
+                <w:color w:val="1A1A1A"/>
+                <w:sz w:val="15"/>
+                <w:szCs w:val="15"/>
+              </w:rPr>
+              <w:t xml:space="preserve">https://agenciabrasil.ebc.com.br/economia/noticia/2025-03/carnaval-de-2025-teve-recordes-para-bares-restaurantes-e-hoteis-do-rj</w:t>
             </w:r>
           </w:p>
         </w:tc>
@@ -11486,7 +12434,7 @@
                 <w:sz w:val="15"/>
                 <w:szCs w:val="15"/>
               </w:rPr>
-              <w:t xml:space="preserve">"Cada vez mais incorporados as agendas politicas de cidades contemporaneas, os megaeventos vem sendo cobicados pelos gestores públicos como uma estratégia de posicionamento competitivo no mercado economico em nivel mundial" (FERNANDES, 2019).</w:t>
+              <w:t xml:space="preserve">"O setor hoteleiro teve 98,62% de taxa de ocupação na capital do Rio" e "o impacto positivo do período de folia na economia chegou a R$ 6,5 bilhões" (AGÊNCIA BRASIL, 2025).</w:t>
             </w:r>
           </w:p>
         </w:tc>
@@ -11514,7 +12462,7 @@
                 <w:sz w:val="15"/>
                 <w:szCs w:val="15"/>
               </w:rPr>
-              <w:t xml:space="preserve">Definição de turismo da Organização Mundial do Turismo</w:t>
+              <w:t xml:space="preserve">Reveillon 2024/2025: mais de 96% dos quartos ocupados na noite de 31 de dezembro</w:t>
             </w:r>
           </w:p>
         </w:tc>
@@ -11540,22 +12488,22 @@
                 <w:sz w:val="15"/>
                 <w:szCs w:val="15"/>
               </w:rPr>
-              <w:t xml:space="preserve">Turismo: Visão e Ação / SciELO - artigo que apresenta a definição da OMT (2001)</w:t>
-            </w:r>
-          </w:p>
-          <w:p>
-            <w:pPr>
-              <w:spacing w:after="0" w:line="250"/>
-              <w:jc w:val="left"/>
-            </w:pPr>
-            <w:r>
-              <w:rPr>
-                <w:rFonts w:ascii="Calibri" w:cs="Calibri" w:eastAsia="Calibri" w:hAnsi="Calibri"/>
-                <w:color w:val="1A1A1A"/>
-                <w:sz w:val="15"/>
-                <w:szCs w:val="15"/>
-              </w:rPr>
-              <w:t xml:space="preserve">https://www.scielo.br/j/tva/a/ChNCsScn8yjfWfSPMrcSLtj/?lang=pt</w:t>
+              <w:t xml:space="preserve">Agência Brasil, com dados do HotéisRIO, 30 dez. 2024</w:t>
+            </w:r>
+          </w:p>
+          <w:p>
+            <w:pPr>
+              <w:spacing w:after="0" w:line="250"/>
+              <w:jc w:val="left"/>
+            </w:pPr>
+            <w:r>
+              <w:rPr>
+                <w:rFonts w:ascii="Calibri" w:cs="Calibri" w:eastAsia="Calibri" w:hAnsi="Calibri"/>
+                <w:color w:val="1A1A1A"/>
+                <w:sz w:val="15"/>
+                <w:szCs w:val="15"/>
+              </w:rPr>
+              <w:t xml:space="preserve">https://agenciabrasil.ebc.com.br/economia/noticia/2024-12/ocupacao-hoteleira-do-rio-passa-de-96-para-o-reveillon</w:t>
             </w:r>
           </w:p>
         </w:tc>
@@ -11581,7 +12529,7 @@
                 <w:sz w:val="15"/>
                 <w:szCs w:val="15"/>
               </w:rPr>
-              <w:t xml:space="preserve">Segundo a OMT (2001), o turismo compreende as atividades que as pessoas realizam durante suas viagens e permanências em lugares distintos do seu entorno habitual, por um período consecutivo inferior a um ano, com finalidade de lazer, negócios ou outros motivos.</w:t>
+              <w:t xml:space="preserve">"Mais de 96% dos quartos de hotéis do Rio de Janeiro já estão ocupados para a noite de Reveillon (31 de dezembro)", e "do dia 29 de dezembro a 1o de janeiro - a ocupação e de cerca de 85%" (HotéisRIO apud AGÊNCIA BRASIL, 2024).</w:t>
             </w:r>
           </w:p>
         </w:tc>
@@ -11610,7 +12558,7 @@
                 <w:sz w:val="15"/>
                 <w:szCs w:val="15"/>
               </w:rPr>
-              <w:t xml:space="preserve">Pandemia afetou mais a hotelaria (64,45%) e os eventos (40,92%), segundo pesquisa nacional</w:t>
+              <w:t xml:space="preserve">Ocupação hoteleira caiu de quase 100% nos megaeventos para média de 51% em 2017</w:t>
             </w:r>
           </w:p>
         </w:tc>
@@ -11637,22 +12585,22 @@
                 <w:sz w:val="15"/>
                 <w:szCs w:val="15"/>
               </w:rPr>
-              <w:t xml:space="preserve">NEVES et al. (2021), Turismo: Visão e Ação, v. 23, n. 1 - artigo científico</w:t>
-            </w:r>
-          </w:p>
-          <w:p>
-            <w:pPr>
-              <w:spacing w:after="0" w:line="250"/>
-              <w:jc w:val="left"/>
-            </w:pPr>
-            <w:r>
-              <w:rPr>
-                <w:rFonts w:ascii="Calibri" w:cs="Calibri" w:eastAsia="Calibri" w:hAnsi="Calibri"/>
-                <w:color w:val="1A1A1A"/>
-                <w:sz w:val="15"/>
-                <w:szCs w:val="15"/>
-              </w:rPr>
-              <w:t xml:space="preserve">https://www.scielo.br/j/tva/a/Sw5gnMfkcB8H8KCYZHKjyrN/?lang=pt</w:t>
+              <w:t xml:space="preserve">RUSSO; FIGUEIRA (2022), RBTur, v. 16, e-2312 - artigo científico revisado por pares</w:t>
+            </w:r>
+          </w:p>
+          <w:p>
+            <w:pPr>
+              <w:spacing w:after="0" w:line="250"/>
+              <w:jc w:val="left"/>
+            </w:pPr>
+            <w:r>
+              <w:rPr>
+                <w:rFonts w:ascii="Calibri" w:cs="Calibri" w:eastAsia="Calibri" w:hAnsi="Calibri"/>
+                <w:color w:val="1A1A1A"/>
+                <w:sz w:val="15"/>
+                <w:szCs w:val="15"/>
+              </w:rPr>
+              <w:t xml:space="preserve">https://www.scielo.br/j/rbtur/a/GpTJtZ5SxKp7kBKtKHFtQdB/?lang=pt</w:t>
             </w:r>
           </w:p>
         </w:tc>
@@ -11679,7 +12627,7 @@
                 <w:sz w:val="15"/>
                 <w:szCs w:val="15"/>
               </w:rPr>
-              <w:t xml:space="preserve">"64,45% (n=504) destacaram a hotelaria" e "40,92% (n=320) apontaram impactos no setor de eventos" entre os setores afetados pelo adiamento ou cancelamento de viagens (NEVES et al., 2021).</w:t>
+              <w:t xml:space="preserve">"Com o fim dos incentivos e grande aumento na oferta de leitos, o setor comecou a passar por um período de grandes dificuldades vendo as taxas de ocupação despencar de quase 100% proximo aos megaeventos para uma média de 51% em 2017" (RUSSO; FIGUEIRA, 2022, p. 1).</w:t>
             </w:r>
           </w:p>
         </w:tc>
@@ -11707,7 +12655,7 @@
                 <w:sz w:val="15"/>
                 <w:szCs w:val="15"/>
               </w:rPr>
-              <w:t xml:space="preserve">Revista e veiculo, produto, negocio, marca, objeto e mistura de jornalismo com entretenimento</w:t>
+              <w:t xml:space="preserve">Oferta hoteleira saltou de cerca de 19.800 unidades habitacionais em 2010 para 37.000 em 2016</w:t>
             </w:r>
           </w:p>
         </w:tc>
@@ -11733,22 +12681,22 @@
                 <w:sz w:val="15"/>
                 <w:szCs w:val="15"/>
               </w:rPr>
-              <w:t xml:space="preserve">SCALZO, Marília. Jornalismo de Revista. São Paulo: Contexto, 2003 - livro (referência verificada em TCC do Repositorio UFSC)</w:t>
-            </w:r>
-          </w:p>
-          <w:p>
-            <w:pPr>
-              <w:spacing w:after="0" w:line="250"/>
-              <w:jc w:val="left"/>
-            </w:pPr>
-            <w:r>
-              <w:rPr>
-                <w:rFonts w:ascii="Calibri" w:cs="Calibri" w:eastAsia="Calibri" w:hAnsi="Calibri"/>
-                <w:color w:val="1A1A1A"/>
-                <w:sz w:val="15"/>
-                <w:szCs w:val="15"/>
-              </w:rPr>
-              <w:t xml:space="preserve">https://repositorio.ufsc.br/bitstream/handle/123456789/202068/TCC.pdf</w:t>
+              <w:t xml:space="preserve">Turismo: Visão e Ação / SciELO - artigo científico</w:t>
+            </w:r>
+          </w:p>
+          <w:p>
+            <w:pPr>
+              <w:spacing w:after="0" w:line="250"/>
+              <w:jc w:val="left"/>
+            </w:pPr>
+            <w:r>
+              <w:rPr>
+                <w:rFonts w:ascii="Calibri" w:cs="Calibri" w:eastAsia="Calibri" w:hAnsi="Calibri"/>
+                <w:color w:val="1A1A1A"/>
+                <w:sz w:val="15"/>
+                <w:szCs w:val="15"/>
+              </w:rPr>
+              <w:t xml:space="preserve">https://www.scielo.br/j/tva/a/NCrFQYwx64kXQFhgFBrbDpR/?lang=pt</w:t>
             </w:r>
           </w:p>
         </w:tc>
@@ -11774,7 +12722,7 @@
                 <w:sz w:val="15"/>
                 <w:szCs w:val="15"/>
               </w:rPr>
-              <w:t xml:space="preserve">Para Scalzo (2003), a revista e um veiculo de comunicação, um produto, um negocio, uma marca, um objeto, um conjunto de serviços e uma mistura de jornalismo com entretenimento.</w:t>
+              <w:t xml:space="preserve">Das cerca de 19.800 unidades habitacionais existentes na cidade em 2010, chegou-se a 37.000 em 2016, número que ultrapassa 51 mil quartos somadas as ofertas de apart-hotéis, albergues e moteis (TURISMO: VISÃO E AÇÃO).</w:t>
             </w:r>
           </w:p>
         </w:tc>
@@ -11803,7 +12751,7 @@
                 <w:sz w:val="15"/>
                 <w:szCs w:val="15"/>
               </w:rPr>
-              <w:t xml:space="preserve">Cada componente de uma publicação existe em relação aos outros</w:t>
+              <w:t xml:space="preserve">Megaevento e ferramenta de marketing e influenciador de escolhas; turismo de eventos planeja e organiza essa demanda</w:t>
             </w:r>
           </w:p>
         </w:tc>
@@ -11830,22 +12778,22 @@
                 <w:sz w:val="15"/>
                 <w:szCs w:val="15"/>
               </w:rPr>
-              <w:t xml:space="preserve">SAMARA, Timothy. Guia de design editorial. Porto Alegre: Bookman, 2011 - livro (referência verificada em TCC do Repositorio UFSC)</w:t>
-            </w:r>
-          </w:p>
-          <w:p>
-            <w:pPr>
-              <w:spacing w:after="0" w:line="250"/>
-              <w:jc w:val="left"/>
-            </w:pPr>
-            <w:r>
-              <w:rPr>
-                <w:rFonts w:ascii="Calibri" w:cs="Calibri" w:eastAsia="Calibri" w:hAnsi="Calibri"/>
-                <w:color w:val="1A1A1A"/>
-                <w:sz w:val="15"/>
-                <w:szCs w:val="15"/>
-              </w:rPr>
-              <w:t xml:space="preserve">https://repositorio.ufsc.br/handle/123456789/164566</w:t>
+              <w:t xml:space="preserve">SILVA; BRAGA; ROMANO (2016), Turismo: Visão e Ação, v. 18, n. 3 - artigo científico</w:t>
+            </w:r>
+          </w:p>
+          <w:p>
+            <w:pPr>
+              <w:spacing w:after="0" w:line="250"/>
+              <w:jc w:val="left"/>
+            </w:pPr>
+            <w:r>
+              <w:rPr>
+                <w:rFonts w:ascii="Calibri" w:cs="Calibri" w:eastAsia="Calibri" w:hAnsi="Calibri"/>
+                <w:color w:val="1A1A1A"/>
+                <w:sz w:val="15"/>
+                <w:szCs w:val="15"/>
+              </w:rPr>
+              <w:t xml:space="preserve">https://www.redalyc.org/journal/2610/261056061010/html/</w:t>
             </w:r>
           </w:p>
         </w:tc>
@@ -11872,7 +12820,7 @@
                 <w:sz w:val="15"/>
                 <w:szCs w:val="15"/>
               </w:rPr>
-              <w:t xml:space="preserve">"Cada componente de uma publicação existe em relação aos outros, de modo que sua diferenciação implica também conexões entre eles" (SAMARA, 2011).</w:t>
+              <w:t xml:space="preserve">"Os megaeventos se colocam diante do mercado como uma grande ferramenta de marketing e, também, uma grande influenciadora de escolhas" (SILVA; BRAGA; ROMANO, 2016).</w:t>
             </w:r>
           </w:p>
         </w:tc>
@@ -11900,6 +12848,488 @@
                 <w:sz w:val="15"/>
                 <w:szCs w:val="15"/>
               </w:rPr>
+              <w:t xml:space="preserve">Megaevento como estratégia de posicionamento competitivo da cidade</w:t>
+            </w:r>
+          </w:p>
+        </w:tc>
+        <w:tc>
+          <w:tcPr>
+            <w:tcW w:type="dxa" w:w="3400"/>
+            <w:tcMar>
+              <w:top w:type="dxa" w:w="80"/>
+              <w:left w:type="dxa" w:w="110"/>
+              <w:bottom w:type="dxa" w:w="80"/>
+              <w:right w:type="dxa" w:w="110"/>
+            </w:tcMar>
+          </w:tcPr>
+          <w:p>
+            <w:pPr>
+              <w:spacing w:after="60" w:line="250"/>
+              <w:jc w:val="left"/>
+            </w:pPr>
+            <w:r>
+              <w:rPr>
+                <w:rFonts w:ascii="Calibri" w:cs="Calibri" w:eastAsia="Calibri" w:hAnsi="Calibri"/>
+                <w:color w:val="1A1A1A"/>
+                <w:sz w:val="15"/>
+                <w:szCs w:val="15"/>
+              </w:rPr>
+              <w:t xml:space="preserve">FERNANDES (2019), Caderno Virtual de Turismo, v. 19, n. 1 - artigo científico</w:t>
+            </w:r>
+          </w:p>
+          <w:p>
+            <w:pPr>
+              <w:spacing w:after="0" w:line="250"/>
+              <w:jc w:val="left"/>
+            </w:pPr>
+            <w:r>
+              <w:rPr>
+                <w:rFonts w:ascii="Calibri" w:cs="Calibri" w:eastAsia="Calibri" w:hAnsi="Calibri"/>
+                <w:color w:val="1A1A1A"/>
+                <w:sz w:val="15"/>
+                <w:szCs w:val="15"/>
+              </w:rPr>
+              <w:t xml:space="preserve">https://www.redalyc.org/journal/1154/115459473003/html/</w:t>
+            </w:r>
+          </w:p>
+        </w:tc>
+        <w:tc>
+          <w:tcPr>
+            <w:tcW w:type="dxa" w:w="3260"/>
+            <w:tcMar>
+              <w:top w:type="dxa" w:w="80"/>
+              <w:left w:type="dxa" w:w="110"/>
+              <w:bottom w:type="dxa" w:w="80"/>
+              <w:right w:type="dxa" w:w="110"/>
+            </w:tcMar>
+          </w:tcPr>
+          <w:p>
+            <w:pPr>
+              <w:spacing w:after="0" w:line="250"/>
+              <w:jc w:val="left"/>
+            </w:pPr>
+            <w:r>
+              <w:rPr>
+                <w:rFonts w:ascii="Calibri" w:cs="Calibri" w:eastAsia="Calibri" w:hAnsi="Calibri"/>
+                <w:color w:val="1A1A1A"/>
+                <w:sz w:val="15"/>
+                <w:szCs w:val="15"/>
+              </w:rPr>
+              <w:t xml:space="preserve">"Cada vez mais incorporados as agendas politicas de cidades contemporaneas, os megaeventos vem sendo cobicados pelos gestores públicos como uma estratégia de posicionamento competitivo no mercado economico em nivel mundial" (FERNANDES, 2019).</w:t>
+            </w:r>
+          </w:p>
+        </w:tc>
+      </w:tr>
+      <w:tr>
+        <w:tc>
+          <w:tcPr>
+            <w:tcW w:type="dxa" w:w="2700"/>
+            <w:shd w:fill="F2F4F7" w:color="auto" w:val="clear"/>
+            <w:tcMar>
+              <w:top w:type="dxa" w:w="80"/>
+              <w:left w:type="dxa" w:w="110"/>
+              <w:bottom w:type="dxa" w:w="80"/>
+              <w:right w:type="dxa" w:w="110"/>
+            </w:tcMar>
+          </w:tcPr>
+          <w:p>
+            <w:pPr>
+              <w:spacing w:after="0" w:line="250"/>
+              <w:jc w:val="left"/>
+            </w:pPr>
+            <w:r>
+              <w:rPr>
+                <w:rFonts w:ascii="Calibri" w:cs="Calibri" w:eastAsia="Calibri" w:hAnsi="Calibri"/>
+                <w:color w:val="1A1A1A"/>
+                <w:sz w:val="15"/>
+                <w:szCs w:val="15"/>
+              </w:rPr>
+              <w:t xml:space="preserve">Definição de turismo da Organização Mundial do Turismo</w:t>
+            </w:r>
+          </w:p>
+        </w:tc>
+        <w:tc>
+          <w:tcPr>
+            <w:tcW w:type="dxa" w:w="3400"/>
+            <w:shd w:fill="F2F4F7" w:color="auto" w:val="clear"/>
+            <w:tcMar>
+              <w:top w:type="dxa" w:w="80"/>
+              <w:left w:type="dxa" w:w="110"/>
+              <w:bottom w:type="dxa" w:w="80"/>
+              <w:right w:type="dxa" w:w="110"/>
+            </w:tcMar>
+          </w:tcPr>
+          <w:p>
+            <w:pPr>
+              <w:spacing w:after="60" w:line="250"/>
+              <w:jc w:val="left"/>
+            </w:pPr>
+            <w:r>
+              <w:rPr>
+                <w:rFonts w:ascii="Calibri" w:cs="Calibri" w:eastAsia="Calibri" w:hAnsi="Calibri"/>
+                <w:color w:val="1A1A1A"/>
+                <w:sz w:val="15"/>
+                <w:szCs w:val="15"/>
+              </w:rPr>
+              <w:t xml:space="preserve">Turismo: Visão e Ação / SciELO - artigo que apresenta a definição da OMT (2001)</w:t>
+            </w:r>
+          </w:p>
+          <w:p>
+            <w:pPr>
+              <w:spacing w:after="0" w:line="250"/>
+              <w:jc w:val="left"/>
+            </w:pPr>
+            <w:r>
+              <w:rPr>
+                <w:rFonts w:ascii="Calibri" w:cs="Calibri" w:eastAsia="Calibri" w:hAnsi="Calibri"/>
+                <w:color w:val="1A1A1A"/>
+                <w:sz w:val="15"/>
+                <w:szCs w:val="15"/>
+              </w:rPr>
+              <w:t xml:space="preserve">https://www.scielo.br/j/tva/a/ChNCsScn8yjfWfSPMrcSLtj/?lang=pt</w:t>
+            </w:r>
+          </w:p>
+        </w:tc>
+        <w:tc>
+          <w:tcPr>
+            <w:tcW w:type="dxa" w:w="3260"/>
+            <w:shd w:fill="F2F4F7" w:color="auto" w:val="clear"/>
+            <w:tcMar>
+              <w:top w:type="dxa" w:w="80"/>
+              <w:left w:type="dxa" w:w="110"/>
+              <w:bottom w:type="dxa" w:w="80"/>
+              <w:right w:type="dxa" w:w="110"/>
+            </w:tcMar>
+          </w:tcPr>
+          <w:p>
+            <w:pPr>
+              <w:spacing w:after="0" w:line="250"/>
+              <w:jc w:val="left"/>
+            </w:pPr>
+            <w:r>
+              <w:rPr>
+                <w:rFonts w:ascii="Calibri" w:cs="Calibri" w:eastAsia="Calibri" w:hAnsi="Calibri"/>
+                <w:color w:val="1A1A1A"/>
+                <w:sz w:val="15"/>
+                <w:szCs w:val="15"/>
+              </w:rPr>
+              <w:t xml:space="preserve">Segundo a OMT (2001), o turismo compreende as atividades que as pessoas realizam durante suas viagens e permanências em lugares distintos do seu entorno habitual, por um período consecutivo inferior a um ano, com finalidade de lazer, negócios ou outros motivos.</w:t>
+            </w:r>
+          </w:p>
+        </w:tc>
+      </w:tr>
+      <w:tr>
+        <w:tc>
+          <w:tcPr>
+            <w:tcW w:type="dxa" w:w="2700"/>
+            <w:tcMar>
+              <w:top w:type="dxa" w:w="80"/>
+              <w:left w:type="dxa" w:w="110"/>
+              <w:bottom w:type="dxa" w:w="80"/>
+              <w:right w:type="dxa" w:w="110"/>
+            </w:tcMar>
+          </w:tcPr>
+          <w:p>
+            <w:pPr>
+              <w:spacing w:after="0" w:line="250"/>
+              <w:jc w:val="left"/>
+            </w:pPr>
+            <w:r>
+              <w:rPr>
+                <w:rFonts w:ascii="Calibri" w:cs="Calibri" w:eastAsia="Calibri" w:hAnsi="Calibri"/>
+                <w:color w:val="1A1A1A"/>
+                <w:sz w:val="15"/>
+                <w:szCs w:val="15"/>
+              </w:rPr>
+              <w:t xml:space="preserve">Pandemia afetou mais a hotelaria (64,45%) e os eventos (40,92%), segundo pesquisa nacional</w:t>
+            </w:r>
+          </w:p>
+        </w:tc>
+        <w:tc>
+          <w:tcPr>
+            <w:tcW w:type="dxa" w:w="3400"/>
+            <w:tcMar>
+              <w:top w:type="dxa" w:w="80"/>
+              <w:left w:type="dxa" w:w="110"/>
+              <w:bottom w:type="dxa" w:w="80"/>
+              <w:right w:type="dxa" w:w="110"/>
+            </w:tcMar>
+          </w:tcPr>
+          <w:p>
+            <w:pPr>
+              <w:spacing w:after="60" w:line="250"/>
+              <w:jc w:val="left"/>
+            </w:pPr>
+            <w:r>
+              <w:rPr>
+                <w:rFonts w:ascii="Calibri" w:cs="Calibri" w:eastAsia="Calibri" w:hAnsi="Calibri"/>
+                <w:color w:val="1A1A1A"/>
+                <w:sz w:val="15"/>
+                <w:szCs w:val="15"/>
+              </w:rPr>
+              <w:t xml:space="preserve">NEVES et al. (2021), Turismo: Visão e Ação, v. 23, n. 1 - artigo científico</w:t>
+            </w:r>
+          </w:p>
+          <w:p>
+            <w:pPr>
+              <w:spacing w:after="0" w:line="250"/>
+              <w:jc w:val="left"/>
+            </w:pPr>
+            <w:r>
+              <w:rPr>
+                <w:rFonts w:ascii="Calibri" w:cs="Calibri" w:eastAsia="Calibri" w:hAnsi="Calibri"/>
+                <w:color w:val="1A1A1A"/>
+                <w:sz w:val="15"/>
+                <w:szCs w:val="15"/>
+              </w:rPr>
+              <w:t xml:space="preserve">https://www.scielo.br/j/tva/a/Sw5gnMfkcB8H8KCYZHKjyrN/?lang=pt</w:t>
+            </w:r>
+          </w:p>
+        </w:tc>
+        <w:tc>
+          <w:tcPr>
+            <w:tcW w:type="dxa" w:w="3260"/>
+            <w:tcMar>
+              <w:top w:type="dxa" w:w="80"/>
+              <w:left w:type="dxa" w:w="110"/>
+              <w:bottom w:type="dxa" w:w="80"/>
+              <w:right w:type="dxa" w:w="110"/>
+            </w:tcMar>
+          </w:tcPr>
+          <w:p>
+            <w:pPr>
+              <w:spacing w:after="0" w:line="250"/>
+              <w:jc w:val="left"/>
+            </w:pPr>
+            <w:r>
+              <w:rPr>
+                <w:rFonts w:ascii="Calibri" w:cs="Calibri" w:eastAsia="Calibri" w:hAnsi="Calibri"/>
+                <w:color w:val="1A1A1A"/>
+                <w:sz w:val="15"/>
+                <w:szCs w:val="15"/>
+              </w:rPr>
+              <w:t xml:space="preserve">"64,45% (n=504) destacaram a hotelaria" e "40,92% (n=320) apontaram impactos no setor de eventos" entre os setores afetados pelo adiamento ou cancelamento de viagens (NEVES et al., 2021).</w:t>
+            </w:r>
+          </w:p>
+        </w:tc>
+      </w:tr>
+      <w:tr>
+        <w:tc>
+          <w:tcPr>
+            <w:tcW w:type="dxa" w:w="2700"/>
+            <w:shd w:fill="F2F4F7" w:color="auto" w:val="clear"/>
+            <w:tcMar>
+              <w:top w:type="dxa" w:w="80"/>
+              <w:left w:type="dxa" w:w="110"/>
+              <w:bottom w:type="dxa" w:w="80"/>
+              <w:right w:type="dxa" w:w="110"/>
+            </w:tcMar>
+          </w:tcPr>
+          <w:p>
+            <w:pPr>
+              <w:spacing w:after="0" w:line="250"/>
+              <w:jc w:val="left"/>
+            </w:pPr>
+            <w:r>
+              <w:rPr>
+                <w:rFonts w:ascii="Calibri" w:cs="Calibri" w:eastAsia="Calibri" w:hAnsi="Calibri"/>
+                <w:color w:val="1A1A1A"/>
+                <w:sz w:val="15"/>
+                <w:szCs w:val="15"/>
+              </w:rPr>
+              <w:t xml:space="preserve">Revista e veiculo, produto, negocio, marca, objeto e mistura de jornalismo com entretenimento</w:t>
+            </w:r>
+          </w:p>
+        </w:tc>
+        <w:tc>
+          <w:tcPr>
+            <w:tcW w:type="dxa" w:w="3400"/>
+            <w:shd w:fill="F2F4F7" w:color="auto" w:val="clear"/>
+            <w:tcMar>
+              <w:top w:type="dxa" w:w="80"/>
+              <w:left w:type="dxa" w:w="110"/>
+              <w:bottom w:type="dxa" w:w="80"/>
+              <w:right w:type="dxa" w:w="110"/>
+            </w:tcMar>
+          </w:tcPr>
+          <w:p>
+            <w:pPr>
+              <w:spacing w:after="60" w:line="250"/>
+              <w:jc w:val="left"/>
+            </w:pPr>
+            <w:r>
+              <w:rPr>
+                <w:rFonts w:ascii="Calibri" w:cs="Calibri" w:eastAsia="Calibri" w:hAnsi="Calibri"/>
+                <w:color w:val="1A1A1A"/>
+                <w:sz w:val="15"/>
+                <w:szCs w:val="15"/>
+              </w:rPr>
+              <w:t xml:space="preserve">SCALZO, Marília. Jornalismo de Revista. São Paulo: Contexto, 2003 - livro (referência verificada em TCC do Repositorio UFSC)</w:t>
+            </w:r>
+          </w:p>
+          <w:p>
+            <w:pPr>
+              <w:spacing w:after="0" w:line="250"/>
+              <w:jc w:val="left"/>
+            </w:pPr>
+            <w:r>
+              <w:rPr>
+                <w:rFonts w:ascii="Calibri" w:cs="Calibri" w:eastAsia="Calibri" w:hAnsi="Calibri"/>
+                <w:color w:val="1A1A1A"/>
+                <w:sz w:val="15"/>
+                <w:szCs w:val="15"/>
+              </w:rPr>
+              <w:t xml:space="preserve">https://repositorio.ufsc.br/bitstream/handle/123456789/202068/TCC.pdf</w:t>
+            </w:r>
+          </w:p>
+        </w:tc>
+        <w:tc>
+          <w:tcPr>
+            <w:tcW w:type="dxa" w:w="3260"/>
+            <w:shd w:fill="F2F4F7" w:color="auto" w:val="clear"/>
+            <w:tcMar>
+              <w:top w:type="dxa" w:w="80"/>
+              <w:left w:type="dxa" w:w="110"/>
+              <w:bottom w:type="dxa" w:w="80"/>
+              <w:right w:type="dxa" w:w="110"/>
+            </w:tcMar>
+          </w:tcPr>
+          <w:p>
+            <w:pPr>
+              <w:spacing w:after="0" w:line="250"/>
+              <w:jc w:val="left"/>
+            </w:pPr>
+            <w:r>
+              <w:rPr>
+                <w:rFonts w:ascii="Calibri" w:cs="Calibri" w:eastAsia="Calibri" w:hAnsi="Calibri"/>
+                <w:color w:val="1A1A1A"/>
+                <w:sz w:val="15"/>
+                <w:szCs w:val="15"/>
+              </w:rPr>
+              <w:t xml:space="preserve">Para Scalzo (2003), a revista e um veiculo de comunicação, um produto, um negocio, uma marca, um objeto, um conjunto de serviços e uma mistura de jornalismo com entretenimento.</w:t>
+            </w:r>
+          </w:p>
+        </w:tc>
+      </w:tr>
+      <w:tr>
+        <w:tc>
+          <w:tcPr>
+            <w:tcW w:type="dxa" w:w="2700"/>
+            <w:tcMar>
+              <w:top w:type="dxa" w:w="80"/>
+              <w:left w:type="dxa" w:w="110"/>
+              <w:bottom w:type="dxa" w:w="80"/>
+              <w:right w:type="dxa" w:w="110"/>
+            </w:tcMar>
+          </w:tcPr>
+          <w:p>
+            <w:pPr>
+              <w:spacing w:after="0" w:line="250"/>
+              <w:jc w:val="left"/>
+            </w:pPr>
+            <w:r>
+              <w:rPr>
+                <w:rFonts w:ascii="Calibri" w:cs="Calibri" w:eastAsia="Calibri" w:hAnsi="Calibri"/>
+                <w:color w:val="1A1A1A"/>
+                <w:sz w:val="15"/>
+                <w:szCs w:val="15"/>
+              </w:rPr>
+              <w:t xml:space="preserve">Cada componente de uma publicação existe em relação aos outros</w:t>
+            </w:r>
+          </w:p>
+        </w:tc>
+        <w:tc>
+          <w:tcPr>
+            <w:tcW w:type="dxa" w:w="3400"/>
+            <w:tcMar>
+              <w:top w:type="dxa" w:w="80"/>
+              <w:left w:type="dxa" w:w="110"/>
+              <w:bottom w:type="dxa" w:w="80"/>
+              <w:right w:type="dxa" w:w="110"/>
+            </w:tcMar>
+          </w:tcPr>
+          <w:p>
+            <w:pPr>
+              <w:spacing w:after="60" w:line="250"/>
+              <w:jc w:val="left"/>
+            </w:pPr>
+            <w:r>
+              <w:rPr>
+                <w:rFonts w:ascii="Calibri" w:cs="Calibri" w:eastAsia="Calibri" w:hAnsi="Calibri"/>
+                <w:color w:val="1A1A1A"/>
+                <w:sz w:val="15"/>
+                <w:szCs w:val="15"/>
+              </w:rPr>
+              <w:t xml:space="preserve">SAMARA, Timothy. Guia de design editorial. Porto Alegre: Bookman, 2011 - livro (referência verificada em TCC do Repositorio UFSC)</w:t>
+            </w:r>
+          </w:p>
+          <w:p>
+            <w:pPr>
+              <w:spacing w:after="0" w:line="250"/>
+              <w:jc w:val="left"/>
+            </w:pPr>
+            <w:r>
+              <w:rPr>
+                <w:rFonts w:ascii="Calibri" w:cs="Calibri" w:eastAsia="Calibri" w:hAnsi="Calibri"/>
+                <w:color w:val="1A1A1A"/>
+                <w:sz w:val="15"/>
+                <w:szCs w:val="15"/>
+              </w:rPr>
+              <w:t xml:space="preserve">https://repositorio.ufsc.br/handle/123456789/164566</w:t>
+            </w:r>
+          </w:p>
+        </w:tc>
+        <w:tc>
+          <w:tcPr>
+            <w:tcW w:type="dxa" w:w="3260"/>
+            <w:tcMar>
+              <w:top w:type="dxa" w:w="80"/>
+              <w:left w:type="dxa" w:w="110"/>
+              <w:bottom w:type="dxa" w:w="80"/>
+              <w:right w:type="dxa" w:w="110"/>
+            </w:tcMar>
+          </w:tcPr>
+          <w:p>
+            <w:pPr>
+              <w:spacing w:after="0" w:line="250"/>
+              <w:jc w:val="left"/>
+            </w:pPr>
+            <w:r>
+              <w:rPr>
+                <w:rFonts w:ascii="Calibri" w:cs="Calibri" w:eastAsia="Calibri" w:hAnsi="Calibri"/>
+                <w:color w:val="1A1A1A"/>
+                <w:sz w:val="15"/>
+                <w:szCs w:val="15"/>
+              </w:rPr>
+              <w:t xml:space="preserve">"Cada componente de uma publicação existe em relação aos outros, de modo que sua diferenciação implica também conexões entre eles" (SAMARA, 2011).</w:t>
+            </w:r>
+          </w:p>
+        </w:tc>
+      </w:tr>
+      <w:tr>
+        <w:tc>
+          <w:tcPr>
+            <w:tcW w:type="dxa" w:w="2700"/>
+            <w:shd w:fill="F2F4F7" w:color="auto" w:val="clear"/>
+            <w:tcMar>
+              <w:top w:type="dxa" w:w="80"/>
+              <w:left w:type="dxa" w:w="110"/>
+              <w:bottom w:type="dxa" w:w="80"/>
+              <w:right w:type="dxa" w:w="110"/>
+            </w:tcMar>
+          </w:tcPr>
+          <w:p>
+            <w:pPr>
+              <w:spacing w:after="0" w:line="250"/>
+              <w:jc w:val="left"/>
+            </w:pPr>
+            <w:r>
+              <w:rPr>
+                <w:rFonts w:ascii="Calibri" w:cs="Calibri" w:eastAsia="Calibri" w:hAnsi="Calibri"/>
+                <w:color w:val="1A1A1A"/>
+                <w:sz w:val="15"/>
+                <w:szCs w:val="15"/>
+              </w:rPr>
               <w:t xml:space="preserve">Série mensal de ocupação hoteleira da cidade, 2018-2025, por região (instrumento da pesquisa)</w:t>
             </w:r>
           </w:p>
@@ -11907,6 +13337,7 @@
         <w:tc>
           <w:tcPr>
             <w:tcW w:type="dxa" w:w="3400"/>
+            <w:shd w:fill="F2F4F7" w:color="auto" w:val="clear"/>
             <w:tcMar>
               <w:top w:type="dxa" w:w="80"/>
               <w:left w:type="dxa" w:w="110"/>
@@ -11948,6 +13379,7 @@
         <w:tc>
           <w:tcPr>
             <w:tcW w:type="dxa" w:w="3260"/>
+            <w:shd w:fill="F2F4F7" w:color="auto" w:val="clear"/>
             <w:tcMar>
               <w:top w:type="dxa" w:w="80"/>
               <w:left w:type="dxa" w:w="110"/>

</xml_diff>

<commit_message>
Recorta a pesquisa para 2022-2025 e acrescenta o texto corrido jornalistico
- recorte 2022-2025: pandemia e ciclo dos megaeventos passam a contexto, nao objeto
- objetivo geral sem a pandemia; hipotese e problema ajustados ao novo periodo
- ano-base interno passa a ser 2022; tabela de efeito recalculada
- comparativo de crescimento do turismo (4 indicadores oficiais)
- contexto ano a ano da cidade (Omicron, ISS, G20, violencia, recorde)
- TEXTO-CORRIDO: materia jornalistica com citacoes, lista dos principais
  eventos em ordem de impacto, conclusao e referencias em ABNT

Co-Authored-By: Claude Opus 5 <noreply@anthropic.com>
</commit_message>
<xml_diff>
--- a/FICHA-DO-PROJETO.docx
+++ b/FICHA-DO-PROJETO.docx
@@ -123,7 +123,7 @@
           <w:sz w:val="22"/>
           <w:szCs w:val="22"/>
         </w:rPr>
-        <w:t xml:space="preserve">Principais eventos que fomentaram o turismo no Rio de Janeiro entre os anos de 2018 a 2025: uma análise da ocupação hoteleira e dos impactos na cidade.</w:t>
+        <w:t xml:space="preserve">Principais eventos que fomentaram o turismo no Rio de Janeiro entre os anos de 2022 a 2025: uma análise da ocupação hoteleira e dos impactos na cidade.</w:t>
       </w:r>
     </w:p>
     <w:p>
@@ -149,7 +149,7 @@
           <w:sz w:val="22"/>
           <w:szCs w:val="22"/>
         </w:rPr>
-        <w:t xml:space="preserve">Principais eventos que fomentaram o turismo no Rio de Janeiro entre os anos de 2018 a 2025.</w:t>
+        <w:t xml:space="preserve">Principais eventos que fomentaram o turismo no Rio de Janeiro entre os anos de 2022 a 2025.</w:t>
       </w:r>
     </w:p>
     <w:p>
@@ -253,7 +253,7 @@
           <w:sz w:val="22"/>
           <w:szCs w:val="22"/>
         </w:rPr>
-        <w:t xml:space="preserve">Eventos turísticos de grande porte realizados no Rio de Janeiro entre 2018 e 2025.</w:t>
+        <w:t xml:space="preserve">Eventos turísticos de grande porte realizados no Rio de Janeiro entre 2022 e 2025.</w:t>
       </w:r>
     </w:p>
     <w:p>
@@ -331,7 +331,7 @@
           <w:sz w:val="22"/>
           <w:szCs w:val="22"/>
         </w:rPr>
-        <w:t xml:space="preserve">Análise dos principais eventos que fomentaram o turismo no Rio de Janeiro entre 2018 e 2025, investigando a ocupação hoteleira e os impactos causados na cidade.</w:t>
+        <w:t xml:space="preserve">Análise dos principais eventos que fomentaram o turismo no Rio de Janeiro entre 2022 e 2025, investigando a ocupação hoteleira e os impactos causados na cidade. O período anterior — o ciclo dos megaeventos de 2014 e 2016 e a interrupção sanitária de 2020 e 2021 — é tratado como contexto, e não como objeto.</w:t>
       </w:r>
     </w:p>
     <w:p>
@@ -357,7 +357,7 @@
           <w:sz w:val="22"/>
           <w:szCs w:val="22"/>
         </w:rPr>
-        <w:t xml:space="preserve">De que forma os principais eventos realizados no Rio de Janeiro entre 2018 e 2025 impactaram a ocupação hoteleira e contribuíram para o desenvolvimento do turismo na cidade?</w:t>
+        <w:t xml:space="preserve">De que forma os principais eventos realizados no Rio de Janeiro entre 2022 e 2025 impactaram a ocupação hoteleira e contribuíram para o desenvolvimento do turismo na cidade?</w:t>
       </w:r>
     </w:p>
     <w:p>
@@ -383,7 +383,7 @@
           <w:sz w:val="22"/>
           <w:szCs w:val="22"/>
         </w:rPr>
-        <w:t xml:space="preserve">Os principais eventos turísticos realizados no Rio de Janeiro entre 2018 e 2025 tiveram impacto positivo significativo na ocupação hoteleira e contribuíram para a retomada e crescimento do turismo, mesmo com a pandemia.</w:t>
+        <w:t xml:space="preserve">Os principais eventos turísticos realizados no Rio de Janeiro entre 2022 e 2025 tiveram impacto positivo significativo na ocupação hoteleira e contribuíram para o crescimento do turismo na cidade, que no período alcançou o melhor desempenho de sua história recente.</w:t>
       </w:r>
     </w:p>
     <w:p>
@@ -409,7 +409,7 @@
           <w:sz w:val="22"/>
           <w:szCs w:val="22"/>
         </w:rPr>
-        <w:t xml:space="preserve">Identificar os eventos turísticos de maior relevância para o Rio de Janeiro no período de 2018 a 2025, relacionando-os aos dados de ocupação hoteleira; analisar os impactos da pandemia da Covid-19 na atividade turística; e discutir a importância destes eventos para a imagem e o crescimento do turismo na cidade.</w:t>
+        <w:t xml:space="preserve">Identificar os eventos turísticos de maior relevância para o Rio de Janeiro no período de 2022 a 2025, relacionando-os aos dados de ocupação hoteleira e ao fluxo de visitantes recebidos pela cidade, e discutir a importância destes eventos para a imagem e o crescimento do turismo carioca.</w:t>
       </w:r>
     </w:p>
     <w:p>
@@ -435,7 +435,7 @@
           <w:sz w:val="22"/>
           <w:szCs w:val="22"/>
         </w:rPr>
-        <w:t xml:space="preserve">Análise dos dados de ocupação hoteleira no Rio de Janeiro entre 2018 e 2025 para identificar os períodos com maior taxa de ocupação; verificação de quais eventos turísticos relevantes ocorreram nesses períodos; curadoria de imagens dos principais eventos; pesquisa bibliográfica; e entrevistas com especialistas do setor turístico.</w:t>
+        <w:t xml:space="preserve">Análise dos dados de ocupação hoteleira no Rio de Janeiro entre 2022 e 2025 para identificar os períodos com maior taxa de ocupação; verificação de quais eventos turísticos relevantes ocorreram nesses períodos; curadoria de imagens dos principais eventos; pesquisa bibliográfica; e entrevistas com especialistas do setor turístico.</w:t>
       </w:r>
     </w:p>
     <w:p>
@@ -523,7 +523,7 @@
         </w:rPr>
         <w:t xml:space="preserve">→ Prefeitura do Rio (SMTUR-Rio, SMDE e Riotur, com dados do IFec RJ), 19 jan. 2026 — Rio recebeu 12,5 milhões de visitantes em 2025, que movimentaram R$ 27,2 bilhões </w:t>
       </w:r>
-      <w:hyperlink w:history="1" r:id="rIdz_lnxna9t6av_ttkb09ra">
+      <w:hyperlink w:history="1" r:id="rIdbouujtmoznupzh0uqpoit">
         <w:r>
           <w:rPr>
             <w:rFonts w:ascii="Calibri" w:cs="Calibri" w:eastAsia="Calibri" w:hAnsi="Calibri"/>
@@ -565,7 +565,7 @@
           <w:sz w:val="24"/>
           <w:szCs w:val="24"/>
         </w:rPr>
-        <w:t xml:space="preserve">2.1. Contextualização: o turismo no Rio de Janeiro entre 2018 e 2025</w:t>
+        <w:t xml:space="preserve">2.1. Contextualização: o turismo no Rio de Janeiro antes e durante o recorte</w:t>
       </w:r>
     </w:p>
     <w:p>
@@ -580,7 +580,7 @@
           <w:sz w:val="22"/>
           <w:szCs w:val="22"/>
         </w:rPr>
-        <w:t xml:space="preserve">O período estudado contém três movimentos distintos: uma estagnação herdada do ciclo dos megaeventos (2018-2019), um colapso sem precedentes (2020-2021) e uma recuperação que terminou em recorde histórico (2022-2025). Cada um desses movimentos tem contexto turístico próprio, documentado por fontes oficiais.</w:t>
+        <w:t xml:space="preserve">O recorte analisado (2022-2025) é precedido por dois movimentos que explicam o seu ponto de partida: a estagnação herdada do ciclo dos megaeventos de 2014 e 2016, e a interrupção da atividade em 2020 e 2021. Ambos entram aqui como contexto documentado, não como objeto de análise. Em seguida descreve-se o período estudado, ano a ano.</w:t>
       </w:r>
     </w:p>
     <w:p>
@@ -597,7 +597,7 @@
           <w:sz w:val="22"/>
           <w:szCs w:val="22"/>
         </w:rPr>
-        <w:t xml:space="preserve">2018-2019: a herança dos megaeventos</w:t>
+        <w:t xml:space="preserve">Antes do recorte: a herança dos megaeventos (2016-2019)</w:t>
       </w:r>
     </w:p>
     <w:p>
@@ -630,7 +630,7 @@
         </w:rPr>
         <w:t xml:space="preserve">→ Práticas de sustentabilidade nos empreendimentos hoteleiros construídos no âmbito dos Jogos Olímpicos Rio 2016 — Turismo: Visão e Ação / SciELO </w:t>
       </w:r>
-      <w:hyperlink w:history="1" r:id="rIdjvdprefiolehfcmlyislm">
+      <w:hyperlink w:history="1" r:id="rIdq6vgiqyfmrpk-5p68gczm">
         <w:r>
           <w:rPr>
             <w:rFonts w:ascii="Calibri" w:cs="Calibri" w:eastAsia="Calibri" w:hAnsi="Calibri"/>
@@ -703,7 +703,7 @@
         </w:rPr>
         <w:t xml:space="preserve">→ RUSSO; FIGUEIRA. O paradoxo dos grandes eventos — RBTur, v. 16, e-2312, 2022 </w:t>
       </w:r>
-      <w:hyperlink w:history="1" r:id="rIdaooco7suycahotqtvwsm4">
+      <w:hyperlink w:history="1" r:id="rIdrvkio9y-jai83-nwu6w-s">
         <w:r>
           <w:rPr>
             <w:rFonts w:ascii="Calibri" w:cs="Calibri" w:eastAsia="Calibri" w:hAnsi="Calibri"/>
@@ -746,7 +746,7 @@
         </w:rPr>
         <w:t xml:space="preserve">→ Rio perdeu R$ 657 milhões em turismo por causa da violência, diz CNC - Agência Brasil, out. 2017 </w:t>
       </w:r>
-      <w:hyperlink w:history="1" r:id="rId-utgtox0ty9lyl1zhsqzh">
+      <w:hyperlink w:history="1" r:id="rIdjxojmm3dqc_iiemf88v1j">
         <w:r>
           <w:rPr>
             <w:rFonts w:ascii="Calibri" w:cs="Calibri" w:eastAsia="Calibri" w:hAnsi="Calibri"/>
@@ -774,7 +774,7 @@
         </w:rPr>
         <w:t xml:space="preserve">→ Violência no Rio faz indústria turística se dissolver, diz presidente do HotéisRIO - Diario do Rio </w:t>
       </w:r>
-      <w:hyperlink w:history="1" r:id="rIdces8e-fssurjm3neizbxh">
+      <w:hyperlink w:history="1" r:id="rIdihlhdgqotq__f-ui52ta9">
         <w:r>
           <w:rPr>
             <w:rFonts w:ascii="Calibri" w:cs="Calibri" w:eastAsia="Calibri" w:hAnsi="Calibri"/>
@@ -802,7 +802,7 @@
         </w:rPr>
         <w:t xml:space="preserve">→ Como a violência afeta o turismo - Observatório Legislativo da Intervenção Federal na Segurança Pública do RJ (Câmara dos Deputados). ATENÇÃO: página fora do ar na consulta de 16/09/2026; tentar novamente ou solicitar a Câmara </w:t>
       </w:r>
-      <w:hyperlink w:history="1" r:id="rIduap7zu2ryifkxj9kky-5y">
+      <w:hyperlink w:history="1" r:id="rIdtsxwrpns8eivzs2_p8st8">
         <w:r>
           <w:rPr>
             <w:rFonts w:ascii="Calibri" w:cs="Calibri" w:eastAsia="Calibri" w:hAnsi="Calibri"/>
@@ -845,7 +845,7 @@
         </w:rPr>
         <w:t xml:space="preserve">→ Queda da violência impulsiona turismo no Rio de Janeiro - CNN Brasil </w:t>
       </w:r>
-      <w:hyperlink w:history="1" r:id="rIdichqa_kpcc-a0vayqlfey">
+      <w:hyperlink w:history="1" r:id="rIdobycmsvkrclvitatdnlez">
         <w:r>
           <w:rPr>
             <w:rFonts w:ascii="Calibri" w:cs="Calibri" w:eastAsia="Calibri" w:hAnsi="Calibri"/>
@@ -888,7 +888,7 @@
         </w:rPr>
         <w:t xml:space="preserve">→ E agora, Rio? O turismo pós-megaeventos — Caderno Virtual de Turismo </w:t>
       </w:r>
-      <w:hyperlink w:history="1" r:id="rIdpwqepsc01ljth5nj5njpu">
+      <w:hyperlink w:history="1" r:id="rId2wmz-fhrsi7isvirkekmi">
         <w:r>
           <w:rPr>
             <w:rFonts w:ascii="Calibri" w:cs="Calibri" w:eastAsia="Calibri" w:hAnsi="Calibri"/>
@@ -916,7 +916,7 @@
         </w:rPr>
         <w:t xml:space="preserve">→ Embratur / Ministério do Turismo / Polícia Federal — série de chegadas internacionais (2019: 6,3 milhões) </w:t>
       </w:r>
-      <w:hyperlink w:history="1" r:id="rIdh1_n7dvnwwtdnood3fbv1">
+      <w:hyperlink w:history="1" r:id="rId48jkmbticbfgufmhdizeq">
         <w:r>
           <w:rPr>
             <w:rFonts w:ascii="Calibri" w:cs="Calibri" w:eastAsia="Calibri" w:hAnsi="Calibri"/>
@@ -943,7 +943,7 @@
           <w:sz w:val="22"/>
           <w:szCs w:val="22"/>
         </w:rPr>
-        <w:t xml:space="preserve">2020-2021: o colapso</w:t>
+        <w:t xml:space="preserve">Antes do recorte: a interrupção de 2020 e 2021</w:t>
       </w:r>
     </w:p>
     <w:p>
@@ -976,7 +976,7 @@
         </w:rPr>
         <w:t xml:space="preserve">→ Com pandemia, Brasil registra em dois anos a chegada de 2,9 milhões de turistas internacionais — Embratur, 20 out. 2022 </w:t>
       </w:r>
-      <w:hyperlink w:history="1" r:id="rIdh0iu5hoitirzwg7xw49um">
+      <w:hyperlink w:history="1" r:id="rIdc2pvzim7bebsyw87ps6c7">
         <w:r>
           <w:rPr>
             <w:rFonts w:ascii="Calibri" w:cs="Calibri" w:eastAsia="Calibri" w:hAnsi="Calibri"/>
@@ -1019,7 +1019,7 @@
         </w:rPr>
         <w:t xml:space="preserve">→ Hotelaria do Rio registra prejuízo de R$ 1,6 bi em um ano — balanço HotéisRIO (PANROTAS, abr. 2021) </w:t>
       </w:r>
-      <w:hyperlink w:history="1" r:id="rId_jfjutzmahn7mwuzwl9wo">
+      <w:hyperlink w:history="1" r:id="rIdht-pezlxjt2q_nbtjc52w">
         <w:r>
           <w:rPr>
             <w:rFonts w:ascii="Calibri" w:cs="Calibri" w:eastAsia="Calibri" w:hAnsi="Calibri"/>
@@ -1047,7 +1047,7 @@
         </w:rPr>
         <w:t xml:space="preserve">→ Na pandemia, hotéis foram fechados e 20 mil empregos do setor suspensos no Rio — Brasil de Fato, ago. 2020 </w:t>
       </w:r>
-      <w:hyperlink w:history="1" r:id="rIdcojyhzb4nmjwunv5a_osc">
+      <w:hyperlink w:history="1" r:id="rIdxk74zyjdqgxi_sc3fwcce">
         <w:r>
           <w:rPr>
             <w:rFonts w:ascii="Calibri" w:cs="Calibri" w:eastAsia="Calibri" w:hAnsi="Calibri"/>
@@ -1090,7 +1090,7 @@
         </w:rPr>
         <w:t xml:space="preserve">→ NEVES et al. Os impactos da Covid-19 nas viagens de turistas brasileiros — Turismo: Visão e Ação, v. 23, n. 1, 2021 </w:t>
       </w:r>
-      <w:hyperlink w:history="1" r:id="rIdxzi3yhzj_vrf_l5zdqjjb">
+      <w:hyperlink w:history="1" r:id="rIdcze1tsrly7-reybry7oha">
         <w:r>
           <w:rPr>
             <w:rFonts w:ascii="Calibri" w:cs="Calibri" w:eastAsia="Calibri" w:hAnsi="Calibri"/>
@@ -1132,7 +1132,7 @@
           <w:sz w:val="22"/>
           <w:szCs w:val="22"/>
         </w:rPr>
-        <w:t xml:space="preserve">2022-2025: a recuperação e o recorde</w:t>
+        <w:t xml:space="preserve">O recorte: 2022 a 2025, quatro anos de crescimento contínuo</w:t>
       </w:r>
     </w:p>
     <w:p>
@@ -1165,7 +1165,7 @@
         </w:rPr>
         <w:t xml:space="preserve">→ Recorde histórico: turismo internacional injeta R$ 34,5 bilhões na economia brasileira em 2023 — Agência Gov / Ministério do Turismo </w:t>
       </w:r>
-      <w:hyperlink w:history="1" r:id="rIdqikjjjxdmqrzl6lbcybrp">
+      <w:hyperlink w:history="1" r:id="rIdyq4i-c1-e7qvgn_lznzeq">
         <w:r>
           <w:rPr>
             <w:rFonts w:ascii="Calibri" w:cs="Calibri" w:eastAsia="Calibri" w:hAnsi="Calibri"/>
@@ -1193,7 +1193,7 @@
         </w:rPr>
         <w:t xml:space="preserve">→ Brasil encerra 2024 com recorde de 6,65 milhões de turistas estrangeiros, alta de 12,6% — Agência Gov </w:t>
       </w:r>
-      <w:hyperlink w:history="1" r:id="rIddcalaesw4lxs0guvisyb4">
+      <w:hyperlink w:history="1" r:id="rIdfdmoe7djkc7jsfrjevuvs">
         <w:r>
           <w:rPr>
             <w:rFonts w:ascii="Calibri" w:cs="Calibri" w:eastAsia="Calibri" w:hAnsi="Calibri"/>
@@ -1221,7 +1221,7 @@
         </w:rPr>
         <w:t xml:space="preserve">→ Brasil alcança recorde histórico e fecha 2025 com 9,3 milhões de turistas internacionais — Secom / Presidência da República </w:t>
       </w:r>
-      <w:hyperlink w:history="1" r:id="rIdp78jukr0zpodsactgb8hh">
+      <w:hyperlink w:history="1" r:id="rId4mpmne2xslyqtfl4bmfnk">
         <w:r>
           <w:rPr>
             <w:rFonts w:ascii="Calibri" w:cs="Calibri" w:eastAsia="Calibri" w:hAnsi="Calibri"/>
@@ -1264,7 +1264,7 @@
         </w:rPr>
         <w:t xml:space="preserve">→ Arrecadação do turismo na cidade superou os R$ 50 milhões no verão - Prefeitura da Cidade do Rio de Janeiro </w:t>
       </w:r>
-      <w:hyperlink w:history="1" r:id="rIdgxlaxpxylgx6ejo1jqdbh">
+      <w:hyperlink w:history="1" r:id="rIduhvprel0jbvkitjn_da94">
         <w:r>
           <w:rPr>
             <w:rFonts w:ascii="Calibri" w:cs="Calibri" w:eastAsia="Calibri" w:hAnsi="Calibri"/>
@@ -1292,7 +1292,7 @@
         </w:rPr>
         <w:t xml:space="preserve">→ Retorno do Carnaval deve movimentar economia do Rio de Janeiro e de São Paulo - Ministério do Turismo </w:t>
       </w:r>
-      <w:hyperlink w:history="1" r:id="rIdxywqugynkfjpi8jlsm4ot">
+      <w:hyperlink w:history="1" r:id="rId75kh5dqy_4ph9xpx1i6dg">
         <w:r>
           <w:rPr>
             <w:rFonts w:ascii="Calibri" w:cs="Calibri" w:eastAsia="Calibri" w:hAnsi="Calibri"/>
@@ -1335,7 +1335,7 @@
         </w:rPr>
         <w:t xml:space="preserve">→ Prefeitura do Rio — SMTUR-Rio, SMDE e Riotur, com dados do Instituto Fecomércio de Pesquisas e Análises (IFec RJ), 19 jan. 2026 </w:t>
       </w:r>
-      <w:hyperlink w:history="1" r:id="rIdpzeyg2xz53v9r0qoeuwxm">
+      <w:hyperlink w:history="1" r:id="rIduilmwlr4ensuxn5_pacmf">
         <w:r>
           <w:rPr>
             <w:rFonts w:ascii="Calibri" w:cs="Calibri" w:eastAsia="Calibri" w:hAnsi="Calibri"/>
@@ -1378,7 +1378,7 @@
         </w:rPr>
         <w:t xml:space="preserve">→ Rio de Janeiro registra aumento de 51,7% na chegada de turistas estrangeiros em 2025 — Embratur, 7 out. 2025 </w:t>
       </w:r>
-      <w:hyperlink w:history="1" r:id="rId1_nowdc4lbxllcnrdh4vk">
+      <w:hyperlink w:history="1" r:id="rIdidsd3k2ibkdqzslqvimjj">
         <w:r>
           <w:rPr>
             <w:rFonts w:ascii="Calibri" w:cs="Calibri" w:eastAsia="Calibri" w:hAnsi="Calibri"/>
@@ -1406,7 +1406,7 @@
         </w:rPr>
         <w:t xml:space="preserve">→ Rio de Janeiro bate recorde de turistas internacionais em 2025 — Agência Brasil, nov. 2025 </w:t>
       </w:r>
-      <w:hyperlink w:history="1" r:id="rIdhuwk1dvmsjkvuyvja4x7e">
+      <w:hyperlink w:history="1" r:id="rIdynmscck9qyqk_saveflbr">
         <w:r>
           <w:rPr>
             <w:rFonts w:ascii="Calibri" w:cs="Calibri" w:eastAsia="Calibri" w:hAnsi="Calibri"/>
@@ -1481,7 +1481,7 @@
         </w:rPr>
         <w:t xml:space="preserve">→ Estudo da FGV sobre o Rock in Rio 2024: 32,6 mil postos de trabalho — Hotelier News </w:t>
       </w:r>
-      <w:hyperlink w:history="1" r:id="rIdkbpket0kklnlr40edfqi0">
+      <w:hyperlink w:history="1" r:id="rIderj76bblcahgsmjwks3oq">
         <w:r>
           <w:rPr>
             <w:rFonts w:ascii="Calibri" w:cs="Calibri" w:eastAsia="Calibri" w:hAnsi="Calibri"/>
@@ -1509,7 +1509,7 @@
         </w:rPr>
         <w:t xml:space="preserve">→ Balanço do Rock in Rio 2024 — Agência Brasil, 23 set. 2024 </w:t>
       </w:r>
-      <w:hyperlink w:history="1" r:id="rIdssv5kxmpaiyot41f0ukge">
+      <w:hyperlink w:history="1" r:id="rIdh47obg32vf9nm2h_rddjk">
         <w:r>
           <w:rPr>
             <w:rFonts w:ascii="Calibri" w:cs="Calibri" w:eastAsia="Calibri" w:hAnsi="Calibri"/>
@@ -1552,7 +1552,7 @@
         </w:rPr>
         <w:t xml:space="preserve">→ Carnaval de 2025 teve recordes para bares, restaurantes e hotéis do RJ — Agência Brasil, 10 mar. 2025 </w:t>
       </w:r>
-      <w:hyperlink w:history="1" r:id="rIdvknlk9x4cttki3yctpo6m">
+      <w:hyperlink w:history="1" r:id="rIdfhv_6rc3fae0vupjqjycs">
         <w:r>
           <w:rPr>
             <w:rFonts w:ascii="Calibri" w:cs="Calibri" w:eastAsia="Calibri" w:hAnsi="Calibri"/>
@@ -1595,7 +1595,7 @@
         </w:rPr>
         <w:t xml:space="preserve">→ Rio perdeu R$ 657 milhões em turismo por causa da violência, diz CNC — Agência Brasil, out. 2017 </w:t>
       </w:r>
-      <w:hyperlink w:history="1" r:id="rIdffothvp3ruxansfcaav3y">
+      <w:hyperlink w:history="1" r:id="rIdsvfwrh1_1fhowbhjbzaoh">
         <w:r>
           <w:rPr>
             <w:rFonts w:ascii="Calibri" w:cs="Calibri" w:eastAsia="Calibri" w:hAnsi="Calibri"/>
@@ -1623,7 +1623,7 @@
         </w:rPr>
         <w:t xml:space="preserve">→ Show de Madonna movimentou R$ 300 milhões e recuperou reputação do Rio, diz governo do estado — Exame, 2024 </w:t>
       </w:r>
-      <w:hyperlink w:history="1" r:id="rId6g44x6ioreemfja2iciuy">
+      <w:hyperlink w:history="1" r:id="rIdbfn9tl1_24zdsgx6xhzpb">
         <w:r>
           <w:rPr>
             <w:rFonts w:ascii="Calibri" w:cs="Calibri" w:eastAsia="Calibri" w:hAnsi="Calibri"/>
@@ -1666,7 +1666,7 @@
         </w:rPr>
         <w:t xml:space="preserve">→ Residents' Perceptions of the Impacts of the Rio 2016 Olympic Games: Before, During and After the Mega-Event — Revista Brasileira de Pesquisa em Turismo </w:t>
       </w:r>
-      <w:hyperlink w:history="1" r:id="rIdtmh2jmk-gfi_gbtdmxqjn">
+      <w:hyperlink w:history="1" r:id="rIdekuxlz4styuz0rh_-irmn">
         <w:r>
           <w:rPr>
             <w:rFonts w:ascii="Calibri" w:cs="Calibri" w:eastAsia="Calibri" w:hAnsi="Calibri"/>
@@ -1741,10 +1741,10 @@
       </w:tblPr>
       <w:tblGrid>
         <w:gridCol w:w="780"/>
-        <w:gridCol w:w="2600"/>
-        <w:gridCol w:w="2900"/>
-        <w:gridCol w:w="1440"/>
-        <w:gridCol w:w="1640"/>
+        <w:gridCol w:w="3000"/>
+        <w:gridCol w:w="3000"/>
+        <w:gridCol w:w="1300"/>
+        <w:gridCol w:w="1280"/>
       </w:tblGrid>
       <w:tr>
         <w:trPr>
@@ -1781,7 +1781,7 @@
         </w:tc>
         <w:tc>
           <w:tcPr>
-            <w:tcW w:type="dxa" w:w="2600"/>
+            <w:tcW w:type="dxa" w:w="3000"/>
             <w:shd w:fill="123A6B" w:color="auto" w:val="clear"/>
             <w:tcMar>
               <w:top w:type="dxa" w:w="80"/>
@@ -1804,13 +1804,13 @@
                 <w:sz w:val="17"/>
                 <w:szCs w:val="17"/>
               </w:rPr>
-              <w:t xml:space="preserve">Contexto turístico</w:t>
-            </w:r>
-          </w:p>
-        </w:tc>
-        <w:tc>
-          <w:tcPr>
-            <w:tcW w:type="dxa" w:w="2900"/>
+              <w:t xml:space="preserve">Contexto turístico e da cidade</w:t>
+            </w:r>
+          </w:p>
+        </w:tc>
+        <w:tc>
+          <w:tcPr>
+            <w:tcW w:type="dxa" w:w="3000"/>
             <w:shd w:fill="123A6B" w:color="auto" w:val="clear"/>
             <w:tcMar>
               <w:top w:type="dxa" w:w="80"/>
@@ -1839,7 +1839,7 @@
         </w:tc>
         <w:tc>
           <w:tcPr>
-            <w:tcW w:type="dxa" w:w="1440"/>
+            <w:tcW w:type="dxa" w:w="1300"/>
             <w:shd w:fill="123A6B" w:color="auto" w:val="clear"/>
             <w:tcMar>
               <w:top w:type="dxa" w:w="80"/>
@@ -1862,13 +1862,13 @@
                 <w:sz w:val="17"/>
                 <w:szCs w:val="17"/>
               </w:rPr>
-              <w:t xml:space="preserve">Ocupação (instrumento)</w:t>
-            </w:r>
-          </w:p>
-        </w:tc>
-        <w:tc>
-          <w:tcPr>
-            <w:tcW w:type="dxa" w:w="1640"/>
+              <w:t xml:space="preserve">Ocupação</w:t>
+            </w:r>
+          </w:p>
+        </w:tc>
+        <w:tc>
+          <w:tcPr>
+            <w:tcW w:type="dxa" w:w="1280"/>
             <w:shd w:fill="123A6B" w:color="auto" w:val="clear"/>
             <w:tcMar>
               <w:top w:type="dxa" w:w="80"/>
@@ -1919,13 +1919,13 @@
                 <w:sz w:val="17"/>
                 <w:szCs w:val="17"/>
               </w:rPr>
-              <w:t xml:space="preserve">2018</w:t>
-            </w:r>
-          </w:p>
-        </w:tc>
-        <w:tc>
-          <w:tcPr>
-            <w:tcW w:type="dxa" w:w="2600"/>
+              <w:t xml:space="preserve">2022</w:t>
+            </w:r>
+          </w:p>
+        </w:tc>
+        <w:tc>
+          <w:tcPr>
+            <w:tcW w:type="dxa" w:w="3000"/>
             <w:tcMar>
               <w:top w:type="dxa" w:w="80"/>
               <w:left w:type="dxa" w:w="110"/>
@@ -1945,13 +1945,13 @@
                 <w:sz w:val="17"/>
                 <w:szCs w:val="17"/>
               </w:rPr>
-              <w:t xml:space="preserve">Sobreoferta hoteleira herdada da Rio 2016; ocupação em torno de 51% já em 2017</w:t>
-            </w:r>
-          </w:p>
-        </w:tc>
-        <w:tc>
-          <w:tcPr>
-            <w:tcW w:type="dxa" w:w="2900"/>
+              <w:t xml:space="preserve">Reabertura; Ômicron adia o Carnaval para abril; ISS do turismo no verão dobra, para R$ 52,5 milhões</w:t>
+            </w:r>
+          </w:p>
+        </w:tc>
+        <w:tc>
+          <w:tcPr>
+            <w:tcW w:type="dxa" w:w="3000"/>
             <w:tcMar>
               <w:top w:type="dxa" w:w="80"/>
               <w:left w:type="dxa" w:w="110"/>
@@ -1971,13 +1971,13 @@
                 <w:sz w:val="17"/>
                 <w:szCs w:val="17"/>
               </w:rPr>
-              <w:t xml:space="preserve">Calendário regular (Réveillon, Carnaval)</w:t>
-            </w:r>
-          </w:p>
-        </w:tc>
-        <w:tc>
-          <w:tcPr>
-            <w:tcW w:type="dxa" w:w="1440"/>
+              <w:t xml:space="preserve">Carnaval em abril; Rock in Rio em setembro</w:t>
+            </w:r>
+          </w:p>
+        </w:tc>
+        <w:tc>
+          <w:tcPr>
+            <w:tcW w:type="dxa" w:w="1300"/>
             <w:tcMar>
               <w:top w:type="dxa" w:w="80"/>
               <w:left w:type="dxa" w:w="110"/>
@@ -1997,13 +1997,13 @@
                 <w:sz w:val="17"/>
                 <w:szCs w:val="17"/>
               </w:rPr>
-              <w:t xml:space="preserve">53,66%</w:t>
-            </w:r>
-          </w:p>
-        </w:tc>
-        <w:tc>
-          <w:tcPr>
-            <w:tcW w:type="dxa" w:w="1640"/>
+              <w:t xml:space="preserve">65,00%</w:t>
+            </w:r>
+          </w:p>
+        </w:tc>
+        <w:tc>
+          <w:tcPr>
+            <w:tcW w:type="dxa" w:w="1280"/>
             <w:tcMar>
               <w:top w:type="dxa" w:w="80"/>
               <w:left w:type="dxa" w:w="110"/>
@@ -2023,7 +2023,7 @@
                 <w:sz w:val="17"/>
                 <w:szCs w:val="17"/>
               </w:rPr>
-              <w:t xml:space="preserve">RBTur 2022; HotéisRIO</w:t>
+              <w:t xml:space="preserve">Prefeitura; HotéisRIO; FGV</w:t>
             </w:r>
           </w:p>
         </w:tc>
@@ -2052,13 +2052,13 @@
                 <w:sz w:val="17"/>
                 <w:szCs w:val="17"/>
               </w:rPr>
-              <w:t xml:space="preserve">2019</w:t>
-            </w:r>
-          </w:p>
-        </w:tc>
-        <w:tc>
-          <w:tcPr>
-            <w:tcW w:type="dxa" w:w="2600"/>
+              <w:t xml:space="preserve">2023</w:t>
+            </w:r>
+          </w:p>
+        </w:tc>
+        <w:tc>
+          <w:tcPr>
+            <w:tcW w:type="dxa" w:w="3000"/>
             <w:shd w:fill="F2F4F7" w:color="auto" w:val="clear"/>
             <w:tcMar>
               <w:top w:type="dxa" w:w="80"/>
@@ -2079,13 +2079,13 @@
                 <w:sz w:val="17"/>
                 <w:szCs w:val="17"/>
               </w:rPr>
-              <w:t xml:space="preserve">Brasil recebe 6,3 mi de turistas internacionais — último ano pré-pandemia</w:t>
-            </w:r>
-          </w:p>
-        </w:tc>
-        <w:tc>
-          <w:tcPr>
-            <w:tcW w:type="dxa" w:w="2900"/>
+              <w:t xml:space="preserve">Turismo internacional injeta R$ 34,5 bi no Brasil; chegadas em 93% do nível pré-pandemia</w:t>
+            </w:r>
+          </w:p>
+        </w:tc>
+        <w:tc>
+          <w:tcPr>
+            <w:tcW w:type="dxa" w:w="3000"/>
             <w:shd w:fill="F2F4F7" w:color="auto" w:val="clear"/>
             <w:tcMar>
               <w:top w:type="dxa" w:w="80"/>
@@ -2106,13 +2106,13 @@
                 <w:sz w:val="17"/>
                 <w:szCs w:val="17"/>
               </w:rPr>
-              <w:t xml:space="preserve">Copa América (final no Maracanã) e Rock in Rio</w:t>
-            </w:r>
-          </w:p>
-        </w:tc>
-        <w:tc>
-          <w:tcPr>
-            <w:tcW w:type="dxa" w:w="1440"/>
+              <w:t xml:space="preserve">Web Summit Rio; Taylor Swift, RBD e RHCP; final da Libertadores</w:t>
+            </w:r>
+          </w:p>
+        </w:tc>
+        <w:tc>
+          <w:tcPr>
+            <w:tcW w:type="dxa" w:w="1300"/>
             <w:shd w:fill="F2F4F7" w:color="auto" w:val="clear"/>
             <w:tcMar>
               <w:top w:type="dxa" w:w="80"/>
@@ -2133,13 +2133,13 @@
                 <w:sz w:val="17"/>
                 <w:szCs w:val="17"/>
               </w:rPr>
-              <w:t xml:space="preserve">64,55%</w:t>
-            </w:r>
-          </w:p>
-        </w:tc>
-        <w:tc>
-          <w:tcPr>
-            <w:tcW w:type="dxa" w:w="1640"/>
+              <w:t xml:space="preserve">71,11%</w:t>
+            </w:r>
+          </w:p>
+        </w:tc>
+        <w:tc>
+          <w:tcPr>
+            <w:tcW w:type="dxa" w:w="1280"/>
             <w:shd w:fill="F2F4F7" w:color="auto" w:val="clear"/>
             <w:tcMar>
               <w:top w:type="dxa" w:w="80"/>
@@ -2160,7 +2160,7 @@
                 <w:sz w:val="17"/>
                 <w:szCs w:val="17"/>
               </w:rPr>
-              <w:t xml:space="preserve">Embratur; HotéisRIO</w:t>
+              <w:t xml:space="preserve">MTur; Prefeitura; HotéisRIO</w:t>
             </w:r>
           </w:p>
         </w:tc>
@@ -2188,13 +2188,13 @@
                 <w:sz w:val="17"/>
                 <w:szCs w:val="17"/>
               </w:rPr>
-              <w:t xml:space="preserve">2020</w:t>
-            </w:r>
-          </w:p>
-        </w:tc>
-        <w:tc>
-          <w:tcPr>
-            <w:tcW w:type="dxa" w:w="2600"/>
+              <w:t xml:space="preserve">2024</w:t>
+            </w:r>
+          </w:p>
+        </w:tc>
+        <w:tc>
+          <w:tcPr>
+            <w:tcW w:type="dxa" w:w="3000"/>
             <w:tcMar>
               <w:top w:type="dxa" w:w="80"/>
               <w:left w:type="dxa" w:w="110"/>
@@ -2214,13 +2214,13 @@
                 <w:sz w:val="17"/>
                 <w:szCs w:val="17"/>
               </w:rPr>
-              <w:t xml:space="preserve">Chegadas internacionais ao Brasil caem 66%, para 2,1 mi; hotelaria carioca a 5% em abril</w:t>
-            </w:r>
-          </w:p>
-        </w:tc>
-        <w:tc>
-          <w:tcPr>
-            <w:tcW w:type="dxa" w:w="2900"/>
+              <w:t xml:space="preserve">Brasil bate recorde com 6,65 mi de estrangeiros (+12,6%); Rio recebe 11,4 mi de visitantes</w:t>
+            </w:r>
+          </w:p>
+        </w:tc>
+        <w:tc>
+          <w:tcPr>
+            <w:tcW w:type="dxa" w:w="3000"/>
             <w:tcMar>
               <w:top w:type="dxa" w:w="80"/>
               <w:left w:type="dxa" w:w="110"/>
@@ -2240,13 +2240,13 @@
                 <w:sz w:val="17"/>
                 <w:szCs w:val="17"/>
               </w:rPr>
-              <w:t xml:space="preserve">Calendário cancelado a partir de março</w:t>
-            </w:r>
-          </w:p>
-        </w:tc>
-        <w:tc>
-          <w:tcPr>
-            <w:tcW w:type="dxa" w:w="1440"/>
+              <w:t xml:space="preserve">Madonna em Copacabana; Rock in Rio 40 anos; Cúpula do G20</w:t>
+            </w:r>
+          </w:p>
+        </w:tc>
+        <w:tc>
+          <w:tcPr>
+            <w:tcW w:type="dxa" w:w="1300"/>
             <w:tcMar>
               <w:top w:type="dxa" w:w="80"/>
               <w:left w:type="dxa" w:w="110"/>
@@ -2266,13 +2266,13 @@
                 <w:sz w:val="17"/>
                 <w:szCs w:val="17"/>
               </w:rPr>
-              <w:t xml:space="preserve">44,06%</w:t>
-            </w:r>
-          </w:p>
-        </w:tc>
-        <w:tc>
-          <w:tcPr>
-            <w:tcW w:type="dxa" w:w="1640"/>
+              <w:t xml:space="preserve">73,15%</w:t>
+            </w:r>
+          </w:p>
+        </w:tc>
+        <w:tc>
+          <w:tcPr>
+            <w:tcW w:type="dxa" w:w="1280"/>
             <w:tcMar>
               <w:top w:type="dxa" w:w="80"/>
               <w:left w:type="dxa" w:w="110"/>
@@ -2292,7 +2292,7 @@
                 <w:sz w:val="17"/>
                 <w:szCs w:val="17"/>
               </w:rPr>
-              <w:t xml:space="preserve">Embratur; HotéisRIO</w:t>
+              <w:t xml:space="preserve">Agência Gov; Prefeitura; HotéisRIO</w:t>
             </w:r>
           </w:p>
         </w:tc>
@@ -2321,13 +2321,13 @@
                 <w:sz w:val="17"/>
                 <w:szCs w:val="17"/>
               </w:rPr>
-              <w:t xml:space="preserve">2021</w:t>
-            </w:r>
-          </w:p>
-        </w:tc>
-        <w:tc>
-          <w:tcPr>
-            <w:tcW w:type="dxa" w:w="2600"/>
+              <w:t xml:space="preserve">2025</w:t>
+            </w:r>
+          </w:p>
+        </w:tc>
+        <w:tc>
+          <w:tcPr>
+            <w:tcW w:type="dxa" w:w="3000"/>
             <w:shd w:fill="F2F4F7" w:color="auto" w:val="clear"/>
             <w:tcMar>
               <w:top w:type="dxa" w:w="80"/>
@@ -2348,13 +2348,13 @@
                 <w:sz w:val="17"/>
                 <w:szCs w:val="17"/>
               </w:rPr>
-              <w:t xml:space="preserve">Brasil recebe 745,8 mil turistas internacionais — queda de 88% sobre 2019</w:t>
-            </w:r>
-          </w:p>
-        </w:tc>
-        <w:tc>
-          <w:tcPr>
-            <w:tcW w:type="dxa" w:w="2900"/>
+              <w:t xml:space="preserve">Brasil alcança 9,29 mi de estrangeiros (+37,1%); Rio recebe 12,5 mi de visitantes e movimenta R$ 27,2 bi, com fluxo internacional +44,8%</w:t>
+            </w:r>
+          </w:p>
+        </w:tc>
+        <w:tc>
+          <w:tcPr>
+            <w:tcW w:type="dxa" w:w="3000"/>
             <w:shd w:fill="F2F4F7" w:color="auto" w:val="clear"/>
             <w:tcMar>
               <w:top w:type="dxa" w:w="80"/>
@@ -2375,13 +2375,13 @@
                 <w:sz w:val="17"/>
                 <w:szCs w:val="17"/>
               </w:rPr>
-              <w:t xml:space="preserve">Carnaval e Réveillon cancelados; Libertadores em novembro</w:t>
-            </w:r>
-          </w:p>
-        </w:tc>
-        <w:tc>
-          <w:tcPr>
-            <w:tcW w:type="dxa" w:w="1440"/>
+              <w:t xml:space="preserve">Carnaval recorde; Web Summit; Lady Gaga; Cúpula do BRICS; Rio Innovation Week</w:t>
+            </w:r>
+          </w:p>
+        </w:tc>
+        <w:tc>
+          <w:tcPr>
+            <w:tcW w:type="dxa" w:w="1300"/>
             <w:shd w:fill="F2F4F7" w:color="auto" w:val="clear"/>
             <w:tcMar>
               <w:top w:type="dxa" w:w="80"/>
@@ -2402,13 +2402,13 @@
                 <w:sz w:val="17"/>
                 <w:szCs w:val="17"/>
               </w:rPr>
-              <w:t xml:space="preserve">48,73%</w:t>
-            </w:r>
-          </w:p>
-        </w:tc>
-        <w:tc>
-          <w:tcPr>
-            <w:tcW w:type="dxa" w:w="1640"/>
+              <w:t xml:space="preserve">77,73%</w:t>
+            </w:r>
+          </w:p>
+        </w:tc>
+        <w:tc>
+          <w:tcPr>
+            <w:tcW w:type="dxa" w:w="1280"/>
             <w:shd w:fill="F2F4F7" w:color="auto" w:val="clear"/>
             <w:tcMar>
               <w:top w:type="dxa" w:w="80"/>
@@ -2429,7 +2429,194 @@
                 <w:sz w:val="17"/>
                 <w:szCs w:val="17"/>
               </w:rPr>
-              <w:t xml:space="preserve">Embratur; HotéisRIO</w:t>
+              <w:t xml:space="preserve">Secom; Embratur; Prefeitura/IFec RJ; HotéisRIO</w:t>
+            </w:r>
+          </w:p>
+        </w:tc>
+      </w:tr>
+    </w:tbl>
+    <w:p>
+      <w:pPr>
+        <w:spacing w:after="120" w:before="0" w:line="300"/>
+        <w:jc w:val="both"/>
+      </w:pPr>
+      <w:r>
+        <w:rPr>
+          <w:rFonts w:ascii="Calibri" w:cs="Calibri" w:eastAsia="Calibri" w:hAnsi="Calibri"/>
+          <w:color w:val="1A1A1A"/>
+          <w:sz w:val="22"/>
+          <w:szCs w:val="22"/>
+        </w:rPr>
+        <w:t xml:space="preserve"/>
+      </w:r>
+    </w:p>
+    <w:p>
+      <w:pPr>
+        <w:pStyle w:val="Heading3"/>
+        <w:spacing w:after="160" w:before="300"/>
+      </w:pPr>
+      <w:r>
+        <w:rPr>
+          <w:rFonts w:ascii="Calibri" w:cs="Calibri" w:eastAsia="Calibri" w:hAnsi="Calibri"/>
+          <w:b/>
+          <w:bCs/>
+          <w:color w:val="123A6B"/>
+          <w:sz w:val="22"/>
+          <w:szCs w:val="22"/>
+        </w:rPr>
+        <w:t xml:space="preserve">O comparativo de crescimento do turismo no recorte</w:t>
+      </w:r>
+    </w:p>
+    <w:p>
+      <w:pPr>
+        <w:spacing w:after="140" w:before="0" w:line="300"/>
+        <w:jc w:val="both"/>
+      </w:pPr>
+      <w:r>
+        <w:rPr>
+          <w:rFonts w:ascii="Calibri" w:cs="Calibri" w:eastAsia="Calibri" w:hAnsi="Calibri"/>
+          <w:color w:val="1A1A1A"/>
+          <w:sz w:val="22"/>
+          <w:szCs w:val="22"/>
+        </w:rPr>
+        <w:t xml:space="preserve">Quatro indicadores independentes, todos oficiais, apontam na mesma direção no período de 2022 a 2025:</w:t>
+      </w:r>
+    </w:p>
+    <w:tbl>
+      <w:tblPr>
+        <w:tblW w:type="dxa" w:w="9360"/>
+        <w:tblBorders>
+          <w:top w:val="single" w:color="auto" w:sz="4"/>
+          <w:left w:val="single" w:color="auto" w:sz="4"/>
+          <w:bottom w:val="single" w:color="auto" w:sz="4"/>
+          <w:right w:val="single" w:color="auto" w:sz="4"/>
+          <w:insideH w:val="single" w:color="auto" w:sz="4"/>
+          <w:insideV w:val="single" w:color="auto" w:sz="4"/>
+        </w:tblBorders>
+      </w:tblPr>
+      <w:tblGrid>
+        <w:gridCol w:w="3100"/>
+        <w:gridCol w:w="2100"/>
+        <w:gridCol w:w="2100"/>
+        <w:gridCol w:w="2060"/>
+      </w:tblGrid>
+      <w:tr>
+        <w:trPr>
+          <w:tblHeader/>
+        </w:trPr>
+        <w:tc>
+          <w:tcPr>
+            <w:tcW w:type="dxa" w:w="3100"/>
+            <w:shd w:fill="123A6B" w:color="auto" w:val="clear"/>
+            <w:tcMar>
+              <w:top w:type="dxa" w:w="80"/>
+              <w:left w:type="dxa" w:w="110"/>
+              <w:bottom w:type="dxa" w:w="80"/>
+              <w:right w:type="dxa" w:w="110"/>
+            </w:tcMar>
+          </w:tcPr>
+          <w:p>
+            <w:pPr>
+              <w:spacing w:after="0" w:line="250"/>
+              <w:jc w:val="left"/>
+            </w:pPr>
+            <w:r>
+              <w:rPr>
+                <w:rFonts w:ascii="Calibri" w:cs="Calibri" w:eastAsia="Calibri" w:hAnsi="Calibri"/>
+                <w:b/>
+                <w:bCs/>
+                <w:color w:val="FFFFFF"/>
+                <w:sz w:val="17"/>
+                <w:szCs w:val="17"/>
+              </w:rPr>
+              <w:t xml:space="preserve">Indicador</w:t>
+            </w:r>
+          </w:p>
+        </w:tc>
+        <w:tc>
+          <w:tcPr>
+            <w:tcW w:type="dxa" w:w="2100"/>
+            <w:shd w:fill="123A6B" w:color="auto" w:val="clear"/>
+            <w:tcMar>
+              <w:top w:type="dxa" w:w="80"/>
+              <w:left w:type="dxa" w:w="110"/>
+              <w:bottom w:type="dxa" w:w="80"/>
+              <w:right w:type="dxa" w:w="110"/>
+            </w:tcMar>
+          </w:tcPr>
+          <w:p>
+            <w:pPr>
+              <w:spacing w:after="0" w:line="250"/>
+              <w:jc w:val="left"/>
+            </w:pPr>
+            <w:r>
+              <w:rPr>
+                <w:rFonts w:ascii="Calibri" w:cs="Calibri" w:eastAsia="Calibri" w:hAnsi="Calibri"/>
+                <w:b/>
+                <w:bCs/>
+                <w:color w:val="FFFFFF"/>
+                <w:sz w:val="17"/>
+                <w:szCs w:val="17"/>
+              </w:rPr>
+              <w:t xml:space="preserve">Início</w:t>
+            </w:r>
+          </w:p>
+        </w:tc>
+        <w:tc>
+          <w:tcPr>
+            <w:tcW w:type="dxa" w:w="2100"/>
+            <w:shd w:fill="123A6B" w:color="auto" w:val="clear"/>
+            <w:tcMar>
+              <w:top w:type="dxa" w:w="80"/>
+              <w:left w:type="dxa" w:w="110"/>
+              <w:bottom w:type="dxa" w:w="80"/>
+              <w:right w:type="dxa" w:w="110"/>
+            </w:tcMar>
+          </w:tcPr>
+          <w:p>
+            <w:pPr>
+              <w:spacing w:after="0" w:line="250"/>
+              <w:jc w:val="left"/>
+            </w:pPr>
+            <w:r>
+              <w:rPr>
+                <w:rFonts w:ascii="Calibri" w:cs="Calibri" w:eastAsia="Calibri" w:hAnsi="Calibri"/>
+                <w:b/>
+                <w:bCs/>
+                <w:color w:val="FFFFFF"/>
+                <w:sz w:val="17"/>
+                <w:szCs w:val="17"/>
+              </w:rPr>
+              <w:t xml:space="preserve">Fim</w:t>
+            </w:r>
+          </w:p>
+        </w:tc>
+        <w:tc>
+          <w:tcPr>
+            <w:tcW w:type="dxa" w:w="2060"/>
+            <w:shd w:fill="123A6B" w:color="auto" w:val="clear"/>
+            <w:tcMar>
+              <w:top w:type="dxa" w:w="80"/>
+              <w:left w:type="dxa" w:w="110"/>
+              <w:bottom w:type="dxa" w:w="80"/>
+              <w:right w:type="dxa" w:w="110"/>
+            </w:tcMar>
+          </w:tcPr>
+          <w:p>
+            <w:pPr>
+              <w:spacing w:after="0" w:line="250"/>
+              <w:jc w:val="left"/>
+            </w:pPr>
+            <w:r>
+              <w:rPr>
+                <w:rFonts w:ascii="Calibri" w:cs="Calibri" w:eastAsia="Calibri" w:hAnsi="Calibri"/>
+                <w:b/>
+                <w:bCs/>
+                <w:color w:val="FFFFFF"/>
+                <w:sz w:val="17"/>
+                <w:szCs w:val="17"/>
+              </w:rPr>
+              <w:t xml:space="preserve">Variação</w:t>
             </w:r>
           </w:p>
         </w:tc>
@@ -2437,7 +2624,7 @@
       <w:tr>
         <w:tc>
           <w:tcPr>
-            <w:tcW w:type="dxa" w:w="780"/>
+            <w:tcW w:type="dxa" w:w="3100"/>
             <w:tcMar>
               <w:top w:type="dxa" w:w="80"/>
               <w:left w:type="dxa" w:w="110"/>
@@ -2457,13 +2644,13 @@
                 <w:sz w:val="17"/>
                 <w:szCs w:val="17"/>
               </w:rPr>
-              <w:t xml:space="preserve">2022</w:t>
-            </w:r>
-          </w:p>
-        </w:tc>
-        <w:tc>
-          <w:tcPr>
-            <w:tcW w:type="dxa" w:w="2600"/>
+              <w:t xml:space="preserve">Ocupação hoteleira média da cidade</w:t>
+            </w:r>
+          </w:p>
+        </w:tc>
+        <w:tc>
+          <w:tcPr>
+            <w:tcW w:type="dxa" w:w="2100"/>
             <w:tcMar>
               <w:top w:type="dxa" w:w="80"/>
               <w:left w:type="dxa" w:w="110"/>
@@ -2483,13 +2670,13 @@
                 <w:sz w:val="17"/>
                 <w:szCs w:val="17"/>
               </w:rPr>
-              <w:t xml:space="preserve">Reabertura de fronteiras e retomada do turismo doméstico</w:t>
-            </w:r>
-          </w:p>
-        </w:tc>
-        <w:tc>
-          <w:tcPr>
-            <w:tcW w:type="dxa" w:w="2900"/>
+              <w:t xml:space="preserve">65,00% (2022)</w:t>
+            </w:r>
+          </w:p>
+        </w:tc>
+        <w:tc>
+          <w:tcPr>
+            <w:tcW w:type="dxa" w:w="2100"/>
             <w:tcMar>
               <w:top w:type="dxa" w:w="80"/>
               <w:left w:type="dxa" w:w="110"/>
@@ -2509,13 +2696,13 @@
                 <w:sz w:val="17"/>
                 <w:szCs w:val="17"/>
               </w:rPr>
-              <w:t xml:space="preserve">Carnaval em abril; Rock in Rio em setembro</w:t>
-            </w:r>
-          </w:p>
-        </w:tc>
-        <w:tc>
-          <w:tcPr>
-            <w:tcW w:type="dxa" w:w="1440"/>
+              <w:t xml:space="preserve">77,73% (2025)</w:t>
+            </w:r>
+          </w:p>
+        </w:tc>
+        <w:tc>
+          <w:tcPr>
+            <w:tcW w:type="dxa" w:w="2060"/>
             <w:tcMar>
               <w:top w:type="dxa" w:w="80"/>
               <w:left w:type="dxa" w:w="110"/>
@@ -2535,13 +2722,16 @@
                 <w:sz w:val="17"/>
                 <w:szCs w:val="17"/>
               </w:rPr>
-              <w:t xml:space="preserve">65,00%</w:t>
-            </w:r>
-          </w:p>
-        </w:tc>
-        <w:tc>
-          <w:tcPr>
-            <w:tcW w:type="dxa" w:w="1640"/>
+              <w:t xml:space="preserve">+12,72 p.p.</w:t>
+            </w:r>
+          </w:p>
+        </w:tc>
+      </w:tr>
+      <w:tr>
+        <w:tc>
+          <w:tcPr>
+            <w:tcW w:type="dxa" w:w="3100"/>
+            <w:shd w:fill="F2F4F7" w:color="auto" w:val="clear"/>
             <w:tcMar>
               <w:top w:type="dxa" w:w="80"/>
               <w:left w:type="dxa" w:w="110"/>
@@ -2561,7 +2751,88 @@
                 <w:sz w:val="17"/>
                 <w:szCs w:val="17"/>
               </w:rPr>
-              <w:t xml:space="preserve">HotéisRIO; FGV</w:t>
+              <w:t xml:space="preserve">Visitantes recebidos pela cidade</w:t>
+            </w:r>
+          </w:p>
+        </w:tc>
+        <w:tc>
+          <w:tcPr>
+            <w:tcW w:type="dxa" w:w="2100"/>
+            <w:shd w:fill="F2F4F7" w:color="auto" w:val="clear"/>
+            <w:tcMar>
+              <w:top w:type="dxa" w:w="80"/>
+              <w:left w:type="dxa" w:w="110"/>
+              <w:bottom w:type="dxa" w:w="80"/>
+              <w:right w:type="dxa" w:w="110"/>
+            </w:tcMar>
+          </w:tcPr>
+          <w:p>
+            <w:pPr>
+              <w:spacing w:after="0" w:line="250"/>
+              <w:jc w:val="left"/>
+            </w:pPr>
+            <w:r>
+              <w:rPr>
+                <w:rFonts w:ascii="Calibri" w:cs="Calibri" w:eastAsia="Calibri" w:hAnsi="Calibri"/>
+                <w:color w:val="1A1A1A"/>
+                <w:sz w:val="17"/>
+                <w:szCs w:val="17"/>
+              </w:rPr>
+              <w:t xml:space="preserve">11,4 mi (2024)</w:t>
+            </w:r>
+          </w:p>
+        </w:tc>
+        <w:tc>
+          <w:tcPr>
+            <w:tcW w:type="dxa" w:w="2100"/>
+            <w:shd w:fill="F2F4F7" w:color="auto" w:val="clear"/>
+            <w:tcMar>
+              <w:top w:type="dxa" w:w="80"/>
+              <w:left w:type="dxa" w:w="110"/>
+              <w:bottom w:type="dxa" w:w="80"/>
+              <w:right w:type="dxa" w:w="110"/>
+            </w:tcMar>
+          </w:tcPr>
+          <w:p>
+            <w:pPr>
+              <w:spacing w:after="0" w:line="250"/>
+              <w:jc w:val="left"/>
+            </w:pPr>
+            <w:r>
+              <w:rPr>
+                <w:rFonts w:ascii="Calibri" w:cs="Calibri" w:eastAsia="Calibri" w:hAnsi="Calibri"/>
+                <w:color w:val="1A1A1A"/>
+                <w:sz w:val="17"/>
+                <w:szCs w:val="17"/>
+              </w:rPr>
+              <w:t xml:space="preserve">12,5 mi (2025)</w:t>
+            </w:r>
+          </w:p>
+        </w:tc>
+        <w:tc>
+          <w:tcPr>
+            <w:tcW w:type="dxa" w:w="2060"/>
+            <w:shd w:fill="F2F4F7" w:color="auto" w:val="clear"/>
+            <w:tcMar>
+              <w:top w:type="dxa" w:w="80"/>
+              <w:left w:type="dxa" w:w="110"/>
+              <w:bottom w:type="dxa" w:w="80"/>
+              <w:right w:type="dxa" w:w="110"/>
+            </w:tcMar>
+          </w:tcPr>
+          <w:p>
+            <w:pPr>
+              <w:spacing w:after="0" w:line="250"/>
+              <w:jc w:val="left"/>
+            </w:pPr>
+            <w:r>
+              <w:rPr>
+                <w:rFonts w:ascii="Calibri" w:cs="Calibri" w:eastAsia="Calibri" w:hAnsi="Calibri"/>
+                <w:color w:val="1A1A1A"/>
+                <w:sz w:val="17"/>
+                <w:szCs w:val="17"/>
+              </w:rPr>
+              <w:t xml:space="preserve">+10,5%</w:t>
             </w:r>
           </w:p>
         </w:tc>
@@ -2569,8 +2840,7 @@
       <w:tr>
         <w:tc>
           <w:tcPr>
-            <w:tcW w:type="dxa" w:w="780"/>
-            <w:shd w:fill="F2F4F7" w:color="auto" w:val="clear"/>
+            <w:tcW w:type="dxa" w:w="3100"/>
             <w:tcMar>
               <w:top w:type="dxa" w:w="80"/>
               <w:left w:type="dxa" w:w="110"/>
@@ -2590,14 +2860,13 @@
                 <w:sz w:val="17"/>
                 <w:szCs w:val="17"/>
               </w:rPr>
-              <w:t xml:space="preserve">2023</w:t>
-            </w:r>
-          </w:p>
-        </w:tc>
-        <w:tc>
-          <w:tcPr>
-            <w:tcW w:type="dxa" w:w="2600"/>
-            <w:shd w:fill="F2F4F7" w:color="auto" w:val="clear"/>
+              <w:t xml:space="preserve">Visitantes estrangeiros na cidade</w:t>
+            </w:r>
+          </w:p>
+        </w:tc>
+        <w:tc>
+          <w:tcPr>
+            <w:tcW w:type="dxa" w:w="2100"/>
             <w:tcMar>
               <w:top w:type="dxa" w:w="80"/>
               <w:left w:type="dxa" w:w="110"/>
@@ -2617,14 +2886,13 @@
                 <w:sz w:val="17"/>
                 <w:szCs w:val="17"/>
               </w:rPr>
-              <w:t xml:space="preserve">Turismo internacional injeta R$ 34,5 bi no Brasil; chegadas em 93% do nível de 2019</w:t>
-            </w:r>
-          </w:p>
-        </w:tc>
-        <w:tc>
-          <w:tcPr>
-            <w:tcW w:type="dxa" w:w="2900"/>
-            <w:shd w:fill="F2F4F7" w:color="auto" w:val="clear"/>
+              <w:t xml:space="preserve">1,5 mi (2024)</w:t>
+            </w:r>
+          </w:p>
+        </w:tc>
+        <w:tc>
+          <w:tcPr>
+            <w:tcW w:type="dxa" w:w="2100"/>
             <w:tcMar>
               <w:top w:type="dxa" w:w="80"/>
               <w:left w:type="dxa" w:w="110"/>
@@ -2644,14 +2912,13 @@
                 <w:sz w:val="17"/>
                 <w:szCs w:val="17"/>
               </w:rPr>
-              <w:t xml:space="preserve">Web Summit Rio; Taylor Swift, RBD e RHCP; final da Libertadores</w:t>
-            </w:r>
-          </w:p>
-        </w:tc>
-        <w:tc>
-          <w:tcPr>
-            <w:tcW w:type="dxa" w:w="1440"/>
-            <w:shd w:fill="F2F4F7" w:color="auto" w:val="clear"/>
+              <w:t xml:space="preserve">2,1 mi (2025)</w:t>
+            </w:r>
+          </w:p>
+        </w:tc>
+        <w:tc>
+          <w:tcPr>
+            <w:tcW w:type="dxa" w:w="2060"/>
             <w:tcMar>
               <w:top w:type="dxa" w:w="80"/>
               <w:left w:type="dxa" w:w="110"/>
@@ -2671,13 +2938,15 @@
                 <w:sz w:val="17"/>
                 <w:szCs w:val="17"/>
               </w:rPr>
-              <w:t xml:space="preserve">71,11%</w:t>
-            </w:r>
-          </w:p>
-        </w:tc>
-        <w:tc>
-          <w:tcPr>
-            <w:tcW w:type="dxa" w:w="1640"/>
+              <w:t xml:space="preserve">+44,8%</w:t>
+            </w:r>
+          </w:p>
+        </w:tc>
+      </w:tr>
+      <w:tr>
+        <w:tc>
+          <w:tcPr>
+            <w:tcW w:type="dxa" w:w="3100"/>
             <w:shd w:fill="F2F4F7" w:color="auto" w:val="clear"/>
             <w:tcMar>
               <w:top w:type="dxa" w:w="80"/>
@@ -2698,7 +2967,88 @@
                 <w:sz w:val="17"/>
                 <w:szCs w:val="17"/>
               </w:rPr>
-              <w:t xml:space="preserve">MTur; Prefeitura; HotéisRIO</w:t>
+              <w:t xml:space="preserve">Movimentação econômica do turismo na cidade</w:t>
+            </w:r>
+          </w:p>
+        </w:tc>
+        <w:tc>
+          <w:tcPr>
+            <w:tcW w:type="dxa" w:w="2100"/>
+            <w:shd w:fill="F2F4F7" w:color="auto" w:val="clear"/>
+            <w:tcMar>
+              <w:top w:type="dxa" w:w="80"/>
+              <w:left w:type="dxa" w:w="110"/>
+              <w:bottom w:type="dxa" w:w="80"/>
+              <w:right w:type="dxa" w:w="110"/>
+            </w:tcMar>
+          </w:tcPr>
+          <w:p>
+            <w:pPr>
+              <w:spacing w:after="0" w:line="250"/>
+              <w:jc w:val="left"/>
+            </w:pPr>
+            <w:r>
+              <w:rPr>
+                <w:rFonts w:ascii="Calibri" w:cs="Calibri" w:eastAsia="Calibri" w:hAnsi="Calibri"/>
+                <w:color w:val="1A1A1A"/>
+                <w:sz w:val="17"/>
+                <w:szCs w:val="17"/>
+              </w:rPr>
+              <w:t xml:space="preserve">—</w:t>
+            </w:r>
+          </w:p>
+        </w:tc>
+        <w:tc>
+          <w:tcPr>
+            <w:tcW w:type="dxa" w:w="2100"/>
+            <w:shd w:fill="F2F4F7" w:color="auto" w:val="clear"/>
+            <w:tcMar>
+              <w:top w:type="dxa" w:w="80"/>
+              <w:left w:type="dxa" w:w="110"/>
+              <w:bottom w:type="dxa" w:w="80"/>
+              <w:right w:type="dxa" w:w="110"/>
+            </w:tcMar>
+          </w:tcPr>
+          <w:p>
+            <w:pPr>
+              <w:spacing w:after="0" w:line="250"/>
+              <w:jc w:val="left"/>
+            </w:pPr>
+            <w:r>
+              <w:rPr>
+                <w:rFonts w:ascii="Calibri" w:cs="Calibri" w:eastAsia="Calibri" w:hAnsi="Calibri"/>
+                <w:color w:val="1A1A1A"/>
+                <w:sz w:val="17"/>
+                <w:szCs w:val="17"/>
+              </w:rPr>
+              <w:t xml:space="preserve">R$ 27,2 bi (2025)</w:t>
+            </w:r>
+          </w:p>
+        </w:tc>
+        <w:tc>
+          <w:tcPr>
+            <w:tcW w:type="dxa" w:w="2060"/>
+            <w:shd w:fill="F2F4F7" w:color="auto" w:val="clear"/>
+            <w:tcMar>
+              <w:top w:type="dxa" w:w="80"/>
+              <w:left w:type="dxa" w:w="110"/>
+              <w:bottom w:type="dxa" w:w="80"/>
+              <w:right w:type="dxa" w:w="110"/>
+            </w:tcMar>
+          </w:tcPr>
+          <w:p>
+            <w:pPr>
+              <w:spacing w:after="0" w:line="250"/>
+              <w:jc w:val="left"/>
+            </w:pPr>
+            <w:r>
+              <w:rPr>
+                <w:rFonts w:ascii="Calibri" w:cs="Calibri" w:eastAsia="Calibri" w:hAnsi="Calibri"/>
+                <w:color w:val="1A1A1A"/>
+                <w:sz w:val="17"/>
+                <w:szCs w:val="17"/>
+              </w:rPr>
+              <w:t xml:space="preserve">R$ 19,5 bi nacionais + R$ 7,8 bi internacionais</w:t>
             </w:r>
           </w:p>
         </w:tc>
@@ -2706,7 +3056,7 @@
       <w:tr>
         <w:tc>
           <w:tcPr>
-            <w:tcW w:type="dxa" w:w="780"/>
+            <w:tcW w:type="dxa" w:w="3100"/>
             <w:tcMar>
               <w:top w:type="dxa" w:w="80"/>
               <w:left w:type="dxa" w:w="110"/>
@@ -2726,13 +3076,13 @@
                 <w:sz w:val="17"/>
                 <w:szCs w:val="17"/>
               </w:rPr>
-              <w:t xml:space="preserve">2024</w:t>
-            </w:r>
-          </w:p>
-        </w:tc>
-        <w:tc>
-          <w:tcPr>
-            <w:tcW w:type="dxa" w:w="2600"/>
+              <w:t xml:space="preserve">Chegadas de estrangeiros ao Brasil</w:t>
+            </w:r>
+          </w:p>
+        </w:tc>
+        <w:tc>
+          <w:tcPr>
+            <w:tcW w:type="dxa" w:w="2100"/>
             <w:tcMar>
               <w:top w:type="dxa" w:w="80"/>
               <w:left w:type="dxa" w:w="110"/>
@@ -2752,13 +3102,13 @@
                 <w:sz w:val="17"/>
                 <w:szCs w:val="17"/>
               </w:rPr>
-              <w:t xml:space="preserve">Brasil bate recorde com 6,65 mi de estrangeiros (+12,6%); Rio recebe 11,4 mi de visitantes</w:t>
-            </w:r>
-          </w:p>
-        </w:tc>
-        <w:tc>
-          <w:tcPr>
-            <w:tcW w:type="dxa" w:w="2900"/>
+              <w:t xml:space="preserve">6,65 mi (2024)</w:t>
+            </w:r>
+          </w:p>
+        </w:tc>
+        <w:tc>
+          <w:tcPr>
+            <w:tcW w:type="dxa" w:w="2100"/>
             <w:tcMar>
               <w:top w:type="dxa" w:w="80"/>
               <w:left w:type="dxa" w:w="110"/>
@@ -2778,13 +3128,13 @@
                 <w:sz w:val="17"/>
                 <w:szCs w:val="17"/>
               </w:rPr>
-              <w:t xml:space="preserve">Madonna em Copacabana; Rock in Rio 40 anos; Cúpula do G20</w:t>
-            </w:r>
-          </w:p>
-        </w:tc>
-        <w:tc>
-          <w:tcPr>
-            <w:tcW w:type="dxa" w:w="1440"/>
+              <w:t xml:space="preserve">9,29 mi (2025)</w:t>
+            </w:r>
+          </w:p>
+        </w:tc>
+        <w:tc>
+          <w:tcPr>
+            <w:tcW w:type="dxa" w:w="2060"/>
             <w:tcMar>
               <w:top w:type="dxa" w:w="80"/>
               <w:left w:type="dxa" w:w="110"/>
@@ -2804,13 +3154,16 @@
                 <w:sz w:val="17"/>
                 <w:szCs w:val="17"/>
               </w:rPr>
-              <w:t xml:space="preserve">73,15%</w:t>
-            </w:r>
-          </w:p>
-        </w:tc>
-        <w:tc>
-          <w:tcPr>
-            <w:tcW w:type="dxa" w:w="1640"/>
+              <w:t xml:space="preserve">+37,1% (recorde histórico)</w:t>
+            </w:r>
+          </w:p>
+        </w:tc>
+      </w:tr>
+      <w:tr>
+        <w:tc>
+          <w:tcPr>
+            <w:tcW w:type="dxa" w:w="3100"/>
+            <w:shd w:fill="F2F4F7" w:color="auto" w:val="clear"/>
             <w:tcMar>
               <w:top w:type="dxa" w:w="80"/>
               <w:left w:type="dxa" w:w="110"/>
@@ -2830,15 +3183,13 @@
                 <w:sz w:val="17"/>
                 <w:szCs w:val="17"/>
               </w:rPr>
-              <w:t xml:space="preserve">Agência Gov; Prefeitura; HotéisRIO</w:t>
-            </w:r>
-          </w:p>
-        </w:tc>
-      </w:tr>
-      <w:tr>
-        <w:tc>
-          <w:tcPr>
-            <w:tcW w:type="dxa" w:w="780"/>
+              <w:t xml:space="preserve">Meses de 2025 acima do mesmo mês de 2022</w:t>
+            </w:r>
+          </w:p>
+        </w:tc>
+        <w:tc>
+          <w:tcPr>
+            <w:tcW w:type="dxa" w:w="2100"/>
             <w:shd w:fill="F2F4F7" w:color="auto" w:val="clear"/>
             <w:tcMar>
               <w:top w:type="dxa" w:w="80"/>
@@ -2859,13 +3210,13 @@
                 <w:sz w:val="17"/>
                 <w:szCs w:val="17"/>
               </w:rPr>
-              <w:t xml:space="preserve">2025</w:t>
-            </w:r>
-          </w:p>
-        </w:tc>
-        <w:tc>
-          <w:tcPr>
-            <w:tcW w:type="dxa" w:w="2600"/>
+              <w:t xml:space="preserve">—</w:t>
+            </w:r>
+          </w:p>
+        </w:tc>
+        <w:tc>
+          <w:tcPr>
+            <w:tcW w:type="dxa" w:w="2100"/>
             <w:shd w:fill="F2F4F7" w:color="auto" w:val="clear"/>
             <w:tcMar>
               <w:top w:type="dxa" w:w="80"/>
@@ -2886,13 +3237,13 @@
                 <w:sz w:val="17"/>
                 <w:szCs w:val="17"/>
               </w:rPr>
-              <w:t xml:space="preserve">Brasil alcança 9,29 mi de estrangeiros (+37,1%); Rio recebe 12,5 mi de visitantes e movimenta R$ 27,2 bi, com fluxo internacional +44,8%</w:t>
-            </w:r>
-          </w:p>
-        </w:tc>
-        <w:tc>
-          <w:tcPr>
-            <w:tcW w:type="dxa" w:w="2900"/>
+              <w:t xml:space="preserve">12 de 12</w:t>
+            </w:r>
+          </w:p>
+        </w:tc>
+        <w:tc>
+          <w:tcPr>
+            <w:tcW w:type="dxa" w:w="2060"/>
             <w:shd w:fill="F2F4F7" w:color="auto" w:val="clear"/>
             <w:tcMar>
               <w:top w:type="dxa" w:w="80"/>
@@ -2913,61 +3264,7 @@
                 <w:sz w:val="17"/>
                 <w:szCs w:val="17"/>
               </w:rPr>
-              <w:t xml:space="preserve">Carnaval recorde; Web Summit; Lady Gaga; Cúpula do BRICS; Rio Innovation Week</w:t>
-            </w:r>
-          </w:p>
-        </w:tc>
-        <w:tc>
-          <w:tcPr>
-            <w:tcW w:type="dxa" w:w="1440"/>
-            <w:shd w:fill="F2F4F7" w:color="auto" w:val="clear"/>
-            <w:tcMar>
-              <w:top w:type="dxa" w:w="80"/>
-              <w:left w:type="dxa" w:w="110"/>
-              <w:bottom w:type="dxa" w:w="80"/>
-              <w:right w:type="dxa" w:w="110"/>
-            </w:tcMar>
-          </w:tcPr>
-          <w:p>
-            <w:pPr>
-              <w:spacing w:after="0" w:line="250"/>
-              <w:jc w:val="left"/>
-            </w:pPr>
-            <w:r>
-              <w:rPr>
-                <w:rFonts w:ascii="Calibri" w:cs="Calibri" w:eastAsia="Calibri" w:hAnsi="Calibri"/>
-                <w:color w:val="1A1A1A"/>
-                <w:sz w:val="17"/>
-                <w:szCs w:val="17"/>
-              </w:rPr>
-              <w:t xml:space="preserve">77,73%</w:t>
-            </w:r>
-          </w:p>
-        </w:tc>
-        <w:tc>
-          <w:tcPr>
-            <w:tcW w:type="dxa" w:w="1640"/>
-            <w:shd w:fill="F2F4F7" w:color="auto" w:val="clear"/>
-            <w:tcMar>
-              <w:top w:type="dxa" w:w="80"/>
-              <w:left w:type="dxa" w:w="110"/>
-              <w:bottom w:type="dxa" w:w="80"/>
-              <w:right w:type="dxa" w:w="110"/>
-            </w:tcMar>
-          </w:tcPr>
-          <w:p>
-            <w:pPr>
-              <w:spacing w:after="0" w:line="250"/>
-              <w:jc w:val="left"/>
-            </w:pPr>
-            <w:r>
-              <w:rPr>
-                <w:rFonts w:ascii="Calibri" w:cs="Calibri" w:eastAsia="Calibri" w:hAnsi="Calibri"/>
-                <w:color w:val="1A1A1A"/>
-                <w:sz w:val="17"/>
-                <w:szCs w:val="17"/>
-              </w:rPr>
-              <w:t xml:space="preserve">Secom; Embratur; Prefeitura/IFec RJ; HotéisRIO</w:t>
+              <w:t xml:space="preserve">sem exceção</w:t>
             </w:r>
           </w:p>
         </w:tc>
@@ -3081,7 +3378,7 @@
         </w:rPr>
         <w:t xml:space="preserve">→ Rock in Rio gera R$ 2,6 bilhões para economia fluminense — Agência Brasil, 23 set. 2024 </w:t>
       </w:r>
-      <w:hyperlink w:history="1" r:id="rIdqb7manfsgqity1ppo41d1">
+      <w:hyperlink w:history="1" r:id="rIdl0mmgq14c1oxioomvlm4i">
         <w:r>
           <w:rPr>
             <w:rFonts w:ascii="Calibri" w:cs="Calibri" w:eastAsia="Calibri" w:hAnsi="Calibri"/>
@@ -3109,7 +3406,7 @@
         </w:rPr>
         <w:t xml:space="preserve">→ Estudo da FGV sobre o impacto econômico do Rock in Rio 2024 — Hotelier News </w:t>
       </w:r>
-      <w:hyperlink w:history="1" r:id="rIdvnx5ominnpmcob3stb9ou">
+      <w:hyperlink w:history="1" r:id="rId-abnneap2k9vjaetgsrft">
         <w:r>
           <w:rPr>
             <w:rFonts w:ascii="Calibri" w:cs="Calibri" w:eastAsia="Calibri" w:hAnsi="Calibri"/>
@@ -3182,7 +3479,7 @@
         </w:rPr>
         <w:t xml:space="preserve">→ O futuro do turismo no Brasil a partir da análise crítica do período 2000-2019 — RBTur / SciELO </w:t>
       </w:r>
-      <w:hyperlink w:history="1" r:id="rIduf4dgzykzhedpr8iamrzy">
+      <w:hyperlink w:history="1" r:id="rId0mu-hrnyj89cxsq8kupo8">
         <w:r>
           <w:rPr>
             <w:rFonts w:ascii="Calibri" w:cs="Calibri" w:eastAsia="Calibri" w:hAnsi="Calibri"/>
@@ -3224,7 +3521,7 @@
           <w:sz w:val="22"/>
           <w:szCs w:val="22"/>
         </w:rPr>
-        <w:t xml:space="preserve">Identificar os eventos turísticos de maior relevância para o Rio de Janeiro no período de 2018 a 2025, relacionando-os aos dados de ocupação hoteleira; analisar os impactos da pandemia da Covid-19 na atividade turística; e discutir a importância destes eventos para a imagem e o crescimento do turismo na cidade.</w:t>
+        <w:t xml:space="preserve">Identificar os eventos turísticos de maior relevância para o Rio de Janeiro no período de 2022 a 2025, relacionando-os aos dados de ocupação hoteleira e ao fluxo de visitantes recebidos pela cidade, e discutir a importância destes eventos para a imagem e o crescimento do turismo carioca.</w:t>
       </w:r>
     </w:p>
     <w:p>
@@ -3471,7 +3768,7 @@
           <w:sz w:val="22"/>
           <w:szCs w:val="22"/>
         </w:rPr>
-        <w:t xml:space="preserve">Recorte analítico: embora a série completa de 2018 a 2025 seja apresentada, a análise se concentra em 2023-2025, intervalo coberto pelo Observatório publicado e no qual a autora conduz diretamente o levantamento. O período 2018-2022 é tratado como contexto histórico e contrafactual.</w:t>
+        <w:t xml:space="preserve">Recorte analítico: a análise cobre os quatro anos de 2022 a 2025 — 48 medições mensais em cinco regiões. A escolha do recorte tem três razões. Primeira, 2022 é o primeiro ano em que a cidade voltou a operar um calendário completo de grandes eventos, o que torna o período homogêneo: todos os anos analisados têm calendário cheio. Segunda, o período contém o achado mais expressivo da série — em 2022, setembro (75,63%) superou janeiro (73,27%). Terceira, todos os doze meses de 2025 superaram os doze meses correspondentes de 2022, sem uma única exceção, o que permite afirmar crescimento sem depender de comparação com os anos de interrupção sanitária. O ciclo dos megaeventos de 2014 e 2016 e os anos de 2020 e 2021 entram como contexto, para explicar o ponto de partida.</w:t>
       </w:r>
     </w:p>
     <w:p>
@@ -3598,7 +3895,7 @@
           <w:sz w:val="22"/>
           <w:szCs w:val="22"/>
         </w:rPr>
-        <w:t xml:space="preserve">Comparação do mesmo mês do calendário entre anos diferentes, tomando como linha de base a média do mesmo mês em 2018 e 2019 — anos anteriores à pandemia e ao ciclo atual de eventos. É o procedimento que permite isolar parcialmente o efeito do evento do efeito da estação.</w:t>
+        <w:t xml:space="preserve">Comparação do mesmo mês do calendário entre anos diferentes, tomando 2022 como ano-base interno do recorte. É o procedimento que permite isolar parcialmente o efeito do evento do efeito da estação, e tem a vantagem de manter a comparação dentro do próprio período analisado.</w:t>
       </w:r>
     </w:p>
     <w:p>
@@ -3613,7 +3910,7 @@
           <w:sz w:val="22"/>
           <w:szCs w:val="22"/>
         </w:rPr>
-        <w:t xml:space="preserve">O quinto passo produziu o resultado mais expressivo da pesquisa. Nos meses com evento de grande porte, o movimento superou a média do mesmo mês em 2018-2019 nas seguintes magnitudes:</w:t>
+        <w:t xml:space="preserve">O quinto passo produziu o resultado mais expressivo da pesquisa: todos os doze meses de 2025 superaram os doze meses correspondentes de 2022, e os meses com evento de grande porte apresentam as maiores diferenças:</w:t>
       </w:r>
     </w:p>
     <w:tbl>
@@ -3750,7 +4047,7 @@
                 <w:sz w:val="17"/>
                 <w:szCs w:val="17"/>
               </w:rPr>
-              <w:t xml:space="preserve">Diferença</w:t>
+              <w:t xml:space="preserve">Diferença sobre o mesmo mês de 2022</w:t>
             </w:r>
           </w:p>
         </w:tc>
@@ -3778,7 +4075,7 @@
                 <w:sz w:val="17"/>
                 <w:szCs w:val="17"/>
               </w:rPr>
-              <w:t xml:space="preserve">abril/2022</w:t>
+              <w:t xml:space="preserve">setembro/2022</w:t>
             </w:r>
           </w:p>
         </w:tc>
@@ -3804,7 +4101,7 @@
                 <w:sz w:val="17"/>
                 <w:szCs w:val="17"/>
               </w:rPr>
-              <w:t xml:space="preserve">Carnaval adiado para abril</w:t>
+              <w:t xml:space="preserve">Rock in Rio (ano-base; pico do ano, acima de janeiro)</w:t>
             </w:r>
           </w:p>
         </w:tc>
@@ -3830,7 +4127,7 @@
                 <w:sz w:val="17"/>
                 <w:szCs w:val="17"/>
               </w:rPr>
-              <w:t xml:space="preserve">63,68%</w:t>
+              <w:t xml:space="preserve">75,63%</w:t>
             </w:r>
           </w:p>
         </w:tc>
@@ -3856,7 +4153,7 @@
                 <w:sz w:val="17"/>
                 <w:szCs w:val="17"/>
               </w:rPr>
-              <w:t xml:space="preserve">+13,63 p.p.</w:t>
+              <w:t xml:space="preserve">—</w:t>
             </w:r>
           </w:p>
         </w:tc>
@@ -3885,7 +4182,7 @@
                 <w:sz w:val="17"/>
                 <w:szCs w:val="17"/>
               </w:rPr>
-              <w:t xml:space="preserve">setembro/2022</w:t>
+              <w:t xml:space="preserve">maio/2023</w:t>
             </w:r>
           </w:p>
         </w:tc>
@@ -3912,7 +4209,7 @@
                 <w:sz w:val="17"/>
                 <w:szCs w:val="17"/>
               </w:rPr>
-              <w:t xml:space="preserve">Rock in Rio</w:t>
+              <w:t xml:space="preserve">Web Summit Rio, 1ª edição</w:t>
             </w:r>
           </w:p>
         </w:tc>
@@ -3939,7 +4236,7 @@
                 <w:sz w:val="17"/>
                 <w:szCs w:val="17"/>
               </w:rPr>
-              <w:t xml:space="preserve">75,63%</w:t>
+              <w:t xml:space="preserve">60,58%</w:t>
             </w:r>
           </w:p>
         </w:tc>
@@ -3966,7 +4263,7 @@
                 <w:sz w:val="17"/>
                 <w:szCs w:val="17"/>
               </w:rPr>
-              <w:t xml:space="preserve">+19,71 p.p.</w:t>
+              <w:t xml:space="preserve">+7,89 p.p.</w:t>
             </w:r>
           </w:p>
         </w:tc>
@@ -3994,7 +4291,7 @@
                 <w:sz w:val="17"/>
                 <w:szCs w:val="17"/>
               </w:rPr>
-              <w:t xml:space="preserve">maio/2023</w:t>
+              <w:t xml:space="preserve">novembro/2023</w:t>
             </w:r>
           </w:p>
         </w:tc>
@@ -4020,7 +4317,7 @@
                 <w:sz w:val="17"/>
                 <w:szCs w:val="17"/>
               </w:rPr>
-              <w:t xml:space="preserve">Web Summit Rio, 1ª edição</w:t>
+              <w:t xml:space="preserve">Taylor Swift, RBD, RHCP e final da Libertadores</w:t>
             </w:r>
           </w:p>
         </w:tc>
@@ -4046,7 +4343,7 @@
                 <w:sz w:val="17"/>
                 <w:szCs w:val="17"/>
               </w:rPr>
-              <w:t xml:space="preserve">60,58%</w:t>
+              <w:t xml:space="preserve">81,98%</w:t>
             </w:r>
           </w:p>
         </w:tc>
@@ -4072,7 +4369,7 @@
                 <w:sz w:val="17"/>
                 <w:szCs w:val="17"/>
               </w:rPr>
-              <w:t xml:space="preserve">+16,48 p.p.</w:t>
+              <w:t xml:space="preserve">+11,31 p.p.</w:t>
             </w:r>
           </w:p>
         </w:tc>
@@ -4101,7 +4398,7 @@
                 <w:sz w:val="17"/>
                 <w:szCs w:val="17"/>
               </w:rPr>
-              <w:t xml:space="preserve">novembro/2023</w:t>
+              <w:t xml:space="preserve">maio/2024</w:t>
             </w:r>
           </w:p>
         </w:tc>
@@ -4128,7 +4425,7 @@
                 <w:sz w:val="17"/>
                 <w:szCs w:val="17"/>
               </w:rPr>
-              <w:t xml:space="preserve">Taylor Swift, RBD, RHCP e Libertadores</w:t>
+              <w:t xml:space="preserve">Madonna em Copacabana</w:t>
             </w:r>
           </w:p>
         </w:tc>
@@ -4155,7 +4452,7 @@
                 <w:sz w:val="17"/>
                 <w:szCs w:val="17"/>
               </w:rPr>
-              <w:t xml:space="preserve">81,98%</w:t>
+              <w:t xml:space="preserve">67,89%</w:t>
             </w:r>
           </w:p>
         </w:tc>
@@ -4182,7 +4479,7 @@
                 <w:sz w:val="17"/>
                 <w:szCs w:val="17"/>
               </w:rPr>
-              <w:t xml:space="preserve">+18,28 p.p.</w:t>
+              <w:t xml:space="preserve">+15,20 p.p.</w:t>
             </w:r>
           </w:p>
         </w:tc>
@@ -4210,7 +4507,7 @@
                 <w:sz w:val="17"/>
                 <w:szCs w:val="17"/>
               </w:rPr>
-              <w:t xml:space="preserve">maio/2024</w:t>
+              <w:t xml:space="preserve">setembro/2024</w:t>
             </w:r>
           </w:p>
         </w:tc>
@@ -4236,7 +4533,7 @@
                 <w:sz w:val="17"/>
                 <w:szCs w:val="17"/>
               </w:rPr>
-              <w:t xml:space="preserve">Madonna em Copacabana</w:t>
+              <w:t xml:space="preserve">Rock in Rio 40 anos</w:t>
             </w:r>
           </w:p>
         </w:tc>
@@ -4262,7 +4559,7 @@
                 <w:sz w:val="17"/>
                 <w:szCs w:val="17"/>
               </w:rPr>
-              <w:t xml:space="preserve">67,89%</w:t>
+              <w:t xml:space="preserve">78,25%</w:t>
             </w:r>
           </w:p>
         </w:tc>
@@ -4288,7 +4585,7 @@
                 <w:sz w:val="17"/>
                 <w:szCs w:val="17"/>
               </w:rPr>
-              <w:t xml:space="preserve">+23,79 p.p.</w:t>
+              <w:t xml:space="preserve">+2,62 p.p.</w:t>
             </w:r>
           </w:p>
         </w:tc>
@@ -4317,7 +4614,7 @@
                 <w:sz w:val="17"/>
                 <w:szCs w:val="17"/>
               </w:rPr>
-              <w:t xml:space="preserve">setembro/2024</w:t>
+              <w:t xml:space="preserve">novembro/2024</w:t>
             </w:r>
           </w:p>
         </w:tc>
@@ -4344,7 +4641,7 @@
                 <w:sz w:val="17"/>
                 <w:szCs w:val="17"/>
               </w:rPr>
-              <w:t xml:space="preserve">Rock in Rio 40 anos</w:t>
+              <w:t xml:space="preserve">Cúpula do G20</w:t>
             </w:r>
           </w:p>
         </w:tc>
@@ -4371,7 +4668,7 @@
                 <w:sz w:val="17"/>
                 <w:szCs w:val="17"/>
               </w:rPr>
-              <w:t xml:space="preserve">78,25%</w:t>
+              <w:t xml:space="preserve">81,61%</w:t>
             </w:r>
           </w:p>
         </w:tc>
@@ -4398,7 +4695,7 @@
                 <w:sz w:val="17"/>
                 <w:szCs w:val="17"/>
               </w:rPr>
-              <w:t xml:space="preserve">+22,34 p.p.</w:t>
+              <w:t xml:space="preserve">+10,94 p.p.</w:t>
             </w:r>
           </w:p>
         </w:tc>
@@ -4426,7 +4723,7 @@
                 <w:sz w:val="17"/>
                 <w:szCs w:val="17"/>
               </w:rPr>
-              <w:t xml:space="preserve">novembro/2024</w:t>
+              <w:t xml:space="preserve">fevereiro/2025</w:t>
             </w:r>
           </w:p>
         </w:tc>
@@ -4452,7 +4749,7 @@
                 <w:sz w:val="17"/>
                 <w:szCs w:val="17"/>
               </w:rPr>
-              <w:t xml:space="preserve">Cúpula do G20</w:t>
+              <w:t xml:space="preserve">Carnaval 2025 (98,62% no período da folia)</w:t>
             </w:r>
           </w:p>
         </w:tc>
@@ -4478,7 +4775,7 @@
                 <w:sz w:val="17"/>
                 <w:szCs w:val="17"/>
               </w:rPr>
-              <w:t xml:space="preserve">81,61%</w:t>
+              <w:t xml:space="preserve">85,71%</w:t>
             </w:r>
           </w:p>
         </w:tc>
@@ -4504,7 +4801,7 @@
                 <w:sz w:val="17"/>
                 <w:szCs w:val="17"/>
               </w:rPr>
-              <w:t xml:space="preserve">+17,91 p.p.</w:t>
+              <w:t xml:space="preserve">+19,71 p.p.</w:t>
             </w:r>
           </w:p>
         </w:tc>
@@ -4533,7 +4830,7 @@
                 <w:sz w:val="17"/>
                 <w:szCs w:val="17"/>
               </w:rPr>
-              <w:t xml:space="preserve">fevereiro/2025</w:t>
+              <w:t xml:space="preserve">abril/2025</w:t>
             </w:r>
           </w:p>
         </w:tc>
@@ -4560,7 +4857,7 @@
                 <w:sz w:val="17"/>
                 <w:szCs w:val="17"/>
               </w:rPr>
-              <w:t xml:space="preserve">Carnaval 2025</w:t>
+              <w:t xml:space="preserve">Web Summit Rio 2025</w:t>
             </w:r>
           </w:p>
         </w:tc>
@@ -4587,7 +4884,7 @@
                 <w:sz w:val="17"/>
                 <w:szCs w:val="17"/>
               </w:rPr>
-              <w:t xml:space="preserve">85,71%</w:t>
+              <w:t xml:space="preserve">76,75%</w:t>
             </w:r>
           </w:p>
         </w:tc>
@@ -4614,7 +4911,7 @@
                 <w:sz w:val="17"/>
                 <w:szCs w:val="17"/>
               </w:rPr>
-              <w:t xml:space="preserve">+15,31 p.p.</w:t>
+              <w:t xml:space="preserve">+13,07 p.p.</w:t>
             </w:r>
           </w:p>
         </w:tc>
@@ -4642,7 +4939,7 @@
                 <w:sz w:val="17"/>
                 <w:szCs w:val="17"/>
               </w:rPr>
-              <w:t xml:space="preserve">abril/2025</w:t>
+              <w:t xml:space="preserve">maio/2025</w:t>
             </w:r>
           </w:p>
         </w:tc>
@@ -4668,7 +4965,7 @@
                 <w:sz w:val="17"/>
                 <w:szCs w:val="17"/>
               </w:rPr>
-              <w:t xml:space="preserve">Web Summit Rio 2025</w:t>
+              <w:t xml:space="preserve">Lady Gaga em Copacabana</w:t>
             </w:r>
           </w:p>
         </w:tc>
@@ -4694,7 +4991,7 @@
                 <w:sz w:val="17"/>
                 <w:szCs w:val="17"/>
               </w:rPr>
-              <w:t xml:space="preserve">76,75%</w:t>
+              <w:t xml:space="preserve">72,81%</w:t>
             </w:r>
           </w:p>
         </w:tc>
@@ -4720,7 +5017,7 @@
                 <w:sz w:val="17"/>
                 <w:szCs w:val="17"/>
               </w:rPr>
-              <w:t xml:space="preserve">+26,70 p.p.</w:t>
+              <w:t xml:space="preserve">+20,12 p.p.</w:t>
             </w:r>
           </w:p>
         </w:tc>
@@ -4749,7 +5046,7 @@
                 <w:sz w:val="17"/>
                 <w:szCs w:val="17"/>
               </w:rPr>
-              <w:t xml:space="preserve">maio/2025</w:t>
+              <w:t xml:space="preserve">julho/2025</w:t>
             </w:r>
           </w:p>
         </w:tc>
@@ -4776,7 +5073,7 @@
                 <w:sz w:val="17"/>
                 <w:szCs w:val="17"/>
               </w:rPr>
-              <w:t xml:space="preserve">Lady Gaga em Copacabana</w:t>
+              <w:t xml:space="preserve">17ª Cúpula do BRICS</w:t>
             </w:r>
           </w:p>
         </w:tc>
@@ -4803,7 +5100,7 @@
                 <w:sz w:val="17"/>
                 <w:szCs w:val="17"/>
               </w:rPr>
-              <w:t xml:space="preserve">72,81%</w:t>
+              <w:t xml:space="preserve">74,13%</w:t>
             </w:r>
           </w:p>
         </w:tc>
@@ -4830,7 +5127,7 @@
                 <w:sz w:val="17"/>
                 <w:szCs w:val="17"/>
               </w:rPr>
-              <w:t xml:space="preserve">+28,71 p.p.</w:t>
+              <w:t xml:space="preserve">+9,10 p.p.</w:t>
             </w:r>
           </w:p>
         </w:tc>
@@ -4858,7 +5155,7 @@
                 <w:sz w:val="17"/>
                 <w:szCs w:val="17"/>
               </w:rPr>
-              <w:t xml:space="preserve">julho/2025</w:t>
+              <w:t xml:space="preserve">agosto/2025</w:t>
             </w:r>
           </w:p>
         </w:tc>
@@ -4884,7 +5181,7 @@
                 <w:sz w:val="17"/>
                 <w:szCs w:val="17"/>
               </w:rPr>
-              <w:t xml:space="preserve">17ª Cúpula do BRICS</w:t>
+              <w:t xml:space="preserve">Rio Innovation Week</w:t>
             </w:r>
           </w:p>
         </w:tc>
@@ -4910,7 +5207,7 @@
                 <w:sz w:val="17"/>
                 <w:szCs w:val="17"/>
               </w:rPr>
-              <w:t xml:space="preserve">74,13%</w:t>
+              <w:t xml:space="preserve">72,87%</w:t>
             </w:r>
           </w:p>
         </w:tc>
@@ -4936,7 +5233,7 @@
                 <w:sz w:val="17"/>
                 <w:szCs w:val="17"/>
               </w:rPr>
-              <w:t xml:space="preserve">+24,03 p.p.</w:t>
+              <w:t xml:space="preserve">+7,67 p.p.</w:t>
             </w:r>
           </w:p>
         </w:tc>
@@ -4965,7 +5262,7 @@
                 <w:sz w:val="17"/>
                 <w:szCs w:val="17"/>
               </w:rPr>
-              <w:t xml:space="preserve">agosto/2025</w:t>
+              <w:t xml:space="preserve">setembro/2025</w:t>
             </w:r>
           </w:p>
         </w:tc>
@@ -4992,7 +5289,7 @@
                 <w:sz w:val="17"/>
                 <w:szCs w:val="17"/>
               </w:rPr>
-              <w:t xml:space="preserve">Rio Innovation Week</w:t>
+              <w:t xml:space="preserve">(sem evento de grande porte no mês)</w:t>
             </w:r>
           </w:p>
         </w:tc>
@@ -5019,7 +5316,7 @@
                 <w:sz w:val="17"/>
                 <w:szCs w:val="17"/>
               </w:rPr>
-              <w:t xml:space="preserve">72,87%</w:t>
+              <w:t xml:space="preserve">79,27%</w:t>
             </w:r>
           </w:p>
         </w:tc>
@@ -5046,7 +5343,7 @@
                 <w:sz w:val="17"/>
                 <w:szCs w:val="17"/>
               </w:rPr>
-              <w:t xml:space="preserve">+20,17 p.p.</w:t>
+              <w:t xml:space="preserve">+3,64 p.p.</w:t>
             </w:r>
           </w:p>
         </w:tc>
@@ -5805,7 +6102,7 @@
         </w:rPr>
         <w:t xml:space="preserve">→ Artigo em Turismo: Visão e Ação (SciELO) que apresenta e discute a definição de turismo da OMT (2001) </w:t>
       </w:r>
-      <w:hyperlink w:history="1" r:id="rIdpzavcsix6zbe7ixhnbs2a">
+      <w:hyperlink w:history="1" r:id="rIdixwd_ogroma_og_tmxdpu">
         <w:r>
           <w:rPr>
             <w:rFonts w:ascii="Calibri" w:cs="Calibri" w:eastAsia="Calibri" w:hAnsi="Calibri"/>
@@ -5971,7 +6268,7 @@
         </w:rPr>
         <w:t xml:space="preserve">→ Megaeventos e Turismo: um estudo bibliométrico dos periódicos brasileiros de turismo — Turismo: Visão e Ação, v. 18, n. 3, p. 633-659, 2016 </w:t>
       </w:r>
-      <w:hyperlink w:history="1" r:id="rIdn6scoezfdkirzwqim7lne">
+      <w:hyperlink w:history="1" r:id="rIdyn6vlcg8ir3d-sfnii9oh">
         <w:r>
           <w:rPr>
             <w:rFonts w:ascii="Calibri" w:cs="Calibri" w:eastAsia="Calibri" w:hAnsi="Calibri"/>
@@ -6029,7 +6326,7 @@
         </w:rPr>
         <w:t xml:space="preserve">→ GETZ, D. Event tourism: definition, evolution, and research. Tourism Management, v. 29, n. 3, p. 403-428, 2008 </w:t>
       </w:r>
-      <w:hyperlink w:history="1" r:id="rId1ieaihmot6vmryhkwp87m">
+      <w:hyperlink w:history="1" r:id="rId5_gfylbmjf6ijhqxplyju">
         <w:r>
           <w:rPr>
             <w:rFonts w:ascii="Calibri" w:cs="Calibri" w:eastAsia="Calibri" w:hAnsi="Calibri"/>
@@ -6072,7 +6369,7 @@
         </w:rPr>
         <w:t xml:space="preserve">→ CARNEIRO, J. B.; FONTES, N. D. Turismo e eventos: instrumento de promoção e estratégia de marketing. Revista Turismo em Análise, v. 8, n. 1, p. 65-74, 1997 </w:t>
       </w:r>
-      <w:hyperlink w:history="1" r:id="rIdhxq_bhzubqjou-zngahth">
+      <w:hyperlink w:history="1" r:id="rIdq2jz1zl-jsrpxg4npvkdi">
         <w:r>
           <w:rPr>
             <w:rFonts w:ascii="Calibri" w:cs="Calibri" w:eastAsia="Calibri" w:hAnsi="Calibri"/>
@@ -6162,7 +6459,7 @@
         </w:rPr>
         <w:t xml:space="preserve">→ RUSSO; FIGUEIRA. O paradoxo dos grandes eventos. RBTur, v. 16, e-2312, 2022. DOI 10.7784/rbtur.v16.2312 </w:t>
       </w:r>
-      <w:hyperlink w:history="1" r:id="rIdbsbaobyleeanoo-j6pdj3">
+      <w:hyperlink w:history="1" r:id="rIdlqfjou1ji-ns1vqn2doqi">
         <w:r>
           <w:rPr>
             <w:rFonts w:ascii="Calibri" w:cs="Calibri" w:eastAsia="Calibri" w:hAnsi="Calibri"/>
@@ -6235,7 +6532,7 @@
         </w:rPr>
         <w:t xml:space="preserve">→ FERNANDES, A. M. V. Megaeventos e Turismo no Rio de Janeiro. Caderno Virtual de Turismo, v. 19, n. 1, 2019. DOI 10.18472/cvt.19n1.2019.1532 </w:t>
       </w:r>
-      <w:hyperlink w:history="1" r:id="rIdwg3m3dgnksw-ddd837mqh">
+      <w:hyperlink w:history="1" r:id="rIdu-nqelx2fydegqpg1pp9o">
         <w:r>
           <w:rPr>
             <w:rFonts w:ascii="Calibri" w:cs="Calibri" w:eastAsia="Calibri" w:hAnsi="Calibri"/>
@@ -6278,7 +6575,7 @@
         </w:rPr>
         <w:t xml:space="preserve">→ E agora, Rio? O turismo pós-megaeventos — Caderno Virtual de Turismo </w:t>
       </w:r>
-      <w:hyperlink w:history="1" r:id="rIdyuukwxamrdnodknedh3da">
+      <w:hyperlink w:history="1" r:id="rIdks2076ixrwqaqnlawrnz_">
         <w:r>
           <w:rPr>
             <w:rFonts w:ascii="Calibri" w:cs="Calibri" w:eastAsia="Calibri" w:hAnsi="Calibri"/>
@@ -6321,7 +6618,7 @@
         </w:rPr>
         <w:t xml:space="preserve">→ Gestão de crise no turismo: reflexos da pandemia da Covid-19 nos meios de hospedagem de Torres (RS) — Turismo: Visão e Ação </w:t>
       </w:r>
-      <w:hyperlink w:history="1" r:id="rIdplcwzgenletol5pmfoenq">
+      <w:hyperlink w:history="1" r:id="rIdqtsk6sguw42uumdykrjff">
         <w:r>
           <w:rPr>
             <w:rFonts w:ascii="Calibri" w:cs="Calibri" w:eastAsia="Calibri" w:hAnsi="Calibri"/>
@@ -6349,7 +6646,7 @@
         </w:rPr>
         <w:t xml:space="preserve">→ Perspectivas para o turismo em Petrópolis (RJ): impactos da Covid-19 e das chuvas no verão de 2022 — SciELO </w:t>
       </w:r>
-      <w:hyperlink w:history="1" r:id="rIdsy-fgqzwb1qayuabwic4r">
+      <w:hyperlink w:history="1" r:id="rIdu371wq54cmp6pydjqcmzz">
         <w:r>
           <w:rPr>
             <w:rFonts w:ascii="Calibri" w:cs="Calibri" w:eastAsia="Calibri" w:hAnsi="Calibri"/>
@@ -6392,7 +6689,7 @@
         </w:rPr>
         <w:t xml:space="preserve">→ Residents' Perceptions of the Impacts of the Rio 2016 Olympic Games — RBTur </w:t>
       </w:r>
-      <w:hyperlink w:history="1" r:id="rIdotv2wukxskeaqchkybayd">
+      <w:hyperlink w:history="1" r:id="rIds9hbcmx5zpwdjn5u2fzxp">
         <w:r>
           <w:rPr>
             <w:rFonts w:ascii="Calibri" w:cs="Calibri" w:eastAsia="Calibri" w:hAnsi="Calibri"/>
@@ -6452,7 +6749,7 @@
         </w:rPr>
         <w:t xml:space="preserve">→ TCC do Repositório da UFSC que utiliza e cita Scalzo — referência: SCALZO, Marília. Jornalismo de Revista. São Paulo: Contexto, 2003 </w:t>
       </w:r>
-      <w:hyperlink w:history="1" r:id="rIddipfdymdagv4hc5xgaucv">
+      <w:hyperlink w:history="1" r:id="rIdkvtgblvz4fogex76r-s37">
         <w:r>
           <w:rPr>
             <w:rFonts w:ascii="Calibri" w:cs="Calibri" w:eastAsia="Calibri" w:hAnsi="Calibri"/>
@@ -6510,7 +6807,7 @@
         </w:rPr>
         <w:t xml:space="preserve">→ Jornalismo Literário: revisão conceitual, história e novas perspectivas — Intercom/SciELO: artigo que discute Vilas Boas e o estilo magazine </w:t>
       </w:r>
-      <w:hyperlink w:history="1" r:id="rIdjwh1tcl88vgi3j17gdtfk">
+      <w:hyperlink w:history="1" r:id="rIdcr87r1xtshifyd-yz6ldv">
         <w:r>
           <w:rPr>
             <w:rFonts w:ascii="Calibri" w:cs="Calibri" w:eastAsia="Calibri" w:hAnsi="Calibri"/>
@@ -6583,7 +6880,7 @@
         </w:rPr>
         <w:t xml:space="preserve">→ SCHUCH, L. D. DCMAGZ: projeto gráfico editorial de uma revista de design gráfico — TCC/UFSC, fonte verificada das referências de design editorial (Ali, Samara, Lupton, Munari) </w:t>
       </w:r>
-      <w:hyperlink w:history="1" r:id="rIdceqk_wnsksyd_v5518qes">
+      <w:hyperlink w:history="1" r:id="rId9lohzsdawaewa1o92yihz">
         <w:r>
           <w:rPr>
             <w:rFonts w:ascii="Calibri" w:cs="Calibri" w:eastAsia="Calibri" w:hAnsi="Calibri"/>
@@ -6673,7 +6970,7 @@
         </w:rPr>
         <w:t xml:space="preserve">→ MARIANO, Agnes Francine de Carvalho. A entrevista como tema de pesquisa no campo da comunicação. Revista FAMECOS, v. 25, n. 2, 2018. DOI 10.15448/1980-3729.2018.2.28307 </w:t>
       </w:r>
-      <w:hyperlink w:history="1" r:id="rIddtzw8pe3hgkoz19l639ib">
+      <w:hyperlink w:history="1" r:id="rIdbd5wch2xzozf9myuxc7hs">
         <w:r>
           <w:rPr>
             <w:rFonts w:ascii="Calibri" w:cs="Calibri" w:eastAsia="Calibri" w:hAnsi="Calibri"/>
@@ -6806,7 +7103,7 @@
         </w:rPr>
         <w:t xml:space="preserve">→ SOARES, L. S.; NEGRINI, M. As técnicas de entrevista utilizadas pelos jornalistas do Jornal Nacional com os presidenciáveis 2018. Revista Alterjor, v. 22, n. 2, 2020 — aplicação das tipologias de Lage </w:t>
       </w:r>
-      <w:hyperlink w:history="1" r:id="rIdyetra7uiktdgyjhybs1np">
+      <w:hyperlink w:history="1" r:id="rIdc_fnapktklpgytcoj3o8l">
         <w:r>
           <w:rPr>
             <w:rFonts w:ascii="Calibri" w:cs="Calibri" w:eastAsia="Calibri" w:hAnsi="Calibri"/>
@@ -6882,7 +7179,7 @@
         </w:rPr>
         <w:t xml:space="preserve">→ Artigo em Revista Alterjor (USP) que discute as técnicas de Lage — referência: LAGE, Nilson. A reportagem: teoria e técnica de entrevista e pesquisa jornalística. Rio de Janeiro: Record, 2001 </w:t>
       </w:r>
-      <w:hyperlink w:history="1" r:id="rIdpyphrdawyjtyepimgdrh9">
+      <w:hyperlink w:history="1" r:id="rIdwfaqcb5qvrtg3aw2vhg5f">
         <w:r>
           <w:rPr>
             <w:rFonts w:ascii="Calibri" w:cs="Calibri" w:eastAsia="Calibri" w:hAnsi="Calibri"/>
@@ -7123,7 +7420,7 @@
         </w:rPr>
         <w:t xml:space="preserve">→ SILVA, Gislene da. Relatório final: inserção dos TCCs do Curso de Jornalismo da UFSC no Repositório Institucional. UFSC, fev. 2020 — mapeamento de três décadas de TCCs e definição das modalidades </w:t>
       </w:r>
-      <w:hyperlink w:history="1" r:id="rIdk-r_gknckmynb229c3yad">
+      <w:hyperlink w:history="1" r:id="rIdlhsdbgz9o2fgcpc3vtsms">
         <w:r>
           <w:rPr>
             <w:rFonts w:ascii="Calibri" w:cs="Calibri" w:eastAsia="Calibri" w:hAnsi="Calibri"/>
@@ -8385,7 +8682,7 @@
         </w:rPr>
         <w:t xml:space="preserve">→ Prefeitura do Rio (SMTUR-Rio, SMDE, Riotur / IFec RJ), 19 jan. 2026 </w:t>
       </w:r>
-      <w:hyperlink w:history="1" r:id="rIdei5tdqcpkwpcebc5ivgv9">
+      <w:hyperlink w:history="1" r:id="rId3rgw3ntlr9i3mauoxp1lh">
         <w:r>
           <w:rPr>
             <w:rFonts w:ascii="Calibri" w:cs="Calibri" w:eastAsia="Calibri" w:hAnsi="Calibri"/>
@@ -8458,7 +8755,7 @@
         </w:rPr>
         <w:t xml:space="preserve">→ Hotéis do Rio que receberão comitivas do G20 atingem 95% de ocupação — dados HotéisRIO/ABIH-RJ (PANROTAS, 14 nov. 2024) </w:t>
       </w:r>
-      <w:hyperlink w:history="1" r:id="rIdo8rikpknsscxnodv5v91j">
+      <w:hyperlink w:history="1" r:id="rIdmfk5qkxv6mqw93my9odxl">
         <w:r>
           <w:rPr>
             <w:rFonts w:ascii="Calibri" w:cs="Calibri" w:eastAsia="Calibri" w:hAnsi="Calibri"/>
@@ -8501,7 +8798,7 @@
         </w:rPr>
         <w:t xml:space="preserve">→ Rio Innovation Week impulsiona ocupação hoteleira no Rio, aponta HotéisRIO — Mercado &amp; Eventos, 2025 </w:t>
       </w:r>
-      <w:hyperlink w:history="1" r:id="rIdta_wts7490bf3dok_x_f6">
+      <w:hyperlink w:history="1" r:id="rIdbjco3gc8pgtiv4c529g5v">
         <w:r>
           <w:rPr>
             <w:rFonts w:ascii="Calibri" w:cs="Calibri" w:eastAsia="Calibri" w:hAnsi="Calibri"/>

</xml_diff>